<commit_message>
Date: 10 Mar 2026
</commit_message>
<xml_diff>
--- a/SeleniumNotes.docx
+++ b/SeleniumNotes.docx
@@ -3253,6 +3253,118 @@
           <w:lang w:val="en-US"/>
         </w:rPr>
         <w:t>)</w:t>
+      </w:r>
+    </w:p>
+    <w:p>
+      <w:pPr>
+        <w:pStyle w:val="ListParagraph"/>
+        <w:numPr>
+          <w:ilvl w:val="0"/>
+          <w:numId w:val="13"/>
+        </w:numPr>
+        <w:rPr>
+          <w:sz w:val="24"/>
+          <w:szCs w:val="22"/>
+          <w:lang w:val="en-US"/>
+        </w:rPr>
+      </w:pPr>
+      <w:r>
+        <w:rPr>
+          <w:sz w:val="24"/>
+          <w:szCs w:val="22"/>
+          <w:lang w:val="en-US"/>
+        </w:rPr>
+        <w:t xml:space="preserve">NoSuchElementException </w:t>
+      </w:r>
+      <w:r>
+        <w:rPr>
+          <w:sz w:val="24"/>
+          <w:szCs w:val="22"/>
+          <w:lang w:val="en-US"/>
+        </w:rPr>
+        <w:sym w:font="Wingdings" w:char="F0E0"/>
+      </w:r>
+      <w:r>
+        <w:rPr>
+          <w:sz w:val="24"/>
+          <w:szCs w:val="22"/>
+          <w:lang w:val="en-US"/>
+        </w:rPr>
+        <w:t xml:space="preserve"> You are trying to locate a control, but Selenium is unable to locate / find this control due to</w:t>
+      </w:r>
+    </w:p>
+    <w:p>
+      <w:pPr>
+        <w:pStyle w:val="ListParagraph"/>
+        <w:numPr>
+          <w:ilvl w:val="1"/>
+          <w:numId w:val="13"/>
+        </w:numPr>
+        <w:rPr>
+          <w:sz w:val="24"/>
+          <w:szCs w:val="22"/>
+          <w:lang w:val="en-US"/>
+        </w:rPr>
+      </w:pPr>
+      <w:r>
+        <w:rPr>
+          <w:sz w:val="24"/>
+          <w:szCs w:val="22"/>
+          <w:lang w:val="en-US"/>
+        </w:rPr>
+        <w:t>The value of locator is wrong.</w:t>
+      </w:r>
+    </w:p>
+    <w:p>
+      <w:pPr>
+        <w:pStyle w:val="ListParagraph"/>
+        <w:numPr>
+          <w:ilvl w:val="1"/>
+          <w:numId w:val="13"/>
+        </w:numPr>
+        <w:rPr>
+          <w:sz w:val="24"/>
+          <w:szCs w:val="22"/>
+          <w:lang w:val="en-US"/>
+        </w:rPr>
+      </w:pPr>
+      <w:r>
+        <w:rPr>
+          <w:sz w:val="24"/>
+          <w:szCs w:val="22"/>
+          <w:lang w:val="en-US"/>
+        </w:rPr>
+        <w:t>The locator value may be dynamic.</w:t>
+      </w:r>
+      <w:r>
+        <w:rPr>
+          <w:sz w:val="24"/>
+          <w:szCs w:val="22"/>
+          <w:lang w:val="en-US"/>
+        </w:rPr>
+        <w:t xml:space="preserve"> (Dynamic value means the value always get change after every refresh)</w:t>
+      </w:r>
+    </w:p>
+    <w:p>
+      <w:pPr>
+        <w:pStyle w:val="ListParagraph"/>
+        <w:numPr>
+          <w:ilvl w:val="1"/>
+          <w:numId w:val="13"/>
+        </w:numPr>
+        <w:rPr>
+          <w:sz w:val="24"/>
+          <w:szCs w:val="22"/>
+          <w:lang w:val="en-US"/>
+        </w:rPr>
+      </w:pPr>
+      <w:r>
+        <w:rPr>
+          <w:sz w:val="24"/>
+          <w:szCs w:val="22"/>
+          <w:lang w:val="en-US"/>
+        </w:rPr>
+        <w:t>The specific control is not available on this page.</w:t>
       </w:r>
     </w:p>
     <w:p>
@@ -3437,6 +3549,7 @@
           <w:szCs w:val="22"/>
           <w:lang w:val="en-US"/>
         </w:rPr>
+        <w:lastRenderedPageBreak/>
         <w:t>For reading any control you can call findElement() method</w:t>
       </w:r>
     </w:p>
@@ -3586,6 +3699,44 @@
     </w:p>
     <w:p>
       <w:pPr>
+        <w:pStyle w:val="ListParagraph"/>
+        <w:numPr>
+          <w:ilvl w:val="1"/>
+          <w:numId w:val="14"/>
+        </w:numPr>
+        <w:rPr>
+          <w:sz w:val="24"/>
+          <w:szCs w:val="22"/>
+          <w:lang w:val="en-US"/>
+        </w:rPr>
+      </w:pPr>
+      <w:r>
+        <w:rPr>
+          <w:sz w:val="24"/>
+          <w:szCs w:val="22"/>
+          <w:lang w:val="en-US"/>
+        </w:rPr>
+        <w:t xml:space="preserve">getAttribute() </w:t>
+      </w:r>
+      <w:r>
+        <w:rPr>
+          <w:sz w:val="24"/>
+          <w:szCs w:val="22"/>
+          <w:lang w:val="en-US"/>
+        </w:rPr>
+        <w:sym w:font="Wingdings" w:char="F0E0"/>
+      </w:r>
+      <w:r>
+        <w:rPr>
+          <w:sz w:val="24"/>
+          <w:szCs w:val="22"/>
+          <w:lang w:val="en-US"/>
+        </w:rPr>
+        <w:t xml:space="preserve"> Will return the value of any attribute of control. (String)</w:t>
+      </w:r>
+    </w:p>
+    <w:p>
+      <w:pPr>
         <w:rPr>
           <w:sz w:val="24"/>
           <w:szCs w:val="22"/>
@@ -3824,24 +3975,6 @@
         </w:rPr>
         <w:t>TagName</w:t>
       </w:r>
-    </w:p>
-    <w:p>
-      <w:pPr>
-        <w:rPr>
-          <w:sz w:val="24"/>
-          <w:szCs w:val="22"/>
-          <w:lang w:val="en-US"/>
-        </w:rPr>
-      </w:pPr>
-    </w:p>
-    <w:p>
-      <w:pPr>
-        <w:rPr>
-          <w:sz w:val="24"/>
-          <w:szCs w:val="22"/>
-          <w:lang w:val="en-US"/>
-        </w:rPr>
-      </w:pPr>
     </w:p>
     <w:p>
       <w:pPr>
@@ -4067,7 +4200,17 @@
           <w:szCs w:val="18"/>
           <w:shd w:val="clear" w:color="auto" w:fill="FEFCF9"/>
         </w:rPr>
-        <w:t>=</w:t>
+        <w:t>=’</w:t>
+      </w:r>
+      <w:r>
+        <w:rPr>
+          <w:rStyle w:val="webkit-html-attribute-value"/>
+          <w:rFonts w:ascii="Courier New" w:hAnsi="Courier New" w:cs="Courier New"/>
+          <w:color w:val="1B1C1A"/>
+          <w:sz w:val="18"/>
+          <w:szCs w:val="18"/>
+        </w:rPr>
+        <w:t>First Name</w:t>
       </w:r>
       <w:r>
         <w:rPr>
@@ -4077,26 +4220,6 @@
           <w:szCs w:val="18"/>
           <w:shd w:val="clear" w:color="auto" w:fill="FEFCF9"/>
         </w:rPr>
-        <w:t>’</w:t>
-      </w:r>
-      <w:r>
-        <w:rPr>
-          <w:rStyle w:val="webkit-html-attribute-value"/>
-          <w:rFonts w:ascii="Courier New" w:hAnsi="Courier New" w:cs="Courier New"/>
-          <w:color w:val="1B1C1A"/>
-          <w:sz w:val="18"/>
-          <w:szCs w:val="18"/>
-        </w:rPr>
-        <w:t>First Name</w:t>
-      </w:r>
-      <w:r>
-        <w:rPr>
-          <w:rFonts w:ascii="Courier New" w:hAnsi="Courier New" w:cs="Courier New"/>
-          <w:color w:val="1B1C1A"/>
-          <w:sz w:val="18"/>
-          <w:szCs w:val="18"/>
-          <w:shd w:val="clear" w:color="auto" w:fill="FEFCF9"/>
-        </w:rPr>
         <w:t>’]</w:t>
       </w:r>
     </w:p>
@@ -4181,6 +4304,7 @@
           <w:szCs w:val="22"/>
           <w:lang w:val="en-US"/>
         </w:rPr>
+        <w:lastRenderedPageBreak/>
         <w:t xml:space="preserve">^ - Starts with </w:t>
       </w:r>
       <w:r>
@@ -4223,17 +4347,263 @@
         <w:br/>
         <w:t>tagName[attribute$=’value’]</w:t>
       </w:r>
+    </w:p>
+    <w:p>
+      <w:pPr>
+        <w:rPr>
+          <w:sz w:val="24"/>
+          <w:szCs w:val="22"/>
+          <w:lang w:val="en-US"/>
+        </w:rPr>
+      </w:pPr>
+    </w:p>
+    <w:p>
+      <w:pPr>
+        <w:rPr>
+          <w:sz w:val="24"/>
+          <w:szCs w:val="22"/>
+          <w:lang w:val="en-US"/>
+        </w:rPr>
+      </w:pPr>
+      <w:r>
+        <w:rPr>
+          <w:sz w:val="24"/>
+          <w:szCs w:val="22"/>
+          <w:lang w:val="en-US"/>
+        </w:rPr>
+        <w:t xml:space="preserve">Pattankodoli Bus Stand </w:t>
+      </w:r>
+      <w:r>
+        <w:rPr>
+          <w:sz w:val="24"/>
+          <w:szCs w:val="22"/>
+          <w:lang w:val="en-US"/>
+        </w:rPr>
+        <w:sym w:font="Wingdings" w:char="F0E0"/>
+      </w:r>
+      <w:r>
+        <w:rPr>
+          <w:sz w:val="24"/>
+          <w:szCs w:val="22"/>
+          <w:lang w:val="en-US"/>
+        </w:rPr>
+        <w:t xml:space="preserve"> Right Turn </w:t>
+      </w:r>
+      <w:r>
+        <w:rPr>
+          <w:sz w:val="24"/>
+          <w:szCs w:val="22"/>
+          <w:lang w:val="en-US"/>
+        </w:rPr>
+        <w:sym w:font="Wingdings" w:char="F0E0"/>
+      </w:r>
+      <w:r>
+        <w:rPr>
+          <w:sz w:val="24"/>
+          <w:szCs w:val="22"/>
+          <w:lang w:val="en-US"/>
+        </w:rPr>
+        <w:t xml:space="preserve"> Hupare Nagar </w:t>
+      </w:r>
+      <w:r>
+        <w:rPr>
+          <w:sz w:val="24"/>
+          <w:szCs w:val="22"/>
+          <w:lang w:val="en-US"/>
+        </w:rPr>
+        <w:sym w:font="Wingdings" w:char="F0E0"/>
+      </w:r>
+      <w:r>
+        <w:rPr>
+          <w:sz w:val="24"/>
+          <w:szCs w:val="22"/>
+          <w:lang w:val="en-US"/>
+        </w:rPr>
+        <w:t xml:space="preserve"> Water Tank </w:t>
+      </w:r>
+      <w:r>
+        <w:rPr>
+          <w:sz w:val="24"/>
+          <w:szCs w:val="22"/>
+          <w:lang w:val="en-US"/>
+        </w:rPr>
+        <w:sym w:font="Wingdings" w:char="F0E0"/>
+      </w:r>
+      <w:r>
+        <w:rPr>
+          <w:sz w:val="24"/>
+          <w:szCs w:val="22"/>
+          <w:lang w:val="en-US"/>
+        </w:rPr>
+        <w:t xml:space="preserve"> Lane no 9 </w:t>
+      </w:r>
+      <w:r>
+        <w:rPr>
+          <w:sz w:val="24"/>
+          <w:szCs w:val="22"/>
+          <w:lang w:val="en-US"/>
+        </w:rPr>
+        <w:sym w:font="Wingdings" w:char="F0E0"/>
+      </w:r>
+      <w:r>
+        <w:rPr>
+          <w:sz w:val="24"/>
+          <w:szCs w:val="22"/>
+          <w:lang w:val="en-US"/>
+        </w:rPr>
+        <w:t xml:space="preserve"> House No 1128</w:t>
+      </w:r>
+    </w:p>
+    <w:p>
+      <w:pPr>
+        <w:rPr>
+          <w:sz w:val="24"/>
+          <w:szCs w:val="22"/>
+          <w:lang w:val="en-US"/>
+        </w:rPr>
+      </w:pPr>
+    </w:p>
+    <w:p>
+      <w:pPr>
+        <w:rPr>
+          <w:b/>
+          <w:bCs/>
+          <w:sz w:val="24"/>
+          <w:szCs w:val="22"/>
+          <w:lang w:val="en-US"/>
+        </w:rPr>
+      </w:pPr>
+      <w:r>
+        <w:rPr>
+          <w:b/>
+          <w:bCs/>
+          <w:sz w:val="24"/>
+          <w:szCs w:val="22"/>
+          <w:lang w:val="en-US"/>
+        </w:rPr>
+        <w:t>XPath (XML Path)</w:t>
+      </w:r>
+    </w:p>
+    <w:p>
+      <w:pPr>
+        <w:pStyle w:val="ListParagraph"/>
+        <w:numPr>
+          <w:ilvl w:val="0"/>
+          <w:numId w:val="18"/>
+        </w:numPr>
+        <w:rPr>
+          <w:sz w:val="24"/>
+          <w:szCs w:val="22"/>
+          <w:lang w:val="en-US"/>
+        </w:rPr>
+      </w:pPr>
+      <w:r>
+        <w:rPr>
+          <w:sz w:val="24"/>
+          <w:szCs w:val="22"/>
+          <w:lang w:val="en-US"/>
+        </w:rPr>
+        <w:t>XPath is the one of most important locator of Selenium.</w:t>
+      </w:r>
+    </w:p>
+    <w:p>
+      <w:pPr>
+        <w:pStyle w:val="ListParagraph"/>
+        <w:numPr>
+          <w:ilvl w:val="0"/>
+          <w:numId w:val="18"/>
+        </w:numPr>
+        <w:rPr>
+          <w:sz w:val="24"/>
+          <w:szCs w:val="22"/>
+          <w:lang w:val="en-US"/>
+        </w:rPr>
+      </w:pPr>
+      <w:r>
+        <w:rPr>
+          <w:sz w:val="24"/>
+          <w:szCs w:val="22"/>
+          <w:lang w:val="en-US"/>
+        </w:rPr>
+        <w:t>XPath will help testers to identify the control using the exact path of that control.</w:t>
+      </w:r>
+    </w:p>
+    <w:p>
+      <w:pPr>
+        <w:pStyle w:val="ListParagraph"/>
+        <w:numPr>
+          <w:ilvl w:val="0"/>
+          <w:numId w:val="18"/>
+        </w:numPr>
+        <w:rPr>
+          <w:sz w:val="24"/>
+          <w:szCs w:val="22"/>
+          <w:lang w:val="en-US"/>
+        </w:rPr>
+      </w:pPr>
+      <w:r>
+        <w:rPr>
+          <w:sz w:val="24"/>
+          <w:szCs w:val="22"/>
+          <w:lang w:val="en-US"/>
+        </w:rPr>
+        <w:t>Types</w:t>
+      </w:r>
+    </w:p>
+    <w:p>
+      <w:pPr>
+        <w:pStyle w:val="ListParagraph"/>
+        <w:numPr>
+          <w:ilvl w:val="1"/>
+          <w:numId w:val="18"/>
+        </w:numPr>
+        <w:rPr>
+          <w:sz w:val="24"/>
+          <w:szCs w:val="22"/>
+          <w:lang w:val="en-US"/>
+        </w:rPr>
+      </w:pPr>
+      <w:r>
+        <w:rPr>
+          <w:sz w:val="24"/>
+          <w:szCs w:val="22"/>
+          <w:lang w:val="en-US"/>
+        </w:rPr>
+        <w:t>Absolute XPath</w:t>
+      </w:r>
+      <w:r>
+        <w:rPr>
+          <w:sz w:val="24"/>
+          <w:szCs w:val="22"/>
+          <w:lang w:val="en-US"/>
+        </w:rPr>
+        <w:br/>
+        <w:t>Starts with html</w:t>
+      </w:r>
       <w:bookmarkStart w:id="0" w:name="_GoBack"/>
       <w:bookmarkEnd w:id="0"/>
     </w:p>
     <w:p>
       <w:pPr>
-        <w:rPr>
-          <w:sz w:val="24"/>
-          <w:szCs w:val="22"/>
-          <w:lang w:val="en-US"/>
-        </w:rPr>
-      </w:pPr>
+        <w:pStyle w:val="ListParagraph"/>
+        <w:numPr>
+          <w:ilvl w:val="1"/>
+          <w:numId w:val="18"/>
+        </w:numPr>
+        <w:rPr>
+          <w:sz w:val="24"/>
+          <w:szCs w:val="22"/>
+          <w:lang w:val="en-US"/>
+        </w:rPr>
+      </w:pPr>
+      <w:r>
+        <w:rPr>
+          <w:sz w:val="24"/>
+          <w:szCs w:val="22"/>
+          <w:lang w:val="en-US"/>
+        </w:rPr>
+        <w:t>Relative XPath</w:t>
+      </w:r>
     </w:p>
     <w:sectPr>
       <w:pgSz w:w="11906" w:h="16838"/>
@@ -4474,6 +4844,119 @@
     </w:lvl>
   </w:abstractNum>
   <w:abstractNum w:abstractNumId="2">
+    <w:nsid w:val="1BB17B8A"/>
+    <w:multiLevelType w:val="hybridMultilevel"/>
+    <w:tmpl w:val="5F1AE160"/>
+    <w:lvl w:ilvl="0" w:tplc="40090001">
+      <w:start w:val="1"/>
+      <w:numFmt w:val="bullet"/>
+      <w:lvlText w:val=""/>
+      <w:lvlJc w:val="left"/>
+      <w:pPr>
+        <w:ind w:left="720" w:hanging="360"/>
+      </w:pPr>
+      <w:rPr>
+        <w:rFonts w:ascii="Symbol" w:hAnsi="Symbol" w:hint="default"/>
+      </w:rPr>
+    </w:lvl>
+    <w:lvl w:ilvl="1" w:tplc="40090003">
+      <w:start w:val="1"/>
+      <w:numFmt w:val="bullet"/>
+      <w:lvlText w:val="o"/>
+      <w:lvlJc w:val="left"/>
+      <w:pPr>
+        <w:ind w:left="1440" w:hanging="360"/>
+      </w:pPr>
+      <w:rPr>
+        <w:rFonts w:ascii="Courier New" w:hAnsi="Courier New" w:cs="Courier New" w:hint="default"/>
+      </w:rPr>
+    </w:lvl>
+    <w:lvl w:ilvl="2" w:tplc="40090005" w:tentative="1">
+      <w:start w:val="1"/>
+      <w:numFmt w:val="bullet"/>
+      <w:lvlText w:val=""/>
+      <w:lvlJc w:val="left"/>
+      <w:pPr>
+        <w:ind w:left="2160" w:hanging="360"/>
+      </w:pPr>
+      <w:rPr>
+        <w:rFonts w:ascii="Wingdings" w:hAnsi="Wingdings" w:hint="default"/>
+      </w:rPr>
+    </w:lvl>
+    <w:lvl w:ilvl="3" w:tplc="40090001" w:tentative="1">
+      <w:start w:val="1"/>
+      <w:numFmt w:val="bullet"/>
+      <w:lvlText w:val=""/>
+      <w:lvlJc w:val="left"/>
+      <w:pPr>
+        <w:ind w:left="2880" w:hanging="360"/>
+      </w:pPr>
+      <w:rPr>
+        <w:rFonts w:ascii="Symbol" w:hAnsi="Symbol" w:hint="default"/>
+      </w:rPr>
+    </w:lvl>
+    <w:lvl w:ilvl="4" w:tplc="40090003" w:tentative="1">
+      <w:start w:val="1"/>
+      <w:numFmt w:val="bullet"/>
+      <w:lvlText w:val="o"/>
+      <w:lvlJc w:val="left"/>
+      <w:pPr>
+        <w:ind w:left="3600" w:hanging="360"/>
+      </w:pPr>
+      <w:rPr>
+        <w:rFonts w:ascii="Courier New" w:hAnsi="Courier New" w:cs="Courier New" w:hint="default"/>
+      </w:rPr>
+    </w:lvl>
+    <w:lvl w:ilvl="5" w:tplc="40090005" w:tentative="1">
+      <w:start w:val="1"/>
+      <w:numFmt w:val="bullet"/>
+      <w:lvlText w:val=""/>
+      <w:lvlJc w:val="left"/>
+      <w:pPr>
+        <w:ind w:left="4320" w:hanging="360"/>
+      </w:pPr>
+      <w:rPr>
+        <w:rFonts w:ascii="Wingdings" w:hAnsi="Wingdings" w:hint="default"/>
+      </w:rPr>
+    </w:lvl>
+    <w:lvl w:ilvl="6" w:tplc="40090001" w:tentative="1">
+      <w:start w:val="1"/>
+      <w:numFmt w:val="bullet"/>
+      <w:lvlText w:val=""/>
+      <w:lvlJc w:val="left"/>
+      <w:pPr>
+        <w:ind w:left="5040" w:hanging="360"/>
+      </w:pPr>
+      <w:rPr>
+        <w:rFonts w:ascii="Symbol" w:hAnsi="Symbol" w:hint="default"/>
+      </w:rPr>
+    </w:lvl>
+    <w:lvl w:ilvl="7" w:tplc="40090003" w:tentative="1">
+      <w:start w:val="1"/>
+      <w:numFmt w:val="bullet"/>
+      <w:lvlText w:val="o"/>
+      <w:lvlJc w:val="left"/>
+      <w:pPr>
+        <w:ind w:left="5760" w:hanging="360"/>
+      </w:pPr>
+      <w:rPr>
+        <w:rFonts w:ascii="Courier New" w:hAnsi="Courier New" w:cs="Courier New" w:hint="default"/>
+      </w:rPr>
+    </w:lvl>
+    <w:lvl w:ilvl="8" w:tplc="40090005" w:tentative="1">
+      <w:start w:val="1"/>
+      <w:numFmt w:val="bullet"/>
+      <w:lvlText w:val=""/>
+      <w:lvlJc w:val="left"/>
+      <w:pPr>
+        <w:ind w:left="6480" w:hanging="360"/>
+      </w:pPr>
+      <w:rPr>
+        <w:rFonts w:ascii="Wingdings" w:hAnsi="Wingdings" w:hint="default"/>
+      </w:rPr>
+    </w:lvl>
+  </w:abstractNum>
+  <w:abstractNum w:abstractNumId="3">
     <w:nsid w:val="1C9C50BA"/>
     <w:multiLevelType w:val="hybridMultilevel"/>
     <w:tmpl w:val="67DA846C"/>
@@ -4586,7 +5069,7 @@
       </w:rPr>
     </w:lvl>
   </w:abstractNum>
-  <w:abstractNum w:abstractNumId="3">
+  <w:abstractNum w:abstractNumId="4">
     <w:nsid w:val="35122F2E"/>
     <w:multiLevelType w:val="hybridMultilevel"/>
     <w:tmpl w:val="86B8B5D2"/>
@@ -4675,7 +5158,7 @@
       </w:pPr>
     </w:lvl>
   </w:abstractNum>
-  <w:abstractNum w:abstractNumId="4">
+  <w:abstractNum w:abstractNumId="5">
     <w:nsid w:val="36FD5624"/>
     <w:multiLevelType w:val="hybridMultilevel"/>
     <w:tmpl w:val="1A5E0934"/>
@@ -4764,7 +5247,7 @@
       </w:pPr>
     </w:lvl>
   </w:abstractNum>
-  <w:abstractNum w:abstractNumId="5">
+  <w:abstractNum w:abstractNumId="6">
     <w:nsid w:val="3A3075AA"/>
     <w:multiLevelType w:val="hybridMultilevel"/>
     <w:tmpl w:val="A1584D44"/>
@@ -4877,7 +5360,7 @@
       </w:rPr>
     </w:lvl>
   </w:abstractNum>
-  <w:abstractNum w:abstractNumId="6">
+  <w:abstractNum w:abstractNumId="7">
     <w:nsid w:val="43183E58"/>
     <w:multiLevelType w:val="hybridMultilevel"/>
     <w:tmpl w:val="EA903AC8"/>
@@ -4990,7 +5473,7 @@
       </w:rPr>
     </w:lvl>
   </w:abstractNum>
-  <w:abstractNum w:abstractNumId="7">
+  <w:abstractNum w:abstractNumId="8">
     <w:nsid w:val="487A3B0D"/>
     <w:multiLevelType w:val="hybridMultilevel"/>
     <w:tmpl w:val="75CA2E34"/>
@@ -5006,7 +5489,7 @@
         <w:rFonts w:hint="default"/>
       </w:rPr>
     </w:lvl>
-    <w:lvl w:ilvl="1" w:tplc="40090019" w:tentative="1">
+    <w:lvl w:ilvl="1" w:tplc="40090019">
       <w:start w:val="1"/>
       <w:numFmt w:val="lowerLetter"/>
       <w:lvlText w:val="%2."/>
@@ -5079,7 +5562,7 @@
       </w:pPr>
     </w:lvl>
   </w:abstractNum>
-  <w:abstractNum w:abstractNumId="8">
+  <w:abstractNum w:abstractNumId="9">
     <w:nsid w:val="56A40A45"/>
     <w:multiLevelType w:val="hybridMultilevel"/>
     <w:tmpl w:val="7862B3F8"/>
@@ -5192,7 +5675,7 @@
       </w:rPr>
     </w:lvl>
   </w:abstractNum>
-  <w:abstractNum w:abstractNumId="9">
+  <w:abstractNum w:abstractNumId="10">
     <w:nsid w:val="590A2A42"/>
     <w:multiLevelType w:val="hybridMultilevel"/>
     <w:tmpl w:val="B2CCDDE8"/>
@@ -5305,7 +5788,7 @@
       </w:rPr>
     </w:lvl>
   </w:abstractNum>
-  <w:abstractNum w:abstractNumId="10">
+  <w:abstractNum w:abstractNumId="11">
     <w:nsid w:val="5AC325C4"/>
     <w:multiLevelType w:val="hybridMultilevel"/>
     <w:tmpl w:val="6BF65148"/>
@@ -5394,7 +5877,7 @@
       </w:pPr>
     </w:lvl>
   </w:abstractNum>
-  <w:abstractNum w:abstractNumId="11">
+  <w:abstractNum w:abstractNumId="12">
     <w:nsid w:val="629C4E82"/>
     <w:multiLevelType w:val="hybridMultilevel"/>
     <w:tmpl w:val="363CE55E"/>
@@ -5483,7 +5966,7 @@
       </w:pPr>
     </w:lvl>
   </w:abstractNum>
-  <w:abstractNum w:abstractNumId="12">
+  <w:abstractNum w:abstractNumId="13">
     <w:nsid w:val="632F5147"/>
     <w:multiLevelType w:val="hybridMultilevel"/>
     <w:tmpl w:val="A2A076AA"/>
@@ -5596,7 +6079,7 @@
       </w:rPr>
     </w:lvl>
   </w:abstractNum>
-  <w:abstractNum w:abstractNumId="13">
+  <w:abstractNum w:abstractNumId="14">
     <w:nsid w:val="6CA66238"/>
     <w:multiLevelType w:val="hybridMultilevel"/>
     <w:tmpl w:val="A2201FCA"/>
@@ -5709,7 +6192,7 @@
       </w:rPr>
     </w:lvl>
   </w:abstractNum>
-  <w:abstractNum w:abstractNumId="14">
+  <w:abstractNum w:abstractNumId="15">
     <w:nsid w:val="73C523EA"/>
     <w:multiLevelType w:val="hybridMultilevel"/>
     <w:tmpl w:val="F1BEC0E4"/>
@@ -5822,7 +6305,7 @@
       </w:rPr>
     </w:lvl>
   </w:abstractNum>
-  <w:abstractNum w:abstractNumId="15">
+  <w:abstractNum w:abstractNumId="16">
     <w:nsid w:val="76CB2945"/>
     <w:multiLevelType w:val="hybridMultilevel"/>
     <w:tmpl w:val="E2880EB2"/>
@@ -5935,7 +6418,7 @@
       </w:rPr>
     </w:lvl>
   </w:abstractNum>
-  <w:abstractNum w:abstractNumId="16">
+  <w:abstractNum w:abstractNumId="17">
     <w:nsid w:val="79FE4925"/>
     <w:multiLevelType w:val="hybridMultilevel"/>
     <w:tmpl w:val="263AE45E"/>
@@ -6025,55 +6508,58 @@
     </w:lvl>
   </w:abstractNum>
   <w:num w:numId="1">
+    <w:abstractNumId w:val="13"/>
+  </w:num>
+  <w:num w:numId="2">
+    <w:abstractNumId w:val="16"/>
+  </w:num>
+  <w:num w:numId="3">
+    <w:abstractNumId w:val="14"/>
+  </w:num>
+  <w:num w:numId="4">
+    <w:abstractNumId w:val="9"/>
+  </w:num>
+  <w:num w:numId="5">
+    <w:abstractNumId w:val="15"/>
+  </w:num>
+  <w:num w:numId="6">
     <w:abstractNumId w:val="12"/>
   </w:num>
-  <w:num w:numId="2">
-    <w:abstractNumId w:val="15"/>
-  </w:num>
-  <w:num w:numId="3">
-    <w:abstractNumId w:val="13"/>
-  </w:num>
-  <w:num w:numId="4">
-    <w:abstractNumId w:val="8"/>
-  </w:num>
-  <w:num w:numId="5">
-    <w:abstractNumId w:val="14"/>
-  </w:num>
-  <w:num w:numId="6">
-    <w:abstractNumId w:val="11"/>
-  </w:num>
   <w:num w:numId="7">
-    <w:abstractNumId w:val="6"/>
+    <w:abstractNumId w:val="7"/>
   </w:num>
   <w:num w:numId="8">
     <w:abstractNumId w:val="1"/>
   </w:num>
   <w:num w:numId="9">
-    <w:abstractNumId w:val="16"/>
+    <w:abstractNumId w:val="17"/>
   </w:num>
   <w:num w:numId="10">
+    <w:abstractNumId w:val="4"/>
+  </w:num>
+  <w:num w:numId="11">
+    <w:abstractNumId w:val="11"/>
+  </w:num>
+  <w:num w:numId="12">
+    <w:abstractNumId w:val="5"/>
+  </w:num>
+  <w:num w:numId="13">
+    <w:abstractNumId w:val="8"/>
+  </w:num>
+  <w:num w:numId="14">
+    <w:abstractNumId w:val="10"/>
+  </w:num>
+  <w:num w:numId="15">
     <w:abstractNumId w:val="3"/>
   </w:num>
-  <w:num w:numId="11">
-    <w:abstractNumId w:val="10"/>
-  </w:num>
-  <w:num w:numId="12">
-    <w:abstractNumId w:val="4"/>
-  </w:num>
-  <w:num w:numId="13">
-    <w:abstractNumId w:val="7"/>
-  </w:num>
-  <w:num w:numId="14">
-    <w:abstractNumId w:val="9"/>
-  </w:num>
-  <w:num w:numId="15">
-    <w:abstractNumId w:val="2"/>
-  </w:num>
   <w:num w:numId="16">
-    <w:abstractNumId w:val="5"/>
+    <w:abstractNumId w:val="6"/>
   </w:num>
   <w:num w:numId="17">
     <w:abstractNumId w:val="0"/>
+  </w:num>
+  <w:num w:numId="18">
+    <w:abstractNumId w:val="2"/>
   </w:num>
 </w:numbering>
 </file>

</xml_diff>

<commit_message>
Date: 11 Mar 2026
</commit_message>
<xml_diff>
--- a/SeleniumNotes.docx
+++ b/SeleniumNotes.docx
@@ -3121,29 +3121,9 @@
           <w:szCs w:val="22"/>
           <w:lang w:val="en-US"/>
         </w:rPr>
-        <w:t xml:space="preserve"> Will read and return the single control on the page. (WebElement)</w:t>
-      </w:r>
-    </w:p>
-    <w:p>
-      <w:pPr>
-        <w:rPr>
-          <w:sz w:val="24"/>
-          <w:szCs w:val="22"/>
-          <w:lang w:val="en-US"/>
-        </w:rPr>
-      </w:pPr>
-    </w:p>
-    <w:p>
-      <w:pPr>
-        <w:rPr>
-          <w:sz w:val="24"/>
-          <w:szCs w:val="22"/>
-          <w:lang w:val="en-US"/>
-        </w:rPr>
-      </w:pPr>
-    </w:p>
-    <w:p>
-      <w:pPr>
+        <w:t xml:space="preserve"> Will read and return the single control on the page. </w:t>
+      </w:r>
+      <w:r>
         <w:rPr>
           <w:b/>
           <w:bCs/>
@@ -3151,8 +3131,37 @@
           <w:szCs w:val="22"/>
           <w:lang w:val="en-US"/>
         </w:rPr>
-      </w:pPr>
-      <w:r>
+        <w:t xml:space="preserve">Will always locates for the first occurrence. </w:t>
+      </w:r>
+      <w:r>
+        <w:rPr>
+          <w:sz w:val="24"/>
+          <w:szCs w:val="22"/>
+          <w:lang w:val="en-US"/>
+        </w:rPr>
+        <w:t>(WebElement)</w:t>
+      </w:r>
+    </w:p>
+    <w:p>
+      <w:pPr>
+        <w:rPr>
+          <w:sz w:val="24"/>
+          <w:szCs w:val="22"/>
+          <w:lang w:val="en-US"/>
+        </w:rPr>
+      </w:pPr>
+    </w:p>
+    <w:p>
+      <w:pPr>
+        <w:rPr>
+          <w:sz w:val="24"/>
+          <w:szCs w:val="22"/>
+          <w:lang w:val="en-US"/>
+        </w:rPr>
+      </w:pPr>
+    </w:p>
+    <w:p>
+      <w:pPr>
         <w:rPr>
           <w:b/>
           <w:bCs/>
@@ -3160,6 +3169,15 @@
           <w:szCs w:val="22"/>
           <w:lang w:val="en-US"/>
         </w:rPr>
+      </w:pPr>
+      <w:r>
+        <w:rPr>
+          <w:b/>
+          <w:bCs/>
+          <w:sz w:val="24"/>
+          <w:szCs w:val="22"/>
+          <w:lang w:val="en-US"/>
+        </w:rPr>
         <w:t>Common Exceptions in WebDriver</w:t>
       </w:r>
     </w:p>
@@ -3366,6 +3384,54 @@
         </w:rPr>
         <w:t>The specific control is not available on this page.</w:t>
       </w:r>
+    </w:p>
+    <w:p>
+      <w:pPr>
+        <w:pStyle w:val="ListParagraph"/>
+        <w:numPr>
+          <w:ilvl w:val="0"/>
+          <w:numId w:val="13"/>
+        </w:numPr>
+        <w:rPr>
+          <w:sz w:val="24"/>
+          <w:szCs w:val="22"/>
+          <w:lang w:val="en-US"/>
+        </w:rPr>
+      </w:pPr>
+      <w:r>
+        <w:rPr>
+          <w:sz w:val="24"/>
+          <w:szCs w:val="22"/>
+          <w:lang w:val="en-US"/>
+        </w:rPr>
+        <w:t xml:space="preserve">InvalidSelectorException </w:t>
+      </w:r>
+      <w:r>
+        <w:rPr>
+          <w:sz w:val="24"/>
+          <w:szCs w:val="22"/>
+          <w:lang w:val="en-US"/>
+        </w:rPr>
+        <w:sym w:font="Wingdings" w:char="F0E0"/>
+      </w:r>
+      <w:r>
+        <w:rPr>
+          <w:sz w:val="24"/>
+          <w:szCs w:val="22"/>
+          <w:lang w:val="en-US"/>
+        </w:rPr>
+        <w:t xml:space="preserve"> </w:t>
+      </w:r>
+      <w:r>
+        <w:rPr>
+          <w:sz w:val="24"/>
+          <w:szCs w:val="22"/>
+          <w:lang w:val="en-US"/>
+        </w:rPr>
+        <w:t>The value of locator is not in the correct format.</w:t>
+      </w:r>
+      <w:bookmarkStart w:id="0" w:name="_GoBack"/>
+      <w:bookmarkEnd w:id="0"/>
     </w:p>
     <w:p>
       <w:pPr>
@@ -3497,6 +3563,7 @@
           <w:szCs w:val="22"/>
           <w:lang w:val="en-US"/>
         </w:rPr>
+        <w:lastRenderedPageBreak/>
         <w:t>WebElement is an interface.</w:t>
       </w:r>
     </w:p>
@@ -3549,7 +3616,6 @@
           <w:szCs w:val="22"/>
           <w:lang w:val="en-US"/>
         </w:rPr>
-        <w:lastRenderedPageBreak/>
         <w:t>For reading any control you can call findElement() method</w:t>
       </w:r>
     </w:p>
@@ -4058,6 +4124,50 @@
           <w:lang w:val="en-US"/>
         </w:rPr>
         <w:t>Please note that attribute is class but locator is className</w:t>
+      </w:r>
+    </w:p>
+    <w:p>
+      <w:pPr>
+        <w:pStyle w:val="ListParagraph"/>
+        <w:numPr>
+          <w:ilvl w:val="0"/>
+          <w:numId w:val="16"/>
+        </w:numPr>
+        <w:rPr>
+          <w:sz w:val="24"/>
+          <w:szCs w:val="22"/>
+          <w:lang w:val="en-US"/>
+        </w:rPr>
+      </w:pPr>
+      <w:r>
+        <w:rPr>
+          <w:sz w:val="24"/>
+          <w:szCs w:val="22"/>
+          <w:lang w:val="en-US"/>
+        </w:rPr>
+        <w:t>The control may have multiple classes applied, such classes are separated via space.</w:t>
+      </w:r>
+    </w:p>
+    <w:p>
+      <w:pPr>
+        <w:pStyle w:val="ListParagraph"/>
+        <w:numPr>
+          <w:ilvl w:val="0"/>
+          <w:numId w:val="16"/>
+        </w:numPr>
+        <w:rPr>
+          <w:sz w:val="24"/>
+          <w:szCs w:val="22"/>
+          <w:lang w:val="en-US"/>
+        </w:rPr>
+      </w:pPr>
+      <w:r>
+        <w:rPr>
+          <w:sz w:val="24"/>
+          <w:szCs w:val="22"/>
+          <w:lang w:val="en-US"/>
+        </w:rPr>
+        <w:t>While locating such controls pick any one class name.</w:t>
       </w:r>
     </w:p>
     <w:p>
@@ -4242,6 +4352,7 @@
           <w:szCs w:val="22"/>
           <w:lang w:val="en-US"/>
         </w:rPr>
+        <w:lastRenderedPageBreak/>
         <w:t>Using Multiple Attributes</w:t>
       </w:r>
       <w:r>
@@ -4304,7 +4415,6 @@
           <w:szCs w:val="22"/>
           <w:lang w:val="en-US"/>
         </w:rPr>
-        <w:lastRenderedPageBreak/>
         <w:t xml:space="preserve">^ - Starts with </w:t>
       </w:r>
       <w:r>
@@ -4580,8 +4690,6 @@
         <w:br/>
         <w:t>Starts with html</w:t>
       </w:r>
-      <w:bookmarkStart w:id="0" w:name="_GoBack"/>
-      <w:bookmarkEnd w:id="0"/>
     </w:p>
     <w:p>
       <w:pPr>

</xml_diff>

<commit_message>
Date: 16 Mar 2026
</commit_message>
<xml_diff>
--- a/SeleniumNotes.docx
+++ b/SeleniumNotes.docx
@@ -1926,6 +1926,7 @@
           <w:lang w:val="en-US"/>
         </w:rPr>
       </w:pPr>
+      <w:proofErr w:type="spellStart"/>
       <w:r>
         <w:rPr>
           <w:sz w:val="24"/>
@@ -1934,6 +1935,7 @@
         </w:rPr>
         <w:t>YourName_SeleniumDemos</w:t>
       </w:r>
+      <w:proofErr w:type="spellEnd"/>
     </w:p>
     <w:p>
       <w:pPr>
@@ -1976,7 +1978,25 @@
           <w:szCs w:val="22"/>
           <w:lang w:val="en-US"/>
         </w:rPr>
-        <w:t>Launch selenium.dev site</w:t>
+        <w:t xml:space="preserve">Launch </w:t>
+      </w:r>
+      <w:proofErr w:type="spellStart"/>
+      <w:r>
+        <w:rPr>
+          <w:sz w:val="24"/>
+          <w:szCs w:val="22"/>
+          <w:lang w:val="en-US"/>
+        </w:rPr>
+        <w:t>selenium.dev</w:t>
+      </w:r>
+      <w:proofErr w:type="spellEnd"/>
+      <w:r>
+        <w:rPr>
+          <w:sz w:val="24"/>
+          <w:szCs w:val="22"/>
+          <w:lang w:val="en-US"/>
+        </w:rPr>
+        <w:t xml:space="preserve"> site</w:t>
       </w:r>
       <w:r>
         <w:rPr>
@@ -2639,8 +2659,18 @@
           <w:szCs w:val="22"/>
           <w:lang w:val="en-US"/>
         </w:rPr>
-        <w:t>Click on ClassPath</w:t>
-      </w:r>
+        <w:t xml:space="preserve">Click on </w:t>
+      </w:r>
+      <w:proofErr w:type="spellStart"/>
+      <w:r>
+        <w:rPr>
+          <w:sz w:val="24"/>
+          <w:szCs w:val="22"/>
+          <w:lang w:val="en-US"/>
+        </w:rPr>
+        <w:t>ClassPath</w:t>
+      </w:r>
+      <w:proofErr w:type="spellEnd"/>
     </w:p>
     <w:p>
       <w:pPr>
@@ -2661,8 +2691,18 @@
           <w:szCs w:val="22"/>
           <w:lang w:val="en-US"/>
         </w:rPr>
-        <w:t>Click on Add External JARs..</w:t>
-      </w:r>
+        <w:t>Click on Add External JARs</w:t>
+      </w:r>
+      <w:proofErr w:type="gramStart"/>
+      <w:r>
+        <w:rPr>
+          <w:sz w:val="24"/>
+          <w:szCs w:val="22"/>
+          <w:lang w:val="en-US"/>
+        </w:rPr>
+        <w:t>..</w:t>
+      </w:r>
+      <w:proofErr w:type="gramEnd"/>
     </w:p>
     <w:p>
       <w:pPr>
@@ -2871,13 +2911,23 @@
           <w:lang w:val="en-US"/>
         </w:rPr>
       </w:pPr>
-      <w:r>
-        <w:rPr>
-          <w:sz w:val="24"/>
-          <w:szCs w:val="22"/>
-          <w:lang w:val="en-US"/>
-        </w:rPr>
-        <w:t xml:space="preserve">get() </w:t>
+      <w:proofErr w:type="gramStart"/>
+      <w:r>
+        <w:rPr>
+          <w:sz w:val="24"/>
+          <w:szCs w:val="22"/>
+          <w:lang w:val="en-US"/>
+        </w:rPr>
+        <w:t>get(</w:t>
+      </w:r>
+      <w:proofErr w:type="gramEnd"/>
+      <w:r>
+        <w:rPr>
+          <w:sz w:val="24"/>
+          <w:szCs w:val="22"/>
+          <w:lang w:val="en-US"/>
+        </w:rPr>
+        <w:t xml:space="preserve">) </w:t>
       </w:r>
       <w:r>
         <w:rPr>
@@ -2909,13 +2959,33 @@
           <w:lang w:val="en-US"/>
         </w:rPr>
       </w:pPr>
-      <w:r>
-        <w:rPr>
-          <w:sz w:val="24"/>
-          <w:szCs w:val="22"/>
-          <w:lang w:val="en-US"/>
-        </w:rPr>
-        <w:t xml:space="preserve">driver.manage().window().maximize() </w:t>
+      <w:proofErr w:type="spellStart"/>
+      <w:proofErr w:type="gramStart"/>
+      <w:r>
+        <w:rPr>
+          <w:sz w:val="24"/>
+          <w:szCs w:val="22"/>
+          <w:lang w:val="en-US"/>
+        </w:rPr>
+        <w:t>driver.manage</w:t>
+      </w:r>
+      <w:proofErr w:type="spellEnd"/>
+      <w:r>
+        <w:rPr>
+          <w:sz w:val="24"/>
+          <w:szCs w:val="22"/>
+          <w:lang w:val="en-US"/>
+        </w:rPr>
+        <w:t>(</w:t>
+      </w:r>
+      <w:proofErr w:type="gramEnd"/>
+      <w:r>
+        <w:rPr>
+          <w:sz w:val="24"/>
+          <w:szCs w:val="22"/>
+          <w:lang w:val="en-US"/>
+        </w:rPr>
+        <w:t xml:space="preserve">).window().maximize() </w:t>
       </w:r>
       <w:r>
         <w:rPr>
@@ -2947,13 +3017,23 @@
           <w:lang w:val="en-US"/>
         </w:rPr>
       </w:pPr>
-      <w:r>
-        <w:rPr>
-          <w:sz w:val="24"/>
-          <w:szCs w:val="22"/>
-          <w:lang w:val="en-US"/>
-        </w:rPr>
-        <w:t xml:space="preserve">close() </w:t>
+      <w:proofErr w:type="gramStart"/>
+      <w:r>
+        <w:rPr>
+          <w:sz w:val="24"/>
+          <w:szCs w:val="22"/>
+          <w:lang w:val="en-US"/>
+        </w:rPr>
+        <w:t>close(</w:t>
+      </w:r>
+      <w:proofErr w:type="gramEnd"/>
+      <w:r>
+        <w:rPr>
+          <w:sz w:val="24"/>
+          <w:szCs w:val="22"/>
+          <w:lang w:val="en-US"/>
+        </w:rPr>
+        <w:t xml:space="preserve">) </w:t>
       </w:r>
       <w:r>
         <w:rPr>
@@ -2985,13 +3065,23 @@
           <w:lang w:val="en-US"/>
         </w:rPr>
       </w:pPr>
-      <w:r>
-        <w:rPr>
-          <w:sz w:val="24"/>
-          <w:szCs w:val="22"/>
-          <w:lang w:val="en-US"/>
-        </w:rPr>
-        <w:t xml:space="preserve">getTitle() </w:t>
+      <w:proofErr w:type="gramStart"/>
+      <w:r>
+        <w:rPr>
+          <w:sz w:val="24"/>
+          <w:szCs w:val="22"/>
+          <w:lang w:val="en-US"/>
+        </w:rPr>
+        <w:t>getTitle(</w:t>
+      </w:r>
+      <w:proofErr w:type="gramEnd"/>
+      <w:r>
+        <w:rPr>
+          <w:sz w:val="24"/>
+          <w:szCs w:val="22"/>
+          <w:lang w:val="en-US"/>
+        </w:rPr>
+        <w:t xml:space="preserve">) </w:t>
       </w:r>
       <w:r>
         <w:rPr>
@@ -3023,13 +3113,23 @@
           <w:lang w:val="en-US"/>
         </w:rPr>
       </w:pPr>
-      <w:r>
-        <w:rPr>
-          <w:sz w:val="24"/>
-          <w:szCs w:val="22"/>
-          <w:lang w:val="en-US"/>
-        </w:rPr>
-        <w:t xml:space="preserve">getCurrentUrl() </w:t>
+      <w:proofErr w:type="gramStart"/>
+      <w:r>
+        <w:rPr>
+          <w:sz w:val="24"/>
+          <w:szCs w:val="22"/>
+          <w:lang w:val="en-US"/>
+        </w:rPr>
+        <w:t>getCurrentUrl(</w:t>
+      </w:r>
+      <w:proofErr w:type="gramEnd"/>
+      <w:r>
+        <w:rPr>
+          <w:sz w:val="24"/>
+          <w:szCs w:val="22"/>
+          <w:lang w:val="en-US"/>
+        </w:rPr>
+        <w:t xml:space="preserve">) </w:t>
       </w:r>
       <w:r>
         <w:rPr>
@@ -3061,13 +3161,23 @@
           <w:lang w:val="en-US"/>
         </w:rPr>
       </w:pPr>
-      <w:r>
-        <w:rPr>
-          <w:sz w:val="24"/>
-          <w:szCs w:val="22"/>
-          <w:lang w:val="en-US"/>
-        </w:rPr>
-        <w:t xml:space="preserve">getPageSource() </w:t>
+      <w:proofErr w:type="gramStart"/>
+      <w:r>
+        <w:rPr>
+          <w:sz w:val="24"/>
+          <w:szCs w:val="22"/>
+          <w:lang w:val="en-US"/>
+        </w:rPr>
+        <w:t>getPageSource(</w:t>
+      </w:r>
+      <w:proofErr w:type="gramEnd"/>
+      <w:r>
+        <w:rPr>
+          <w:sz w:val="24"/>
+          <w:szCs w:val="22"/>
+          <w:lang w:val="en-US"/>
+        </w:rPr>
+        <w:t xml:space="preserve">) </w:t>
       </w:r>
       <w:r>
         <w:rPr>
@@ -3099,13 +3209,23 @@
           <w:lang w:val="en-US"/>
         </w:rPr>
       </w:pPr>
-      <w:r>
-        <w:rPr>
-          <w:sz w:val="24"/>
-          <w:szCs w:val="22"/>
-          <w:lang w:val="en-US"/>
-        </w:rPr>
-        <w:t xml:space="preserve">findElement() </w:t>
+      <w:proofErr w:type="gramStart"/>
+      <w:r>
+        <w:rPr>
+          <w:sz w:val="24"/>
+          <w:szCs w:val="22"/>
+          <w:lang w:val="en-US"/>
+        </w:rPr>
+        <w:t>findElement(</w:t>
+      </w:r>
+      <w:proofErr w:type="gramEnd"/>
+      <w:r>
+        <w:rPr>
+          <w:sz w:val="24"/>
+          <w:szCs w:val="22"/>
+          <w:lang w:val="en-US"/>
+        </w:rPr>
+        <w:t xml:space="preserve">) </w:t>
       </w:r>
       <w:r>
         <w:rPr>
@@ -3155,13 +3275,23 @@
           <w:lang w:val="en-US"/>
         </w:rPr>
       </w:pPr>
-      <w:r>
-        <w:rPr>
-          <w:sz w:val="24"/>
-          <w:szCs w:val="22"/>
-          <w:lang w:val="en-US"/>
-        </w:rPr>
-        <w:t xml:space="preserve">findElements() </w:t>
+      <w:proofErr w:type="gramStart"/>
+      <w:r>
+        <w:rPr>
+          <w:sz w:val="24"/>
+          <w:szCs w:val="22"/>
+          <w:lang w:val="en-US"/>
+        </w:rPr>
+        <w:t>findElements(</w:t>
+      </w:r>
+      <w:proofErr w:type="gramEnd"/>
+      <w:r>
+        <w:rPr>
+          <w:sz w:val="24"/>
+          <w:szCs w:val="22"/>
+          <w:lang w:val="en-US"/>
+        </w:rPr>
+        <w:t xml:space="preserve">) </w:t>
       </w:r>
       <w:r>
         <w:rPr>
@@ -3468,6 +3598,46 @@
         </w:rPr>
         <w:t>The value of locator is not in the correct format.</w:t>
       </w:r>
+    </w:p>
+    <w:p>
+      <w:pPr>
+        <w:pStyle w:val="ListParagraph"/>
+        <w:numPr>
+          <w:ilvl w:val="0"/>
+          <w:numId w:val="13"/>
+        </w:numPr>
+        <w:rPr>
+          <w:sz w:val="24"/>
+          <w:szCs w:val="22"/>
+          <w:lang w:val="en-US"/>
+        </w:rPr>
+      </w:pPr>
+      <w:r>
+        <w:rPr>
+          <w:sz w:val="24"/>
+          <w:szCs w:val="22"/>
+          <w:lang w:val="en-US"/>
+        </w:rPr>
+        <w:t xml:space="preserve">TimeoutException </w:t>
+      </w:r>
+      <w:r>
+        <w:rPr>
+          <w:sz w:val="24"/>
+          <w:szCs w:val="22"/>
+          <w:lang w:val="en-US"/>
+        </w:rPr>
+        <w:sym w:font="Wingdings" w:char="F0E0"/>
+      </w:r>
+      <w:r>
+        <w:rPr>
+          <w:sz w:val="24"/>
+          <w:szCs w:val="22"/>
+          <w:lang w:val="en-US"/>
+        </w:rPr>
+        <w:t xml:space="preserve"> If the condition in ExplicitWait / FluentWait is not getting satisfied within the specified duration.</w:t>
+      </w:r>
+      <w:bookmarkStart w:id="0" w:name="_GoBack"/>
+      <w:bookmarkEnd w:id="0"/>
     </w:p>
     <w:p>
       <w:pPr>
@@ -3551,6 +3721,7 @@
           <w:szCs w:val="22"/>
           <w:lang w:val="en-US"/>
         </w:rPr>
+        <w:lastRenderedPageBreak/>
         <w:t>WebElement</w:t>
       </w:r>
     </w:p>
@@ -3575,7 +3746,6 @@
           <w:szCs w:val="22"/>
           <w:lang w:val="en-US"/>
         </w:rPr>
-        <w:lastRenderedPageBreak/>
         <w:t>Every control (like text box, radio button, command button, check box, label, drop down list etc.) is treated as WebElement in Selenium.</w:t>
       </w:r>
     </w:p>
@@ -3690,13 +3860,23 @@
           <w:lang w:val="en-US"/>
         </w:rPr>
       </w:pPr>
-      <w:r>
-        <w:rPr>
-          <w:sz w:val="24"/>
-          <w:szCs w:val="22"/>
-          <w:lang w:val="en-US"/>
-        </w:rPr>
-        <w:t xml:space="preserve">sendKeys() </w:t>
+      <w:proofErr w:type="gramStart"/>
+      <w:r>
+        <w:rPr>
+          <w:sz w:val="24"/>
+          <w:szCs w:val="22"/>
+          <w:lang w:val="en-US"/>
+        </w:rPr>
+        <w:t>sendKeys(</w:t>
+      </w:r>
+      <w:proofErr w:type="gramEnd"/>
+      <w:r>
+        <w:rPr>
+          <w:sz w:val="24"/>
+          <w:szCs w:val="22"/>
+          <w:lang w:val="en-US"/>
+        </w:rPr>
+        <w:t xml:space="preserve">) </w:t>
       </w:r>
       <w:r>
         <w:rPr>
@@ -3736,13 +3916,23 @@
           <w:lang w:val="en-US"/>
         </w:rPr>
       </w:pPr>
-      <w:r>
-        <w:rPr>
-          <w:sz w:val="24"/>
-          <w:szCs w:val="22"/>
-          <w:lang w:val="en-US"/>
-        </w:rPr>
-        <w:t xml:space="preserve">click() </w:t>
+      <w:proofErr w:type="gramStart"/>
+      <w:r>
+        <w:rPr>
+          <w:sz w:val="24"/>
+          <w:szCs w:val="22"/>
+          <w:lang w:val="en-US"/>
+        </w:rPr>
+        <w:t>click(</w:t>
+      </w:r>
+      <w:proofErr w:type="gramEnd"/>
+      <w:r>
+        <w:rPr>
+          <w:sz w:val="24"/>
+          <w:szCs w:val="22"/>
+          <w:lang w:val="en-US"/>
+        </w:rPr>
+        <w:t xml:space="preserve">) </w:t>
       </w:r>
       <w:r>
         <w:rPr>
@@ -3774,13 +3964,23 @@
           <w:lang w:val="en-US"/>
         </w:rPr>
       </w:pPr>
-      <w:r>
-        <w:rPr>
-          <w:sz w:val="24"/>
-          <w:szCs w:val="22"/>
-          <w:lang w:val="en-US"/>
-        </w:rPr>
-        <w:t xml:space="preserve">getText() </w:t>
+      <w:proofErr w:type="gramStart"/>
+      <w:r>
+        <w:rPr>
+          <w:sz w:val="24"/>
+          <w:szCs w:val="22"/>
+          <w:lang w:val="en-US"/>
+        </w:rPr>
+        <w:t>getText(</w:t>
+      </w:r>
+      <w:proofErr w:type="gramEnd"/>
+      <w:r>
+        <w:rPr>
+          <w:sz w:val="24"/>
+          <w:szCs w:val="22"/>
+          <w:lang w:val="en-US"/>
+        </w:rPr>
+        <w:t xml:space="preserve">) </w:t>
       </w:r>
       <w:r>
         <w:rPr>
@@ -3812,13 +4012,23 @@
           <w:lang w:val="en-US"/>
         </w:rPr>
       </w:pPr>
-      <w:r>
-        <w:rPr>
-          <w:sz w:val="24"/>
-          <w:szCs w:val="22"/>
-          <w:lang w:val="en-US"/>
-        </w:rPr>
-        <w:t xml:space="preserve">getAttribute() </w:t>
+      <w:proofErr w:type="gramStart"/>
+      <w:r>
+        <w:rPr>
+          <w:sz w:val="24"/>
+          <w:szCs w:val="22"/>
+          <w:lang w:val="en-US"/>
+        </w:rPr>
+        <w:t>getAttribute(</w:t>
+      </w:r>
+      <w:proofErr w:type="gramEnd"/>
+      <w:r>
+        <w:rPr>
+          <w:sz w:val="24"/>
+          <w:szCs w:val="22"/>
+          <w:lang w:val="en-US"/>
+        </w:rPr>
+        <w:t xml:space="preserve">) </w:t>
       </w:r>
       <w:r>
         <w:rPr>
@@ -3850,13 +4060,23 @@
           <w:lang w:val="en-US"/>
         </w:rPr>
       </w:pPr>
-      <w:r>
-        <w:rPr>
-          <w:sz w:val="24"/>
-          <w:szCs w:val="22"/>
-          <w:lang w:val="en-US"/>
-        </w:rPr>
-        <w:t xml:space="preserve">isSelected() </w:t>
+      <w:proofErr w:type="gramStart"/>
+      <w:r>
+        <w:rPr>
+          <w:sz w:val="24"/>
+          <w:szCs w:val="22"/>
+          <w:lang w:val="en-US"/>
+        </w:rPr>
+        <w:t>isSelected(</w:t>
+      </w:r>
+      <w:proofErr w:type="gramEnd"/>
+      <w:r>
+        <w:rPr>
+          <w:sz w:val="24"/>
+          <w:szCs w:val="22"/>
+          <w:lang w:val="en-US"/>
+        </w:rPr>
+        <w:t xml:space="preserve">) </w:t>
       </w:r>
       <w:r>
         <w:rPr>
@@ -3896,13 +4116,23 @@
           <w:lang w:val="en-US"/>
         </w:rPr>
       </w:pPr>
-      <w:r>
-        <w:rPr>
-          <w:sz w:val="24"/>
-          <w:szCs w:val="22"/>
-          <w:lang w:val="en-US"/>
-        </w:rPr>
-        <w:t xml:space="preserve">isEnabled() </w:t>
+      <w:proofErr w:type="gramStart"/>
+      <w:r>
+        <w:rPr>
+          <w:sz w:val="24"/>
+          <w:szCs w:val="22"/>
+          <w:lang w:val="en-US"/>
+        </w:rPr>
+        <w:t>isEnabled(</w:t>
+      </w:r>
+      <w:proofErr w:type="gramEnd"/>
+      <w:r>
+        <w:rPr>
+          <w:sz w:val="24"/>
+          <w:szCs w:val="22"/>
+          <w:lang w:val="en-US"/>
+        </w:rPr>
+        <w:t xml:space="preserve">) </w:t>
       </w:r>
       <w:r>
         <w:rPr>
@@ -4368,6 +4598,7 @@
           <w:szCs w:val="22"/>
           <w:lang w:val="en-US"/>
         </w:rPr>
+        <w:lastRenderedPageBreak/>
         <w:t>You can find any control using any single or multiple attribute of the control.</w:t>
       </w:r>
     </w:p>
@@ -4390,7 +4621,6 @@
           <w:szCs w:val="22"/>
           <w:lang w:val="en-US"/>
         </w:rPr>
-        <w:lastRenderedPageBreak/>
         <w:t>Type</w:t>
       </w:r>
     </w:p>
@@ -5036,13 +5266,23 @@
           <w:lang w:val="en-US"/>
         </w:rPr>
       </w:pPr>
-      <w:r>
-        <w:rPr>
-          <w:sz w:val="24"/>
-          <w:szCs w:val="22"/>
-          <w:lang w:val="en-US"/>
-        </w:rPr>
-        <w:t xml:space="preserve">getFirstSelectedOption() </w:t>
+      <w:proofErr w:type="gramStart"/>
+      <w:r>
+        <w:rPr>
+          <w:sz w:val="24"/>
+          <w:szCs w:val="22"/>
+          <w:lang w:val="en-US"/>
+        </w:rPr>
+        <w:t>getFirstSelectedOption(</w:t>
+      </w:r>
+      <w:proofErr w:type="gramEnd"/>
+      <w:r>
+        <w:rPr>
+          <w:sz w:val="24"/>
+          <w:szCs w:val="22"/>
+          <w:lang w:val="en-US"/>
+        </w:rPr>
+        <w:t xml:space="preserve">) </w:t>
       </w:r>
       <w:r>
         <w:rPr>
@@ -5090,13 +5330,23 @@
           <w:lang w:val="en-US"/>
         </w:rPr>
       </w:pPr>
-      <w:r>
-        <w:rPr>
-          <w:sz w:val="24"/>
-          <w:szCs w:val="22"/>
-          <w:lang w:val="en-US"/>
-        </w:rPr>
-        <w:t xml:space="preserve">getOptions() </w:t>
+      <w:proofErr w:type="gramStart"/>
+      <w:r>
+        <w:rPr>
+          <w:sz w:val="24"/>
+          <w:szCs w:val="22"/>
+          <w:lang w:val="en-US"/>
+        </w:rPr>
+        <w:t>getOptions(</w:t>
+      </w:r>
+      <w:proofErr w:type="gramEnd"/>
+      <w:r>
+        <w:rPr>
+          <w:sz w:val="24"/>
+          <w:szCs w:val="22"/>
+          <w:lang w:val="en-US"/>
+        </w:rPr>
+        <w:t xml:space="preserve">) </w:t>
       </w:r>
       <w:r>
         <w:rPr>
@@ -5128,13 +5378,23 @@
           <w:lang w:val="en-US"/>
         </w:rPr>
       </w:pPr>
-      <w:r>
-        <w:rPr>
-          <w:sz w:val="24"/>
-          <w:szCs w:val="22"/>
-          <w:lang w:val="en-US"/>
-        </w:rPr>
-        <w:t xml:space="preserve">selectByVisibleText() </w:t>
+      <w:proofErr w:type="gramStart"/>
+      <w:r>
+        <w:rPr>
+          <w:sz w:val="24"/>
+          <w:szCs w:val="22"/>
+          <w:lang w:val="en-US"/>
+        </w:rPr>
+        <w:t>selectByVisibleText(</w:t>
+      </w:r>
+      <w:proofErr w:type="gramEnd"/>
+      <w:r>
+        <w:rPr>
+          <w:sz w:val="24"/>
+          <w:szCs w:val="22"/>
+          <w:lang w:val="en-US"/>
+        </w:rPr>
+        <w:t xml:space="preserve">) </w:t>
       </w:r>
       <w:r>
         <w:rPr>
@@ -5166,6 +5426,7 @@
           <w:lang w:val="en-US"/>
         </w:rPr>
       </w:pPr>
+      <w:proofErr w:type="gramStart"/>
       <w:r>
         <w:rPr>
           <w:sz w:val="24"/>
@@ -5173,7 +5434,16 @@
           <w:lang w:val="en-US"/>
         </w:rPr>
         <w:lastRenderedPageBreak/>
-        <w:t xml:space="preserve">selectByContainsVisibleText() </w:t>
+        <w:t>selectByContainsVisibleText(</w:t>
+      </w:r>
+      <w:proofErr w:type="gramEnd"/>
+      <w:r>
+        <w:rPr>
+          <w:sz w:val="24"/>
+          <w:szCs w:val="22"/>
+          <w:lang w:val="en-US"/>
+        </w:rPr>
+        <w:t xml:space="preserve">) </w:t>
       </w:r>
       <w:r>
         <w:rPr>
@@ -5205,13 +5475,23 @@
           <w:lang w:val="en-US"/>
         </w:rPr>
       </w:pPr>
-      <w:r>
-        <w:rPr>
-          <w:sz w:val="24"/>
-          <w:szCs w:val="22"/>
-          <w:lang w:val="en-US"/>
-        </w:rPr>
-        <w:t xml:space="preserve">selectByValue() </w:t>
+      <w:proofErr w:type="gramStart"/>
+      <w:r>
+        <w:rPr>
+          <w:sz w:val="24"/>
+          <w:szCs w:val="22"/>
+          <w:lang w:val="en-US"/>
+        </w:rPr>
+        <w:t>selectByValue(</w:t>
+      </w:r>
+      <w:proofErr w:type="gramEnd"/>
+      <w:r>
+        <w:rPr>
+          <w:sz w:val="24"/>
+          <w:szCs w:val="22"/>
+          <w:lang w:val="en-US"/>
+        </w:rPr>
+        <w:t xml:space="preserve">) </w:t>
       </w:r>
       <w:r>
         <w:rPr>
@@ -5243,13 +5523,23 @@
           <w:lang w:val="en-US"/>
         </w:rPr>
       </w:pPr>
-      <w:r>
-        <w:rPr>
-          <w:sz w:val="24"/>
-          <w:szCs w:val="22"/>
-          <w:lang w:val="en-US"/>
-        </w:rPr>
-        <w:t xml:space="preserve">selectByIndex() </w:t>
+      <w:proofErr w:type="gramStart"/>
+      <w:r>
+        <w:rPr>
+          <w:sz w:val="24"/>
+          <w:szCs w:val="22"/>
+          <w:lang w:val="en-US"/>
+        </w:rPr>
+        <w:t>selectByIndex(</w:t>
+      </w:r>
+      <w:proofErr w:type="gramEnd"/>
+      <w:r>
+        <w:rPr>
+          <w:sz w:val="24"/>
+          <w:szCs w:val="22"/>
+          <w:lang w:val="en-US"/>
+        </w:rPr>
+        <w:t xml:space="preserve">) </w:t>
       </w:r>
       <w:r>
         <w:rPr>
@@ -5281,13 +5571,23 @@
           <w:lang w:val="en-US"/>
         </w:rPr>
       </w:pPr>
-      <w:r>
-        <w:rPr>
-          <w:sz w:val="24"/>
-          <w:szCs w:val="22"/>
-          <w:lang w:val="en-US"/>
-        </w:rPr>
-        <w:t xml:space="preserve">getAllSelectedOptions() </w:t>
+      <w:proofErr w:type="gramStart"/>
+      <w:r>
+        <w:rPr>
+          <w:sz w:val="24"/>
+          <w:szCs w:val="22"/>
+          <w:lang w:val="en-US"/>
+        </w:rPr>
+        <w:t>getAllSelectedOptions(</w:t>
+      </w:r>
+      <w:proofErr w:type="gramEnd"/>
+      <w:r>
+        <w:rPr>
+          <w:sz w:val="24"/>
+          <w:szCs w:val="22"/>
+          <w:lang w:val="en-US"/>
+        </w:rPr>
+        <w:t xml:space="preserve">) </w:t>
       </w:r>
       <w:r>
         <w:rPr>
@@ -5327,13 +5627,23 @@
           <w:lang w:val="en-US"/>
         </w:rPr>
       </w:pPr>
-      <w:r>
-        <w:rPr>
-          <w:sz w:val="24"/>
-          <w:szCs w:val="22"/>
-          <w:lang w:val="en-US"/>
-        </w:rPr>
-        <w:t xml:space="preserve">isMultiple() </w:t>
+      <w:proofErr w:type="gramStart"/>
+      <w:r>
+        <w:rPr>
+          <w:sz w:val="24"/>
+          <w:szCs w:val="22"/>
+          <w:lang w:val="en-US"/>
+        </w:rPr>
+        <w:t>isMultiple(</w:t>
+      </w:r>
+      <w:proofErr w:type="gramEnd"/>
+      <w:r>
+        <w:rPr>
+          <w:sz w:val="24"/>
+          <w:szCs w:val="22"/>
+          <w:lang w:val="en-US"/>
+        </w:rPr>
+        <w:t xml:space="preserve">) </w:t>
       </w:r>
       <w:r>
         <w:rPr>
@@ -5522,13 +5832,33 @@
           <w:lang w:val="en-US"/>
         </w:rPr>
       </w:pPr>
-      <w:r>
-        <w:rPr>
-          <w:sz w:val="24"/>
-          <w:szCs w:val="22"/>
-          <w:lang w:val="en-US"/>
-        </w:rPr>
-        <w:t>Thread.sleep()</w:t>
+      <w:proofErr w:type="spellStart"/>
+      <w:proofErr w:type="gramStart"/>
+      <w:r>
+        <w:rPr>
+          <w:sz w:val="24"/>
+          <w:szCs w:val="22"/>
+          <w:lang w:val="en-US"/>
+        </w:rPr>
+        <w:t>Thread.sleep</w:t>
+      </w:r>
+      <w:proofErr w:type="spellEnd"/>
+      <w:r>
+        <w:rPr>
+          <w:sz w:val="24"/>
+          <w:szCs w:val="22"/>
+          <w:lang w:val="en-US"/>
+        </w:rPr>
+        <w:t>(</w:t>
+      </w:r>
+      <w:proofErr w:type="gramEnd"/>
+      <w:r>
+        <w:rPr>
+          <w:sz w:val="24"/>
+          <w:szCs w:val="22"/>
+          <w:lang w:val="en-US"/>
+        </w:rPr>
+        <w:t>)</w:t>
       </w:r>
       <w:r>
         <w:rPr>
@@ -5664,10 +5994,16 @@
           <w:szCs w:val="22"/>
           <w:lang w:val="en-US"/>
         </w:rPr>
-        <w:t>It doesn’t take mandatory delay.</w:t>
-      </w:r>
-      <w:bookmarkStart w:id="0" w:name="_GoBack"/>
-      <w:bookmarkEnd w:id="0"/>
+        <w:t>It doesn’t take mandatory delay</w:t>
+      </w:r>
+      <w:r>
+        <w:rPr>
+          <w:sz w:val="24"/>
+          <w:szCs w:val="22"/>
+          <w:lang w:val="en-US"/>
+        </w:rPr>
+        <w:t>.</w:t>
+      </w:r>
     </w:p>
     <w:p>
       <w:pPr>
@@ -5711,6 +6047,104 @@
           <w:lang w:val="en-US"/>
         </w:rPr>
         <w:t>ExplicitWait</w:t>
+      </w:r>
+      <w:r>
+        <w:rPr>
+          <w:sz w:val="24"/>
+          <w:szCs w:val="22"/>
+          <w:lang w:val="en-US"/>
+        </w:rPr>
+        <w:t xml:space="preserve"> (WebDriverWait Class) </w:t>
+      </w:r>
+      <w:r>
+        <w:rPr>
+          <w:sz w:val="24"/>
+          <w:szCs w:val="22"/>
+          <w:lang w:val="en-US"/>
+        </w:rPr>
+        <w:sym w:font="Wingdings" w:char="F0E0"/>
+      </w:r>
+      <w:r>
+        <w:rPr>
+          <w:sz w:val="24"/>
+          <w:szCs w:val="22"/>
+          <w:lang w:val="en-US"/>
+        </w:rPr>
+        <w:t xml:space="preserve"> We can wait till some condition is getting satisfying</w:t>
+      </w:r>
+    </w:p>
+    <w:p>
+      <w:pPr>
+        <w:pStyle w:val="ListParagraph"/>
+        <w:numPr>
+          <w:ilvl w:val="1"/>
+          <w:numId w:val="20"/>
+        </w:numPr>
+        <w:rPr>
+          <w:sz w:val="24"/>
+          <w:szCs w:val="22"/>
+          <w:lang w:val="en-US"/>
+        </w:rPr>
+      </w:pPr>
+      <w:r>
+        <w:rPr>
+          <w:sz w:val="24"/>
+          <w:szCs w:val="22"/>
+          <w:lang w:val="en-US"/>
+        </w:rPr>
+        <w:t>It is applicable to single statement only.</w:t>
+      </w:r>
+    </w:p>
+    <w:p>
+      <w:pPr>
+        <w:pStyle w:val="ListParagraph"/>
+        <w:numPr>
+          <w:ilvl w:val="1"/>
+          <w:numId w:val="20"/>
+        </w:numPr>
+        <w:rPr>
+          <w:sz w:val="24"/>
+          <w:szCs w:val="22"/>
+          <w:lang w:val="en-US"/>
+        </w:rPr>
+      </w:pPr>
+      <w:r>
+        <w:rPr>
+          <w:sz w:val="24"/>
+          <w:szCs w:val="22"/>
+          <w:lang w:val="en-US"/>
+        </w:rPr>
+        <w:t>It doesn’t take mandatory delay</w:t>
+      </w:r>
+      <w:r>
+        <w:rPr>
+          <w:sz w:val="24"/>
+          <w:szCs w:val="22"/>
+          <w:lang w:val="en-US"/>
+        </w:rPr>
+        <w:t>.</w:t>
+      </w:r>
+    </w:p>
+    <w:p>
+      <w:pPr>
+        <w:pStyle w:val="ListParagraph"/>
+        <w:numPr>
+          <w:ilvl w:val="1"/>
+          <w:numId w:val="20"/>
+        </w:numPr>
+        <w:rPr>
+          <w:sz w:val="24"/>
+          <w:szCs w:val="22"/>
+          <w:lang w:val="en-US"/>
+        </w:rPr>
+      </w:pPr>
+      <w:r>
+        <w:rPr>
+          <w:sz w:val="24"/>
+          <w:szCs w:val="22"/>
+          <w:lang w:val="en-US"/>
+        </w:rPr>
+        <w:t xml:space="preserve">Allows to handle the conditions like elementToBeClickable, alertIsPresent, visibliltyOfElementLocated </w:t>
       </w:r>
     </w:p>
     <w:p>

</xml_diff>

<commit_message>
Date: 17 Mar 2026
</commit_message>
<xml_diff>
--- a/SeleniumNotes.docx
+++ b/SeleniumNotes.docx
@@ -3636,8 +3636,62 @@
         </w:rPr>
         <w:t xml:space="preserve"> If the condition in ExplicitWait / FluentWait is not getting satisfied within the specified duration.</w:t>
       </w:r>
-      <w:bookmarkStart w:id="0" w:name="_GoBack"/>
-      <w:bookmarkEnd w:id="0"/>
+    </w:p>
+    <w:p>
+      <w:pPr>
+        <w:pStyle w:val="ListParagraph"/>
+        <w:numPr>
+          <w:ilvl w:val="0"/>
+          <w:numId w:val="13"/>
+        </w:numPr>
+        <w:rPr>
+          <w:sz w:val="24"/>
+          <w:szCs w:val="22"/>
+          <w:lang w:val="en-US"/>
+        </w:rPr>
+      </w:pPr>
+      <w:r>
+        <w:rPr>
+          <w:sz w:val="24"/>
+          <w:szCs w:val="22"/>
+          <w:lang w:val="en-US"/>
+        </w:rPr>
+        <w:t xml:space="preserve">SessionTimeoutException </w:t>
+      </w:r>
+      <w:r>
+        <w:rPr>
+          <w:sz w:val="24"/>
+          <w:szCs w:val="22"/>
+          <w:lang w:val="en-US"/>
+        </w:rPr>
+        <w:sym w:font="Wingdings" w:char="F0E0"/>
+      </w:r>
+      <w:r>
+        <w:rPr>
+          <w:sz w:val="24"/>
+          <w:szCs w:val="22"/>
+          <w:lang w:val="en-US"/>
+        </w:rPr>
+        <w:t xml:space="preserve"> </w:t>
+      </w:r>
+      <w:proofErr w:type="spellStart"/>
+      <w:r>
+        <w:rPr>
+          <w:sz w:val="24"/>
+          <w:szCs w:val="22"/>
+          <w:lang w:val="en-US"/>
+        </w:rPr>
+        <w:t>driver.get</w:t>
+      </w:r>
+      <w:proofErr w:type="spellEnd"/>
+      <w:r>
+        <w:rPr>
+          <w:sz w:val="24"/>
+          <w:szCs w:val="22"/>
+          <w:lang w:val="en-US"/>
+        </w:rPr>
+        <w:t>() is having implicit wait of 30 seconds, means Selenium will wait for maximum 30 seconds till the page get loaded. But if the page is not getting loaded within 30 seconds, Selenium will throw SessionTimeoutException.</w:t>
+      </w:r>
     </w:p>
     <w:p>
       <w:pPr>
@@ -3652,6 +3706,7 @@
           <w:noProof/>
           <w:lang w:eastAsia="en-IN"/>
         </w:rPr>
+        <w:lastRenderedPageBreak/>
         <w:br/>
       </w:r>
       <w:r>
@@ -3721,7 +3776,6 @@
           <w:szCs w:val="22"/>
           <w:lang w:val="en-US"/>
         </w:rPr>
-        <w:lastRenderedPageBreak/>
         <w:t>WebElement</w:t>
       </w:r>
     </w:p>
@@ -4598,7 +4652,6 @@
           <w:szCs w:val="22"/>
           <w:lang w:val="en-US"/>
         </w:rPr>
-        <w:lastRenderedPageBreak/>
         <w:t>You can find any control using any single or multiple attribute of the control.</w:t>
       </w:r>
     </w:p>
@@ -5172,6 +5225,7 @@
           <w:szCs w:val="22"/>
           <w:lang w:val="en-US"/>
         </w:rPr>
+        <w:lastRenderedPageBreak/>
         <w:t>Handling Dropdown list and List Box</w:t>
       </w:r>
     </w:p>
@@ -5433,7 +5487,6 @@
           <w:szCs w:val="22"/>
           <w:lang w:val="en-US"/>
         </w:rPr>
-        <w:lastRenderedPageBreak/>
         <w:t>selectByContainsVisibleText(</w:t>
       </w:r>
       <w:proofErr w:type="gramEnd"/>
@@ -6114,15 +6167,7 @@
           <w:szCs w:val="22"/>
           <w:lang w:val="en-US"/>
         </w:rPr>
-        <w:t>It doesn’t take mandatory delay</w:t>
-      </w:r>
-      <w:r>
-        <w:rPr>
-          <w:sz w:val="24"/>
-          <w:szCs w:val="22"/>
-          <w:lang w:val="en-US"/>
-        </w:rPr>
-        <w:t>.</w:t>
+        <w:t>It doesn’t take mandatory delay.</w:t>
       </w:r>
     </w:p>
     <w:p>
@@ -6166,14 +6211,39 @@
           <w:szCs w:val="22"/>
           <w:lang w:val="en-US"/>
         </w:rPr>
+        <w:lastRenderedPageBreak/>
         <w:t>FluentWait</w:t>
       </w:r>
-    </w:p>
-    <w:p>
-      <w:pPr>
-        <w:pStyle w:val="ListParagraph"/>
-        <w:numPr>
-          <w:ilvl w:val="0"/>
+      <w:r>
+        <w:rPr>
+          <w:sz w:val="24"/>
+          <w:szCs w:val="22"/>
+          <w:lang w:val="en-US"/>
+        </w:rPr>
+        <w:t xml:space="preserve"> </w:t>
+      </w:r>
+      <w:r>
+        <w:rPr>
+          <w:sz w:val="24"/>
+          <w:szCs w:val="22"/>
+          <w:lang w:val="en-US"/>
+        </w:rPr>
+        <w:sym w:font="Wingdings" w:char="F0E0"/>
+      </w:r>
+      <w:r>
+        <w:rPr>
+          <w:sz w:val="24"/>
+          <w:szCs w:val="22"/>
+          <w:lang w:val="en-US"/>
+        </w:rPr>
+        <w:t xml:space="preserve"> This is next version of ExplicitWait which allows to handle the exception as well. If any one of the exception rather than specified exception will throw then Selenium should not wait rather it should stop the execution.</w:t>
+      </w:r>
+    </w:p>
+    <w:p>
+      <w:pPr>
+        <w:pStyle w:val="ListParagraph"/>
+        <w:numPr>
+          <w:ilvl w:val="1"/>
           <w:numId w:val="20"/>
         </w:numPr>
         <w:rPr>
@@ -6188,26 +6258,1069 @@
           <w:szCs w:val="22"/>
           <w:lang w:val="en-US"/>
         </w:rPr>
+        <w:t>It is applicable to single statement only.</w:t>
+      </w:r>
+    </w:p>
+    <w:p>
+      <w:pPr>
+        <w:pStyle w:val="ListParagraph"/>
+        <w:numPr>
+          <w:ilvl w:val="1"/>
+          <w:numId w:val="20"/>
+        </w:numPr>
+        <w:rPr>
+          <w:sz w:val="24"/>
+          <w:szCs w:val="22"/>
+          <w:lang w:val="en-US"/>
+        </w:rPr>
+      </w:pPr>
+      <w:r>
+        <w:rPr>
+          <w:sz w:val="24"/>
+          <w:szCs w:val="22"/>
+          <w:lang w:val="en-US"/>
+        </w:rPr>
+        <w:t>It doesn’t take mandatory delay.</w:t>
+      </w:r>
+    </w:p>
+    <w:p>
+      <w:pPr>
+        <w:pStyle w:val="ListParagraph"/>
+        <w:numPr>
+          <w:ilvl w:val="1"/>
+          <w:numId w:val="20"/>
+        </w:numPr>
+        <w:rPr>
+          <w:sz w:val="24"/>
+          <w:szCs w:val="22"/>
+          <w:lang w:val="en-US"/>
+        </w:rPr>
+      </w:pPr>
+      <w:r>
+        <w:rPr>
+          <w:sz w:val="24"/>
+          <w:szCs w:val="22"/>
+          <w:lang w:val="en-US"/>
+        </w:rPr>
+        <w:t xml:space="preserve">Allows to handle the conditions like elementToBeClickable, alertIsPresent, visibliltyOfElementLocated </w:t>
+      </w:r>
+    </w:p>
+    <w:p>
+      <w:pPr>
+        <w:pStyle w:val="ListParagraph"/>
+        <w:numPr>
+          <w:ilvl w:val="1"/>
+          <w:numId w:val="20"/>
+        </w:numPr>
+        <w:rPr>
+          <w:sz w:val="24"/>
+          <w:szCs w:val="22"/>
+          <w:lang w:val="en-US"/>
+        </w:rPr>
+      </w:pPr>
+      <w:r>
+        <w:rPr>
+          <w:sz w:val="24"/>
+          <w:szCs w:val="22"/>
+          <w:lang w:val="en-US"/>
+        </w:rPr>
+        <w:t>Allows to handle exception</w:t>
+      </w:r>
+      <w:r>
+        <w:rPr>
+          <w:sz w:val="24"/>
+          <w:szCs w:val="22"/>
+          <w:lang w:val="en-US"/>
+        </w:rPr>
+        <w:br/>
+        <w:t>w – withTimeout</w:t>
+      </w:r>
+      <w:r>
+        <w:t xml:space="preserve"> </w:t>
+      </w:r>
+      <w:r>
+        <w:rPr>
+          <w:sz w:val="24"/>
+          <w:szCs w:val="22"/>
+          <w:lang w:val="en-US"/>
+        </w:rPr>
+        <w:br/>
+      </w:r>
+      <w:proofErr w:type="spellStart"/>
+      <w:r>
+        <w:rPr>
+          <w:sz w:val="24"/>
+          <w:szCs w:val="22"/>
+          <w:lang w:val="en-US"/>
+        </w:rPr>
+        <w:t>i</w:t>
+      </w:r>
+      <w:proofErr w:type="spellEnd"/>
+      <w:r>
+        <w:rPr>
+          <w:sz w:val="24"/>
+          <w:szCs w:val="22"/>
+          <w:lang w:val="en-US"/>
+        </w:rPr>
+        <w:t xml:space="preserve"> – ignoring </w:t>
+      </w:r>
+      <w:r>
+        <w:rPr>
+          <w:sz w:val="24"/>
+          <w:szCs w:val="22"/>
+          <w:lang w:val="en-US"/>
+        </w:rPr>
+        <w:br/>
+        <w:t xml:space="preserve">p – pollingEvery </w:t>
+      </w:r>
+      <w:r>
+        <w:rPr>
+          <w:sz w:val="24"/>
+          <w:szCs w:val="22"/>
+          <w:lang w:val="en-US"/>
+        </w:rPr>
+        <w:br/>
+        <w:t xml:space="preserve">u – until </w:t>
+      </w:r>
+    </w:p>
+    <w:p>
+      <w:pPr>
+        <w:pStyle w:val="ListParagraph"/>
+        <w:numPr>
+          <w:ilvl w:val="0"/>
+          <w:numId w:val="20"/>
+        </w:numPr>
+        <w:rPr>
+          <w:sz w:val="24"/>
+          <w:szCs w:val="22"/>
+          <w:lang w:val="en-US"/>
+        </w:rPr>
+      </w:pPr>
+      <w:r>
+        <w:rPr>
+          <w:sz w:val="24"/>
+          <w:szCs w:val="22"/>
+          <w:lang w:val="en-US"/>
+        </w:rPr>
         <w:t>PageLoadTimeout</w:t>
       </w:r>
-    </w:p>
-    <w:p>
-      <w:pPr>
-        <w:rPr>
-          <w:sz w:val="24"/>
-          <w:szCs w:val="22"/>
-          <w:lang w:val="en-US"/>
-        </w:rPr>
-      </w:pPr>
-    </w:p>
-    <w:p>
-      <w:pPr>
-        <w:rPr>
-          <w:sz w:val="24"/>
-          <w:szCs w:val="22"/>
-          <w:lang w:val="en-US"/>
-        </w:rPr>
-      </w:pPr>
+      <w:r>
+        <w:rPr>
+          <w:sz w:val="24"/>
+          <w:szCs w:val="22"/>
+          <w:lang w:val="en-US"/>
+        </w:rPr>
+        <w:t xml:space="preserve"> </w:t>
+      </w:r>
+      <w:r>
+        <w:rPr>
+          <w:sz w:val="24"/>
+          <w:szCs w:val="22"/>
+          <w:lang w:val="en-US"/>
+        </w:rPr>
+        <w:sym w:font="Wingdings" w:char="F0E0"/>
+      </w:r>
+      <w:r>
+        <w:rPr>
+          <w:sz w:val="24"/>
+          <w:szCs w:val="22"/>
+          <w:lang w:val="en-US"/>
+        </w:rPr>
+        <w:t xml:space="preserve"> We can add some more implicit wait for loading the page to avoid SessionTimeoutException.</w:t>
+      </w:r>
+    </w:p>
+    <w:p>
+      <w:pPr>
+        <w:rPr>
+          <w:sz w:val="24"/>
+          <w:szCs w:val="22"/>
+          <w:lang w:val="en-US"/>
+        </w:rPr>
+      </w:pPr>
+    </w:p>
+    <w:p>
+      <w:pPr>
+        <w:rPr>
+          <w:sz w:val="24"/>
+          <w:szCs w:val="22"/>
+          <w:lang w:val="en-US"/>
+        </w:rPr>
+      </w:pPr>
+      <w:r>
+        <w:rPr>
+          <w:sz w:val="24"/>
+          <w:szCs w:val="22"/>
+          <w:lang w:val="en-US"/>
+        </w:rPr>
+        <w:t>&lt;</w:t>
+      </w:r>
+      <w:proofErr w:type="gramStart"/>
+      <w:r>
+        <w:rPr>
+          <w:sz w:val="24"/>
+          <w:szCs w:val="22"/>
+          <w:lang w:val="en-US"/>
+        </w:rPr>
+        <w:t>table</w:t>
+      </w:r>
+      <w:proofErr w:type="gramEnd"/>
+      <w:r>
+        <w:rPr>
+          <w:sz w:val="24"/>
+          <w:szCs w:val="22"/>
+          <w:lang w:val="en-US"/>
+        </w:rPr>
+        <w:t>&gt;</w:t>
+      </w:r>
+    </w:p>
+    <w:p>
+      <w:pPr>
+        <w:rPr>
+          <w:sz w:val="24"/>
+          <w:szCs w:val="22"/>
+          <w:lang w:val="en-US"/>
+        </w:rPr>
+      </w:pPr>
+      <w:r>
+        <w:rPr>
+          <w:sz w:val="24"/>
+          <w:szCs w:val="22"/>
+          <w:lang w:val="en-US"/>
+        </w:rPr>
+        <w:tab/>
+        <w:t>&lt;</w:t>
+      </w:r>
+      <w:proofErr w:type="spellStart"/>
+      <w:proofErr w:type="gramStart"/>
+      <w:r>
+        <w:rPr>
+          <w:sz w:val="24"/>
+          <w:szCs w:val="22"/>
+          <w:lang w:val="en-US"/>
+        </w:rPr>
+        <w:t>thead</w:t>
+      </w:r>
+      <w:proofErr w:type="spellEnd"/>
+      <w:proofErr w:type="gramEnd"/>
+      <w:r>
+        <w:rPr>
+          <w:sz w:val="24"/>
+          <w:szCs w:val="22"/>
+          <w:lang w:val="en-US"/>
+        </w:rPr>
+        <w:t>&gt;</w:t>
+      </w:r>
+      <w:r>
+        <w:rPr>
+          <w:sz w:val="24"/>
+          <w:szCs w:val="22"/>
+          <w:lang w:val="en-US"/>
+        </w:rPr>
+        <w:tab/>
+        <w:t>Header Part</w:t>
+      </w:r>
+    </w:p>
+    <w:p>
+      <w:pPr>
+        <w:rPr>
+          <w:sz w:val="24"/>
+          <w:szCs w:val="22"/>
+          <w:lang w:val="en-US"/>
+        </w:rPr>
+      </w:pPr>
+      <w:r>
+        <w:rPr>
+          <w:sz w:val="24"/>
+          <w:szCs w:val="22"/>
+          <w:lang w:val="en-US"/>
+        </w:rPr>
+        <w:tab/>
+      </w:r>
+      <w:r>
+        <w:rPr>
+          <w:sz w:val="24"/>
+          <w:szCs w:val="22"/>
+          <w:lang w:val="en-US"/>
+        </w:rPr>
+        <w:tab/>
+        <w:t>&lt;</w:t>
+      </w:r>
+      <w:proofErr w:type="spellStart"/>
+      <w:proofErr w:type="gramStart"/>
+      <w:r>
+        <w:rPr>
+          <w:sz w:val="24"/>
+          <w:szCs w:val="22"/>
+          <w:lang w:val="en-US"/>
+        </w:rPr>
+        <w:t>tr</w:t>
+      </w:r>
+      <w:proofErr w:type="spellEnd"/>
+      <w:proofErr w:type="gramEnd"/>
+      <w:r>
+        <w:rPr>
+          <w:sz w:val="24"/>
+          <w:szCs w:val="22"/>
+          <w:lang w:val="en-US"/>
+        </w:rPr>
+        <w:t>&gt;</w:t>
+      </w:r>
+      <w:r>
+        <w:rPr>
+          <w:sz w:val="24"/>
+          <w:szCs w:val="22"/>
+          <w:lang w:val="en-US"/>
+        </w:rPr>
+        <w:tab/>
+        <w:t>Table Row</w:t>
+      </w:r>
+    </w:p>
+    <w:p>
+      <w:pPr>
+        <w:rPr>
+          <w:sz w:val="24"/>
+          <w:szCs w:val="22"/>
+          <w:lang w:val="en-US"/>
+        </w:rPr>
+      </w:pPr>
+      <w:r>
+        <w:rPr>
+          <w:sz w:val="24"/>
+          <w:szCs w:val="22"/>
+          <w:lang w:val="en-US"/>
+        </w:rPr>
+        <w:tab/>
+      </w:r>
+      <w:r>
+        <w:rPr>
+          <w:sz w:val="24"/>
+          <w:szCs w:val="22"/>
+          <w:lang w:val="en-US"/>
+        </w:rPr>
+        <w:tab/>
+      </w:r>
+      <w:r>
+        <w:rPr>
+          <w:sz w:val="24"/>
+          <w:szCs w:val="22"/>
+          <w:lang w:val="en-US"/>
+        </w:rPr>
+        <w:tab/>
+        <w:t>&lt;</w:t>
+      </w:r>
+      <w:proofErr w:type="spellStart"/>
+      <w:proofErr w:type="gramStart"/>
+      <w:r>
+        <w:rPr>
+          <w:sz w:val="24"/>
+          <w:szCs w:val="22"/>
+          <w:lang w:val="en-US"/>
+        </w:rPr>
+        <w:t>th</w:t>
+      </w:r>
+      <w:proofErr w:type="spellEnd"/>
+      <w:r>
+        <w:rPr>
+          <w:sz w:val="24"/>
+          <w:szCs w:val="22"/>
+          <w:lang w:val="en-US"/>
+        </w:rPr>
+        <w:t>&gt;</w:t>
+      </w:r>
+      <w:proofErr w:type="spellStart"/>
+      <w:proofErr w:type="gramEnd"/>
+      <w:r>
+        <w:rPr>
+          <w:sz w:val="24"/>
+          <w:szCs w:val="22"/>
+          <w:lang w:val="en-US"/>
+        </w:rPr>
+        <w:t>Sr</w:t>
+      </w:r>
+      <w:proofErr w:type="spellEnd"/>
+      <w:r>
+        <w:rPr>
+          <w:sz w:val="24"/>
+          <w:szCs w:val="22"/>
+          <w:lang w:val="en-US"/>
+        </w:rPr>
+        <w:t xml:space="preserve"> No&lt;/</w:t>
+      </w:r>
+      <w:proofErr w:type="spellStart"/>
+      <w:r>
+        <w:rPr>
+          <w:sz w:val="24"/>
+          <w:szCs w:val="22"/>
+          <w:lang w:val="en-US"/>
+        </w:rPr>
+        <w:t>th</w:t>
+      </w:r>
+      <w:proofErr w:type="spellEnd"/>
+      <w:r>
+        <w:rPr>
+          <w:sz w:val="24"/>
+          <w:szCs w:val="22"/>
+          <w:lang w:val="en-US"/>
+        </w:rPr>
+        <w:t>&gt;</w:t>
+      </w:r>
+      <w:r>
+        <w:rPr>
+          <w:sz w:val="24"/>
+          <w:szCs w:val="22"/>
+          <w:lang w:val="en-US"/>
+        </w:rPr>
+        <w:tab/>
+        <w:t>Table Header</w:t>
+      </w:r>
+    </w:p>
+    <w:p>
+      <w:pPr>
+        <w:rPr>
+          <w:sz w:val="24"/>
+          <w:szCs w:val="22"/>
+          <w:lang w:val="en-US"/>
+        </w:rPr>
+      </w:pPr>
+      <w:r>
+        <w:rPr>
+          <w:sz w:val="24"/>
+          <w:szCs w:val="22"/>
+          <w:lang w:val="en-US"/>
+        </w:rPr>
+        <w:tab/>
+      </w:r>
+      <w:r>
+        <w:rPr>
+          <w:sz w:val="24"/>
+          <w:szCs w:val="22"/>
+          <w:lang w:val="en-US"/>
+        </w:rPr>
+        <w:tab/>
+      </w:r>
+      <w:r>
+        <w:rPr>
+          <w:sz w:val="24"/>
+          <w:szCs w:val="22"/>
+          <w:lang w:val="en-US"/>
+        </w:rPr>
+        <w:tab/>
+        <w:t>&lt;</w:t>
+      </w:r>
+      <w:proofErr w:type="spellStart"/>
+      <w:proofErr w:type="gramStart"/>
+      <w:r>
+        <w:rPr>
+          <w:sz w:val="24"/>
+          <w:szCs w:val="22"/>
+          <w:lang w:val="en-US"/>
+        </w:rPr>
+        <w:t>th</w:t>
+      </w:r>
+      <w:proofErr w:type="spellEnd"/>
+      <w:r>
+        <w:rPr>
+          <w:sz w:val="24"/>
+          <w:szCs w:val="22"/>
+          <w:lang w:val="en-US"/>
+        </w:rPr>
+        <w:t>&gt;</w:t>
+      </w:r>
+      <w:proofErr w:type="gramEnd"/>
+      <w:r>
+        <w:rPr>
+          <w:sz w:val="24"/>
+          <w:szCs w:val="22"/>
+          <w:lang w:val="en-US"/>
+        </w:rPr>
+        <w:t>Company&lt;/</w:t>
+      </w:r>
+      <w:proofErr w:type="spellStart"/>
+      <w:r>
+        <w:rPr>
+          <w:sz w:val="24"/>
+          <w:szCs w:val="22"/>
+          <w:lang w:val="en-US"/>
+        </w:rPr>
+        <w:t>th</w:t>
+      </w:r>
+      <w:proofErr w:type="spellEnd"/>
+      <w:r>
+        <w:rPr>
+          <w:sz w:val="24"/>
+          <w:szCs w:val="22"/>
+          <w:lang w:val="en-US"/>
+        </w:rPr>
+        <w:t>&gt;</w:t>
+      </w:r>
+    </w:p>
+    <w:p>
+      <w:pPr>
+        <w:rPr>
+          <w:sz w:val="24"/>
+          <w:szCs w:val="22"/>
+          <w:lang w:val="en-US"/>
+        </w:rPr>
+      </w:pPr>
+      <w:r>
+        <w:rPr>
+          <w:sz w:val="24"/>
+          <w:szCs w:val="22"/>
+          <w:lang w:val="en-US"/>
+        </w:rPr>
+        <w:tab/>
+      </w:r>
+      <w:r>
+        <w:rPr>
+          <w:sz w:val="24"/>
+          <w:szCs w:val="22"/>
+          <w:lang w:val="en-US"/>
+        </w:rPr>
+        <w:tab/>
+        <w:t>&lt;/</w:t>
+      </w:r>
+      <w:proofErr w:type="spellStart"/>
+      <w:proofErr w:type="gramStart"/>
+      <w:r>
+        <w:rPr>
+          <w:sz w:val="24"/>
+          <w:szCs w:val="22"/>
+          <w:lang w:val="en-US"/>
+        </w:rPr>
+        <w:t>tr</w:t>
+      </w:r>
+      <w:proofErr w:type="spellEnd"/>
+      <w:proofErr w:type="gramEnd"/>
+      <w:r>
+        <w:rPr>
+          <w:sz w:val="24"/>
+          <w:szCs w:val="22"/>
+          <w:lang w:val="en-US"/>
+        </w:rPr>
+        <w:t>&gt;</w:t>
+      </w:r>
+    </w:p>
+    <w:p>
+      <w:pPr>
+        <w:rPr>
+          <w:sz w:val="24"/>
+          <w:szCs w:val="22"/>
+          <w:lang w:val="en-US"/>
+        </w:rPr>
+      </w:pPr>
+      <w:r>
+        <w:rPr>
+          <w:sz w:val="24"/>
+          <w:szCs w:val="22"/>
+          <w:lang w:val="en-US"/>
+        </w:rPr>
+        <w:tab/>
+        <w:t>&lt;/</w:t>
+      </w:r>
+      <w:proofErr w:type="spellStart"/>
+      <w:r>
+        <w:rPr>
+          <w:sz w:val="24"/>
+          <w:szCs w:val="22"/>
+          <w:lang w:val="en-US"/>
+        </w:rPr>
+        <w:t>thead</w:t>
+      </w:r>
+      <w:proofErr w:type="spellEnd"/>
+      <w:r>
+        <w:rPr>
+          <w:sz w:val="24"/>
+          <w:szCs w:val="22"/>
+          <w:lang w:val="en-US"/>
+        </w:rPr>
+        <w:t>&gt;</w:t>
+      </w:r>
+    </w:p>
+    <w:p>
+      <w:pPr>
+        <w:rPr>
+          <w:sz w:val="24"/>
+          <w:szCs w:val="22"/>
+          <w:lang w:val="en-US"/>
+        </w:rPr>
+      </w:pPr>
+      <w:r>
+        <w:rPr>
+          <w:sz w:val="24"/>
+          <w:szCs w:val="22"/>
+          <w:lang w:val="en-US"/>
+        </w:rPr>
+        <w:tab/>
+        <w:t>&lt;</w:t>
+      </w:r>
+      <w:proofErr w:type="spellStart"/>
+      <w:proofErr w:type="gramStart"/>
+      <w:r>
+        <w:rPr>
+          <w:sz w:val="24"/>
+          <w:szCs w:val="22"/>
+          <w:lang w:val="en-US"/>
+        </w:rPr>
+        <w:t>tbody</w:t>
+      </w:r>
+      <w:proofErr w:type="spellEnd"/>
+      <w:proofErr w:type="gramEnd"/>
+      <w:r>
+        <w:rPr>
+          <w:sz w:val="24"/>
+          <w:szCs w:val="22"/>
+          <w:lang w:val="en-US"/>
+        </w:rPr>
+        <w:t>&gt;</w:t>
+      </w:r>
+      <w:r>
+        <w:rPr>
+          <w:sz w:val="24"/>
+          <w:szCs w:val="22"/>
+          <w:lang w:val="en-US"/>
+        </w:rPr>
+        <w:tab/>
+        <w:t>Body of table</w:t>
+      </w:r>
+    </w:p>
+    <w:p>
+      <w:pPr>
+        <w:rPr>
+          <w:sz w:val="24"/>
+          <w:szCs w:val="22"/>
+          <w:lang w:val="en-US"/>
+        </w:rPr>
+      </w:pPr>
+      <w:r>
+        <w:rPr>
+          <w:sz w:val="24"/>
+          <w:szCs w:val="22"/>
+          <w:lang w:val="en-US"/>
+        </w:rPr>
+        <w:tab/>
+      </w:r>
+      <w:r>
+        <w:rPr>
+          <w:sz w:val="24"/>
+          <w:szCs w:val="22"/>
+          <w:lang w:val="en-US"/>
+        </w:rPr>
+        <w:tab/>
+        <w:t>&lt;</w:t>
+      </w:r>
+      <w:proofErr w:type="spellStart"/>
+      <w:proofErr w:type="gramStart"/>
+      <w:r>
+        <w:rPr>
+          <w:sz w:val="24"/>
+          <w:szCs w:val="22"/>
+          <w:lang w:val="en-US"/>
+        </w:rPr>
+        <w:t>tr</w:t>
+      </w:r>
+      <w:proofErr w:type="spellEnd"/>
+      <w:proofErr w:type="gramEnd"/>
+      <w:r>
+        <w:rPr>
+          <w:sz w:val="24"/>
+          <w:szCs w:val="22"/>
+          <w:lang w:val="en-US"/>
+        </w:rPr>
+        <w:t>&gt;</w:t>
+      </w:r>
+    </w:p>
+    <w:p>
+      <w:pPr>
+        <w:rPr>
+          <w:sz w:val="24"/>
+          <w:szCs w:val="22"/>
+          <w:lang w:val="en-US"/>
+        </w:rPr>
+      </w:pPr>
+      <w:r>
+        <w:rPr>
+          <w:sz w:val="24"/>
+          <w:szCs w:val="22"/>
+          <w:lang w:val="en-US"/>
+        </w:rPr>
+        <w:tab/>
+      </w:r>
+      <w:r>
+        <w:rPr>
+          <w:sz w:val="24"/>
+          <w:szCs w:val="22"/>
+          <w:lang w:val="en-US"/>
+        </w:rPr>
+        <w:tab/>
+      </w:r>
+      <w:r>
+        <w:rPr>
+          <w:sz w:val="24"/>
+          <w:szCs w:val="22"/>
+          <w:lang w:val="en-US"/>
+        </w:rPr>
+        <w:tab/>
+        <w:t>&lt;</w:t>
+      </w:r>
+      <w:proofErr w:type="gramStart"/>
+      <w:r>
+        <w:rPr>
+          <w:sz w:val="24"/>
+          <w:szCs w:val="22"/>
+          <w:lang w:val="en-US"/>
+        </w:rPr>
+        <w:t>td&gt;</w:t>
+      </w:r>
+      <w:proofErr w:type="gramEnd"/>
+      <w:r>
+        <w:rPr>
+          <w:sz w:val="24"/>
+          <w:szCs w:val="22"/>
+          <w:lang w:val="en-US"/>
+        </w:rPr>
+        <w:t>1&lt;/td&gt;</w:t>
+      </w:r>
+    </w:p>
+    <w:p>
+      <w:pPr>
+        <w:rPr>
+          <w:sz w:val="24"/>
+          <w:szCs w:val="22"/>
+          <w:lang w:val="en-US"/>
+        </w:rPr>
+      </w:pPr>
+      <w:r>
+        <w:rPr>
+          <w:sz w:val="24"/>
+          <w:szCs w:val="22"/>
+          <w:lang w:val="en-US"/>
+        </w:rPr>
+        <w:tab/>
+      </w:r>
+      <w:r>
+        <w:rPr>
+          <w:sz w:val="24"/>
+          <w:szCs w:val="22"/>
+          <w:lang w:val="en-US"/>
+        </w:rPr>
+        <w:tab/>
+      </w:r>
+      <w:r>
+        <w:rPr>
+          <w:sz w:val="24"/>
+          <w:szCs w:val="22"/>
+          <w:lang w:val="en-US"/>
+        </w:rPr>
+        <w:tab/>
+        <w:t>&lt;</w:t>
+      </w:r>
+      <w:proofErr w:type="gramStart"/>
+      <w:r>
+        <w:rPr>
+          <w:sz w:val="24"/>
+          <w:szCs w:val="22"/>
+          <w:lang w:val="en-US"/>
+        </w:rPr>
+        <w:t>td&gt;</w:t>
+      </w:r>
+      <w:proofErr w:type="spellStart"/>
+      <w:proofErr w:type="gramEnd"/>
+      <w:r>
+        <w:rPr>
+          <w:sz w:val="24"/>
+          <w:szCs w:val="22"/>
+          <w:lang w:val="en-US"/>
+        </w:rPr>
+        <w:t>AViIT</w:t>
+      </w:r>
+      <w:proofErr w:type="spellEnd"/>
+      <w:r>
+        <w:rPr>
+          <w:sz w:val="24"/>
+          <w:szCs w:val="22"/>
+          <w:lang w:val="en-US"/>
+        </w:rPr>
+        <w:t>&lt;/td&gt;</w:t>
+      </w:r>
+    </w:p>
+    <w:p>
+      <w:pPr>
+        <w:rPr>
+          <w:sz w:val="24"/>
+          <w:szCs w:val="22"/>
+          <w:lang w:val="en-US"/>
+        </w:rPr>
+      </w:pPr>
+      <w:r>
+        <w:rPr>
+          <w:sz w:val="24"/>
+          <w:szCs w:val="22"/>
+          <w:lang w:val="en-US"/>
+        </w:rPr>
+        <w:tab/>
+      </w:r>
+      <w:r>
+        <w:rPr>
+          <w:sz w:val="24"/>
+          <w:szCs w:val="22"/>
+          <w:lang w:val="en-US"/>
+        </w:rPr>
+        <w:tab/>
+        <w:t>&lt;/</w:t>
+      </w:r>
+      <w:proofErr w:type="spellStart"/>
+      <w:proofErr w:type="gramStart"/>
+      <w:r>
+        <w:rPr>
+          <w:sz w:val="24"/>
+          <w:szCs w:val="22"/>
+          <w:lang w:val="en-US"/>
+        </w:rPr>
+        <w:t>tr</w:t>
+      </w:r>
+      <w:proofErr w:type="spellEnd"/>
+      <w:proofErr w:type="gramEnd"/>
+      <w:r>
+        <w:rPr>
+          <w:sz w:val="24"/>
+          <w:szCs w:val="22"/>
+          <w:lang w:val="en-US"/>
+        </w:rPr>
+        <w:t>&gt;</w:t>
+      </w:r>
+    </w:p>
+    <w:p>
+      <w:pPr>
+        <w:rPr>
+          <w:sz w:val="24"/>
+          <w:szCs w:val="22"/>
+          <w:lang w:val="en-US"/>
+        </w:rPr>
+      </w:pPr>
+      <w:r>
+        <w:rPr>
+          <w:sz w:val="24"/>
+          <w:szCs w:val="22"/>
+          <w:lang w:val="en-US"/>
+        </w:rPr>
+        <w:tab/>
+      </w:r>
+      <w:r>
+        <w:rPr>
+          <w:sz w:val="24"/>
+          <w:szCs w:val="22"/>
+          <w:lang w:val="en-US"/>
+        </w:rPr>
+        <w:tab/>
+        <w:t>&lt;</w:t>
+      </w:r>
+      <w:proofErr w:type="spellStart"/>
+      <w:proofErr w:type="gramStart"/>
+      <w:r>
+        <w:rPr>
+          <w:sz w:val="24"/>
+          <w:szCs w:val="22"/>
+          <w:lang w:val="en-US"/>
+        </w:rPr>
+        <w:t>tr</w:t>
+      </w:r>
+      <w:proofErr w:type="spellEnd"/>
+      <w:proofErr w:type="gramEnd"/>
+      <w:r>
+        <w:rPr>
+          <w:sz w:val="24"/>
+          <w:szCs w:val="22"/>
+          <w:lang w:val="en-US"/>
+        </w:rPr>
+        <w:t>&gt;</w:t>
+      </w:r>
+    </w:p>
+    <w:p>
+      <w:pPr>
+        <w:rPr>
+          <w:sz w:val="24"/>
+          <w:szCs w:val="22"/>
+          <w:lang w:val="en-US"/>
+        </w:rPr>
+      </w:pPr>
+      <w:r>
+        <w:rPr>
+          <w:sz w:val="24"/>
+          <w:szCs w:val="22"/>
+          <w:lang w:val="en-US"/>
+        </w:rPr>
+        <w:tab/>
+      </w:r>
+      <w:r>
+        <w:rPr>
+          <w:sz w:val="24"/>
+          <w:szCs w:val="22"/>
+          <w:lang w:val="en-US"/>
+        </w:rPr>
+        <w:tab/>
+      </w:r>
+      <w:r>
+        <w:rPr>
+          <w:sz w:val="24"/>
+          <w:szCs w:val="22"/>
+          <w:lang w:val="en-US"/>
+        </w:rPr>
+        <w:tab/>
+        <w:t>&lt;</w:t>
+      </w:r>
+      <w:proofErr w:type="gramStart"/>
+      <w:r>
+        <w:rPr>
+          <w:sz w:val="24"/>
+          <w:szCs w:val="22"/>
+          <w:lang w:val="en-US"/>
+        </w:rPr>
+        <w:t>td&gt;</w:t>
+      </w:r>
+      <w:proofErr w:type="gramEnd"/>
+      <w:r>
+        <w:rPr>
+          <w:sz w:val="24"/>
+          <w:szCs w:val="22"/>
+          <w:lang w:val="en-US"/>
+        </w:rPr>
+        <w:t>2&lt;/td&gt;</w:t>
+      </w:r>
+    </w:p>
+    <w:p>
+      <w:pPr>
+        <w:rPr>
+          <w:sz w:val="24"/>
+          <w:szCs w:val="22"/>
+          <w:lang w:val="en-US"/>
+        </w:rPr>
+      </w:pPr>
+      <w:r>
+        <w:rPr>
+          <w:sz w:val="24"/>
+          <w:szCs w:val="22"/>
+          <w:lang w:val="en-US"/>
+        </w:rPr>
+        <w:tab/>
+      </w:r>
+      <w:r>
+        <w:rPr>
+          <w:sz w:val="24"/>
+          <w:szCs w:val="22"/>
+          <w:lang w:val="en-US"/>
+        </w:rPr>
+        <w:tab/>
+      </w:r>
+      <w:r>
+        <w:rPr>
+          <w:sz w:val="24"/>
+          <w:szCs w:val="22"/>
+          <w:lang w:val="en-US"/>
+        </w:rPr>
+        <w:tab/>
+        <w:t>&lt;td&gt;Manorama&lt;/td</w:t>
+      </w:r>
+      <w:bookmarkStart w:id="0" w:name="_GoBack"/>
+      <w:bookmarkEnd w:id="0"/>
+    </w:p>
+    <w:p>
+      <w:pPr>
+        <w:rPr>
+          <w:sz w:val="24"/>
+          <w:szCs w:val="22"/>
+          <w:lang w:val="en-US"/>
+        </w:rPr>
+      </w:pPr>
+      <w:r>
+        <w:rPr>
+          <w:sz w:val="24"/>
+          <w:szCs w:val="22"/>
+          <w:lang w:val="en-US"/>
+        </w:rPr>
+        <w:tab/>
+      </w:r>
+      <w:r>
+        <w:rPr>
+          <w:sz w:val="24"/>
+          <w:szCs w:val="22"/>
+          <w:lang w:val="en-US"/>
+        </w:rPr>
+        <w:tab/>
+        <w:t>&lt;/</w:t>
+      </w:r>
+      <w:proofErr w:type="spellStart"/>
+      <w:proofErr w:type="gramStart"/>
+      <w:r>
+        <w:rPr>
+          <w:sz w:val="24"/>
+          <w:szCs w:val="22"/>
+          <w:lang w:val="en-US"/>
+        </w:rPr>
+        <w:t>tr</w:t>
+      </w:r>
+      <w:proofErr w:type="spellEnd"/>
+      <w:proofErr w:type="gramEnd"/>
+      <w:r>
+        <w:rPr>
+          <w:sz w:val="24"/>
+          <w:szCs w:val="22"/>
+          <w:lang w:val="en-US"/>
+        </w:rPr>
+        <w:t>&gt;</w:t>
+      </w:r>
+    </w:p>
+    <w:p>
+      <w:pPr>
+        <w:rPr>
+          <w:sz w:val="24"/>
+          <w:szCs w:val="22"/>
+          <w:lang w:val="en-US"/>
+        </w:rPr>
+      </w:pPr>
+      <w:r>
+        <w:rPr>
+          <w:sz w:val="24"/>
+          <w:szCs w:val="22"/>
+          <w:lang w:val="en-US"/>
+        </w:rPr>
+        <w:tab/>
+        <w:t>&lt;/</w:t>
+      </w:r>
+      <w:proofErr w:type="spellStart"/>
+      <w:r>
+        <w:rPr>
+          <w:sz w:val="24"/>
+          <w:szCs w:val="22"/>
+          <w:lang w:val="en-US"/>
+        </w:rPr>
+        <w:t>tbody</w:t>
+      </w:r>
+      <w:proofErr w:type="spellEnd"/>
+      <w:r>
+        <w:rPr>
+          <w:sz w:val="24"/>
+          <w:szCs w:val="22"/>
+          <w:lang w:val="en-US"/>
+        </w:rPr>
+        <w:t>&gt;</w:t>
+      </w:r>
+    </w:p>
+    <w:p>
+      <w:pPr>
+        <w:rPr>
+          <w:sz w:val="24"/>
+          <w:szCs w:val="22"/>
+          <w:lang w:val="en-US"/>
+        </w:rPr>
+      </w:pPr>
+      <w:r>
+        <w:rPr>
+          <w:sz w:val="24"/>
+          <w:szCs w:val="22"/>
+          <w:lang w:val="en-US"/>
+        </w:rPr>
+        <w:t>&lt;/table&gt;</w:t>
+      </w:r>
     </w:p>
     <w:sectPr>
       <w:pgSz w:w="11906" w:h="16838"/>
@@ -8775,7 +9888,6 @@
   <w:style w:type="character" w:default="1" w:styleId="DefaultParagraphFont">
     <w:name w:val="Default Paragraph Font"/>
     <w:uiPriority w:val="1"/>
-    <w:semiHidden/>
     <w:unhideWhenUsed/>
   </w:style>
   <w:style w:type="table" w:default="1" w:styleId="TableNormal">

</xml_diff>

<commit_message>
Date: 20 Mar 2026
</commit_message>
<xml_diff>
--- a/SeleniumNotes.docx
+++ b/SeleniumNotes.docx
@@ -1926,7 +1926,6 @@
           <w:lang w:val="en-US"/>
         </w:rPr>
       </w:pPr>
-      <w:proofErr w:type="spellStart"/>
       <w:r>
         <w:rPr>
           <w:sz w:val="24"/>
@@ -1935,7 +1934,6 @@
         </w:rPr>
         <w:t>YourName_SeleniumDemos</w:t>
       </w:r>
-      <w:proofErr w:type="spellEnd"/>
     </w:p>
     <w:p>
       <w:pPr>
@@ -1978,25 +1976,7 @@
           <w:szCs w:val="22"/>
           <w:lang w:val="en-US"/>
         </w:rPr>
-        <w:t xml:space="preserve">Launch </w:t>
-      </w:r>
-      <w:proofErr w:type="spellStart"/>
-      <w:r>
-        <w:rPr>
-          <w:sz w:val="24"/>
-          <w:szCs w:val="22"/>
-          <w:lang w:val="en-US"/>
-        </w:rPr>
-        <w:t>selenium.dev</w:t>
-      </w:r>
-      <w:proofErr w:type="spellEnd"/>
-      <w:r>
-        <w:rPr>
-          <w:sz w:val="24"/>
-          <w:szCs w:val="22"/>
-          <w:lang w:val="en-US"/>
-        </w:rPr>
-        <w:t xml:space="preserve"> site</w:t>
+        <w:t>Launch selenium.dev site</w:t>
       </w:r>
       <w:r>
         <w:rPr>
@@ -2659,18 +2639,8 @@
           <w:szCs w:val="22"/>
           <w:lang w:val="en-US"/>
         </w:rPr>
-        <w:t xml:space="preserve">Click on </w:t>
-      </w:r>
-      <w:proofErr w:type="spellStart"/>
-      <w:r>
-        <w:rPr>
-          <w:sz w:val="24"/>
-          <w:szCs w:val="22"/>
-          <w:lang w:val="en-US"/>
-        </w:rPr>
-        <w:t>ClassPath</w:t>
-      </w:r>
-      <w:proofErr w:type="spellEnd"/>
+        <w:t>Click on ClassPath</w:t>
+      </w:r>
     </w:p>
     <w:p>
       <w:pPr>
@@ -2691,18 +2661,8 @@
           <w:szCs w:val="22"/>
           <w:lang w:val="en-US"/>
         </w:rPr>
-        <w:t>Click on Add External JARs</w:t>
-      </w:r>
-      <w:proofErr w:type="gramStart"/>
-      <w:r>
-        <w:rPr>
-          <w:sz w:val="24"/>
-          <w:szCs w:val="22"/>
-          <w:lang w:val="en-US"/>
-        </w:rPr>
-        <w:t>..</w:t>
-      </w:r>
-      <w:proofErr w:type="gramEnd"/>
+        <w:t>Click on Add External JARs..</w:t>
+      </w:r>
     </w:p>
     <w:p>
       <w:pPr>
@@ -2911,23 +2871,13 @@
           <w:lang w:val="en-US"/>
         </w:rPr>
       </w:pPr>
-      <w:proofErr w:type="gramStart"/>
-      <w:r>
-        <w:rPr>
-          <w:sz w:val="24"/>
-          <w:szCs w:val="22"/>
-          <w:lang w:val="en-US"/>
-        </w:rPr>
-        <w:t>get(</w:t>
-      </w:r>
-      <w:proofErr w:type="gramEnd"/>
-      <w:r>
-        <w:rPr>
-          <w:sz w:val="24"/>
-          <w:szCs w:val="22"/>
-          <w:lang w:val="en-US"/>
-        </w:rPr>
-        <w:t xml:space="preserve">) </w:t>
+      <w:r>
+        <w:rPr>
+          <w:sz w:val="24"/>
+          <w:szCs w:val="22"/>
+          <w:lang w:val="en-US"/>
+        </w:rPr>
+        <w:t xml:space="preserve">get() </w:t>
       </w:r>
       <w:r>
         <w:rPr>
@@ -2959,33 +2909,13 @@
           <w:lang w:val="en-US"/>
         </w:rPr>
       </w:pPr>
-      <w:proofErr w:type="spellStart"/>
-      <w:proofErr w:type="gramStart"/>
-      <w:r>
-        <w:rPr>
-          <w:sz w:val="24"/>
-          <w:szCs w:val="22"/>
-          <w:lang w:val="en-US"/>
-        </w:rPr>
-        <w:t>driver.manage</w:t>
-      </w:r>
-      <w:proofErr w:type="spellEnd"/>
-      <w:r>
-        <w:rPr>
-          <w:sz w:val="24"/>
-          <w:szCs w:val="22"/>
-          <w:lang w:val="en-US"/>
-        </w:rPr>
-        <w:t>(</w:t>
-      </w:r>
-      <w:proofErr w:type="gramEnd"/>
-      <w:r>
-        <w:rPr>
-          <w:sz w:val="24"/>
-          <w:szCs w:val="22"/>
-          <w:lang w:val="en-US"/>
-        </w:rPr>
-        <w:t xml:space="preserve">).window().maximize() </w:t>
+      <w:r>
+        <w:rPr>
+          <w:sz w:val="24"/>
+          <w:szCs w:val="22"/>
+          <w:lang w:val="en-US"/>
+        </w:rPr>
+        <w:t xml:space="preserve">driver.manage().window().maximize() </w:t>
       </w:r>
       <w:r>
         <w:rPr>
@@ -3017,23 +2947,13 @@
           <w:lang w:val="en-US"/>
         </w:rPr>
       </w:pPr>
-      <w:proofErr w:type="gramStart"/>
-      <w:r>
-        <w:rPr>
-          <w:sz w:val="24"/>
-          <w:szCs w:val="22"/>
-          <w:lang w:val="en-US"/>
-        </w:rPr>
-        <w:t>close(</w:t>
-      </w:r>
-      <w:proofErr w:type="gramEnd"/>
-      <w:r>
-        <w:rPr>
-          <w:sz w:val="24"/>
-          <w:szCs w:val="22"/>
-          <w:lang w:val="en-US"/>
-        </w:rPr>
-        <w:t xml:space="preserve">) </w:t>
+      <w:r>
+        <w:rPr>
+          <w:sz w:val="24"/>
+          <w:szCs w:val="22"/>
+          <w:lang w:val="en-US"/>
+        </w:rPr>
+        <w:t xml:space="preserve">close() </w:t>
       </w:r>
       <w:r>
         <w:rPr>
@@ -3065,23 +2985,13 @@
           <w:lang w:val="en-US"/>
         </w:rPr>
       </w:pPr>
-      <w:proofErr w:type="gramStart"/>
-      <w:r>
-        <w:rPr>
-          <w:sz w:val="24"/>
-          <w:szCs w:val="22"/>
-          <w:lang w:val="en-US"/>
-        </w:rPr>
-        <w:t>getTitle(</w:t>
-      </w:r>
-      <w:proofErr w:type="gramEnd"/>
-      <w:r>
-        <w:rPr>
-          <w:sz w:val="24"/>
-          <w:szCs w:val="22"/>
-          <w:lang w:val="en-US"/>
-        </w:rPr>
-        <w:t xml:space="preserve">) </w:t>
+      <w:r>
+        <w:rPr>
+          <w:sz w:val="24"/>
+          <w:szCs w:val="22"/>
+          <w:lang w:val="en-US"/>
+        </w:rPr>
+        <w:t xml:space="preserve">getTitle() </w:t>
       </w:r>
       <w:r>
         <w:rPr>
@@ -3113,23 +3023,13 @@
           <w:lang w:val="en-US"/>
         </w:rPr>
       </w:pPr>
-      <w:proofErr w:type="gramStart"/>
-      <w:r>
-        <w:rPr>
-          <w:sz w:val="24"/>
-          <w:szCs w:val="22"/>
-          <w:lang w:val="en-US"/>
-        </w:rPr>
-        <w:t>getCurrentUrl(</w:t>
-      </w:r>
-      <w:proofErr w:type="gramEnd"/>
-      <w:r>
-        <w:rPr>
-          <w:sz w:val="24"/>
-          <w:szCs w:val="22"/>
-          <w:lang w:val="en-US"/>
-        </w:rPr>
-        <w:t xml:space="preserve">) </w:t>
+      <w:r>
+        <w:rPr>
+          <w:sz w:val="24"/>
+          <w:szCs w:val="22"/>
+          <w:lang w:val="en-US"/>
+        </w:rPr>
+        <w:t xml:space="preserve">getCurrentUrl() </w:t>
       </w:r>
       <w:r>
         <w:rPr>
@@ -3161,23 +3061,13 @@
           <w:lang w:val="en-US"/>
         </w:rPr>
       </w:pPr>
-      <w:proofErr w:type="gramStart"/>
-      <w:r>
-        <w:rPr>
-          <w:sz w:val="24"/>
-          <w:szCs w:val="22"/>
-          <w:lang w:val="en-US"/>
-        </w:rPr>
-        <w:t>getPageSource(</w:t>
-      </w:r>
-      <w:proofErr w:type="gramEnd"/>
-      <w:r>
-        <w:rPr>
-          <w:sz w:val="24"/>
-          <w:szCs w:val="22"/>
-          <w:lang w:val="en-US"/>
-        </w:rPr>
-        <w:t xml:space="preserve">) </w:t>
+      <w:r>
+        <w:rPr>
+          <w:sz w:val="24"/>
+          <w:szCs w:val="22"/>
+          <w:lang w:val="en-US"/>
+        </w:rPr>
+        <w:t xml:space="preserve">getPageSource() </w:t>
       </w:r>
       <w:r>
         <w:rPr>
@@ -3209,23 +3099,13 @@
           <w:lang w:val="en-US"/>
         </w:rPr>
       </w:pPr>
-      <w:proofErr w:type="gramStart"/>
-      <w:r>
-        <w:rPr>
-          <w:sz w:val="24"/>
-          <w:szCs w:val="22"/>
-          <w:lang w:val="en-US"/>
-        </w:rPr>
-        <w:t>findElement(</w:t>
-      </w:r>
-      <w:proofErr w:type="gramEnd"/>
-      <w:r>
-        <w:rPr>
-          <w:sz w:val="24"/>
-          <w:szCs w:val="22"/>
-          <w:lang w:val="en-US"/>
-        </w:rPr>
-        <w:t xml:space="preserve">) </w:t>
+      <w:r>
+        <w:rPr>
+          <w:sz w:val="24"/>
+          <w:szCs w:val="22"/>
+          <w:lang w:val="en-US"/>
+        </w:rPr>
+        <w:t xml:space="preserve">findElement() </w:t>
       </w:r>
       <w:r>
         <w:rPr>
@@ -3275,23 +3155,13 @@
           <w:lang w:val="en-US"/>
         </w:rPr>
       </w:pPr>
-      <w:proofErr w:type="gramStart"/>
-      <w:r>
-        <w:rPr>
-          <w:sz w:val="24"/>
-          <w:szCs w:val="22"/>
-          <w:lang w:val="en-US"/>
-        </w:rPr>
-        <w:t>findElements(</w:t>
-      </w:r>
-      <w:proofErr w:type="gramEnd"/>
-      <w:r>
-        <w:rPr>
-          <w:sz w:val="24"/>
-          <w:szCs w:val="22"/>
-          <w:lang w:val="en-US"/>
-        </w:rPr>
-        <w:t xml:space="preserve">) </w:t>
+      <w:r>
+        <w:rPr>
+          <w:sz w:val="24"/>
+          <w:szCs w:val="22"/>
+          <w:lang w:val="en-US"/>
+        </w:rPr>
+        <w:t xml:space="preserve">findElements() </w:t>
       </w:r>
       <w:r>
         <w:rPr>
@@ -3308,6 +3178,82 @@
           <w:lang w:val="en-US"/>
         </w:rPr>
         <w:t xml:space="preserve"> Will read and return multiple controls. (List&lt;WebElement&gt;)</w:t>
+      </w:r>
+    </w:p>
+    <w:p>
+      <w:pPr>
+        <w:pStyle w:val="ListParagraph"/>
+        <w:numPr>
+          <w:ilvl w:val="0"/>
+          <w:numId w:val="12"/>
+        </w:numPr>
+        <w:rPr>
+          <w:sz w:val="24"/>
+          <w:szCs w:val="22"/>
+          <w:lang w:val="en-US"/>
+        </w:rPr>
+      </w:pPr>
+      <w:r>
+        <w:rPr>
+          <w:sz w:val="24"/>
+          <w:szCs w:val="22"/>
+          <w:lang w:val="en-US"/>
+        </w:rPr>
+        <w:t xml:space="preserve">getWindowHandles() </w:t>
+      </w:r>
+      <w:r>
+        <w:rPr>
+          <w:sz w:val="24"/>
+          <w:szCs w:val="22"/>
+          <w:lang w:val="en-US"/>
+        </w:rPr>
+        <w:sym w:font="Wingdings" w:char="F0E0"/>
+      </w:r>
+      <w:r>
+        <w:rPr>
+          <w:sz w:val="24"/>
+          <w:szCs w:val="22"/>
+          <w:lang w:val="en-US"/>
+        </w:rPr>
+        <w:t xml:space="preserve"> will return the names of all the windows those are opened by WebDriver. (Set&lt;String&gt;)</w:t>
+      </w:r>
+    </w:p>
+    <w:p>
+      <w:pPr>
+        <w:pStyle w:val="ListParagraph"/>
+        <w:numPr>
+          <w:ilvl w:val="0"/>
+          <w:numId w:val="12"/>
+        </w:numPr>
+        <w:rPr>
+          <w:sz w:val="24"/>
+          <w:szCs w:val="22"/>
+          <w:lang w:val="en-US"/>
+        </w:rPr>
+      </w:pPr>
+      <w:r>
+        <w:rPr>
+          <w:sz w:val="24"/>
+          <w:szCs w:val="22"/>
+          <w:lang w:val="en-US"/>
+        </w:rPr>
+        <w:t xml:space="preserve">quit() </w:t>
+      </w:r>
+      <w:r>
+        <w:rPr>
+          <w:sz w:val="24"/>
+          <w:szCs w:val="22"/>
+          <w:lang w:val="en-US"/>
+        </w:rPr>
+        <w:sym w:font="Wingdings" w:char="F0E0"/>
+      </w:r>
+      <w:r>
+        <w:rPr>
+          <w:sz w:val="24"/>
+          <w:szCs w:val="22"/>
+          <w:lang w:val="en-US"/>
+        </w:rPr>
+        <w:t xml:space="preserve"> will close all the browser windows / tabs those are opened by WebDriver. </w:t>
       </w:r>
     </w:p>
     <w:p>
@@ -3672,26 +3618,48 @@
           <w:szCs w:val="22"/>
           <w:lang w:val="en-US"/>
         </w:rPr>
-        <w:t xml:space="preserve"> </w:t>
-      </w:r>
-      <w:proofErr w:type="spellStart"/>
-      <w:r>
-        <w:rPr>
-          <w:sz w:val="24"/>
-          <w:szCs w:val="22"/>
-          <w:lang w:val="en-US"/>
-        </w:rPr>
-        <w:t>driver.get</w:t>
-      </w:r>
-      <w:proofErr w:type="spellEnd"/>
-      <w:r>
-        <w:rPr>
-          <w:sz w:val="24"/>
-          <w:szCs w:val="22"/>
-          <w:lang w:val="en-US"/>
-        </w:rPr>
-        <w:t>() is having implicit wait of 30 seconds, means Selenium will wait for maximum 30 seconds till the page get loaded. But if the page is not getting loaded within 30 seconds, Selenium will throw SessionTimeoutException.</w:t>
-      </w:r>
+        <w:t xml:space="preserve"> driver.get() is having implicit wait of 30 seconds, means Selenium will wait for maximum 30 seconds till the page get loaded. But if the page is not getting loaded within 30 seconds, Selenium will throw SessionTimeoutException.</w:t>
+      </w:r>
+    </w:p>
+    <w:p>
+      <w:pPr>
+        <w:pStyle w:val="ListParagraph"/>
+        <w:numPr>
+          <w:ilvl w:val="0"/>
+          <w:numId w:val="13"/>
+        </w:numPr>
+        <w:rPr>
+          <w:sz w:val="24"/>
+          <w:szCs w:val="22"/>
+          <w:lang w:val="en-US"/>
+        </w:rPr>
+      </w:pPr>
+      <w:r>
+        <w:rPr>
+          <w:sz w:val="24"/>
+          <w:szCs w:val="22"/>
+          <w:lang w:val="en-US"/>
+        </w:rPr>
+        <w:t xml:space="preserve">ElementClickInterceptedException </w:t>
+      </w:r>
+      <w:r>
+        <w:rPr>
+          <w:sz w:val="24"/>
+          <w:szCs w:val="22"/>
+          <w:lang w:val="en-US"/>
+        </w:rPr>
+        <w:sym w:font="Wingdings" w:char="F0E0"/>
+      </w:r>
+      <w:r>
+        <w:rPr>
+          <w:sz w:val="24"/>
+          <w:szCs w:val="22"/>
+          <w:lang w:val="en-US"/>
+        </w:rPr>
+        <w:t xml:space="preserve"> When any control is hidden by some another control especially by advt. and Selenium will not able to click on such control.</w:t>
+      </w:r>
+      <w:bookmarkStart w:id="0" w:name="_GoBack"/>
+      <w:bookmarkEnd w:id="0"/>
     </w:p>
     <w:p>
       <w:pPr>
@@ -3914,23 +3882,13 @@
           <w:lang w:val="en-US"/>
         </w:rPr>
       </w:pPr>
-      <w:proofErr w:type="gramStart"/>
-      <w:r>
-        <w:rPr>
-          <w:sz w:val="24"/>
-          <w:szCs w:val="22"/>
-          <w:lang w:val="en-US"/>
-        </w:rPr>
-        <w:t>sendKeys(</w:t>
-      </w:r>
-      <w:proofErr w:type="gramEnd"/>
-      <w:r>
-        <w:rPr>
-          <w:sz w:val="24"/>
-          <w:szCs w:val="22"/>
-          <w:lang w:val="en-US"/>
-        </w:rPr>
-        <w:t xml:space="preserve">) </w:t>
+      <w:r>
+        <w:rPr>
+          <w:sz w:val="24"/>
+          <w:szCs w:val="22"/>
+          <w:lang w:val="en-US"/>
+        </w:rPr>
+        <w:t xml:space="preserve">sendKeys() </w:t>
       </w:r>
       <w:r>
         <w:rPr>
@@ -3970,23 +3928,13 @@
           <w:lang w:val="en-US"/>
         </w:rPr>
       </w:pPr>
-      <w:proofErr w:type="gramStart"/>
-      <w:r>
-        <w:rPr>
-          <w:sz w:val="24"/>
-          <w:szCs w:val="22"/>
-          <w:lang w:val="en-US"/>
-        </w:rPr>
-        <w:t>click(</w:t>
-      </w:r>
-      <w:proofErr w:type="gramEnd"/>
-      <w:r>
-        <w:rPr>
-          <w:sz w:val="24"/>
-          <w:szCs w:val="22"/>
-          <w:lang w:val="en-US"/>
-        </w:rPr>
-        <w:t xml:space="preserve">) </w:t>
+      <w:r>
+        <w:rPr>
+          <w:sz w:val="24"/>
+          <w:szCs w:val="22"/>
+          <w:lang w:val="en-US"/>
+        </w:rPr>
+        <w:t xml:space="preserve">click() </w:t>
       </w:r>
       <w:r>
         <w:rPr>
@@ -4018,23 +3966,13 @@
           <w:lang w:val="en-US"/>
         </w:rPr>
       </w:pPr>
-      <w:proofErr w:type="gramStart"/>
-      <w:r>
-        <w:rPr>
-          <w:sz w:val="24"/>
-          <w:szCs w:val="22"/>
-          <w:lang w:val="en-US"/>
-        </w:rPr>
-        <w:t>getText(</w:t>
-      </w:r>
-      <w:proofErr w:type="gramEnd"/>
-      <w:r>
-        <w:rPr>
-          <w:sz w:val="24"/>
-          <w:szCs w:val="22"/>
-          <w:lang w:val="en-US"/>
-        </w:rPr>
-        <w:t xml:space="preserve">) </w:t>
+      <w:r>
+        <w:rPr>
+          <w:sz w:val="24"/>
+          <w:szCs w:val="22"/>
+          <w:lang w:val="en-US"/>
+        </w:rPr>
+        <w:t xml:space="preserve">getText() </w:t>
       </w:r>
       <w:r>
         <w:rPr>
@@ -4066,23 +4004,13 @@
           <w:lang w:val="en-US"/>
         </w:rPr>
       </w:pPr>
-      <w:proofErr w:type="gramStart"/>
-      <w:r>
-        <w:rPr>
-          <w:sz w:val="24"/>
-          <w:szCs w:val="22"/>
-          <w:lang w:val="en-US"/>
-        </w:rPr>
-        <w:t>getAttribute(</w:t>
-      </w:r>
-      <w:proofErr w:type="gramEnd"/>
-      <w:r>
-        <w:rPr>
-          <w:sz w:val="24"/>
-          <w:szCs w:val="22"/>
-          <w:lang w:val="en-US"/>
-        </w:rPr>
-        <w:t xml:space="preserve">) </w:t>
+      <w:r>
+        <w:rPr>
+          <w:sz w:val="24"/>
+          <w:szCs w:val="22"/>
+          <w:lang w:val="en-US"/>
+        </w:rPr>
+        <w:t xml:space="preserve">getAttribute() </w:t>
       </w:r>
       <w:r>
         <w:rPr>
@@ -4114,23 +4042,13 @@
           <w:lang w:val="en-US"/>
         </w:rPr>
       </w:pPr>
-      <w:proofErr w:type="gramStart"/>
-      <w:r>
-        <w:rPr>
-          <w:sz w:val="24"/>
-          <w:szCs w:val="22"/>
-          <w:lang w:val="en-US"/>
-        </w:rPr>
-        <w:t>isSelected(</w:t>
-      </w:r>
-      <w:proofErr w:type="gramEnd"/>
-      <w:r>
-        <w:rPr>
-          <w:sz w:val="24"/>
-          <w:szCs w:val="22"/>
-          <w:lang w:val="en-US"/>
-        </w:rPr>
-        <w:t xml:space="preserve">) </w:t>
+      <w:r>
+        <w:rPr>
+          <w:sz w:val="24"/>
+          <w:szCs w:val="22"/>
+          <w:lang w:val="en-US"/>
+        </w:rPr>
+        <w:t xml:space="preserve">isSelected() </w:t>
       </w:r>
       <w:r>
         <w:rPr>
@@ -4170,23 +4088,13 @@
           <w:lang w:val="en-US"/>
         </w:rPr>
       </w:pPr>
-      <w:proofErr w:type="gramStart"/>
-      <w:r>
-        <w:rPr>
-          <w:sz w:val="24"/>
-          <w:szCs w:val="22"/>
-          <w:lang w:val="en-US"/>
-        </w:rPr>
-        <w:t>isEnabled(</w:t>
-      </w:r>
-      <w:proofErr w:type="gramEnd"/>
-      <w:r>
-        <w:rPr>
-          <w:sz w:val="24"/>
-          <w:szCs w:val="22"/>
-          <w:lang w:val="en-US"/>
-        </w:rPr>
-        <w:t xml:space="preserve">) </w:t>
+      <w:r>
+        <w:rPr>
+          <w:sz w:val="24"/>
+          <w:szCs w:val="22"/>
+          <w:lang w:val="en-US"/>
+        </w:rPr>
+        <w:t xml:space="preserve">isEnabled() </w:t>
       </w:r>
       <w:r>
         <w:rPr>
@@ -4245,6 +4153,44 @@
     </w:p>
     <w:p>
       <w:pPr>
+        <w:pStyle w:val="ListParagraph"/>
+        <w:numPr>
+          <w:ilvl w:val="1"/>
+          <w:numId w:val="14"/>
+        </w:numPr>
+        <w:rPr>
+          <w:sz w:val="24"/>
+          <w:szCs w:val="22"/>
+          <w:lang w:val="en-US"/>
+        </w:rPr>
+      </w:pPr>
+      <w:r>
+        <w:rPr>
+          <w:sz w:val="24"/>
+          <w:szCs w:val="22"/>
+          <w:lang w:val="en-US"/>
+        </w:rPr>
+        <w:t xml:space="preserve">clear() </w:t>
+      </w:r>
+      <w:r>
+        <w:rPr>
+          <w:sz w:val="24"/>
+          <w:szCs w:val="22"/>
+          <w:lang w:val="en-US"/>
+        </w:rPr>
+        <w:sym w:font="Wingdings" w:char="F0E0"/>
+      </w:r>
+      <w:r>
+        <w:rPr>
+          <w:sz w:val="24"/>
+          <w:szCs w:val="22"/>
+          <w:lang w:val="en-US"/>
+        </w:rPr>
+        <w:t xml:space="preserve"> Will clear the text box.</w:t>
+      </w:r>
+    </w:p>
+    <w:p>
+      <w:pPr>
         <w:rPr>
           <w:sz w:val="24"/>
           <w:szCs w:val="22"/>
@@ -4472,6 +4418,7 @@
           <w:szCs w:val="22"/>
           <w:lang w:val="en-US"/>
         </w:rPr>
+        <w:lastRenderedPageBreak/>
         <w:t>TagName</w:t>
       </w:r>
     </w:p>
@@ -5225,7 +5172,6 @@
           <w:szCs w:val="22"/>
           <w:lang w:val="en-US"/>
         </w:rPr>
-        <w:lastRenderedPageBreak/>
         <w:t>Handling Dropdown list and List Box</w:t>
       </w:r>
     </w:p>
@@ -5320,23 +5266,13 @@
           <w:lang w:val="en-US"/>
         </w:rPr>
       </w:pPr>
-      <w:proofErr w:type="gramStart"/>
-      <w:r>
-        <w:rPr>
-          <w:sz w:val="24"/>
-          <w:szCs w:val="22"/>
-          <w:lang w:val="en-US"/>
-        </w:rPr>
-        <w:t>getFirstSelectedOption(</w:t>
-      </w:r>
-      <w:proofErr w:type="gramEnd"/>
-      <w:r>
-        <w:rPr>
-          <w:sz w:val="24"/>
-          <w:szCs w:val="22"/>
-          <w:lang w:val="en-US"/>
-        </w:rPr>
-        <w:t xml:space="preserve">) </w:t>
+      <w:r>
+        <w:rPr>
+          <w:sz w:val="24"/>
+          <w:szCs w:val="22"/>
+          <w:lang w:val="en-US"/>
+        </w:rPr>
+        <w:t xml:space="preserve">getFirstSelectedOption() </w:t>
       </w:r>
       <w:r>
         <w:rPr>
@@ -5384,23 +5320,13 @@
           <w:lang w:val="en-US"/>
         </w:rPr>
       </w:pPr>
-      <w:proofErr w:type="gramStart"/>
-      <w:r>
-        <w:rPr>
-          <w:sz w:val="24"/>
-          <w:szCs w:val="22"/>
-          <w:lang w:val="en-US"/>
-        </w:rPr>
-        <w:t>getOptions(</w:t>
-      </w:r>
-      <w:proofErr w:type="gramEnd"/>
-      <w:r>
-        <w:rPr>
-          <w:sz w:val="24"/>
-          <w:szCs w:val="22"/>
-          <w:lang w:val="en-US"/>
-        </w:rPr>
-        <w:t xml:space="preserve">) </w:t>
+      <w:r>
+        <w:rPr>
+          <w:sz w:val="24"/>
+          <w:szCs w:val="22"/>
+          <w:lang w:val="en-US"/>
+        </w:rPr>
+        <w:t xml:space="preserve">getOptions() </w:t>
       </w:r>
       <w:r>
         <w:rPr>
@@ -5432,23 +5358,13 @@
           <w:lang w:val="en-US"/>
         </w:rPr>
       </w:pPr>
-      <w:proofErr w:type="gramStart"/>
-      <w:r>
-        <w:rPr>
-          <w:sz w:val="24"/>
-          <w:szCs w:val="22"/>
-          <w:lang w:val="en-US"/>
-        </w:rPr>
-        <w:t>selectByVisibleText(</w:t>
-      </w:r>
-      <w:proofErr w:type="gramEnd"/>
-      <w:r>
-        <w:rPr>
-          <w:sz w:val="24"/>
-          <w:szCs w:val="22"/>
-          <w:lang w:val="en-US"/>
-        </w:rPr>
-        <w:t xml:space="preserve">) </w:t>
+      <w:r>
+        <w:rPr>
+          <w:sz w:val="24"/>
+          <w:szCs w:val="22"/>
+          <w:lang w:val="en-US"/>
+        </w:rPr>
+        <w:t xml:space="preserve">selectByVisibleText() </w:t>
       </w:r>
       <w:r>
         <w:rPr>
@@ -5480,23 +5396,13 @@
           <w:lang w:val="en-US"/>
         </w:rPr>
       </w:pPr>
-      <w:proofErr w:type="gramStart"/>
-      <w:r>
-        <w:rPr>
-          <w:sz w:val="24"/>
-          <w:szCs w:val="22"/>
-          <w:lang w:val="en-US"/>
-        </w:rPr>
-        <w:t>selectByContainsVisibleText(</w:t>
-      </w:r>
-      <w:proofErr w:type="gramEnd"/>
-      <w:r>
-        <w:rPr>
-          <w:sz w:val="24"/>
-          <w:szCs w:val="22"/>
-          <w:lang w:val="en-US"/>
-        </w:rPr>
-        <w:t xml:space="preserve">) </w:t>
+      <w:r>
+        <w:rPr>
+          <w:sz w:val="24"/>
+          <w:szCs w:val="22"/>
+          <w:lang w:val="en-US"/>
+        </w:rPr>
+        <w:t xml:space="preserve">selectByContainsVisibleText() </w:t>
       </w:r>
       <w:r>
         <w:rPr>
@@ -5528,23 +5434,13 @@
           <w:lang w:val="en-US"/>
         </w:rPr>
       </w:pPr>
-      <w:proofErr w:type="gramStart"/>
-      <w:r>
-        <w:rPr>
-          <w:sz w:val="24"/>
-          <w:szCs w:val="22"/>
-          <w:lang w:val="en-US"/>
-        </w:rPr>
-        <w:t>selectByValue(</w:t>
-      </w:r>
-      <w:proofErr w:type="gramEnd"/>
-      <w:r>
-        <w:rPr>
-          <w:sz w:val="24"/>
-          <w:szCs w:val="22"/>
-          <w:lang w:val="en-US"/>
-        </w:rPr>
-        <w:t xml:space="preserve">) </w:t>
+      <w:r>
+        <w:rPr>
+          <w:sz w:val="24"/>
+          <w:szCs w:val="22"/>
+          <w:lang w:val="en-US"/>
+        </w:rPr>
+        <w:t xml:space="preserve">selectByValue() </w:t>
       </w:r>
       <w:r>
         <w:rPr>
@@ -5576,23 +5472,13 @@
           <w:lang w:val="en-US"/>
         </w:rPr>
       </w:pPr>
-      <w:proofErr w:type="gramStart"/>
-      <w:r>
-        <w:rPr>
-          <w:sz w:val="24"/>
-          <w:szCs w:val="22"/>
-          <w:lang w:val="en-US"/>
-        </w:rPr>
-        <w:t>selectByIndex(</w:t>
-      </w:r>
-      <w:proofErr w:type="gramEnd"/>
-      <w:r>
-        <w:rPr>
-          <w:sz w:val="24"/>
-          <w:szCs w:val="22"/>
-          <w:lang w:val="en-US"/>
-        </w:rPr>
-        <w:t xml:space="preserve">) </w:t>
+      <w:r>
+        <w:rPr>
+          <w:sz w:val="24"/>
+          <w:szCs w:val="22"/>
+          <w:lang w:val="en-US"/>
+        </w:rPr>
+        <w:t xml:space="preserve">selectByIndex() </w:t>
       </w:r>
       <w:r>
         <w:rPr>
@@ -5624,23 +5510,13 @@
           <w:lang w:val="en-US"/>
         </w:rPr>
       </w:pPr>
-      <w:proofErr w:type="gramStart"/>
-      <w:r>
-        <w:rPr>
-          <w:sz w:val="24"/>
-          <w:szCs w:val="22"/>
-          <w:lang w:val="en-US"/>
-        </w:rPr>
-        <w:t>getAllSelectedOptions(</w:t>
-      </w:r>
-      <w:proofErr w:type="gramEnd"/>
-      <w:r>
-        <w:rPr>
-          <w:sz w:val="24"/>
-          <w:szCs w:val="22"/>
-          <w:lang w:val="en-US"/>
-        </w:rPr>
-        <w:t xml:space="preserve">) </w:t>
+      <w:r>
+        <w:rPr>
+          <w:sz w:val="24"/>
+          <w:szCs w:val="22"/>
+          <w:lang w:val="en-US"/>
+        </w:rPr>
+        <w:t xml:space="preserve">getAllSelectedOptions() </w:t>
       </w:r>
       <w:r>
         <w:rPr>
@@ -5680,23 +5556,13 @@
           <w:lang w:val="en-US"/>
         </w:rPr>
       </w:pPr>
-      <w:proofErr w:type="gramStart"/>
-      <w:r>
-        <w:rPr>
-          <w:sz w:val="24"/>
-          <w:szCs w:val="22"/>
-          <w:lang w:val="en-US"/>
-        </w:rPr>
-        <w:t>isMultiple(</w:t>
-      </w:r>
-      <w:proofErr w:type="gramEnd"/>
-      <w:r>
-        <w:rPr>
-          <w:sz w:val="24"/>
-          <w:szCs w:val="22"/>
-          <w:lang w:val="en-US"/>
-        </w:rPr>
-        <w:t xml:space="preserve">) </w:t>
+      <w:r>
+        <w:rPr>
+          <w:sz w:val="24"/>
+          <w:szCs w:val="22"/>
+          <w:lang w:val="en-US"/>
+        </w:rPr>
+        <w:t xml:space="preserve">isMultiple() </w:t>
       </w:r>
       <w:r>
         <w:rPr>
@@ -5885,33 +5751,13 @@
           <w:lang w:val="en-US"/>
         </w:rPr>
       </w:pPr>
-      <w:proofErr w:type="spellStart"/>
-      <w:proofErr w:type="gramStart"/>
-      <w:r>
-        <w:rPr>
-          <w:sz w:val="24"/>
-          <w:szCs w:val="22"/>
-          <w:lang w:val="en-US"/>
-        </w:rPr>
-        <w:t>Thread.sleep</w:t>
-      </w:r>
-      <w:proofErr w:type="spellEnd"/>
-      <w:r>
-        <w:rPr>
-          <w:sz w:val="24"/>
-          <w:szCs w:val="22"/>
-          <w:lang w:val="en-US"/>
-        </w:rPr>
-        <w:t>(</w:t>
-      </w:r>
-      <w:proofErr w:type="gramEnd"/>
-      <w:r>
-        <w:rPr>
-          <w:sz w:val="24"/>
-          <w:szCs w:val="22"/>
-          <w:lang w:val="en-US"/>
-        </w:rPr>
-        <w:t>)</w:t>
+      <w:r>
+        <w:rPr>
+          <w:sz w:val="24"/>
+          <w:szCs w:val="22"/>
+          <w:lang w:val="en-US"/>
+        </w:rPr>
+        <w:t>Thread.sleep()</w:t>
       </w:r>
       <w:r>
         <w:rPr>
@@ -6345,24 +6191,7 @@
           <w:lang w:val="en-US"/>
         </w:rPr>
         <w:br/>
-      </w:r>
-      <w:proofErr w:type="spellStart"/>
-      <w:r>
-        <w:rPr>
-          <w:sz w:val="24"/>
-          <w:szCs w:val="22"/>
-          <w:lang w:val="en-US"/>
-        </w:rPr>
-        <w:t>i</w:t>
-      </w:r>
-      <w:proofErr w:type="spellEnd"/>
-      <w:r>
-        <w:rPr>
-          <w:sz w:val="24"/>
-          <w:szCs w:val="22"/>
-          <w:lang w:val="en-US"/>
-        </w:rPr>
-        <w:t xml:space="preserve"> – ignoring </w:t>
+        <w:t xml:space="preserve">i – ignoring </w:t>
       </w:r>
       <w:r>
         <w:rPr>
@@ -6452,25 +6281,7 @@
           <w:szCs w:val="22"/>
           <w:lang w:val="en-US"/>
         </w:rPr>
-        <w:t>&lt;</w:t>
-      </w:r>
-      <w:proofErr w:type="gramStart"/>
-      <w:r>
-        <w:rPr>
-          <w:sz w:val="24"/>
-          <w:szCs w:val="22"/>
-          <w:lang w:val="en-US"/>
-        </w:rPr>
-        <w:t>table</w:t>
-      </w:r>
-      <w:proofErr w:type="gramEnd"/>
-      <w:r>
-        <w:rPr>
-          <w:sz w:val="24"/>
-          <w:szCs w:val="22"/>
-          <w:lang w:val="en-US"/>
-        </w:rPr>
-        <w:t>&gt;</w:t>
+        <w:t>&lt;table&gt;</w:t>
       </w:r>
     </w:p>
     <w:p>
@@ -6488,27 +6299,7 @@
           <w:lang w:val="en-US"/>
         </w:rPr>
         <w:tab/>
-        <w:t>&lt;</w:t>
-      </w:r>
-      <w:proofErr w:type="spellStart"/>
-      <w:proofErr w:type="gramStart"/>
-      <w:r>
-        <w:rPr>
-          <w:sz w:val="24"/>
-          <w:szCs w:val="22"/>
-          <w:lang w:val="en-US"/>
-        </w:rPr>
-        <w:t>thead</w:t>
-      </w:r>
-      <w:proofErr w:type="spellEnd"/>
-      <w:proofErr w:type="gramEnd"/>
-      <w:r>
-        <w:rPr>
-          <w:sz w:val="24"/>
-          <w:szCs w:val="22"/>
-          <w:lang w:val="en-US"/>
-        </w:rPr>
-        <w:t>&gt;</w:t>
+        <w:t>&lt;thead&gt;</w:t>
       </w:r>
       <w:r>
         <w:rPr>
@@ -6543,27 +6334,7 @@
           <w:lang w:val="en-US"/>
         </w:rPr>
         <w:tab/>
-        <w:t>&lt;</w:t>
-      </w:r>
-      <w:proofErr w:type="spellStart"/>
-      <w:proofErr w:type="gramStart"/>
-      <w:r>
-        <w:rPr>
-          <w:sz w:val="24"/>
-          <w:szCs w:val="22"/>
-          <w:lang w:val="en-US"/>
-        </w:rPr>
-        <w:t>tr</w:t>
-      </w:r>
-      <w:proofErr w:type="spellEnd"/>
-      <w:proofErr w:type="gramEnd"/>
-      <w:r>
-        <w:rPr>
-          <w:sz w:val="24"/>
-          <w:szCs w:val="22"/>
-          <w:lang w:val="en-US"/>
-        </w:rPr>
-        <w:t>&gt;</w:t>
+        <w:t>&lt;tr&gt;</w:t>
       </w:r>
       <w:r>
         <w:rPr>
@@ -6606,63 +6377,7 @@
           <w:lang w:val="en-US"/>
         </w:rPr>
         <w:tab/>
-        <w:t>&lt;</w:t>
-      </w:r>
-      <w:proofErr w:type="spellStart"/>
-      <w:proofErr w:type="gramStart"/>
-      <w:r>
-        <w:rPr>
-          <w:sz w:val="24"/>
-          <w:szCs w:val="22"/>
-          <w:lang w:val="en-US"/>
-        </w:rPr>
-        <w:t>th</w:t>
-      </w:r>
-      <w:proofErr w:type="spellEnd"/>
-      <w:r>
-        <w:rPr>
-          <w:sz w:val="24"/>
-          <w:szCs w:val="22"/>
-          <w:lang w:val="en-US"/>
-        </w:rPr>
-        <w:t>&gt;</w:t>
-      </w:r>
-      <w:proofErr w:type="spellStart"/>
-      <w:proofErr w:type="gramEnd"/>
-      <w:r>
-        <w:rPr>
-          <w:sz w:val="24"/>
-          <w:szCs w:val="22"/>
-          <w:lang w:val="en-US"/>
-        </w:rPr>
-        <w:t>Sr</w:t>
-      </w:r>
-      <w:proofErr w:type="spellEnd"/>
-      <w:r>
-        <w:rPr>
-          <w:sz w:val="24"/>
-          <w:szCs w:val="22"/>
-          <w:lang w:val="en-US"/>
-        </w:rPr>
-        <w:t xml:space="preserve"> No&lt;/</w:t>
-      </w:r>
-      <w:proofErr w:type="spellStart"/>
-      <w:r>
-        <w:rPr>
-          <w:sz w:val="24"/>
-          <w:szCs w:val="22"/>
-          <w:lang w:val="en-US"/>
-        </w:rPr>
-        <w:t>th</w:t>
-      </w:r>
-      <w:proofErr w:type="spellEnd"/>
-      <w:r>
-        <w:rPr>
-          <w:sz w:val="24"/>
-          <w:szCs w:val="22"/>
-          <w:lang w:val="en-US"/>
-        </w:rPr>
-        <w:t>&gt;</w:t>
+        <w:t>&lt;th&gt;Sr No&lt;/th&gt;</w:t>
       </w:r>
       <w:r>
         <w:rPr>
@@ -6705,53 +6420,7 @@
           <w:lang w:val="en-US"/>
         </w:rPr>
         <w:tab/>
-        <w:t>&lt;</w:t>
-      </w:r>
-      <w:proofErr w:type="spellStart"/>
-      <w:proofErr w:type="gramStart"/>
-      <w:r>
-        <w:rPr>
-          <w:sz w:val="24"/>
-          <w:szCs w:val="22"/>
-          <w:lang w:val="en-US"/>
-        </w:rPr>
-        <w:t>th</w:t>
-      </w:r>
-      <w:proofErr w:type="spellEnd"/>
-      <w:r>
-        <w:rPr>
-          <w:sz w:val="24"/>
-          <w:szCs w:val="22"/>
-          <w:lang w:val="en-US"/>
-        </w:rPr>
-        <w:t>&gt;</w:t>
-      </w:r>
-      <w:proofErr w:type="gramEnd"/>
-      <w:r>
-        <w:rPr>
-          <w:sz w:val="24"/>
-          <w:szCs w:val="22"/>
-          <w:lang w:val="en-US"/>
-        </w:rPr>
-        <w:t>Company&lt;/</w:t>
-      </w:r>
-      <w:proofErr w:type="spellStart"/>
-      <w:r>
-        <w:rPr>
-          <w:sz w:val="24"/>
-          <w:szCs w:val="22"/>
-          <w:lang w:val="en-US"/>
-        </w:rPr>
-        <w:t>th</w:t>
-      </w:r>
-      <w:proofErr w:type="spellEnd"/>
-      <w:r>
-        <w:rPr>
-          <w:sz w:val="24"/>
-          <w:szCs w:val="22"/>
-          <w:lang w:val="en-US"/>
-        </w:rPr>
-        <w:t>&gt;</w:t>
+        <w:t>&lt;th&gt;Company&lt;/th&gt;</w:t>
       </w:r>
     </w:p>
     <w:p>
@@ -6777,27 +6446,7 @@
           <w:lang w:val="en-US"/>
         </w:rPr>
         <w:tab/>
-        <w:t>&lt;/</w:t>
-      </w:r>
-      <w:proofErr w:type="spellStart"/>
-      <w:proofErr w:type="gramStart"/>
-      <w:r>
-        <w:rPr>
-          <w:sz w:val="24"/>
-          <w:szCs w:val="22"/>
-          <w:lang w:val="en-US"/>
-        </w:rPr>
-        <w:t>tr</w:t>
-      </w:r>
-      <w:proofErr w:type="spellEnd"/>
-      <w:proofErr w:type="gramEnd"/>
-      <w:r>
-        <w:rPr>
-          <w:sz w:val="24"/>
-          <w:szCs w:val="22"/>
-          <w:lang w:val="en-US"/>
-        </w:rPr>
-        <w:t>&gt;</w:t>
+        <w:t>&lt;/tr&gt;</w:t>
       </w:r>
     </w:p>
     <w:p>
@@ -6815,25 +6464,7 @@
           <w:lang w:val="en-US"/>
         </w:rPr>
         <w:tab/>
-        <w:t>&lt;/</w:t>
-      </w:r>
-      <w:proofErr w:type="spellStart"/>
-      <w:r>
-        <w:rPr>
-          <w:sz w:val="24"/>
-          <w:szCs w:val="22"/>
-          <w:lang w:val="en-US"/>
-        </w:rPr>
-        <w:t>thead</w:t>
-      </w:r>
-      <w:proofErr w:type="spellEnd"/>
-      <w:r>
-        <w:rPr>
-          <w:sz w:val="24"/>
-          <w:szCs w:val="22"/>
-          <w:lang w:val="en-US"/>
-        </w:rPr>
-        <w:t>&gt;</w:t>
+        <w:t>&lt;/thead&gt;</w:t>
       </w:r>
     </w:p>
     <w:p>
@@ -6851,27 +6482,7 @@
           <w:lang w:val="en-US"/>
         </w:rPr>
         <w:tab/>
-        <w:t>&lt;</w:t>
-      </w:r>
-      <w:proofErr w:type="spellStart"/>
-      <w:proofErr w:type="gramStart"/>
-      <w:r>
-        <w:rPr>
-          <w:sz w:val="24"/>
-          <w:szCs w:val="22"/>
-          <w:lang w:val="en-US"/>
-        </w:rPr>
-        <w:t>tbody</w:t>
-      </w:r>
-      <w:proofErr w:type="spellEnd"/>
-      <w:proofErr w:type="gramEnd"/>
-      <w:r>
-        <w:rPr>
-          <w:sz w:val="24"/>
-          <w:szCs w:val="22"/>
-          <w:lang w:val="en-US"/>
-        </w:rPr>
-        <w:t>&gt;</w:t>
+        <w:t>&lt;tbody&gt;</w:t>
       </w:r>
       <w:r>
         <w:rPr>
@@ -6906,27 +6517,7 @@
           <w:lang w:val="en-US"/>
         </w:rPr>
         <w:tab/>
-        <w:t>&lt;</w:t>
-      </w:r>
-      <w:proofErr w:type="spellStart"/>
-      <w:proofErr w:type="gramStart"/>
-      <w:r>
-        <w:rPr>
-          <w:sz w:val="24"/>
-          <w:szCs w:val="22"/>
-          <w:lang w:val="en-US"/>
-        </w:rPr>
-        <w:t>tr</w:t>
-      </w:r>
-      <w:proofErr w:type="spellEnd"/>
-      <w:proofErr w:type="gramEnd"/>
-      <w:r>
-        <w:rPr>
-          <w:sz w:val="24"/>
-          <w:szCs w:val="22"/>
-          <w:lang w:val="en-US"/>
-        </w:rPr>
-        <w:t>&gt;</w:t>
+        <w:t>&lt;tr&gt;</w:t>
       </w:r>
     </w:p>
     <w:p>
@@ -6960,25 +6551,7 @@
           <w:lang w:val="en-US"/>
         </w:rPr>
         <w:tab/>
-        <w:t>&lt;</w:t>
-      </w:r>
-      <w:proofErr w:type="gramStart"/>
-      <w:r>
-        <w:rPr>
-          <w:sz w:val="24"/>
-          <w:szCs w:val="22"/>
-          <w:lang w:val="en-US"/>
-        </w:rPr>
-        <w:t>td&gt;</w:t>
-      </w:r>
-      <w:proofErr w:type="gramEnd"/>
-      <w:r>
-        <w:rPr>
-          <w:sz w:val="24"/>
-          <w:szCs w:val="22"/>
-          <w:lang w:val="en-US"/>
-        </w:rPr>
-        <w:t>1&lt;/td&gt;</w:t>
+        <w:t>&lt;td&gt;1&lt;/td&gt;</w:t>
       </w:r>
     </w:p>
     <w:p>
@@ -7012,35 +6585,7 @@
           <w:lang w:val="en-US"/>
         </w:rPr>
         <w:tab/>
-        <w:t>&lt;</w:t>
-      </w:r>
-      <w:proofErr w:type="gramStart"/>
-      <w:r>
-        <w:rPr>
-          <w:sz w:val="24"/>
-          <w:szCs w:val="22"/>
-          <w:lang w:val="en-US"/>
-        </w:rPr>
-        <w:t>td&gt;</w:t>
-      </w:r>
-      <w:proofErr w:type="spellStart"/>
-      <w:proofErr w:type="gramEnd"/>
-      <w:r>
-        <w:rPr>
-          <w:sz w:val="24"/>
-          <w:szCs w:val="22"/>
-          <w:lang w:val="en-US"/>
-        </w:rPr>
-        <w:t>AViIT</w:t>
-      </w:r>
-      <w:proofErr w:type="spellEnd"/>
-      <w:r>
-        <w:rPr>
-          <w:sz w:val="24"/>
-          <w:szCs w:val="22"/>
-          <w:lang w:val="en-US"/>
-        </w:rPr>
-        <w:t>&lt;/td&gt;</w:t>
+        <w:t>&lt;td&gt;AViIT&lt;/td&gt;</w:t>
       </w:r>
     </w:p>
     <w:p>
@@ -7066,27 +6611,7 @@
           <w:lang w:val="en-US"/>
         </w:rPr>
         <w:tab/>
-        <w:t>&lt;/</w:t>
-      </w:r>
-      <w:proofErr w:type="spellStart"/>
-      <w:proofErr w:type="gramStart"/>
-      <w:r>
-        <w:rPr>
-          <w:sz w:val="24"/>
-          <w:szCs w:val="22"/>
-          <w:lang w:val="en-US"/>
-        </w:rPr>
-        <w:t>tr</w:t>
-      </w:r>
-      <w:proofErr w:type="spellEnd"/>
-      <w:proofErr w:type="gramEnd"/>
-      <w:r>
-        <w:rPr>
-          <w:sz w:val="24"/>
-          <w:szCs w:val="22"/>
-          <w:lang w:val="en-US"/>
-        </w:rPr>
-        <w:t>&gt;</w:t>
+        <w:t>&lt;/tr&gt;</w:t>
       </w:r>
     </w:p>
     <w:p>
@@ -7112,27 +6637,7 @@
           <w:lang w:val="en-US"/>
         </w:rPr>
         <w:tab/>
-        <w:t>&lt;</w:t>
-      </w:r>
-      <w:proofErr w:type="spellStart"/>
-      <w:proofErr w:type="gramStart"/>
-      <w:r>
-        <w:rPr>
-          <w:sz w:val="24"/>
-          <w:szCs w:val="22"/>
-          <w:lang w:val="en-US"/>
-        </w:rPr>
-        <w:t>tr</w:t>
-      </w:r>
-      <w:proofErr w:type="spellEnd"/>
-      <w:proofErr w:type="gramEnd"/>
-      <w:r>
-        <w:rPr>
-          <w:sz w:val="24"/>
-          <w:szCs w:val="22"/>
-          <w:lang w:val="en-US"/>
-        </w:rPr>
-        <w:t>&gt;</w:t>
+        <w:t>&lt;tr&gt;</w:t>
       </w:r>
     </w:p>
     <w:p>
@@ -7166,25 +6671,7 @@
           <w:lang w:val="en-US"/>
         </w:rPr>
         <w:tab/>
-        <w:t>&lt;</w:t>
-      </w:r>
-      <w:proofErr w:type="gramStart"/>
-      <w:r>
-        <w:rPr>
-          <w:sz w:val="24"/>
-          <w:szCs w:val="22"/>
-          <w:lang w:val="en-US"/>
-        </w:rPr>
-        <w:t>td&gt;</w:t>
-      </w:r>
-      <w:proofErr w:type="gramEnd"/>
-      <w:r>
-        <w:rPr>
-          <w:sz w:val="24"/>
-          <w:szCs w:val="22"/>
-          <w:lang w:val="en-US"/>
-        </w:rPr>
-        <w:t>2&lt;/td&gt;</w:t>
+        <w:t>&lt;td&gt;2&lt;/td&gt;</w:t>
       </w:r>
     </w:p>
     <w:p>
@@ -7220,8 +6707,6 @@
         <w:tab/>
         <w:t>&lt;td&gt;Manorama&lt;/td</w:t>
       </w:r>
-      <w:bookmarkStart w:id="0" w:name="_GoBack"/>
-      <w:bookmarkEnd w:id="0"/>
     </w:p>
     <w:p>
       <w:pPr>
@@ -7246,27 +6731,7 @@
           <w:lang w:val="en-US"/>
         </w:rPr>
         <w:tab/>
-        <w:t>&lt;/</w:t>
-      </w:r>
-      <w:proofErr w:type="spellStart"/>
-      <w:proofErr w:type="gramStart"/>
-      <w:r>
-        <w:rPr>
-          <w:sz w:val="24"/>
-          <w:szCs w:val="22"/>
-          <w:lang w:val="en-US"/>
-        </w:rPr>
-        <w:t>tr</w:t>
-      </w:r>
-      <w:proofErr w:type="spellEnd"/>
-      <w:proofErr w:type="gramEnd"/>
-      <w:r>
-        <w:rPr>
-          <w:sz w:val="24"/>
-          <w:szCs w:val="22"/>
-          <w:lang w:val="en-US"/>
-        </w:rPr>
-        <w:t>&gt;</w:t>
+        <w:t>&lt;/tr&gt;</w:t>
       </w:r>
     </w:p>
     <w:p>
@@ -7284,25 +6749,7 @@
           <w:lang w:val="en-US"/>
         </w:rPr>
         <w:tab/>
-        <w:t>&lt;/</w:t>
-      </w:r>
-      <w:proofErr w:type="spellStart"/>
-      <w:r>
-        <w:rPr>
-          <w:sz w:val="24"/>
-          <w:szCs w:val="22"/>
-          <w:lang w:val="en-US"/>
-        </w:rPr>
-        <w:t>tbody</w:t>
-      </w:r>
-      <w:proofErr w:type="spellEnd"/>
-      <w:r>
-        <w:rPr>
-          <w:sz w:val="24"/>
-          <w:szCs w:val="22"/>
-          <w:lang w:val="en-US"/>
-        </w:rPr>
-        <w:t>&gt;</w:t>
+        <w:t>&lt;/tbody&gt;</w:t>
       </w:r>
     </w:p>
     <w:p>
@@ -7321,6 +6768,125 @@
         </w:rPr>
         <w:t>&lt;/table&gt;</w:t>
       </w:r>
+    </w:p>
+    <w:p>
+      <w:pPr>
+        <w:rPr>
+          <w:sz w:val="24"/>
+          <w:szCs w:val="22"/>
+          <w:lang w:val="en-US"/>
+        </w:rPr>
+      </w:pPr>
+    </w:p>
+    <w:p>
+      <w:pPr>
+        <w:rPr>
+          <w:b/>
+          <w:bCs/>
+          <w:sz w:val="24"/>
+          <w:szCs w:val="22"/>
+          <w:lang w:val="en-US"/>
+        </w:rPr>
+      </w:pPr>
+      <w:r>
+        <w:rPr>
+          <w:b/>
+          <w:bCs/>
+          <w:sz w:val="24"/>
+          <w:szCs w:val="22"/>
+          <w:lang w:val="en-US"/>
+        </w:rPr>
+        <w:lastRenderedPageBreak/>
+        <w:t>Handling File Upload</w:t>
+      </w:r>
+    </w:p>
+    <w:p>
+      <w:pPr>
+        <w:pStyle w:val="ListParagraph"/>
+        <w:numPr>
+          <w:ilvl w:val="0"/>
+          <w:numId w:val="21"/>
+        </w:numPr>
+        <w:rPr>
+          <w:sz w:val="24"/>
+          <w:szCs w:val="22"/>
+          <w:lang w:val="en-US"/>
+        </w:rPr>
+      </w:pPr>
+      <w:r>
+        <w:rPr>
+          <w:sz w:val="24"/>
+          <w:szCs w:val="22"/>
+          <w:lang w:val="en-US"/>
+        </w:rPr>
+        <w:t xml:space="preserve">If the </w:t>
+      </w:r>
+      <w:r>
+        <w:rPr>
+          <w:sz w:val="24"/>
+          <w:szCs w:val="22"/>
+          <w:lang w:val="en-US"/>
+        </w:rPr>
+        <w:t>control is having &lt;type=”file”&gt; attribute, then such control is treated as FileUpload.</w:t>
+      </w:r>
+    </w:p>
+    <w:p>
+      <w:pPr>
+        <w:pStyle w:val="ListParagraph"/>
+        <w:numPr>
+          <w:ilvl w:val="0"/>
+          <w:numId w:val="21"/>
+        </w:numPr>
+        <w:rPr>
+          <w:sz w:val="24"/>
+          <w:szCs w:val="22"/>
+          <w:lang w:val="en-US"/>
+        </w:rPr>
+      </w:pPr>
+      <w:r>
+        <w:rPr>
+          <w:sz w:val="24"/>
+          <w:szCs w:val="22"/>
+          <w:lang w:val="en-US"/>
+        </w:rPr>
+        <w:t>For uploading any file with this control simply call .sendKeys() method.</w:t>
+      </w:r>
+    </w:p>
+    <w:p>
+      <w:pPr>
+        <w:pStyle w:val="ListParagraph"/>
+        <w:numPr>
+          <w:ilvl w:val="0"/>
+          <w:numId w:val="21"/>
+        </w:numPr>
+        <w:rPr>
+          <w:sz w:val="24"/>
+          <w:szCs w:val="22"/>
+          <w:lang w:val="en-US"/>
+        </w:rPr>
+      </w:pPr>
+      <w:r>
+        <w:rPr>
+          <w:sz w:val="24"/>
+          <w:szCs w:val="22"/>
+          <w:lang w:val="en-US"/>
+        </w:rPr>
+        <w:t>While calling .sendKeys() method pass the full path of the file.</w:t>
+      </w:r>
+    </w:p>
+    <w:p>
+      <w:pPr>
+        <w:pStyle w:val="ListParagraph"/>
+        <w:numPr>
+          <w:ilvl w:val="0"/>
+          <w:numId w:val="21"/>
+        </w:numPr>
+        <w:rPr>
+          <w:sz w:val="24"/>
+          <w:szCs w:val="22"/>
+          <w:lang w:val="en-US"/>
+        </w:rPr>
+      </w:pPr>
     </w:p>
     <w:sectPr>
       <w:pgSz w:w="11906" w:h="16838"/>
@@ -8369,6 +7935,119 @@
     </w:lvl>
   </w:abstractNum>
   <w:abstractNum w:abstractNumId="10">
+    <w:nsid w:val="4C187E13"/>
+    <w:multiLevelType w:val="hybridMultilevel"/>
+    <w:tmpl w:val="E8ACCDB8"/>
+    <w:lvl w:ilvl="0" w:tplc="40090001">
+      <w:start w:val="1"/>
+      <w:numFmt w:val="bullet"/>
+      <w:lvlText w:val=""/>
+      <w:lvlJc w:val="left"/>
+      <w:pPr>
+        <w:ind w:left="720" w:hanging="360"/>
+      </w:pPr>
+      <w:rPr>
+        <w:rFonts w:ascii="Symbol" w:hAnsi="Symbol" w:hint="default"/>
+      </w:rPr>
+    </w:lvl>
+    <w:lvl w:ilvl="1" w:tplc="40090003" w:tentative="1">
+      <w:start w:val="1"/>
+      <w:numFmt w:val="bullet"/>
+      <w:lvlText w:val="o"/>
+      <w:lvlJc w:val="left"/>
+      <w:pPr>
+        <w:ind w:left="1440" w:hanging="360"/>
+      </w:pPr>
+      <w:rPr>
+        <w:rFonts w:ascii="Courier New" w:hAnsi="Courier New" w:cs="Courier New" w:hint="default"/>
+      </w:rPr>
+    </w:lvl>
+    <w:lvl w:ilvl="2" w:tplc="40090005" w:tentative="1">
+      <w:start w:val="1"/>
+      <w:numFmt w:val="bullet"/>
+      <w:lvlText w:val=""/>
+      <w:lvlJc w:val="left"/>
+      <w:pPr>
+        <w:ind w:left="2160" w:hanging="360"/>
+      </w:pPr>
+      <w:rPr>
+        <w:rFonts w:ascii="Wingdings" w:hAnsi="Wingdings" w:hint="default"/>
+      </w:rPr>
+    </w:lvl>
+    <w:lvl w:ilvl="3" w:tplc="40090001" w:tentative="1">
+      <w:start w:val="1"/>
+      <w:numFmt w:val="bullet"/>
+      <w:lvlText w:val=""/>
+      <w:lvlJc w:val="left"/>
+      <w:pPr>
+        <w:ind w:left="2880" w:hanging="360"/>
+      </w:pPr>
+      <w:rPr>
+        <w:rFonts w:ascii="Symbol" w:hAnsi="Symbol" w:hint="default"/>
+      </w:rPr>
+    </w:lvl>
+    <w:lvl w:ilvl="4" w:tplc="40090003" w:tentative="1">
+      <w:start w:val="1"/>
+      <w:numFmt w:val="bullet"/>
+      <w:lvlText w:val="o"/>
+      <w:lvlJc w:val="left"/>
+      <w:pPr>
+        <w:ind w:left="3600" w:hanging="360"/>
+      </w:pPr>
+      <w:rPr>
+        <w:rFonts w:ascii="Courier New" w:hAnsi="Courier New" w:cs="Courier New" w:hint="default"/>
+      </w:rPr>
+    </w:lvl>
+    <w:lvl w:ilvl="5" w:tplc="40090005" w:tentative="1">
+      <w:start w:val="1"/>
+      <w:numFmt w:val="bullet"/>
+      <w:lvlText w:val=""/>
+      <w:lvlJc w:val="left"/>
+      <w:pPr>
+        <w:ind w:left="4320" w:hanging="360"/>
+      </w:pPr>
+      <w:rPr>
+        <w:rFonts w:ascii="Wingdings" w:hAnsi="Wingdings" w:hint="default"/>
+      </w:rPr>
+    </w:lvl>
+    <w:lvl w:ilvl="6" w:tplc="40090001" w:tentative="1">
+      <w:start w:val="1"/>
+      <w:numFmt w:val="bullet"/>
+      <w:lvlText w:val=""/>
+      <w:lvlJc w:val="left"/>
+      <w:pPr>
+        <w:ind w:left="5040" w:hanging="360"/>
+      </w:pPr>
+      <w:rPr>
+        <w:rFonts w:ascii="Symbol" w:hAnsi="Symbol" w:hint="default"/>
+      </w:rPr>
+    </w:lvl>
+    <w:lvl w:ilvl="7" w:tplc="40090003" w:tentative="1">
+      <w:start w:val="1"/>
+      <w:numFmt w:val="bullet"/>
+      <w:lvlText w:val="o"/>
+      <w:lvlJc w:val="left"/>
+      <w:pPr>
+        <w:ind w:left="5760" w:hanging="360"/>
+      </w:pPr>
+      <w:rPr>
+        <w:rFonts w:ascii="Courier New" w:hAnsi="Courier New" w:cs="Courier New" w:hint="default"/>
+      </w:rPr>
+    </w:lvl>
+    <w:lvl w:ilvl="8" w:tplc="40090005" w:tentative="1">
+      <w:start w:val="1"/>
+      <w:numFmt w:val="bullet"/>
+      <w:lvlText w:val=""/>
+      <w:lvlJc w:val="left"/>
+      <w:pPr>
+        <w:ind w:left="6480" w:hanging="360"/>
+      </w:pPr>
+      <w:rPr>
+        <w:rFonts w:ascii="Wingdings" w:hAnsi="Wingdings" w:hint="default"/>
+      </w:rPr>
+    </w:lvl>
+  </w:abstractNum>
+  <w:abstractNum w:abstractNumId="11">
     <w:nsid w:val="56A40A45"/>
     <w:multiLevelType w:val="hybridMultilevel"/>
     <w:tmpl w:val="7862B3F8"/>
@@ -8481,7 +8160,7 @@
       </w:rPr>
     </w:lvl>
   </w:abstractNum>
-  <w:abstractNum w:abstractNumId="11">
+  <w:abstractNum w:abstractNumId="12">
     <w:nsid w:val="590A2A42"/>
     <w:multiLevelType w:val="hybridMultilevel"/>
     <w:tmpl w:val="B2CCDDE8"/>
@@ -8594,7 +8273,7 @@
       </w:rPr>
     </w:lvl>
   </w:abstractNum>
-  <w:abstractNum w:abstractNumId="12">
+  <w:abstractNum w:abstractNumId="13">
     <w:nsid w:val="5AC325C4"/>
     <w:multiLevelType w:val="hybridMultilevel"/>
     <w:tmpl w:val="6BF65148"/>
@@ -8683,7 +8362,7 @@
       </w:pPr>
     </w:lvl>
   </w:abstractNum>
-  <w:abstractNum w:abstractNumId="13">
+  <w:abstractNum w:abstractNumId="14">
     <w:nsid w:val="5E1A5E19"/>
     <w:multiLevelType w:val="hybridMultilevel"/>
     <w:tmpl w:val="3C0054B4"/>
@@ -8796,7 +8475,7 @@
       </w:rPr>
     </w:lvl>
   </w:abstractNum>
-  <w:abstractNum w:abstractNumId="14">
+  <w:abstractNum w:abstractNumId="15">
     <w:nsid w:val="629C4E82"/>
     <w:multiLevelType w:val="hybridMultilevel"/>
     <w:tmpl w:val="363CE55E"/>
@@ -8885,7 +8564,7 @@
       </w:pPr>
     </w:lvl>
   </w:abstractNum>
-  <w:abstractNum w:abstractNumId="15">
+  <w:abstractNum w:abstractNumId="16">
     <w:nsid w:val="632F5147"/>
     <w:multiLevelType w:val="hybridMultilevel"/>
     <w:tmpl w:val="A2A076AA"/>
@@ -8998,7 +8677,7 @@
       </w:rPr>
     </w:lvl>
   </w:abstractNum>
-  <w:abstractNum w:abstractNumId="16">
+  <w:abstractNum w:abstractNumId="17">
     <w:nsid w:val="6CA66238"/>
     <w:multiLevelType w:val="hybridMultilevel"/>
     <w:tmpl w:val="A2201FCA"/>
@@ -9111,7 +8790,7 @@
       </w:rPr>
     </w:lvl>
   </w:abstractNum>
-  <w:abstractNum w:abstractNumId="17">
+  <w:abstractNum w:abstractNumId="18">
     <w:nsid w:val="73C523EA"/>
     <w:multiLevelType w:val="hybridMultilevel"/>
     <w:tmpl w:val="F1BEC0E4"/>
@@ -9224,7 +8903,7 @@
       </w:rPr>
     </w:lvl>
   </w:abstractNum>
-  <w:abstractNum w:abstractNumId="18">
+  <w:abstractNum w:abstractNumId="19">
     <w:nsid w:val="76CB2945"/>
     <w:multiLevelType w:val="hybridMultilevel"/>
     <w:tmpl w:val="E2880EB2"/>
@@ -9337,7 +9016,7 @@
       </w:rPr>
     </w:lvl>
   </w:abstractNum>
-  <w:abstractNum w:abstractNumId="19">
+  <w:abstractNum w:abstractNumId="20">
     <w:nsid w:val="79FE4925"/>
     <w:multiLevelType w:val="hybridMultilevel"/>
     <w:tmpl w:val="263AE45E"/>
@@ -9427,22 +9106,22 @@
     </w:lvl>
   </w:abstractNum>
   <w:num w:numId="1">
-    <w:abstractNumId w:val="15"/>
+    <w:abstractNumId w:val="16"/>
   </w:num>
   <w:num w:numId="2">
+    <w:abstractNumId w:val="19"/>
+  </w:num>
+  <w:num w:numId="3">
+    <w:abstractNumId w:val="17"/>
+  </w:num>
+  <w:num w:numId="4">
+    <w:abstractNumId w:val="11"/>
+  </w:num>
+  <w:num w:numId="5">
     <w:abstractNumId w:val="18"/>
   </w:num>
-  <w:num w:numId="3">
-    <w:abstractNumId w:val="16"/>
-  </w:num>
-  <w:num w:numId="4">
-    <w:abstractNumId w:val="10"/>
-  </w:num>
-  <w:num w:numId="5">
-    <w:abstractNumId w:val="17"/>
-  </w:num>
   <w:num w:numId="6">
-    <w:abstractNumId w:val="14"/>
+    <w:abstractNumId w:val="15"/>
   </w:num>
   <w:num w:numId="7">
     <w:abstractNumId w:val="8"/>
@@ -9451,13 +9130,13 @@
     <w:abstractNumId w:val="1"/>
   </w:num>
   <w:num w:numId="9">
-    <w:abstractNumId w:val="19"/>
+    <w:abstractNumId w:val="20"/>
   </w:num>
   <w:num w:numId="10">
     <w:abstractNumId w:val="5"/>
   </w:num>
   <w:num w:numId="11">
-    <w:abstractNumId w:val="12"/>
+    <w:abstractNumId w:val="13"/>
   </w:num>
   <w:num w:numId="12">
     <w:abstractNumId w:val="6"/>
@@ -9466,7 +9145,7 @@
     <w:abstractNumId w:val="9"/>
   </w:num>
   <w:num w:numId="14">
-    <w:abstractNumId w:val="11"/>
+    <w:abstractNumId w:val="12"/>
   </w:num>
   <w:num w:numId="15">
     <w:abstractNumId w:val="3"/>
@@ -9481,10 +9160,13 @@
     <w:abstractNumId w:val="2"/>
   </w:num>
   <w:num w:numId="19">
-    <w:abstractNumId w:val="13"/>
+    <w:abstractNumId w:val="14"/>
   </w:num>
   <w:num w:numId="20">
     <w:abstractNumId w:val="4"/>
+  </w:num>
+  <w:num w:numId="21">
+    <w:abstractNumId w:val="10"/>
   </w:num>
 </w:numbering>
 </file>
@@ -9888,6 +9570,7 @@
   <w:style w:type="character" w:default="1" w:styleId="DefaultParagraphFont">
     <w:name w:val="Default Paragraph Font"/>
     <w:uiPriority w:val="1"/>
+    <w:semiHidden/>
     <w:unhideWhenUsed/>
   </w:style>
   <w:style w:type="table" w:default="1" w:styleId="TableNormal">

</xml_diff>

<commit_message>
Date: 25 Mar 2026
</commit_message>
<xml_diff>
--- a/SeleniumNotes.docx
+++ b/SeleniumNotes.docx
@@ -1926,7 +1926,6 @@
           <w:lang w:val="en-US"/>
         </w:rPr>
       </w:pPr>
-      <w:proofErr w:type="spellStart"/>
       <w:r>
         <w:rPr>
           <w:sz w:val="24"/>
@@ -1935,7 +1934,6 @@
         </w:rPr>
         <w:t>YourName_SeleniumDemos</w:t>
       </w:r>
-      <w:proofErr w:type="spellEnd"/>
     </w:p>
     <w:p>
       <w:pPr>
@@ -1978,25 +1976,7 @@
           <w:szCs w:val="22"/>
           <w:lang w:val="en-US"/>
         </w:rPr>
-        <w:t xml:space="preserve">Launch </w:t>
-      </w:r>
-      <w:proofErr w:type="spellStart"/>
-      <w:r>
-        <w:rPr>
-          <w:sz w:val="24"/>
-          <w:szCs w:val="22"/>
-          <w:lang w:val="en-US"/>
-        </w:rPr>
-        <w:t>selenium.dev</w:t>
-      </w:r>
-      <w:proofErr w:type="spellEnd"/>
-      <w:r>
-        <w:rPr>
-          <w:sz w:val="24"/>
-          <w:szCs w:val="22"/>
-          <w:lang w:val="en-US"/>
-        </w:rPr>
-        <w:t xml:space="preserve"> site</w:t>
+        <w:t>Launch selenium.dev site</w:t>
       </w:r>
       <w:r>
         <w:rPr>
@@ -2659,18 +2639,8 @@
           <w:szCs w:val="22"/>
           <w:lang w:val="en-US"/>
         </w:rPr>
-        <w:t xml:space="preserve">Click on </w:t>
-      </w:r>
-      <w:proofErr w:type="spellStart"/>
-      <w:r>
-        <w:rPr>
-          <w:sz w:val="24"/>
-          <w:szCs w:val="22"/>
-          <w:lang w:val="en-US"/>
-        </w:rPr>
-        <w:t>ClassPath</w:t>
-      </w:r>
-      <w:proofErr w:type="spellEnd"/>
+        <w:t>Click on ClassPath</w:t>
+      </w:r>
     </w:p>
     <w:p>
       <w:pPr>
@@ -2691,18 +2661,8 @@
           <w:szCs w:val="22"/>
           <w:lang w:val="en-US"/>
         </w:rPr>
-        <w:t>Click on Add External JARs</w:t>
-      </w:r>
-      <w:proofErr w:type="gramStart"/>
-      <w:r>
-        <w:rPr>
-          <w:sz w:val="24"/>
-          <w:szCs w:val="22"/>
-          <w:lang w:val="en-US"/>
-        </w:rPr>
-        <w:t>..</w:t>
-      </w:r>
-      <w:proofErr w:type="gramEnd"/>
+        <w:t>Click on Add External JARs..</w:t>
+      </w:r>
     </w:p>
     <w:p>
       <w:pPr>
@@ -2911,23 +2871,13 @@
           <w:lang w:val="en-US"/>
         </w:rPr>
       </w:pPr>
-      <w:proofErr w:type="gramStart"/>
-      <w:r>
-        <w:rPr>
-          <w:sz w:val="24"/>
-          <w:szCs w:val="22"/>
-          <w:lang w:val="en-US"/>
-        </w:rPr>
-        <w:t>get(</w:t>
-      </w:r>
-      <w:proofErr w:type="gramEnd"/>
-      <w:r>
-        <w:rPr>
-          <w:sz w:val="24"/>
-          <w:szCs w:val="22"/>
-          <w:lang w:val="en-US"/>
-        </w:rPr>
-        <w:t xml:space="preserve">) </w:t>
+      <w:r>
+        <w:rPr>
+          <w:sz w:val="24"/>
+          <w:szCs w:val="22"/>
+          <w:lang w:val="en-US"/>
+        </w:rPr>
+        <w:t xml:space="preserve">get() </w:t>
       </w:r>
       <w:r>
         <w:rPr>
@@ -2959,33 +2909,13 @@
           <w:lang w:val="en-US"/>
         </w:rPr>
       </w:pPr>
-      <w:proofErr w:type="spellStart"/>
-      <w:proofErr w:type="gramStart"/>
-      <w:r>
-        <w:rPr>
-          <w:sz w:val="24"/>
-          <w:szCs w:val="22"/>
-          <w:lang w:val="en-US"/>
-        </w:rPr>
-        <w:t>driver.manage</w:t>
-      </w:r>
-      <w:proofErr w:type="spellEnd"/>
-      <w:r>
-        <w:rPr>
-          <w:sz w:val="24"/>
-          <w:szCs w:val="22"/>
-          <w:lang w:val="en-US"/>
-        </w:rPr>
-        <w:t>(</w:t>
-      </w:r>
-      <w:proofErr w:type="gramEnd"/>
-      <w:r>
-        <w:rPr>
-          <w:sz w:val="24"/>
-          <w:szCs w:val="22"/>
-          <w:lang w:val="en-US"/>
-        </w:rPr>
-        <w:t xml:space="preserve">).window().maximize() </w:t>
+      <w:r>
+        <w:rPr>
+          <w:sz w:val="24"/>
+          <w:szCs w:val="22"/>
+          <w:lang w:val="en-US"/>
+        </w:rPr>
+        <w:t xml:space="preserve">driver.manage().window().maximize() </w:t>
       </w:r>
       <w:r>
         <w:rPr>
@@ -3017,23 +2947,13 @@
           <w:lang w:val="en-US"/>
         </w:rPr>
       </w:pPr>
-      <w:proofErr w:type="gramStart"/>
-      <w:r>
-        <w:rPr>
-          <w:sz w:val="24"/>
-          <w:szCs w:val="22"/>
-          <w:lang w:val="en-US"/>
-        </w:rPr>
-        <w:t>close(</w:t>
-      </w:r>
-      <w:proofErr w:type="gramEnd"/>
-      <w:r>
-        <w:rPr>
-          <w:sz w:val="24"/>
-          <w:szCs w:val="22"/>
-          <w:lang w:val="en-US"/>
-        </w:rPr>
-        <w:t xml:space="preserve">) </w:t>
+      <w:r>
+        <w:rPr>
+          <w:sz w:val="24"/>
+          <w:szCs w:val="22"/>
+          <w:lang w:val="en-US"/>
+        </w:rPr>
+        <w:t xml:space="preserve">close() </w:t>
       </w:r>
       <w:r>
         <w:rPr>
@@ -3065,23 +2985,13 @@
           <w:lang w:val="en-US"/>
         </w:rPr>
       </w:pPr>
-      <w:proofErr w:type="gramStart"/>
-      <w:r>
-        <w:rPr>
-          <w:sz w:val="24"/>
-          <w:szCs w:val="22"/>
-          <w:lang w:val="en-US"/>
-        </w:rPr>
-        <w:t>getTitle(</w:t>
-      </w:r>
-      <w:proofErr w:type="gramEnd"/>
-      <w:r>
-        <w:rPr>
-          <w:sz w:val="24"/>
-          <w:szCs w:val="22"/>
-          <w:lang w:val="en-US"/>
-        </w:rPr>
-        <w:t xml:space="preserve">) </w:t>
+      <w:r>
+        <w:rPr>
+          <w:sz w:val="24"/>
+          <w:szCs w:val="22"/>
+          <w:lang w:val="en-US"/>
+        </w:rPr>
+        <w:t xml:space="preserve">getTitle() </w:t>
       </w:r>
       <w:r>
         <w:rPr>
@@ -3113,23 +3023,13 @@
           <w:lang w:val="en-US"/>
         </w:rPr>
       </w:pPr>
-      <w:proofErr w:type="gramStart"/>
-      <w:r>
-        <w:rPr>
-          <w:sz w:val="24"/>
-          <w:szCs w:val="22"/>
-          <w:lang w:val="en-US"/>
-        </w:rPr>
-        <w:t>getCurrentUrl(</w:t>
-      </w:r>
-      <w:proofErr w:type="gramEnd"/>
-      <w:r>
-        <w:rPr>
-          <w:sz w:val="24"/>
-          <w:szCs w:val="22"/>
-          <w:lang w:val="en-US"/>
-        </w:rPr>
-        <w:t xml:space="preserve">) </w:t>
+      <w:r>
+        <w:rPr>
+          <w:sz w:val="24"/>
+          <w:szCs w:val="22"/>
+          <w:lang w:val="en-US"/>
+        </w:rPr>
+        <w:t xml:space="preserve">getCurrentUrl() </w:t>
       </w:r>
       <w:r>
         <w:rPr>
@@ -3161,23 +3061,13 @@
           <w:lang w:val="en-US"/>
         </w:rPr>
       </w:pPr>
-      <w:proofErr w:type="gramStart"/>
-      <w:r>
-        <w:rPr>
-          <w:sz w:val="24"/>
-          <w:szCs w:val="22"/>
-          <w:lang w:val="en-US"/>
-        </w:rPr>
-        <w:t>getPageSource(</w:t>
-      </w:r>
-      <w:proofErr w:type="gramEnd"/>
-      <w:r>
-        <w:rPr>
-          <w:sz w:val="24"/>
-          <w:szCs w:val="22"/>
-          <w:lang w:val="en-US"/>
-        </w:rPr>
-        <w:t xml:space="preserve">) </w:t>
+      <w:r>
+        <w:rPr>
+          <w:sz w:val="24"/>
+          <w:szCs w:val="22"/>
+          <w:lang w:val="en-US"/>
+        </w:rPr>
+        <w:t xml:space="preserve">getPageSource() </w:t>
       </w:r>
       <w:r>
         <w:rPr>
@@ -3209,23 +3099,13 @@
           <w:lang w:val="en-US"/>
         </w:rPr>
       </w:pPr>
-      <w:proofErr w:type="gramStart"/>
-      <w:r>
-        <w:rPr>
-          <w:sz w:val="24"/>
-          <w:szCs w:val="22"/>
-          <w:lang w:val="en-US"/>
-        </w:rPr>
-        <w:t>findElement(</w:t>
-      </w:r>
-      <w:proofErr w:type="gramEnd"/>
-      <w:r>
-        <w:rPr>
-          <w:sz w:val="24"/>
-          <w:szCs w:val="22"/>
-          <w:lang w:val="en-US"/>
-        </w:rPr>
-        <w:t xml:space="preserve">) </w:t>
+      <w:r>
+        <w:rPr>
+          <w:sz w:val="24"/>
+          <w:szCs w:val="22"/>
+          <w:lang w:val="en-US"/>
+        </w:rPr>
+        <w:t xml:space="preserve">findElement() </w:t>
       </w:r>
       <w:r>
         <w:rPr>
@@ -3275,23 +3155,13 @@
           <w:lang w:val="en-US"/>
         </w:rPr>
       </w:pPr>
-      <w:proofErr w:type="gramStart"/>
-      <w:r>
-        <w:rPr>
-          <w:sz w:val="24"/>
-          <w:szCs w:val="22"/>
-          <w:lang w:val="en-US"/>
-        </w:rPr>
-        <w:t>findElements(</w:t>
-      </w:r>
-      <w:proofErr w:type="gramEnd"/>
-      <w:r>
-        <w:rPr>
-          <w:sz w:val="24"/>
-          <w:szCs w:val="22"/>
-          <w:lang w:val="en-US"/>
-        </w:rPr>
-        <w:t xml:space="preserve">) </w:t>
+      <w:r>
+        <w:rPr>
+          <w:sz w:val="24"/>
+          <w:szCs w:val="22"/>
+          <w:lang w:val="en-US"/>
+        </w:rPr>
+        <w:t xml:space="preserve">findElements() </w:t>
       </w:r>
       <w:r>
         <w:rPr>
@@ -3323,23 +3193,13 @@
           <w:lang w:val="en-US"/>
         </w:rPr>
       </w:pPr>
-      <w:proofErr w:type="gramStart"/>
-      <w:r>
-        <w:rPr>
-          <w:sz w:val="24"/>
-          <w:szCs w:val="22"/>
-          <w:lang w:val="en-US"/>
-        </w:rPr>
-        <w:t>getWindowHandles(</w:t>
-      </w:r>
-      <w:proofErr w:type="gramEnd"/>
-      <w:r>
-        <w:rPr>
-          <w:sz w:val="24"/>
-          <w:szCs w:val="22"/>
-          <w:lang w:val="en-US"/>
-        </w:rPr>
-        <w:t xml:space="preserve">) </w:t>
+      <w:r>
+        <w:rPr>
+          <w:sz w:val="24"/>
+          <w:szCs w:val="22"/>
+          <w:lang w:val="en-US"/>
+        </w:rPr>
+        <w:t xml:space="preserve">getWindowHandles() </w:t>
       </w:r>
       <w:r>
         <w:rPr>
@@ -3371,23 +3231,13 @@
           <w:lang w:val="en-US"/>
         </w:rPr>
       </w:pPr>
-      <w:proofErr w:type="gramStart"/>
-      <w:r>
-        <w:rPr>
-          <w:sz w:val="24"/>
-          <w:szCs w:val="22"/>
-          <w:lang w:val="en-US"/>
-        </w:rPr>
-        <w:t>quit(</w:t>
-      </w:r>
-      <w:proofErr w:type="gramEnd"/>
-      <w:r>
-        <w:rPr>
-          <w:sz w:val="24"/>
-          <w:szCs w:val="22"/>
-          <w:lang w:val="en-US"/>
-        </w:rPr>
-        <w:t xml:space="preserve">) </w:t>
+      <w:r>
+        <w:rPr>
+          <w:sz w:val="24"/>
+          <w:szCs w:val="22"/>
+          <w:lang w:val="en-US"/>
+        </w:rPr>
+        <w:t xml:space="preserve">quit() </w:t>
       </w:r>
       <w:r>
         <w:rPr>
@@ -3768,25 +3618,7 @@
           <w:szCs w:val="22"/>
           <w:lang w:val="en-US"/>
         </w:rPr>
-        <w:t xml:space="preserve"> </w:t>
-      </w:r>
-      <w:proofErr w:type="spellStart"/>
-      <w:r>
-        <w:rPr>
-          <w:sz w:val="24"/>
-          <w:szCs w:val="22"/>
-          <w:lang w:val="en-US"/>
-        </w:rPr>
-        <w:t>driver.get</w:t>
-      </w:r>
-      <w:proofErr w:type="spellEnd"/>
-      <w:r>
-        <w:rPr>
-          <w:sz w:val="24"/>
-          <w:szCs w:val="22"/>
-          <w:lang w:val="en-US"/>
-        </w:rPr>
-        <w:t>() is having implicit wait of 30 seconds, means Selenium will wait for maximum 30 seconds till the page get loaded. But if the page is not getting loaded within 30 seconds, Selenium will throw SessionTimeoutException.</w:t>
+        <w:t xml:space="preserve"> driver.get() is having implicit wait of 30 seconds, means Selenium will wait for maximum 30 seconds till the page get loaded. But if the page is not getting loaded within 30 seconds, Selenium will throw SessionTimeoutException.</w:t>
       </w:r>
     </w:p>
     <w:p>
@@ -4048,23 +3880,13 @@
           <w:lang w:val="en-US"/>
         </w:rPr>
       </w:pPr>
-      <w:proofErr w:type="gramStart"/>
-      <w:r>
-        <w:rPr>
-          <w:sz w:val="24"/>
-          <w:szCs w:val="22"/>
-          <w:lang w:val="en-US"/>
-        </w:rPr>
-        <w:t>sendKeys(</w:t>
-      </w:r>
-      <w:proofErr w:type="gramEnd"/>
-      <w:r>
-        <w:rPr>
-          <w:sz w:val="24"/>
-          <w:szCs w:val="22"/>
-          <w:lang w:val="en-US"/>
-        </w:rPr>
-        <w:t xml:space="preserve">) </w:t>
+      <w:r>
+        <w:rPr>
+          <w:sz w:val="24"/>
+          <w:szCs w:val="22"/>
+          <w:lang w:val="en-US"/>
+        </w:rPr>
+        <w:t xml:space="preserve">sendKeys() </w:t>
       </w:r>
       <w:r>
         <w:rPr>
@@ -4104,23 +3926,13 @@
           <w:lang w:val="en-US"/>
         </w:rPr>
       </w:pPr>
-      <w:proofErr w:type="gramStart"/>
-      <w:r>
-        <w:rPr>
-          <w:sz w:val="24"/>
-          <w:szCs w:val="22"/>
-          <w:lang w:val="en-US"/>
-        </w:rPr>
-        <w:t>click(</w:t>
-      </w:r>
-      <w:proofErr w:type="gramEnd"/>
-      <w:r>
-        <w:rPr>
-          <w:sz w:val="24"/>
-          <w:szCs w:val="22"/>
-          <w:lang w:val="en-US"/>
-        </w:rPr>
-        <w:t xml:space="preserve">) </w:t>
+      <w:r>
+        <w:rPr>
+          <w:sz w:val="24"/>
+          <w:szCs w:val="22"/>
+          <w:lang w:val="en-US"/>
+        </w:rPr>
+        <w:t xml:space="preserve">click() </w:t>
       </w:r>
       <w:r>
         <w:rPr>
@@ -4152,23 +3964,13 @@
           <w:lang w:val="en-US"/>
         </w:rPr>
       </w:pPr>
-      <w:proofErr w:type="gramStart"/>
-      <w:r>
-        <w:rPr>
-          <w:sz w:val="24"/>
-          <w:szCs w:val="22"/>
-          <w:lang w:val="en-US"/>
-        </w:rPr>
-        <w:t>getText(</w:t>
-      </w:r>
-      <w:proofErr w:type="gramEnd"/>
-      <w:r>
-        <w:rPr>
-          <w:sz w:val="24"/>
-          <w:szCs w:val="22"/>
-          <w:lang w:val="en-US"/>
-        </w:rPr>
-        <w:t xml:space="preserve">) </w:t>
+      <w:r>
+        <w:rPr>
+          <w:sz w:val="24"/>
+          <w:szCs w:val="22"/>
+          <w:lang w:val="en-US"/>
+        </w:rPr>
+        <w:t xml:space="preserve">getText() </w:t>
       </w:r>
       <w:r>
         <w:rPr>
@@ -4200,23 +4002,13 @@
           <w:lang w:val="en-US"/>
         </w:rPr>
       </w:pPr>
-      <w:proofErr w:type="gramStart"/>
-      <w:r>
-        <w:rPr>
-          <w:sz w:val="24"/>
-          <w:szCs w:val="22"/>
-          <w:lang w:val="en-US"/>
-        </w:rPr>
-        <w:t>getAttribute(</w:t>
-      </w:r>
-      <w:proofErr w:type="gramEnd"/>
-      <w:r>
-        <w:rPr>
-          <w:sz w:val="24"/>
-          <w:szCs w:val="22"/>
-          <w:lang w:val="en-US"/>
-        </w:rPr>
-        <w:t xml:space="preserve">) </w:t>
+      <w:r>
+        <w:rPr>
+          <w:sz w:val="24"/>
+          <w:szCs w:val="22"/>
+          <w:lang w:val="en-US"/>
+        </w:rPr>
+        <w:t xml:space="preserve">getAttribute() </w:t>
       </w:r>
       <w:r>
         <w:rPr>
@@ -4248,23 +4040,13 @@
           <w:lang w:val="en-US"/>
         </w:rPr>
       </w:pPr>
-      <w:proofErr w:type="gramStart"/>
-      <w:r>
-        <w:rPr>
-          <w:sz w:val="24"/>
-          <w:szCs w:val="22"/>
-          <w:lang w:val="en-US"/>
-        </w:rPr>
-        <w:t>isSelected(</w:t>
-      </w:r>
-      <w:proofErr w:type="gramEnd"/>
-      <w:r>
-        <w:rPr>
-          <w:sz w:val="24"/>
-          <w:szCs w:val="22"/>
-          <w:lang w:val="en-US"/>
-        </w:rPr>
-        <w:t xml:space="preserve">) </w:t>
+      <w:r>
+        <w:rPr>
+          <w:sz w:val="24"/>
+          <w:szCs w:val="22"/>
+          <w:lang w:val="en-US"/>
+        </w:rPr>
+        <w:t xml:space="preserve">isSelected() </w:t>
       </w:r>
       <w:r>
         <w:rPr>
@@ -4304,23 +4086,13 @@
           <w:lang w:val="en-US"/>
         </w:rPr>
       </w:pPr>
-      <w:proofErr w:type="gramStart"/>
-      <w:r>
-        <w:rPr>
-          <w:sz w:val="24"/>
-          <w:szCs w:val="22"/>
-          <w:lang w:val="en-US"/>
-        </w:rPr>
-        <w:t>isEnabled(</w:t>
-      </w:r>
-      <w:proofErr w:type="gramEnd"/>
-      <w:r>
-        <w:rPr>
-          <w:sz w:val="24"/>
-          <w:szCs w:val="22"/>
-          <w:lang w:val="en-US"/>
-        </w:rPr>
-        <w:t xml:space="preserve">) </w:t>
+      <w:r>
+        <w:rPr>
+          <w:sz w:val="24"/>
+          <w:szCs w:val="22"/>
+          <w:lang w:val="en-US"/>
+        </w:rPr>
+        <w:t xml:space="preserve">isEnabled() </w:t>
       </w:r>
       <w:r>
         <w:rPr>
@@ -4390,23 +4162,13 @@
           <w:lang w:val="en-US"/>
         </w:rPr>
       </w:pPr>
-      <w:proofErr w:type="gramStart"/>
-      <w:r>
-        <w:rPr>
-          <w:sz w:val="24"/>
-          <w:szCs w:val="22"/>
-          <w:lang w:val="en-US"/>
-        </w:rPr>
-        <w:t>clear(</w:t>
-      </w:r>
-      <w:proofErr w:type="gramEnd"/>
-      <w:r>
-        <w:rPr>
-          <w:sz w:val="24"/>
-          <w:szCs w:val="22"/>
-          <w:lang w:val="en-US"/>
-        </w:rPr>
-        <w:t xml:space="preserve">) </w:t>
+      <w:r>
+        <w:rPr>
+          <w:sz w:val="24"/>
+          <w:szCs w:val="22"/>
+          <w:lang w:val="en-US"/>
+        </w:rPr>
+        <w:t xml:space="preserve">clear() </w:t>
       </w:r>
       <w:r>
         <w:rPr>
@@ -5502,23 +5264,13 @@
           <w:lang w:val="en-US"/>
         </w:rPr>
       </w:pPr>
-      <w:proofErr w:type="gramStart"/>
-      <w:r>
-        <w:rPr>
-          <w:sz w:val="24"/>
-          <w:szCs w:val="22"/>
-          <w:lang w:val="en-US"/>
-        </w:rPr>
-        <w:t>getFirstSelectedOption(</w:t>
-      </w:r>
-      <w:proofErr w:type="gramEnd"/>
-      <w:r>
-        <w:rPr>
-          <w:sz w:val="24"/>
-          <w:szCs w:val="22"/>
-          <w:lang w:val="en-US"/>
-        </w:rPr>
-        <w:t xml:space="preserve">) </w:t>
+      <w:r>
+        <w:rPr>
+          <w:sz w:val="24"/>
+          <w:szCs w:val="22"/>
+          <w:lang w:val="en-US"/>
+        </w:rPr>
+        <w:t xml:space="preserve">getFirstSelectedOption() </w:t>
       </w:r>
       <w:r>
         <w:rPr>
@@ -5566,23 +5318,13 @@
           <w:lang w:val="en-US"/>
         </w:rPr>
       </w:pPr>
-      <w:proofErr w:type="gramStart"/>
-      <w:r>
-        <w:rPr>
-          <w:sz w:val="24"/>
-          <w:szCs w:val="22"/>
-          <w:lang w:val="en-US"/>
-        </w:rPr>
-        <w:t>getOptions(</w:t>
-      </w:r>
-      <w:proofErr w:type="gramEnd"/>
-      <w:r>
-        <w:rPr>
-          <w:sz w:val="24"/>
-          <w:szCs w:val="22"/>
-          <w:lang w:val="en-US"/>
-        </w:rPr>
-        <w:t xml:space="preserve">) </w:t>
+      <w:r>
+        <w:rPr>
+          <w:sz w:val="24"/>
+          <w:szCs w:val="22"/>
+          <w:lang w:val="en-US"/>
+        </w:rPr>
+        <w:t xml:space="preserve">getOptions() </w:t>
       </w:r>
       <w:r>
         <w:rPr>
@@ -5614,23 +5356,13 @@
           <w:lang w:val="en-US"/>
         </w:rPr>
       </w:pPr>
-      <w:proofErr w:type="gramStart"/>
-      <w:r>
-        <w:rPr>
-          <w:sz w:val="24"/>
-          <w:szCs w:val="22"/>
-          <w:lang w:val="en-US"/>
-        </w:rPr>
-        <w:t>selectByVisibleText(</w:t>
-      </w:r>
-      <w:proofErr w:type="gramEnd"/>
-      <w:r>
-        <w:rPr>
-          <w:sz w:val="24"/>
-          <w:szCs w:val="22"/>
-          <w:lang w:val="en-US"/>
-        </w:rPr>
-        <w:t xml:space="preserve">) </w:t>
+      <w:r>
+        <w:rPr>
+          <w:sz w:val="24"/>
+          <w:szCs w:val="22"/>
+          <w:lang w:val="en-US"/>
+        </w:rPr>
+        <w:t xml:space="preserve">selectByVisibleText() </w:t>
       </w:r>
       <w:r>
         <w:rPr>
@@ -5662,23 +5394,13 @@
           <w:lang w:val="en-US"/>
         </w:rPr>
       </w:pPr>
-      <w:proofErr w:type="gramStart"/>
-      <w:r>
-        <w:rPr>
-          <w:sz w:val="24"/>
-          <w:szCs w:val="22"/>
-          <w:lang w:val="en-US"/>
-        </w:rPr>
-        <w:t>selectByContainsVisibleText(</w:t>
-      </w:r>
-      <w:proofErr w:type="gramEnd"/>
-      <w:r>
-        <w:rPr>
-          <w:sz w:val="24"/>
-          <w:szCs w:val="22"/>
-          <w:lang w:val="en-US"/>
-        </w:rPr>
-        <w:t xml:space="preserve">) </w:t>
+      <w:r>
+        <w:rPr>
+          <w:sz w:val="24"/>
+          <w:szCs w:val="22"/>
+          <w:lang w:val="en-US"/>
+        </w:rPr>
+        <w:t xml:space="preserve">selectByContainsVisibleText() </w:t>
       </w:r>
       <w:r>
         <w:rPr>
@@ -5710,23 +5432,13 @@
           <w:lang w:val="en-US"/>
         </w:rPr>
       </w:pPr>
-      <w:proofErr w:type="gramStart"/>
-      <w:r>
-        <w:rPr>
-          <w:sz w:val="24"/>
-          <w:szCs w:val="22"/>
-          <w:lang w:val="en-US"/>
-        </w:rPr>
-        <w:t>selectByValue(</w:t>
-      </w:r>
-      <w:proofErr w:type="gramEnd"/>
-      <w:r>
-        <w:rPr>
-          <w:sz w:val="24"/>
-          <w:szCs w:val="22"/>
-          <w:lang w:val="en-US"/>
-        </w:rPr>
-        <w:t xml:space="preserve">) </w:t>
+      <w:r>
+        <w:rPr>
+          <w:sz w:val="24"/>
+          <w:szCs w:val="22"/>
+          <w:lang w:val="en-US"/>
+        </w:rPr>
+        <w:t xml:space="preserve">selectByValue() </w:t>
       </w:r>
       <w:r>
         <w:rPr>
@@ -5758,23 +5470,13 @@
           <w:lang w:val="en-US"/>
         </w:rPr>
       </w:pPr>
-      <w:proofErr w:type="gramStart"/>
-      <w:r>
-        <w:rPr>
-          <w:sz w:val="24"/>
-          <w:szCs w:val="22"/>
-          <w:lang w:val="en-US"/>
-        </w:rPr>
-        <w:t>selectByIndex(</w:t>
-      </w:r>
-      <w:proofErr w:type="gramEnd"/>
-      <w:r>
-        <w:rPr>
-          <w:sz w:val="24"/>
-          <w:szCs w:val="22"/>
-          <w:lang w:val="en-US"/>
-        </w:rPr>
-        <w:t xml:space="preserve">) </w:t>
+      <w:r>
+        <w:rPr>
+          <w:sz w:val="24"/>
+          <w:szCs w:val="22"/>
+          <w:lang w:val="en-US"/>
+        </w:rPr>
+        <w:t xml:space="preserve">selectByIndex() </w:t>
       </w:r>
       <w:r>
         <w:rPr>
@@ -5806,23 +5508,13 @@
           <w:lang w:val="en-US"/>
         </w:rPr>
       </w:pPr>
-      <w:proofErr w:type="gramStart"/>
-      <w:r>
-        <w:rPr>
-          <w:sz w:val="24"/>
-          <w:szCs w:val="22"/>
-          <w:lang w:val="en-US"/>
-        </w:rPr>
-        <w:t>getAllSelectedOptions(</w:t>
-      </w:r>
-      <w:proofErr w:type="gramEnd"/>
-      <w:r>
-        <w:rPr>
-          <w:sz w:val="24"/>
-          <w:szCs w:val="22"/>
-          <w:lang w:val="en-US"/>
-        </w:rPr>
-        <w:t xml:space="preserve">) </w:t>
+      <w:r>
+        <w:rPr>
+          <w:sz w:val="24"/>
+          <w:szCs w:val="22"/>
+          <w:lang w:val="en-US"/>
+        </w:rPr>
+        <w:t xml:space="preserve">getAllSelectedOptions() </w:t>
       </w:r>
       <w:r>
         <w:rPr>
@@ -5862,23 +5554,13 @@
           <w:lang w:val="en-US"/>
         </w:rPr>
       </w:pPr>
-      <w:proofErr w:type="gramStart"/>
-      <w:r>
-        <w:rPr>
-          <w:sz w:val="24"/>
-          <w:szCs w:val="22"/>
-          <w:lang w:val="en-US"/>
-        </w:rPr>
-        <w:t>isMultiple(</w:t>
-      </w:r>
-      <w:proofErr w:type="gramEnd"/>
-      <w:r>
-        <w:rPr>
-          <w:sz w:val="24"/>
-          <w:szCs w:val="22"/>
-          <w:lang w:val="en-US"/>
-        </w:rPr>
-        <w:t xml:space="preserve">) </w:t>
+      <w:r>
+        <w:rPr>
+          <w:sz w:val="24"/>
+          <w:szCs w:val="22"/>
+          <w:lang w:val="en-US"/>
+        </w:rPr>
+        <w:t xml:space="preserve">isMultiple() </w:t>
       </w:r>
       <w:r>
         <w:rPr>
@@ -6067,33 +5749,13 @@
           <w:lang w:val="en-US"/>
         </w:rPr>
       </w:pPr>
-      <w:proofErr w:type="spellStart"/>
-      <w:proofErr w:type="gramStart"/>
-      <w:r>
-        <w:rPr>
-          <w:sz w:val="24"/>
-          <w:szCs w:val="22"/>
-          <w:lang w:val="en-US"/>
-        </w:rPr>
-        <w:t>Thread.sleep</w:t>
-      </w:r>
-      <w:proofErr w:type="spellEnd"/>
-      <w:r>
-        <w:rPr>
-          <w:sz w:val="24"/>
-          <w:szCs w:val="22"/>
-          <w:lang w:val="en-US"/>
-        </w:rPr>
-        <w:t>(</w:t>
-      </w:r>
-      <w:proofErr w:type="gramEnd"/>
-      <w:r>
-        <w:rPr>
-          <w:sz w:val="24"/>
-          <w:szCs w:val="22"/>
-          <w:lang w:val="en-US"/>
-        </w:rPr>
-        <w:t>)</w:t>
+      <w:r>
+        <w:rPr>
+          <w:sz w:val="24"/>
+          <w:szCs w:val="22"/>
+          <w:lang w:val="en-US"/>
+        </w:rPr>
+        <w:t>Thread.sleep()</w:t>
       </w:r>
       <w:r>
         <w:rPr>
@@ -6527,24 +6189,7 @@
           <w:lang w:val="en-US"/>
         </w:rPr>
         <w:br/>
-      </w:r>
-      <w:proofErr w:type="spellStart"/>
-      <w:r>
-        <w:rPr>
-          <w:sz w:val="24"/>
-          <w:szCs w:val="22"/>
-          <w:lang w:val="en-US"/>
-        </w:rPr>
-        <w:t>i</w:t>
-      </w:r>
-      <w:proofErr w:type="spellEnd"/>
-      <w:r>
-        <w:rPr>
-          <w:sz w:val="24"/>
-          <w:szCs w:val="22"/>
-          <w:lang w:val="en-US"/>
-        </w:rPr>
-        <w:t xml:space="preserve"> – ignoring </w:t>
+        <w:t xml:space="preserve">i – ignoring </w:t>
       </w:r>
       <w:r>
         <w:rPr>
@@ -6634,25 +6279,7 @@
           <w:szCs w:val="22"/>
           <w:lang w:val="en-US"/>
         </w:rPr>
-        <w:t>&lt;</w:t>
-      </w:r>
-      <w:proofErr w:type="gramStart"/>
-      <w:r>
-        <w:rPr>
-          <w:sz w:val="24"/>
-          <w:szCs w:val="22"/>
-          <w:lang w:val="en-US"/>
-        </w:rPr>
-        <w:t>table</w:t>
-      </w:r>
-      <w:proofErr w:type="gramEnd"/>
-      <w:r>
-        <w:rPr>
-          <w:sz w:val="24"/>
-          <w:szCs w:val="22"/>
-          <w:lang w:val="en-US"/>
-        </w:rPr>
-        <w:t>&gt;</w:t>
+        <w:t>&lt;table&gt;</w:t>
       </w:r>
     </w:p>
     <w:p>
@@ -6670,27 +6297,7 @@
           <w:lang w:val="en-US"/>
         </w:rPr>
         <w:tab/>
-        <w:t>&lt;</w:t>
-      </w:r>
-      <w:proofErr w:type="spellStart"/>
-      <w:proofErr w:type="gramStart"/>
-      <w:r>
-        <w:rPr>
-          <w:sz w:val="24"/>
-          <w:szCs w:val="22"/>
-          <w:lang w:val="en-US"/>
-        </w:rPr>
-        <w:t>thead</w:t>
-      </w:r>
-      <w:proofErr w:type="spellEnd"/>
-      <w:proofErr w:type="gramEnd"/>
-      <w:r>
-        <w:rPr>
-          <w:sz w:val="24"/>
-          <w:szCs w:val="22"/>
-          <w:lang w:val="en-US"/>
-        </w:rPr>
-        <w:t>&gt;</w:t>
+        <w:t>&lt;thead&gt;</w:t>
       </w:r>
       <w:r>
         <w:rPr>
@@ -6725,27 +6332,7 @@
           <w:lang w:val="en-US"/>
         </w:rPr>
         <w:tab/>
-        <w:t>&lt;</w:t>
-      </w:r>
-      <w:proofErr w:type="spellStart"/>
-      <w:proofErr w:type="gramStart"/>
-      <w:r>
-        <w:rPr>
-          <w:sz w:val="24"/>
-          <w:szCs w:val="22"/>
-          <w:lang w:val="en-US"/>
-        </w:rPr>
-        <w:t>tr</w:t>
-      </w:r>
-      <w:proofErr w:type="spellEnd"/>
-      <w:proofErr w:type="gramEnd"/>
-      <w:r>
-        <w:rPr>
-          <w:sz w:val="24"/>
-          <w:szCs w:val="22"/>
-          <w:lang w:val="en-US"/>
-        </w:rPr>
-        <w:t>&gt;</w:t>
+        <w:t>&lt;tr&gt;</w:t>
       </w:r>
       <w:r>
         <w:rPr>
@@ -6788,63 +6375,7 @@
           <w:lang w:val="en-US"/>
         </w:rPr>
         <w:tab/>
-        <w:t>&lt;</w:t>
-      </w:r>
-      <w:proofErr w:type="spellStart"/>
-      <w:proofErr w:type="gramStart"/>
-      <w:r>
-        <w:rPr>
-          <w:sz w:val="24"/>
-          <w:szCs w:val="22"/>
-          <w:lang w:val="en-US"/>
-        </w:rPr>
-        <w:t>th</w:t>
-      </w:r>
-      <w:proofErr w:type="spellEnd"/>
-      <w:r>
-        <w:rPr>
-          <w:sz w:val="24"/>
-          <w:szCs w:val="22"/>
-          <w:lang w:val="en-US"/>
-        </w:rPr>
-        <w:t>&gt;</w:t>
-      </w:r>
-      <w:proofErr w:type="spellStart"/>
-      <w:proofErr w:type="gramEnd"/>
-      <w:r>
-        <w:rPr>
-          <w:sz w:val="24"/>
-          <w:szCs w:val="22"/>
-          <w:lang w:val="en-US"/>
-        </w:rPr>
-        <w:t>Sr</w:t>
-      </w:r>
-      <w:proofErr w:type="spellEnd"/>
-      <w:r>
-        <w:rPr>
-          <w:sz w:val="24"/>
-          <w:szCs w:val="22"/>
-          <w:lang w:val="en-US"/>
-        </w:rPr>
-        <w:t xml:space="preserve"> No&lt;/</w:t>
-      </w:r>
-      <w:proofErr w:type="spellStart"/>
-      <w:r>
-        <w:rPr>
-          <w:sz w:val="24"/>
-          <w:szCs w:val="22"/>
-          <w:lang w:val="en-US"/>
-        </w:rPr>
-        <w:t>th</w:t>
-      </w:r>
-      <w:proofErr w:type="spellEnd"/>
-      <w:r>
-        <w:rPr>
-          <w:sz w:val="24"/>
-          <w:szCs w:val="22"/>
-          <w:lang w:val="en-US"/>
-        </w:rPr>
-        <w:t>&gt;</w:t>
+        <w:t>&lt;th&gt;Sr No&lt;/th&gt;</w:t>
       </w:r>
       <w:r>
         <w:rPr>
@@ -6887,53 +6418,7 @@
           <w:lang w:val="en-US"/>
         </w:rPr>
         <w:tab/>
-        <w:t>&lt;</w:t>
-      </w:r>
-      <w:proofErr w:type="spellStart"/>
-      <w:proofErr w:type="gramStart"/>
-      <w:r>
-        <w:rPr>
-          <w:sz w:val="24"/>
-          <w:szCs w:val="22"/>
-          <w:lang w:val="en-US"/>
-        </w:rPr>
-        <w:t>th</w:t>
-      </w:r>
-      <w:proofErr w:type="spellEnd"/>
-      <w:r>
-        <w:rPr>
-          <w:sz w:val="24"/>
-          <w:szCs w:val="22"/>
-          <w:lang w:val="en-US"/>
-        </w:rPr>
-        <w:t>&gt;</w:t>
-      </w:r>
-      <w:proofErr w:type="gramEnd"/>
-      <w:r>
-        <w:rPr>
-          <w:sz w:val="24"/>
-          <w:szCs w:val="22"/>
-          <w:lang w:val="en-US"/>
-        </w:rPr>
-        <w:t>Company&lt;/</w:t>
-      </w:r>
-      <w:proofErr w:type="spellStart"/>
-      <w:r>
-        <w:rPr>
-          <w:sz w:val="24"/>
-          <w:szCs w:val="22"/>
-          <w:lang w:val="en-US"/>
-        </w:rPr>
-        <w:t>th</w:t>
-      </w:r>
-      <w:proofErr w:type="spellEnd"/>
-      <w:r>
-        <w:rPr>
-          <w:sz w:val="24"/>
-          <w:szCs w:val="22"/>
-          <w:lang w:val="en-US"/>
-        </w:rPr>
-        <w:t>&gt;</w:t>
+        <w:t>&lt;th&gt;Company&lt;/th&gt;</w:t>
       </w:r>
     </w:p>
     <w:p>
@@ -6959,27 +6444,7 @@
           <w:lang w:val="en-US"/>
         </w:rPr>
         <w:tab/>
-        <w:t>&lt;/</w:t>
-      </w:r>
-      <w:proofErr w:type="spellStart"/>
-      <w:proofErr w:type="gramStart"/>
-      <w:r>
-        <w:rPr>
-          <w:sz w:val="24"/>
-          <w:szCs w:val="22"/>
-          <w:lang w:val="en-US"/>
-        </w:rPr>
-        <w:t>tr</w:t>
-      </w:r>
-      <w:proofErr w:type="spellEnd"/>
-      <w:proofErr w:type="gramEnd"/>
-      <w:r>
-        <w:rPr>
-          <w:sz w:val="24"/>
-          <w:szCs w:val="22"/>
-          <w:lang w:val="en-US"/>
-        </w:rPr>
-        <w:t>&gt;</w:t>
+        <w:t>&lt;/tr&gt;</w:t>
       </w:r>
     </w:p>
     <w:p>
@@ -6997,25 +6462,7 @@
           <w:lang w:val="en-US"/>
         </w:rPr>
         <w:tab/>
-        <w:t>&lt;/</w:t>
-      </w:r>
-      <w:proofErr w:type="spellStart"/>
-      <w:r>
-        <w:rPr>
-          <w:sz w:val="24"/>
-          <w:szCs w:val="22"/>
-          <w:lang w:val="en-US"/>
-        </w:rPr>
-        <w:t>thead</w:t>
-      </w:r>
-      <w:proofErr w:type="spellEnd"/>
-      <w:r>
-        <w:rPr>
-          <w:sz w:val="24"/>
-          <w:szCs w:val="22"/>
-          <w:lang w:val="en-US"/>
-        </w:rPr>
-        <w:t>&gt;</w:t>
+        <w:t>&lt;/thead&gt;</w:t>
       </w:r>
     </w:p>
     <w:p>
@@ -7033,27 +6480,7 @@
           <w:lang w:val="en-US"/>
         </w:rPr>
         <w:tab/>
-        <w:t>&lt;</w:t>
-      </w:r>
-      <w:proofErr w:type="spellStart"/>
-      <w:proofErr w:type="gramStart"/>
-      <w:r>
-        <w:rPr>
-          <w:sz w:val="24"/>
-          <w:szCs w:val="22"/>
-          <w:lang w:val="en-US"/>
-        </w:rPr>
-        <w:t>tbody</w:t>
-      </w:r>
-      <w:proofErr w:type="spellEnd"/>
-      <w:proofErr w:type="gramEnd"/>
-      <w:r>
-        <w:rPr>
-          <w:sz w:val="24"/>
-          <w:szCs w:val="22"/>
-          <w:lang w:val="en-US"/>
-        </w:rPr>
-        <w:t>&gt;</w:t>
+        <w:t>&lt;tbody&gt;</w:t>
       </w:r>
       <w:r>
         <w:rPr>
@@ -7088,27 +6515,7 @@
           <w:lang w:val="en-US"/>
         </w:rPr>
         <w:tab/>
-        <w:t>&lt;</w:t>
-      </w:r>
-      <w:proofErr w:type="spellStart"/>
-      <w:proofErr w:type="gramStart"/>
-      <w:r>
-        <w:rPr>
-          <w:sz w:val="24"/>
-          <w:szCs w:val="22"/>
-          <w:lang w:val="en-US"/>
-        </w:rPr>
-        <w:t>tr</w:t>
-      </w:r>
-      <w:proofErr w:type="spellEnd"/>
-      <w:proofErr w:type="gramEnd"/>
-      <w:r>
-        <w:rPr>
-          <w:sz w:val="24"/>
-          <w:szCs w:val="22"/>
-          <w:lang w:val="en-US"/>
-        </w:rPr>
-        <w:t>&gt;</w:t>
+        <w:t>&lt;tr&gt;</w:t>
       </w:r>
     </w:p>
     <w:p>
@@ -7142,25 +6549,7 @@
           <w:lang w:val="en-US"/>
         </w:rPr>
         <w:tab/>
-        <w:t>&lt;</w:t>
-      </w:r>
-      <w:proofErr w:type="gramStart"/>
-      <w:r>
-        <w:rPr>
-          <w:sz w:val="24"/>
-          <w:szCs w:val="22"/>
-          <w:lang w:val="en-US"/>
-        </w:rPr>
-        <w:t>td&gt;</w:t>
-      </w:r>
-      <w:proofErr w:type="gramEnd"/>
-      <w:r>
-        <w:rPr>
-          <w:sz w:val="24"/>
-          <w:szCs w:val="22"/>
-          <w:lang w:val="en-US"/>
-        </w:rPr>
-        <w:t>1&lt;/td&gt;</w:t>
+        <w:t>&lt;td&gt;1&lt;/td&gt;</w:t>
       </w:r>
     </w:p>
     <w:p>
@@ -7194,35 +6583,7 @@
           <w:lang w:val="en-US"/>
         </w:rPr>
         <w:tab/>
-        <w:t>&lt;</w:t>
-      </w:r>
-      <w:proofErr w:type="gramStart"/>
-      <w:r>
-        <w:rPr>
-          <w:sz w:val="24"/>
-          <w:szCs w:val="22"/>
-          <w:lang w:val="en-US"/>
-        </w:rPr>
-        <w:t>td&gt;</w:t>
-      </w:r>
-      <w:proofErr w:type="spellStart"/>
-      <w:proofErr w:type="gramEnd"/>
-      <w:r>
-        <w:rPr>
-          <w:sz w:val="24"/>
-          <w:szCs w:val="22"/>
-          <w:lang w:val="en-US"/>
-        </w:rPr>
-        <w:t>AViIT</w:t>
-      </w:r>
-      <w:proofErr w:type="spellEnd"/>
-      <w:r>
-        <w:rPr>
-          <w:sz w:val="24"/>
-          <w:szCs w:val="22"/>
-          <w:lang w:val="en-US"/>
-        </w:rPr>
-        <w:t>&lt;/td&gt;</w:t>
+        <w:t>&lt;td&gt;AViIT&lt;/td&gt;</w:t>
       </w:r>
     </w:p>
     <w:p>
@@ -7248,27 +6609,7 @@
           <w:lang w:val="en-US"/>
         </w:rPr>
         <w:tab/>
-        <w:t>&lt;/</w:t>
-      </w:r>
-      <w:proofErr w:type="spellStart"/>
-      <w:proofErr w:type="gramStart"/>
-      <w:r>
-        <w:rPr>
-          <w:sz w:val="24"/>
-          <w:szCs w:val="22"/>
-          <w:lang w:val="en-US"/>
-        </w:rPr>
-        <w:t>tr</w:t>
-      </w:r>
-      <w:proofErr w:type="spellEnd"/>
-      <w:proofErr w:type="gramEnd"/>
-      <w:r>
-        <w:rPr>
-          <w:sz w:val="24"/>
-          <w:szCs w:val="22"/>
-          <w:lang w:val="en-US"/>
-        </w:rPr>
-        <w:t>&gt;</w:t>
+        <w:t>&lt;/tr&gt;</w:t>
       </w:r>
     </w:p>
     <w:p>
@@ -7294,27 +6635,7 @@
           <w:lang w:val="en-US"/>
         </w:rPr>
         <w:tab/>
-        <w:t>&lt;</w:t>
-      </w:r>
-      <w:proofErr w:type="spellStart"/>
-      <w:proofErr w:type="gramStart"/>
-      <w:r>
-        <w:rPr>
-          <w:sz w:val="24"/>
-          <w:szCs w:val="22"/>
-          <w:lang w:val="en-US"/>
-        </w:rPr>
-        <w:t>tr</w:t>
-      </w:r>
-      <w:proofErr w:type="spellEnd"/>
-      <w:proofErr w:type="gramEnd"/>
-      <w:r>
-        <w:rPr>
-          <w:sz w:val="24"/>
-          <w:szCs w:val="22"/>
-          <w:lang w:val="en-US"/>
-        </w:rPr>
-        <w:t>&gt;</w:t>
+        <w:t>&lt;tr&gt;</w:t>
       </w:r>
     </w:p>
     <w:p>
@@ -7348,25 +6669,7 @@
           <w:lang w:val="en-US"/>
         </w:rPr>
         <w:tab/>
-        <w:t>&lt;</w:t>
-      </w:r>
-      <w:proofErr w:type="gramStart"/>
-      <w:r>
-        <w:rPr>
-          <w:sz w:val="24"/>
-          <w:szCs w:val="22"/>
-          <w:lang w:val="en-US"/>
-        </w:rPr>
-        <w:t>td&gt;</w:t>
-      </w:r>
-      <w:proofErr w:type="gramEnd"/>
-      <w:r>
-        <w:rPr>
-          <w:sz w:val="24"/>
-          <w:szCs w:val="22"/>
-          <w:lang w:val="en-US"/>
-        </w:rPr>
-        <w:t>2&lt;/td&gt;</w:t>
+        <w:t>&lt;td&gt;2&lt;/td&gt;</w:t>
       </w:r>
     </w:p>
     <w:p>
@@ -7400,35 +6703,7 @@
           <w:lang w:val="en-US"/>
         </w:rPr>
         <w:tab/>
-        <w:t>&lt;</w:t>
-      </w:r>
-      <w:proofErr w:type="gramStart"/>
-      <w:r>
-        <w:rPr>
-          <w:sz w:val="24"/>
-          <w:szCs w:val="22"/>
-          <w:lang w:val="en-US"/>
-        </w:rPr>
-        <w:t>td&gt;</w:t>
-      </w:r>
-      <w:proofErr w:type="spellStart"/>
-      <w:proofErr w:type="gramEnd"/>
-      <w:r>
-        <w:rPr>
-          <w:sz w:val="24"/>
-          <w:szCs w:val="22"/>
-          <w:lang w:val="en-US"/>
-        </w:rPr>
-        <w:t>Manorama</w:t>
-      </w:r>
-      <w:proofErr w:type="spellEnd"/>
-      <w:r>
-        <w:rPr>
-          <w:sz w:val="24"/>
-          <w:szCs w:val="22"/>
-          <w:lang w:val="en-US"/>
-        </w:rPr>
-        <w:t>&lt;/td</w:t>
+        <w:t>&lt;td&gt;Manorama&lt;/td</w:t>
       </w:r>
     </w:p>
     <w:p>
@@ -7454,27 +6729,7 @@
           <w:lang w:val="en-US"/>
         </w:rPr>
         <w:tab/>
-        <w:t>&lt;/</w:t>
-      </w:r>
-      <w:proofErr w:type="spellStart"/>
-      <w:proofErr w:type="gramStart"/>
-      <w:r>
-        <w:rPr>
-          <w:sz w:val="24"/>
-          <w:szCs w:val="22"/>
-          <w:lang w:val="en-US"/>
-        </w:rPr>
-        <w:t>tr</w:t>
-      </w:r>
-      <w:proofErr w:type="spellEnd"/>
-      <w:proofErr w:type="gramEnd"/>
-      <w:r>
-        <w:rPr>
-          <w:sz w:val="24"/>
-          <w:szCs w:val="22"/>
-          <w:lang w:val="en-US"/>
-        </w:rPr>
-        <w:t>&gt;</w:t>
+        <w:t>&lt;/tr&gt;</w:t>
       </w:r>
     </w:p>
     <w:p>
@@ -7492,25 +6747,7 @@
           <w:lang w:val="en-US"/>
         </w:rPr>
         <w:tab/>
-        <w:t>&lt;/</w:t>
-      </w:r>
-      <w:proofErr w:type="spellStart"/>
-      <w:r>
-        <w:rPr>
-          <w:sz w:val="24"/>
-          <w:szCs w:val="22"/>
-          <w:lang w:val="en-US"/>
-        </w:rPr>
-        <w:t>tbody</w:t>
-      </w:r>
-      <w:proofErr w:type="spellEnd"/>
-      <w:r>
-        <w:rPr>
-          <w:sz w:val="24"/>
-          <w:szCs w:val="22"/>
-          <w:lang w:val="en-US"/>
-        </w:rPr>
-        <w:t>&gt;</w:t>
+        <w:t>&lt;/tbody&gt;</w:t>
       </w:r>
     </w:p>
     <w:p>
@@ -7610,25 +6847,7 @@
           <w:szCs w:val="22"/>
           <w:lang w:val="en-US"/>
         </w:rPr>
-        <w:t>For uploading any file with this control simply call .</w:t>
-      </w:r>
-      <w:proofErr w:type="gramStart"/>
-      <w:r>
-        <w:rPr>
-          <w:sz w:val="24"/>
-          <w:szCs w:val="22"/>
-          <w:lang w:val="en-US"/>
-        </w:rPr>
-        <w:t>sendKeys(</w:t>
-      </w:r>
-      <w:proofErr w:type="gramEnd"/>
-      <w:r>
-        <w:rPr>
-          <w:sz w:val="24"/>
-          <w:szCs w:val="22"/>
-          <w:lang w:val="en-US"/>
-        </w:rPr>
-        <w:t>) method.</w:t>
+        <w:t>For uploading any file with this control simply call .sendKeys() method.</w:t>
       </w:r>
     </w:p>
     <w:p>
@@ -7650,25 +6869,7 @@
           <w:szCs w:val="22"/>
           <w:lang w:val="en-US"/>
         </w:rPr>
-        <w:t>While calling .</w:t>
-      </w:r>
-      <w:proofErr w:type="gramStart"/>
-      <w:r>
-        <w:rPr>
-          <w:sz w:val="24"/>
-          <w:szCs w:val="22"/>
-          <w:lang w:val="en-US"/>
-        </w:rPr>
-        <w:t>sendKeys(</w:t>
-      </w:r>
-      <w:proofErr w:type="gramEnd"/>
-      <w:r>
-        <w:rPr>
-          <w:sz w:val="24"/>
-          <w:szCs w:val="22"/>
-          <w:lang w:val="en-US"/>
-        </w:rPr>
-        <w:t>) method pass the full path of the file.</w:t>
+        <w:t>While calling .sendKeys() method pass the full path of the file.</w:t>
       </w:r>
     </w:p>
     <w:p>
@@ -8048,23 +7249,13 @@
           <w:lang w:val="en-US"/>
         </w:rPr>
       </w:pPr>
-      <w:proofErr w:type="gramStart"/>
-      <w:r>
-        <w:rPr>
-          <w:sz w:val="24"/>
-          <w:szCs w:val="22"/>
-          <w:lang w:val="en-US"/>
-        </w:rPr>
-        <w:t>moveToElement(</w:t>
-      </w:r>
-      <w:proofErr w:type="gramEnd"/>
-      <w:r>
-        <w:rPr>
-          <w:sz w:val="24"/>
-          <w:szCs w:val="22"/>
-          <w:lang w:val="en-US"/>
-        </w:rPr>
-        <w:t xml:space="preserve">) </w:t>
+      <w:r>
+        <w:rPr>
+          <w:sz w:val="24"/>
+          <w:szCs w:val="22"/>
+          <w:lang w:val="en-US"/>
+        </w:rPr>
+        <w:t xml:space="preserve">moveToElement() </w:t>
       </w:r>
       <w:r>
         <w:rPr>
@@ -8096,23 +7287,13 @@
           <w:lang w:val="en-US"/>
         </w:rPr>
       </w:pPr>
-      <w:proofErr w:type="gramStart"/>
-      <w:r>
-        <w:rPr>
-          <w:sz w:val="24"/>
-          <w:szCs w:val="22"/>
-          <w:lang w:val="en-US"/>
-        </w:rPr>
-        <w:t>perform(</w:t>
-      </w:r>
-      <w:proofErr w:type="gramEnd"/>
-      <w:r>
-        <w:rPr>
-          <w:sz w:val="24"/>
-          <w:szCs w:val="22"/>
-          <w:lang w:val="en-US"/>
-        </w:rPr>
-        <w:t xml:space="preserve">) </w:t>
+      <w:r>
+        <w:rPr>
+          <w:sz w:val="24"/>
+          <w:szCs w:val="22"/>
+          <w:lang w:val="en-US"/>
+        </w:rPr>
+        <w:t xml:space="preserve">perform() </w:t>
       </w:r>
       <w:r>
         <w:rPr>
@@ -8144,23 +7325,13 @@
           <w:lang w:val="en-US"/>
         </w:rPr>
       </w:pPr>
-      <w:proofErr w:type="gramStart"/>
-      <w:r>
-        <w:rPr>
-          <w:sz w:val="24"/>
-          <w:szCs w:val="22"/>
-          <w:lang w:val="en-US"/>
-        </w:rPr>
-        <w:t>contextClick(</w:t>
-      </w:r>
-      <w:proofErr w:type="gramEnd"/>
-      <w:r>
-        <w:rPr>
-          <w:sz w:val="24"/>
-          <w:szCs w:val="22"/>
-          <w:lang w:val="en-US"/>
-        </w:rPr>
-        <w:t xml:space="preserve">) </w:t>
+      <w:r>
+        <w:rPr>
+          <w:sz w:val="24"/>
+          <w:szCs w:val="22"/>
+          <w:lang w:val="en-US"/>
+        </w:rPr>
+        <w:t xml:space="preserve">contextClick() </w:t>
       </w:r>
       <w:r>
         <w:rPr>
@@ -8192,23 +7363,13 @@
           <w:lang w:val="en-US"/>
         </w:rPr>
       </w:pPr>
-      <w:proofErr w:type="gramStart"/>
-      <w:r>
-        <w:rPr>
-          <w:sz w:val="24"/>
-          <w:szCs w:val="22"/>
-          <w:lang w:val="en-US"/>
-        </w:rPr>
-        <w:t>doubleClick(</w:t>
-      </w:r>
-      <w:proofErr w:type="gramEnd"/>
-      <w:r>
-        <w:rPr>
-          <w:sz w:val="24"/>
-          <w:szCs w:val="22"/>
-          <w:lang w:val="en-US"/>
-        </w:rPr>
-        <w:t xml:space="preserve">) </w:t>
+      <w:r>
+        <w:rPr>
+          <w:sz w:val="24"/>
+          <w:szCs w:val="22"/>
+          <w:lang w:val="en-US"/>
+        </w:rPr>
+        <w:t xml:space="preserve">doubleClick() </w:t>
       </w:r>
       <w:r>
         <w:rPr>
@@ -8240,6 +7401,30 @@
           <w:lang w:val="en-US"/>
         </w:rPr>
       </w:pPr>
+      <w:r>
+        <w:rPr>
+          <w:sz w:val="24"/>
+          <w:szCs w:val="22"/>
+          <w:lang w:val="en-US"/>
+        </w:rPr>
+        <w:t xml:space="preserve">dragAndDrop() </w:t>
+      </w:r>
+      <w:r>
+        <w:rPr>
+          <w:sz w:val="24"/>
+          <w:szCs w:val="22"/>
+          <w:lang w:val="en-US"/>
+        </w:rPr>
+        <w:sym w:font="Wingdings" w:char="F0E0"/>
+      </w:r>
+      <w:r>
+        <w:rPr>
+          <w:sz w:val="24"/>
+          <w:szCs w:val="22"/>
+          <w:lang w:val="en-US"/>
+        </w:rPr>
+        <w:t xml:space="preserve"> Will drag a source and will drop on a target.</w:t>
+      </w:r>
       <w:bookmarkStart w:id="0" w:name="_GoBack"/>
       <w:bookmarkEnd w:id="0"/>
     </w:p>

</xml_diff>

<commit_message>
Date: 31 Mar 2026
</commit_message>
<xml_diff>
--- a/SeleniumNotes.docx
+++ b/SeleniumNotes.docx
@@ -1926,7 +1926,6 @@
           <w:lang w:val="en-US"/>
         </w:rPr>
       </w:pPr>
-      <w:proofErr w:type="spellStart"/>
       <w:r>
         <w:rPr>
           <w:sz w:val="24"/>
@@ -1935,7 +1934,6 @@
         </w:rPr>
         <w:t>YourName_SeleniumDemos</w:t>
       </w:r>
-      <w:proofErr w:type="spellEnd"/>
     </w:p>
     <w:p>
       <w:pPr>
@@ -1978,25 +1976,7 @@
           <w:szCs w:val="22"/>
           <w:lang w:val="en-US"/>
         </w:rPr>
-        <w:t xml:space="preserve">Launch </w:t>
-      </w:r>
-      <w:proofErr w:type="spellStart"/>
-      <w:r>
-        <w:rPr>
-          <w:sz w:val="24"/>
-          <w:szCs w:val="22"/>
-          <w:lang w:val="en-US"/>
-        </w:rPr>
-        <w:t>selenium.dev</w:t>
-      </w:r>
-      <w:proofErr w:type="spellEnd"/>
-      <w:r>
-        <w:rPr>
-          <w:sz w:val="24"/>
-          <w:szCs w:val="22"/>
-          <w:lang w:val="en-US"/>
-        </w:rPr>
-        <w:t xml:space="preserve"> site</w:t>
+        <w:t>Launch selenium.dev site</w:t>
       </w:r>
       <w:r>
         <w:rPr>
@@ -2659,18 +2639,8 @@
           <w:szCs w:val="22"/>
           <w:lang w:val="en-US"/>
         </w:rPr>
-        <w:t xml:space="preserve">Click on </w:t>
-      </w:r>
-      <w:proofErr w:type="spellStart"/>
-      <w:r>
-        <w:rPr>
-          <w:sz w:val="24"/>
-          <w:szCs w:val="22"/>
-          <w:lang w:val="en-US"/>
-        </w:rPr>
-        <w:t>ClassPath</w:t>
-      </w:r>
-      <w:proofErr w:type="spellEnd"/>
+        <w:t>Click on ClassPath</w:t>
+      </w:r>
     </w:p>
     <w:p>
       <w:pPr>
@@ -2691,18 +2661,8 @@
           <w:szCs w:val="22"/>
           <w:lang w:val="en-US"/>
         </w:rPr>
-        <w:t>Click on Add External JARs</w:t>
-      </w:r>
-      <w:proofErr w:type="gramStart"/>
-      <w:r>
-        <w:rPr>
-          <w:sz w:val="24"/>
-          <w:szCs w:val="22"/>
-          <w:lang w:val="en-US"/>
-        </w:rPr>
-        <w:t>..</w:t>
-      </w:r>
-      <w:proofErr w:type="gramEnd"/>
+        <w:t>Click on Add External JARs..</w:t>
+      </w:r>
     </w:p>
     <w:p>
       <w:pPr>
@@ -2911,23 +2871,13 @@
           <w:lang w:val="en-US"/>
         </w:rPr>
       </w:pPr>
-      <w:proofErr w:type="gramStart"/>
-      <w:r>
-        <w:rPr>
-          <w:sz w:val="24"/>
-          <w:szCs w:val="22"/>
-          <w:lang w:val="en-US"/>
-        </w:rPr>
-        <w:t>get(</w:t>
-      </w:r>
-      <w:proofErr w:type="gramEnd"/>
-      <w:r>
-        <w:rPr>
-          <w:sz w:val="24"/>
-          <w:szCs w:val="22"/>
-          <w:lang w:val="en-US"/>
-        </w:rPr>
-        <w:t xml:space="preserve">) </w:t>
+      <w:r>
+        <w:rPr>
+          <w:sz w:val="24"/>
+          <w:szCs w:val="22"/>
+          <w:lang w:val="en-US"/>
+        </w:rPr>
+        <w:t xml:space="preserve">get() </w:t>
       </w:r>
       <w:r>
         <w:rPr>
@@ -2959,33 +2909,13 @@
           <w:lang w:val="en-US"/>
         </w:rPr>
       </w:pPr>
-      <w:proofErr w:type="spellStart"/>
-      <w:proofErr w:type="gramStart"/>
-      <w:r>
-        <w:rPr>
-          <w:sz w:val="24"/>
-          <w:szCs w:val="22"/>
-          <w:lang w:val="en-US"/>
-        </w:rPr>
-        <w:t>driver.manage</w:t>
-      </w:r>
-      <w:proofErr w:type="spellEnd"/>
-      <w:r>
-        <w:rPr>
-          <w:sz w:val="24"/>
-          <w:szCs w:val="22"/>
-          <w:lang w:val="en-US"/>
-        </w:rPr>
-        <w:t>(</w:t>
-      </w:r>
-      <w:proofErr w:type="gramEnd"/>
-      <w:r>
-        <w:rPr>
-          <w:sz w:val="24"/>
-          <w:szCs w:val="22"/>
-          <w:lang w:val="en-US"/>
-        </w:rPr>
-        <w:t xml:space="preserve">).window().maximize() </w:t>
+      <w:r>
+        <w:rPr>
+          <w:sz w:val="24"/>
+          <w:szCs w:val="22"/>
+          <w:lang w:val="en-US"/>
+        </w:rPr>
+        <w:t xml:space="preserve">driver.manage().window().maximize() </w:t>
       </w:r>
       <w:r>
         <w:rPr>
@@ -3017,23 +2947,13 @@
           <w:lang w:val="en-US"/>
         </w:rPr>
       </w:pPr>
-      <w:proofErr w:type="gramStart"/>
-      <w:r>
-        <w:rPr>
-          <w:sz w:val="24"/>
-          <w:szCs w:val="22"/>
-          <w:lang w:val="en-US"/>
-        </w:rPr>
-        <w:t>close(</w:t>
-      </w:r>
-      <w:proofErr w:type="gramEnd"/>
-      <w:r>
-        <w:rPr>
-          <w:sz w:val="24"/>
-          <w:szCs w:val="22"/>
-          <w:lang w:val="en-US"/>
-        </w:rPr>
-        <w:t xml:space="preserve">) </w:t>
+      <w:r>
+        <w:rPr>
+          <w:sz w:val="24"/>
+          <w:szCs w:val="22"/>
+          <w:lang w:val="en-US"/>
+        </w:rPr>
+        <w:t xml:space="preserve">close() </w:t>
       </w:r>
       <w:r>
         <w:rPr>
@@ -3065,23 +2985,13 @@
           <w:lang w:val="en-US"/>
         </w:rPr>
       </w:pPr>
-      <w:proofErr w:type="gramStart"/>
-      <w:r>
-        <w:rPr>
-          <w:sz w:val="24"/>
-          <w:szCs w:val="22"/>
-          <w:lang w:val="en-US"/>
-        </w:rPr>
-        <w:t>getTitle(</w:t>
-      </w:r>
-      <w:proofErr w:type="gramEnd"/>
-      <w:r>
-        <w:rPr>
-          <w:sz w:val="24"/>
-          <w:szCs w:val="22"/>
-          <w:lang w:val="en-US"/>
-        </w:rPr>
-        <w:t xml:space="preserve">) </w:t>
+      <w:r>
+        <w:rPr>
+          <w:sz w:val="24"/>
+          <w:szCs w:val="22"/>
+          <w:lang w:val="en-US"/>
+        </w:rPr>
+        <w:t xml:space="preserve">getTitle() </w:t>
       </w:r>
       <w:r>
         <w:rPr>
@@ -3113,23 +3023,13 @@
           <w:lang w:val="en-US"/>
         </w:rPr>
       </w:pPr>
-      <w:proofErr w:type="gramStart"/>
-      <w:r>
-        <w:rPr>
-          <w:sz w:val="24"/>
-          <w:szCs w:val="22"/>
-          <w:lang w:val="en-US"/>
-        </w:rPr>
-        <w:t>getCurrentUrl(</w:t>
-      </w:r>
-      <w:proofErr w:type="gramEnd"/>
-      <w:r>
-        <w:rPr>
-          <w:sz w:val="24"/>
-          <w:szCs w:val="22"/>
-          <w:lang w:val="en-US"/>
-        </w:rPr>
-        <w:t xml:space="preserve">) </w:t>
+      <w:r>
+        <w:rPr>
+          <w:sz w:val="24"/>
+          <w:szCs w:val="22"/>
+          <w:lang w:val="en-US"/>
+        </w:rPr>
+        <w:t xml:space="preserve">getCurrentUrl() </w:t>
       </w:r>
       <w:r>
         <w:rPr>
@@ -3161,23 +3061,13 @@
           <w:lang w:val="en-US"/>
         </w:rPr>
       </w:pPr>
-      <w:proofErr w:type="gramStart"/>
-      <w:r>
-        <w:rPr>
-          <w:sz w:val="24"/>
-          <w:szCs w:val="22"/>
-          <w:lang w:val="en-US"/>
-        </w:rPr>
-        <w:t>getPageSource(</w:t>
-      </w:r>
-      <w:proofErr w:type="gramEnd"/>
-      <w:r>
-        <w:rPr>
-          <w:sz w:val="24"/>
-          <w:szCs w:val="22"/>
-          <w:lang w:val="en-US"/>
-        </w:rPr>
-        <w:t xml:space="preserve">) </w:t>
+      <w:r>
+        <w:rPr>
+          <w:sz w:val="24"/>
+          <w:szCs w:val="22"/>
+          <w:lang w:val="en-US"/>
+        </w:rPr>
+        <w:t xml:space="preserve">getPageSource() </w:t>
       </w:r>
       <w:r>
         <w:rPr>
@@ -3209,23 +3099,13 @@
           <w:lang w:val="en-US"/>
         </w:rPr>
       </w:pPr>
-      <w:proofErr w:type="gramStart"/>
-      <w:r>
-        <w:rPr>
-          <w:sz w:val="24"/>
-          <w:szCs w:val="22"/>
-          <w:lang w:val="en-US"/>
-        </w:rPr>
-        <w:t>findElement(</w:t>
-      </w:r>
-      <w:proofErr w:type="gramEnd"/>
-      <w:r>
-        <w:rPr>
-          <w:sz w:val="24"/>
-          <w:szCs w:val="22"/>
-          <w:lang w:val="en-US"/>
-        </w:rPr>
-        <w:t xml:space="preserve">) </w:t>
+      <w:r>
+        <w:rPr>
+          <w:sz w:val="24"/>
+          <w:szCs w:val="22"/>
+          <w:lang w:val="en-US"/>
+        </w:rPr>
+        <w:t xml:space="preserve">findElement() </w:t>
       </w:r>
       <w:r>
         <w:rPr>
@@ -3275,23 +3155,13 @@
           <w:lang w:val="en-US"/>
         </w:rPr>
       </w:pPr>
-      <w:proofErr w:type="gramStart"/>
-      <w:r>
-        <w:rPr>
-          <w:sz w:val="24"/>
-          <w:szCs w:val="22"/>
-          <w:lang w:val="en-US"/>
-        </w:rPr>
-        <w:t>findElements(</w:t>
-      </w:r>
-      <w:proofErr w:type="gramEnd"/>
-      <w:r>
-        <w:rPr>
-          <w:sz w:val="24"/>
-          <w:szCs w:val="22"/>
-          <w:lang w:val="en-US"/>
-        </w:rPr>
-        <w:t xml:space="preserve">) </w:t>
+      <w:r>
+        <w:rPr>
+          <w:sz w:val="24"/>
+          <w:szCs w:val="22"/>
+          <w:lang w:val="en-US"/>
+        </w:rPr>
+        <w:t xml:space="preserve">findElements() </w:t>
       </w:r>
       <w:r>
         <w:rPr>
@@ -3323,23 +3193,13 @@
           <w:lang w:val="en-US"/>
         </w:rPr>
       </w:pPr>
-      <w:proofErr w:type="gramStart"/>
-      <w:r>
-        <w:rPr>
-          <w:sz w:val="24"/>
-          <w:szCs w:val="22"/>
-          <w:lang w:val="en-US"/>
-        </w:rPr>
-        <w:t>getWindowHandles(</w:t>
-      </w:r>
-      <w:proofErr w:type="gramEnd"/>
-      <w:r>
-        <w:rPr>
-          <w:sz w:val="24"/>
-          <w:szCs w:val="22"/>
-          <w:lang w:val="en-US"/>
-        </w:rPr>
-        <w:t xml:space="preserve">) </w:t>
+      <w:r>
+        <w:rPr>
+          <w:sz w:val="24"/>
+          <w:szCs w:val="22"/>
+          <w:lang w:val="en-US"/>
+        </w:rPr>
+        <w:t xml:space="preserve">getWindowHandles() </w:t>
       </w:r>
       <w:r>
         <w:rPr>
@@ -3371,23 +3231,13 @@
           <w:lang w:val="en-US"/>
         </w:rPr>
       </w:pPr>
-      <w:proofErr w:type="gramStart"/>
-      <w:r>
-        <w:rPr>
-          <w:sz w:val="24"/>
-          <w:szCs w:val="22"/>
-          <w:lang w:val="en-US"/>
-        </w:rPr>
-        <w:t>quit(</w:t>
-      </w:r>
-      <w:proofErr w:type="gramEnd"/>
-      <w:r>
-        <w:rPr>
-          <w:sz w:val="24"/>
-          <w:szCs w:val="22"/>
-          <w:lang w:val="en-US"/>
-        </w:rPr>
-        <w:t xml:space="preserve">) </w:t>
+      <w:r>
+        <w:rPr>
+          <w:sz w:val="24"/>
+          <w:szCs w:val="22"/>
+          <w:lang w:val="en-US"/>
+        </w:rPr>
+        <w:t xml:space="preserve">quit() </w:t>
       </w:r>
       <w:r>
         <w:rPr>
@@ -3768,25 +3618,7 @@
           <w:szCs w:val="22"/>
           <w:lang w:val="en-US"/>
         </w:rPr>
-        <w:t xml:space="preserve"> </w:t>
-      </w:r>
-      <w:proofErr w:type="spellStart"/>
-      <w:r>
-        <w:rPr>
-          <w:sz w:val="24"/>
-          <w:szCs w:val="22"/>
-          <w:lang w:val="en-US"/>
-        </w:rPr>
-        <w:t>driver.get</w:t>
-      </w:r>
-      <w:proofErr w:type="spellEnd"/>
-      <w:r>
-        <w:rPr>
-          <w:sz w:val="24"/>
-          <w:szCs w:val="22"/>
-          <w:lang w:val="en-US"/>
-        </w:rPr>
-        <w:t>() is having implicit wait of 30 seconds, means Selenium will wait for maximum 30 seconds till the page get loaded. But if the page is not getting loaded within 30 seconds, Selenium will throw SessionTimeoutException.</w:t>
+        <w:t xml:space="preserve"> driver.get() is having implicit wait of 30 seconds, means Selenium will wait for maximum 30 seconds till the page get loaded. But if the page is not getting loaded within 30 seconds, Selenium will throw SessionTimeoutException.</w:t>
       </w:r>
     </w:p>
     <w:p>
@@ -4048,23 +3880,13 @@
           <w:lang w:val="en-US"/>
         </w:rPr>
       </w:pPr>
-      <w:proofErr w:type="gramStart"/>
-      <w:r>
-        <w:rPr>
-          <w:sz w:val="24"/>
-          <w:szCs w:val="22"/>
-          <w:lang w:val="en-US"/>
-        </w:rPr>
-        <w:t>sendKeys(</w:t>
-      </w:r>
-      <w:proofErr w:type="gramEnd"/>
-      <w:r>
-        <w:rPr>
-          <w:sz w:val="24"/>
-          <w:szCs w:val="22"/>
-          <w:lang w:val="en-US"/>
-        </w:rPr>
-        <w:t xml:space="preserve">) </w:t>
+      <w:r>
+        <w:rPr>
+          <w:sz w:val="24"/>
+          <w:szCs w:val="22"/>
+          <w:lang w:val="en-US"/>
+        </w:rPr>
+        <w:t xml:space="preserve">sendKeys() </w:t>
       </w:r>
       <w:r>
         <w:rPr>
@@ -4104,23 +3926,13 @@
           <w:lang w:val="en-US"/>
         </w:rPr>
       </w:pPr>
-      <w:proofErr w:type="gramStart"/>
-      <w:r>
-        <w:rPr>
-          <w:sz w:val="24"/>
-          <w:szCs w:val="22"/>
-          <w:lang w:val="en-US"/>
-        </w:rPr>
-        <w:t>click(</w:t>
-      </w:r>
-      <w:proofErr w:type="gramEnd"/>
-      <w:r>
-        <w:rPr>
-          <w:sz w:val="24"/>
-          <w:szCs w:val="22"/>
-          <w:lang w:val="en-US"/>
-        </w:rPr>
-        <w:t xml:space="preserve">) </w:t>
+      <w:r>
+        <w:rPr>
+          <w:sz w:val="24"/>
+          <w:szCs w:val="22"/>
+          <w:lang w:val="en-US"/>
+        </w:rPr>
+        <w:t xml:space="preserve">click() </w:t>
       </w:r>
       <w:r>
         <w:rPr>
@@ -4152,23 +3964,13 @@
           <w:lang w:val="en-US"/>
         </w:rPr>
       </w:pPr>
-      <w:proofErr w:type="gramStart"/>
-      <w:r>
-        <w:rPr>
-          <w:sz w:val="24"/>
-          <w:szCs w:val="22"/>
-          <w:lang w:val="en-US"/>
-        </w:rPr>
-        <w:t>getText(</w:t>
-      </w:r>
-      <w:proofErr w:type="gramEnd"/>
-      <w:r>
-        <w:rPr>
-          <w:sz w:val="24"/>
-          <w:szCs w:val="22"/>
-          <w:lang w:val="en-US"/>
-        </w:rPr>
-        <w:t xml:space="preserve">) </w:t>
+      <w:r>
+        <w:rPr>
+          <w:sz w:val="24"/>
+          <w:szCs w:val="22"/>
+          <w:lang w:val="en-US"/>
+        </w:rPr>
+        <w:t xml:space="preserve">getText() </w:t>
       </w:r>
       <w:r>
         <w:rPr>
@@ -4200,23 +4002,13 @@
           <w:lang w:val="en-US"/>
         </w:rPr>
       </w:pPr>
-      <w:proofErr w:type="gramStart"/>
-      <w:r>
-        <w:rPr>
-          <w:sz w:val="24"/>
-          <w:szCs w:val="22"/>
-          <w:lang w:val="en-US"/>
-        </w:rPr>
-        <w:t>getAttribute(</w:t>
-      </w:r>
-      <w:proofErr w:type="gramEnd"/>
-      <w:r>
-        <w:rPr>
-          <w:sz w:val="24"/>
-          <w:szCs w:val="22"/>
-          <w:lang w:val="en-US"/>
-        </w:rPr>
-        <w:t xml:space="preserve">) </w:t>
+      <w:r>
+        <w:rPr>
+          <w:sz w:val="24"/>
+          <w:szCs w:val="22"/>
+          <w:lang w:val="en-US"/>
+        </w:rPr>
+        <w:t xml:space="preserve">getAttribute() </w:t>
       </w:r>
       <w:r>
         <w:rPr>
@@ -4248,23 +4040,13 @@
           <w:lang w:val="en-US"/>
         </w:rPr>
       </w:pPr>
-      <w:proofErr w:type="gramStart"/>
-      <w:r>
-        <w:rPr>
-          <w:sz w:val="24"/>
-          <w:szCs w:val="22"/>
-          <w:lang w:val="en-US"/>
-        </w:rPr>
-        <w:t>isSelected(</w:t>
-      </w:r>
-      <w:proofErr w:type="gramEnd"/>
-      <w:r>
-        <w:rPr>
-          <w:sz w:val="24"/>
-          <w:szCs w:val="22"/>
-          <w:lang w:val="en-US"/>
-        </w:rPr>
-        <w:t xml:space="preserve">) </w:t>
+      <w:r>
+        <w:rPr>
+          <w:sz w:val="24"/>
+          <w:szCs w:val="22"/>
+          <w:lang w:val="en-US"/>
+        </w:rPr>
+        <w:t xml:space="preserve">isSelected() </w:t>
       </w:r>
       <w:r>
         <w:rPr>
@@ -4304,23 +4086,13 @@
           <w:lang w:val="en-US"/>
         </w:rPr>
       </w:pPr>
-      <w:proofErr w:type="gramStart"/>
-      <w:r>
-        <w:rPr>
-          <w:sz w:val="24"/>
-          <w:szCs w:val="22"/>
-          <w:lang w:val="en-US"/>
-        </w:rPr>
-        <w:t>isEnabled(</w:t>
-      </w:r>
-      <w:proofErr w:type="gramEnd"/>
-      <w:r>
-        <w:rPr>
-          <w:sz w:val="24"/>
-          <w:szCs w:val="22"/>
-          <w:lang w:val="en-US"/>
-        </w:rPr>
-        <w:t xml:space="preserve">) </w:t>
+      <w:r>
+        <w:rPr>
+          <w:sz w:val="24"/>
+          <w:szCs w:val="22"/>
+          <w:lang w:val="en-US"/>
+        </w:rPr>
+        <w:t xml:space="preserve">isEnabled() </w:t>
       </w:r>
       <w:r>
         <w:rPr>
@@ -4390,23 +4162,13 @@
           <w:lang w:val="en-US"/>
         </w:rPr>
       </w:pPr>
-      <w:proofErr w:type="gramStart"/>
-      <w:r>
-        <w:rPr>
-          <w:sz w:val="24"/>
-          <w:szCs w:val="22"/>
-          <w:lang w:val="en-US"/>
-        </w:rPr>
-        <w:t>clear(</w:t>
-      </w:r>
-      <w:proofErr w:type="gramEnd"/>
-      <w:r>
-        <w:rPr>
-          <w:sz w:val="24"/>
-          <w:szCs w:val="22"/>
-          <w:lang w:val="en-US"/>
-        </w:rPr>
-        <w:t xml:space="preserve">) </w:t>
+      <w:r>
+        <w:rPr>
+          <w:sz w:val="24"/>
+          <w:szCs w:val="22"/>
+          <w:lang w:val="en-US"/>
+        </w:rPr>
+        <w:t xml:space="preserve">clear() </w:t>
       </w:r>
       <w:r>
         <w:rPr>
@@ -5502,23 +5264,13 @@
           <w:lang w:val="en-US"/>
         </w:rPr>
       </w:pPr>
-      <w:proofErr w:type="gramStart"/>
-      <w:r>
-        <w:rPr>
-          <w:sz w:val="24"/>
-          <w:szCs w:val="22"/>
-          <w:lang w:val="en-US"/>
-        </w:rPr>
-        <w:t>getFirstSelectedOption(</w:t>
-      </w:r>
-      <w:proofErr w:type="gramEnd"/>
-      <w:r>
-        <w:rPr>
-          <w:sz w:val="24"/>
-          <w:szCs w:val="22"/>
-          <w:lang w:val="en-US"/>
-        </w:rPr>
-        <w:t xml:space="preserve">) </w:t>
+      <w:r>
+        <w:rPr>
+          <w:sz w:val="24"/>
+          <w:szCs w:val="22"/>
+          <w:lang w:val="en-US"/>
+        </w:rPr>
+        <w:t xml:space="preserve">getFirstSelectedOption() </w:t>
       </w:r>
       <w:r>
         <w:rPr>
@@ -5566,23 +5318,13 @@
           <w:lang w:val="en-US"/>
         </w:rPr>
       </w:pPr>
-      <w:proofErr w:type="gramStart"/>
-      <w:r>
-        <w:rPr>
-          <w:sz w:val="24"/>
-          <w:szCs w:val="22"/>
-          <w:lang w:val="en-US"/>
-        </w:rPr>
-        <w:t>getOptions(</w:t>
-      </w:r>
-      <w:proofErr w:type="gramEnd"/>
-      <w:r>
-        <w:rPr>
-          <w:sz w:val="24"/>
-          <w:szCs w:val="22"/>
-          <w:lang w:val="en-US"/>
-        </w:rPr>
-        <w:t xml:space="preserve">) </w:t>
+      <w:r>
+        <w:rPr>
+          <w:sz w:val="24"/>
+          <w:szCs w:val="22"/>
+          <w:lang w:val="en-US"/>
+        </w:rPr>
+        <w:t xml:space="preserve">getOptions() </w:t>
       </w:r>
       <w:r>
         <w:rPr>
@@ -5614,23 +5356,13 @@
           <w:lang w:val="en-US"/>
         </w:rPr>
       </w:pPr>
-      <w:proofErr w:type="gramStart"/>
-      <w:r>
-        <w:rPr>
-          <w:sz w:val="24"/>
-          <w:szCs w:val="22"/>
-          <w:lang w:val="en-US"/>
-        </w:rPr>
-        <w:t>selectByVisibleText(</w:t>
-      </w:r>
-      <w:proofErr w:type="gramEnd"/>
-      <w:r>
-        <w:rPr>
-          <w:sz w:val="24"/>
-          <w:szCs w:val="22"/>
-          <w:lang w:val="en-US"/>
-        </w:rPr>
-        <w:t xml:space="preserve">) </w:t>
+      <w:r>
+        <w:rPr>
+          <w:sz w:val="24"/>
+          <w:szCs w:val="22"/>
+          <w:lang w:val="en-US"/>
+        </w:rPr>
+        <w:t xml:space="preserve">selectByVisibleText() </w:t>
       </w:r>
       <w:r>
         <w:rPr>
@@ -5662,23 +5394,13 @@
           <w:lang w:val="en-US"/>
         </w:rPr>
       </w:pPr>
-      <w:proofErr w:type="gramStart"/>
-      <w:r>
-        <w:rPr>
-          <w:sz w:val="24"/>
-          <w:szCs w:val="22"/>
-          <w:lang w:val="en-US"/>
-        </w:rPr>
-        <w:t>selectByContainsVisibleText(</w:t>
-      </w:r>
-      <w:proofErr w:type="gramEnd"/>
-      <w:r>
-        <w:rPr>
-          <w:sz w:val="24"/>
-          <w:szCs w:val="22"/>
-          <w:lang w:val="en-US"/>
-        </w:rPr>
-        <w:t xml:space="preserve">) </w:t>
+      <w:r>
+        <w:rPr>
+          <w:sz w:val="24"/>
+          <w:szCs w:val="22"/>
+          <w:lang w:val="en-US"/>
+        </w:rPr>
+        <w:t xml:space="preserve">selectByContainsVisibleText() </w:t>
       </w:r>
       <w:r>
         <w:rPr>
@@ -5710,23 +5432,13 @@
           <w:lang w:val="en-US"/>
         </w:rPr>
       </w:pPr>
-      <w:proofErr w:type="gramStart"/>
-      <w:r>
-        <w:rPr>
-          <w:sz w:val="24"/>
-          <w:szCs w:val="22"/>
-          <w:lang w:val="en-US"/>
-        </w:rPr>
-        <w:t>selectByValue(</w:t>
-      </w:r>
-      <w:proofErr w:type="gramEnd"/>
-      <w:r>
-        <w:rPr>
-          <w:sz w:val="24"/>
-          <w:szCs w:val="22"/>
-          <w:lang w:val="en-US"/>
-        </w:rPr>
-        <w:t xml:space="preserve">) </w:t>
+      <w:r>
+        <w:rPr>
+          <w:sz w:val="24"/>
+          <w:szCs w:val="22"/>
+          <w:lang w:val="en-US"/>
+        </w:rPr>
+        <w:t xml:space="preserve">selectByValue() </w:t>
       </w:r>
       <w:r>
         <w:rPr>
@@ -5758,23 +5470,13 @@
           <w:lang w:val="en-US"/>
         </w:rPr>
       </w:pPr>
-      <w:proofErr w:type="gramStart"/>
-      <w:r>
-        <w:rPr>
-          <w:sz w:val="24"/>
-          <w:szCs w:val="22"/>
-          <w:lang w:val="en-US"/>
-        </w:rPr>
-        <w:t>selectByIndex(</w:t>
-      </w:r>
-      <w:proofErr w:type="gramEnd"/>
-      <w:r>
-        <w:rPr>
-          <w:sz w:val="24"/>
-          <w:szCs w:val="22"/>
-          <w:lang w:val="en-US"/>
-        </w:rPr>
-        <w:t xml:space="preserve">) </w:t>
+      <w:r>
+        <w:rPr>
+          <w:sz w:val="24"/>
+          <w:szCs w:val="22"/>
+          <w:lang w:val="en-US"/>
+        </w:rPr>
+        <w:t xml:space="preserve">selectByIndex() </w:t>
       </w:r>
       <w:r>
         <w:rPr>
@@ -5806,23 +5508,13 @@
           <w:lang w:val="en-US"/>
         </w:rPr>
       </w:pPr>
-      <w:proofErr w:type="gramStart"/>
-      <w:r>
-        <w:rPr>
-          <w:sz w:val="24"/>
-          <w:szCs w:val="22"/>
-          <w:lang w:val="en-US"/>
-        </w:rPr>
-        <w:t>getAllSelectedOptions(</w:t>
-      </w:r>
-      <w:proofErr w:type="gramEnd"/>
-      <w:r>
-        <w:rPr>
-          <w:sz w:val="24"/>
-          <w:szCs w:val="22"/>
-          <w:lang w:val="en-US"/>
-        </w:rPr>
-        <w:t xml:space="preserve">) </w:t>
+      <w:r>
+        <w:rPr>
+          <w:sz w:val="24"/>
+          <w:szCs w:val="22"/>
+          <w:lang w:val="en-US"/>
+        </w:rPr>
+        <w:t xml:space="preserve">getAllSelectedOptions() </w:t>
       </w:r>
       <w:r>
         <w:rPr>
@@ -5862,23 +5554,13 @@
           <w:lang w:val="en-US"/>
         </w:rPr>
       </w:pPr>
-      <w:proofErr w:type="gramStart"/>
-      <w:r>
-        <w:rPr>
-          <w:sz w:val="24"/>
-          <w:szCs w:val="22"/>
-          <w:lang w:val="en-US"/>
-        </w:rPr>
-        <w:t>isMultiple(</w:t>
-      </w:r>
-      <w:proofErr w:type="gramEnd"/>
-      <w:r>
-        <w:rPr>
-          <w:sz w:val="24"/>
-          <w:szCs w:val="22"/>
-          <w:lang w:val="en-US"/>
-        </w:rPr>
-        <w:t xml:space="preserve">) </w:t>
+      <w:r>
+        <w:rPr>
+          <w:sz w:val="24"/>
+          <w:szCs w:val="22"/>
+          <w:lang w:val="en-US"/>
+        </w:rPr>
+        <w:t xml:space="preserve">isMultiple() </w:t>
       </w:r>
       <w:r>
         <w:rPr>
@@ -6067,33 +5749,13 @@
           <w:lang w:val="en-US"/>
         </w:rPr>
       </w:pPr>
-      <w:proofErr w:type="spellStart"/>
-      <w:proofErr w:type="gramStart"/>
-      <w:r>
-        <w:rPr>
-          <w:sz w:val="24"/>
-          <w:szCs w:val="22"/>
-          <w:lang w:val="en-US"/>
-        </w:rPr>
-        <w:t>Thread.sleep</w:t>
-      </w:r>
-      <w:proofErr w:type="spellEnd"/>
-      <w:r>
-        <w:rPr>
-          <w:sz w:val="24"/>
-          <w:szCs w:val="22"/>
-          <w:lang w:val="en-US"/>
-        </w:rPr>
-        <w:t>(</w:t>
-      </w:r>
-      <w:proofErr w:type="gramEnd"/>
-      <w:r>
-        <w:rPr>
-          <w:sz w:val="24"/>
-          <w:szCs w:val="22"/>
-          <w:lang w:val="en-US"/>
-        </w:rPr>
-        <w:t>)</w:t>
+      <w:r>
+        <w:rPr>
+          <w:sz w:val="24"/>
+          <w:szCs w:val="22"/>
+          <w:lang w:val="en-US"/>
+        </w:rPr>
+        <w:t>Thread.sleep()</w:t>
       </w:r>
       <w:r>
         <w:rPr>
@@ -6527,24 +6189,7 @@
           <w:lang w:val="en-US"/>
         </w:rPr>
         <w:br/>
-      </w:r>
-      <w:proofErr w:type="spellStart"/>
-      <w:r>
-        <w:rPr>
-          <w:sz w:val="24"/>
-          <w:szCs w:val="22"/>
-          <w:lang w:val="en-US"/>
-        </w:rPr>
-        <w:t>i</w:t>
-      </w:r>
-      <w:proofErr w:type="spellEnd"/>
-      <w:r>
-        <w:rPr>
-          <w:sz w:val="24"/>
-          <w:szCs w:val="22"/>
-          <w:lang w:val="en-US"/>
-        </w:rPr>
-        <w:t xml:space="preserve"> – ignoring </w:t>
+        <w:t xml:space="preserve">i – ignoring </w:t>
       </w:r>
       <w:r>
         <w:rPr>
@@ -6634,25 +6279,7 @@
           <w:szCs w:val="22"/>
           <w:lang w:val="en-US"/>
         </w:rPr>
-        <w:t>&lt;</w:t>
-      </w:r>
-      <w:proofErr w:type="gramStart"/>
-      <w:r>
-        <w:rPr>
-          <w:sz w:val="24"/>
-          <w:szCs w:val="22"/>
-          <w:lang w:val="en-US"/>
-        </w:rPr>
-        <w:t>table</w:t>
-      </w:r>
-      <w:proofErr w:type="gramEnd"/>
-      <w:r>
-        <w:rPr>
-          <w:sz w:val="24"/>
-          <w:szCs w:val="22"/>
-          <w:lang w:val="en-US"/>
-        </w:rPr>
-        <w:t>&gt;</w:t>
+        <w:t>&lt;table&gt;</w:t>
       </w:r>
     </w:p>
     <w:p>
@@ -6670,27 +6297,7 @@
           <w:lang w:val="en-US"/>
         </w:rPr>
         <w:tab/>
-        <w:t>&lt;</w:t>
-      </w:r>
-      <w:proofErr w:type="spellStart"/>
-      <w:proofErr w:type="gramStart"/>
-      <w:r>
-        <w:rPr>
-          <w:sz w:val="24"/>
-          <w:szCs w:val="22"/>
-          <w:lang w:val="en-US"/>
-        </w:rPr>
-        <w:t>thead</w:t>
-      </w:r>
-      <w:proofErr w:type="spellEnd"/>
-      <w:proofErr w:type="gramEnd"/>
-      <w:r>
-        <w:rPr>
-          <w:sz w:val="24"/>
-          <w:szCs w:val="22"/>
-          <w:lang w:val="en-US"/>
-        </w:rPr>
-        <w:t>&gt;</w:t>
+        <w:t>&lt;thead&gt;</w:t>
       </w:r>
       <w:r>
         <w:rPr>
@@ -6725,27 +6332,7 @@
           <w:lang w:val="en-US"/>
         </w:rPr>
         <w:tab/>
-        <w:t>&lt;</w:t>
-      </w:r>
-      <w:proofErr w:type="spellStart"/>
-      <w:proofErr w:type="gramStart"/>
-      <w:r>
-        <w:rPr>
-          <w:sz w:val="24"/>
-          <w:szCs w:val="22"/>
-          <w:lang w:val="en-US"/>
-        </w:rPr>
-        <w:t>tr</w:t>
-      </w:r>
-      <w:proofErr w:type="spellEnd"/>
-      <w:proofErr w:type="gramEnd"/>
-      <w:r>
-        <w:rPr>
-          <w:sz w:val="24"/>
-          <w:szCs w:val="22"/>
-          <w:lang w:val="en-US"/>
-        </w:rPr>
-        <w:t>&gt;</w:t>
+        <w:t>&lt;tr&gt;</w:t>
       </w:r>
       <w:r>
         <w:rPr>
@@ -6788,63 +6375,7 @@
           <w:lang w:val="en-US"/>
         </w:rPr>
         <w:tab/>
-        <w:t>&lt;</w:t>
-      </w:r>
-      <w:proofErr w:type="spellStart"/>
-      <w:proofErr w:type="gramStart"/>
-      <w:r>
-        <w:rPr>
-          <w:sz w:val="24"/>
-          <w:szCs w:val="22"/>
-          <w:lang w:val="en-US"/>
-        </w:rPr>
-        <w:t>th</w:t>
-      </w:r>
-      <w:proofErr w:type="spellEnd"/>
-      <w:r>
-        <w:rPr>
-          <w:sz w:val="24"/>
-          <w:szCs w:val="22"/>
-          <w:lang w:val="en-US"/>
-        </w:rPr>
-        <w:t>&gt;</w:t>
-      </w:r>
-      <w:proofErr w:type="spellStart"/>
-      <w:proofErr w:type="gramEnd"/>
-      <w:r>
-        <w:rPr>
-          <w:sz w:val="24"/>
-          <w:szCs w:val="22"/>
-          <w:lang w:val="en-US"/>
-        </w:rPr>
-        <w:t>Sr</w:t>
-      </w:r>
-      <w:proofErr w:type="spellEnd"/>
-      <w:r>
-        <w:rPr>
-          <w:sz w:val="24"/>
-          <w:szCs w:val="22"/>
-          <w:lang w:val="en-US"/>
-        </w:rPr>
-        <w:t xml:space="preserve"> No&lt;/</w:t>
-      </w:r>
-      <w:proofErr w:type="spellStart"/>
-      <w:r>
-        <w:rPr>
-          <w:sz w:val="24"/>
-          <w:szCs w:val="22"/>
-          <w:lang w:val="en-US"/>
-        </w:rPr>
-        <w:t>th</w:t>
-      </w:r>
-      <w:proofErr w:type="spellEnd"/>
-      <w:r>
-        <w:rPr>
-          <w:sz w:val="24"/>
-          <w:szCs w:val="22"/>
-          <w:lang w:val="en-US"/>
-        </w:rPr>
-        <w:t>&gt;</w:t>
+        <w:t>&lt;th&gt;Sr No&lt;/th&gt;</w:t>
       </w:r>
       <w:r>
         <w:rPr>
@@ -6887,53 +6418,7 @@
           <w:lang w:val="en-US"/>
         </w:rPr>
         <w:tab/>
-        <w:t>&lt;</w:t>
-      </w:r>
-      <w:proofErr w:type="spellStart"/>
-      <w:proofErr w:type="gramStart"/>
-      <w:r>
-        <w:rPr>
-          <w:sz w:val="24"/>
-          <w:szCs w:val="22"/>
-          <w:lang w:val="en-US"/>
-        </w:rPr>
-        <w:t>th</w:t>
-      </w:r>
-      <w:proofErr w:type="spellEnd"/>
-      <w:r>
-        <w:rPr>
-          <w:sz w:val="24"/>
-          <w:szCs w:val="22"/>
-          <w:lang w:val="en-US"/>
-        </w:rPr>
-        <w:t>&gt;</w:t>
-      </w:r>
-      <w:proofErr w:type="gramEnd"/>
-      <w:r>
-        <w:rPr>
-          <w:sz w:val="24"/>
-          <w:szCs w:val="22"/>
-          <w:lang w:val="en-US"/>
-        </w:rPr>
-        <w:t>Company&lt;/</w:t>
-      </w:r>
-      <w:proofErr w:type="spellStart"/>
-      <w:r>
-        <w:rPr>
-          <w:sz w:val="24"/>
-          <w:szCs w:val="22"/>
-          <w:lang w:val="en-US"/>
-        </w:rPr>
-        <w:t>th</w:t>
-      </w:r>
-      <w:proofErr w:type="spellEnd"/>
-      <w:r>
-        <w:rPr>
-          <w:sz w:val="24"/>
-          <w:szCs w:val="22"/>
-          <w:lang w:val="en-US"/>
-        </w:rPr>
-        <w:t>&gt;</w:t>
+        <w:t>&lt;th&gt;Company&lt;/th&gt;</w:t>
       </w:r>
     </w:p>
     <w:p>
@@ -6959,27 +6444,7 @@
           <w:lang w:val="en-US"/>
         </w:rPr>
         <w:tab/>
-        <w:t>&lt;/</w:t>
-      </w:r>
-      <w:proofErr w:type="spellStart"/>
-      <w:proofErr w:type="gramStart"/>
-      <w:r>
-        <w:rPr>
-          <w:sz w:val="24"/>
-          <w:szCs w:val="22"/>
-          <w:lang w:val="en-US"/>
-        </w:rPr>
-        <w:t>tr</w:t>
-      </w:r>
-      <w:proofErr w:type="spellEnd"/>
-      <w:proofErr w:type="gramEnd"/>
-      <w:r>
-        <w:rPr>
-          <w:sz w:val="24"/>
-          <w:szCs w:val="22"/>
-          <w:lang w:val="en-US"/>
-        </w:rPr>
-        <w:t>&gt;</w:t>
+        <w:t>&lt;/tr&gt;</w:t>
       </w:r>
     </w:p>
     <w:p>
@@ -6997,25 +6462,7 @@
           <w:lang w:val="en-US"/>
         </w:rPr>
         <w:tab/>
-        <w:t>&lt;/</w:t>
-      </w:r>
-      <w:proofErr w:type="spellStart"/>
-      <w:r>
-        <w:rPr>
-          <w:sz w:val="24"/>
-          <w:szCs w:val="22"/>
-          <w:lang w:val="en-US"/>
-        </w:rPr>
-        <w:t>thead</w:t>
-      </w:r>
-      <w:proofErr w:type="spellEnd"/>
-      <w:r>
-        <w:rPr>
-          <w:sz w:val="24"/>
-          <w:szCs w:val="22"/>
-          <w:lang w:val="en-US"/>
-        </w:rPr>
-        <w:t>&gt;</w:t>
+        <w:t>&lt;/thead&gt;</w:t>
       </w:r>
     </w:p>
     <w:p>
@@ -7033,27 +6480,7 @@
           <w:lang w:val="en-US"/>
         </w:rPr>
         <w:tab/>
-        <w:t>&lt;</w:t>
-      </w:r>
-      <w:proofErr w:type="spellStart"/>
-      <w:proofErr w:type="gramStart"/>
-      <w:r>
-        <w:rPr>
-          <w:sz w:val="24"/>
-          <w:szCs w:val="22"/>
-          <w:lang w:val="en-US"/>
-        </w:rPr>
-        <w:t>tbody</w:t>
-      </w:r>
-      <w:proofErr w:type="spellEnd"/>
-      <w:proofErr w:type="gramEnd"/>
-      <w:r>
-        <w:rPr>
-          <w:sz w:val="24"/>
-          <w:szCs w:val="22"/>
-          <w:lang w:val="en-US"/>
-        </w:rPr>
-        <w:t>&gt;</w:t>
+        <w:t>&lt;tbody&gt;</w:t>
       </w:r>
       <w:r>
         <w:rPr>
@@ -7088,27 +6515,7 @@
           <w:lang w:val="en-US"/>
         </w:rPr>
         <w:tab/>
-        <w:t>&lt;</w:t>
-      </w:r>
-      <w:proofErr w:type="spellStart"/>
-      <w:proofErr w:type="gramStart"/>
-      <w:r>
-        <w:rPr>
-          <w:sz w:val="24"/>
-          <w:szCs w:val="22"/>
-          <w:lang w:val="en-US"/>
-        </w:rPr>
-        <w:t>tr</w:t>
-      </w:r>
-      <w:proofErr w:type="spellEnd"/>
-      <w:proofErr w:type="gramEnd"/>
-      <w:r>
-        <w:rPr>
-          <w:sz w:val="24"/>
-          <w:szCs w:val="22"/>
-          <w:lang w:val="en-US"/>
-        </w:rPr>
-        <w:t>&gt;</w:t>
+        <w:t>&lt;tr&gt;</w:t>
       </w:r>
     </w:p>
     <w:p>
@@ -7142,25 +6549,7 @@
           <w:lang w:val="en-US"/>
         </w:rPr>
         <w:tab/>
-        <w:t>&lt;</w:t>
-      </w:r>
-      <w:proofErr w:type="gramStart"/>
-      <w:r>
-        <w:rPr>
-          <w:sz w:val="24"/>
-          <w:szCs w:val="22"/>
-          <w:lang w:val="en-US"/>
-        </w:rPr>
-        <w:t>td&gt;</w:t>
-      </w:r>
-      <w:proofErr w:type="gramEnd"/>
-      <w:r>
-        <w:rPr>
-          <w:sz w:val="24"/>
-          <w:szCs w:val="22"/>
-          <w:lang w:val="en-US"/>
-        </w:rPr>
-        <w:t>1&lt;/td&gt;</w:t>
+        <w:t>&lt;td&gt;1&lt;/td&gt;</w:t>
       </w:r>
     </w:p>
     <w:p>
@@ -7194,35 +6583,7 @@
           <w:lang w:val="en-US"/>
         </w:rPr>
         <w:tab/>
-        <w:t>&lt;</w:t>
-      </w:r>
-      <w:proofErr w:type="gramStart"/>
-      <w:r>
-        <w:rPr>
-          <w:sz w:val="24"/>
-          <w:szCs w:val="22"/>
-          <w:lang w:val="en-US"/>
-        </w:rPr>
-        <w:t>td&gt;</w:t>
-      </w:r>
-      <w:proofErr w:type="spellStart"/>
-      <w:proofErr w:type="gramEnd"/>
-      <w:r>
-        <w:rPr>
-          <w:sz w:val="24"/>
-          <w:szCs w:val="22"/>
-          <w:lang w:val="en-US"/>
-        </w:rPr>
-        <w:t>AViIT</w:t>
-      </w:r>
-      <w:proofErr w:type="spellEnd"/>
-      <w:r>
-        <w:rPr>
-          <w:sz w:val="24"/>
-          <w:szCs w:val="22"/>
-          <w:lang w:val="en-US"/>
-        </w:rPr>
-        <w:t>&lt;/td&gt;</w:t>
+        <w:t>&lt;td&gt;AViIT&lt;/td&gt;</w:t>
       </w:r>
     </w:p>
     <w:p>
@@ -7248,27 +6609,7 @@
           <w:lang w:val="en-US"/>
         </w:rPr>
         <w:tab/>
-        <w:t>&lt;/</w:t>
-      </w:r>
-      <w:proofErr w:type="spellStart"/>
-      <w:proofErr w:type="gramStart"/>
-      <w:r>
-        <w:rPr>
-          <w:sz w:val="24"/>
-          <w:szCs w:val="22"/>
-          <w:lang w:val="en-US"/>
-        </w:rPr>
-        <w:t>tr</w:t>
-      </w:r>
-      <w:proofErr w:type="spellEnd"/>
-      <w:proofErr w:type="gramEnd"/>
-      <w:r>
-        <w:rPr>
-          <w:sz w:val="24"/>
-          <w:szCs w:val="22"/>
-          <w:lang w:val="en-US"/>
-        </w:rPr>
-        <w:t>&gt;</w:t>
+        <w:t>&lt;/tr&gt;</w:t>
       </w:r>
     </w:p>
     <w:p>
@@ -7294,27 +6635,7 @@
           <w:lang w:val="en-US"/>
         </w:rPr>
         <w:tab/>
-        <w:t>&lt;</w:t>
-      </w:r>
-      <w:proofErr w:type="spellStart"/>
-      <w:proofErr w:type="gramStart"/>
-      <w:r>
-        <w:rPr>
-          <w:sz w:val="24"/>
-          <w:szCs w:val="22"/>
-          <w:lang w:val="en-US"/>
-        </w:rPr>
-        <w:t>tr</w:t>
-      </w:r>
-      <w:proofErr w:type="spellEnd"/>
-      <w:proofErr w:type="gramEnd"/>
-      <w:r>
-        <w:rPr>
-          <w:sz w:val="24"/>
-          <w:szCs w:val="22"/>
-          <w:lang w:val="en-US"/>
-        </w:rPr>
-        <w:t>&gt;</w:t>
+        <w:t>&lt;tr&gt;</w:t>
       </w:r>
     </w:p>
     <w:p>
@@ -7348,25 +6669,7 @@
           <w:lang w:val="en-US"/>
         </w:rPr>
         <w:tab/>
-        <w:t>&lt;</w:t>
-      </w:r>
-      <w:proofErr w:type="gramStart"/>
-      <w:r>
-        <w:rPr>
-          <w:sz w:val="24"/>
-          <w:szCs w:val="22"/>
-          <w:lang w:val="en-US"/>
-        </w:rPr>
-        <w:t>td&gt;</w:t>
-      </w:r>
-      <w:proofErr w:type="gramEnd"/>
-      <w:r>
-        <w:rPr>
-          <w:sz w:val="24"/>
-          <w:szCs w:val="22"/>
-          <w:lang w:val="en-US"/>
-        </w:rPr>
-        <w:t>2&lt;/td&gt;</w:t>
+        <w:t>&lt;td&gt;2&lt;/td&gt;</w:t>
       </w:r>
     </w:p>
     <w:p>
@@ -7400,35 +6703,7 @@
           <w:lang w:val="en-US"/>
         </w:rPr>
         <w:tab/>
-        <w:t>&lt;</w:t>
-      </w:r>
-      <w:proofErr w:type="gramStart"/>
-      <w:r>
-        <w:rPr>
-          <w:sz w:val="24"/>
-          <w:szCs w:val="22"/>
-          <w:lang w:val="en-US"/>
-        </w:rPr>
-        <w:t>td&gt;</w:t>
-      </w:r>
-      <w:proofErr w:type="spellStart"/>
-      <w:proofErr w:type="gramEnd"/>
-      <w:r>
-        <w:rPr>
-          <w:sz w:val="24"/>
-          <w:szCs w:val="22"/>
-          <w:lang w:val="en-US"/>
-        </w:rPr>
-        <w:t>Manorama</w:t>
-      </w:r>
-      <w:proofErr w:type="spellEnd"/>
-      <w:r>
-        <w:rPr>
-          <w:sz w:val="24"/>
-          <w:szCs w:val="22"/>
-          <w:lang w:val="en-US"/>
-        </w:rPr>
-        <w:t>&lt;/td</w:t>
+        <w:t>&lt;td&gt;Manorama&lt;/td</w:t>
       </w:r>
     </w:p>
     <w:p>
@@ -7454,27 +6729,7 @@
           <w:lang w:val="en-US"/>
         </w:rPr>
         <w:tab/>
-        <w:t>&lt;/</w:t>
-      </w:r>
-      <w:proofErr w:type="spellStart"/>
-      <w:proofErr w:type="gramStart"/>
-      <w:r>
-        <w:rPr>
-          <w:sz w:val="24"/>
-          <w:szCs w:val="22"/>
-          <w:lang w:val="en-US"/>
-        </w:rPr>
-        <w:t>tr</w:t>
-      </w:r>
-      <w:proofErr w:type="spellEnd"/>
-      <w:proofErr w:type="gramEnd"/>
-      <w:r>
-        <w:rPr>
-          <w:sz w:val="24"/>
-          <w:szCs w:val="22"/>
-          <w:lang w:val="en-US"/>
-        </w:rPr>
-        <w:t>&gt;</w:t>
+        <w:t>&lt;/tr&gt;</w:t>
       </w:r>
     </w:p>
     <w:p>
@@ -7492,25 +6747,7 @@
           <w:lang w:val="en-US"/>
         </w:rPr>
         <w:tab/>
-        <w:t>&lt;/</w:t>
-      </w:r>
-      <w:proofErr w:type="spellStart"/>
-      <w:r>
-        <w:rPr>
-          <w:sz w:val="24"/>
-          <w:szCs w:val="22"/>
-          <w:lang w:val="en-US"/>
-        </w:rPr>
-        <w:t>tbody</w:t>
-      </w:r>
-      <w:proofErr w:type="spellEnd"/>
-      <w:r>
-        <w:rPr>
-          <w:sz w:val="24"/>
-          <w:szCs w:val="22"/>
-          <w:lang w:val="en-US"/>
-        </w:rPr>
-        <w:t>&gt;</w:t>
+        <w:t>&lt;/tbody&gt;</w:t>
       </w:r>
     </w:p>
     <w:p>
@@ -7610,25 +6847,7 @@
           <w:szCs w:val="22"/>
           <w:lang w:val="en-US"/>
         </w:rPr>
-        <w:t>For uploading any file with this control simply call .</w:t>
-      </w:r>
-      <w:proofErr w:type="gramStart"/>
-      <w:r>
-        <w:rPr>
-          <w:sz w:val="24"/>
-          <w:szCs w:val="22"/>
-          <w:lang w:val="en-US"/>
-        </w:rPr>
-        <w:t>sendKeys(</w:t>
-      </w:r>
-      <w:proofErr w:type="gramEnd"/>
-      <w:r>
-        <w:rPr>
-          <w:sz w:val="24"/>
-          <w:szCs w:val="22"/>
-          <w:lang w:val="en-US"/>
-        </w:rPr>
-        <w:t>) method.</w:t>
+        <w:t>For uploading any file with this control simply call .sendKeys() method.</w:t>
       </w:r>
     </w:p>
     <w:p>
@@ -7650,25 +6869,7 @@
           <w:szCs w:val="22"/>
           <w:lang w:val="en-US"/>
         </w:rPr>
-        <w:t>While calling .</w:t>
-      </w:r>
-      <w:proofErr w:type="gramStart"/>
-      <w:r>
-        <w:rPr>
-          <w:sz w:val="24"/>
-          <w:szCs w:val="22"/>
-          <w:lang w:val="en-US"/>
-        </w:rPr>
-        <w:t>sendKeys(</w:t>
-      </w:r>
-      <w:proofErr w:type="gramEnd"/>
-      <w:r>
-        <w:rPr>
-          <w:sz w:val="24"/>
-          <w:szCs w:val="22"/>
-          <w:lang w:val="en-US"/>
-        </w:rPr>
-        <w:t>) method pass the full path of the file.</w:t>
+        <w:t>While calling .sendKeys() method pass the full path of the file.</w:t>
       </w:r>
     </w:p>
     <w:p>
@@ -8048,23 +7249,13 @@
           <w:lang w:val="en-US"/>
         </w:rPr>
       </w:pPr>
-      <w:proofErr w:type="gramStart"/>
-      <w:r>
-        <w:rPr>
-          <w:sz w:val="24"/>
-          <w:szCs w:val="22"/>
-          <w:lang w:val="en-US"/>
-        </w:rPr>
-        <w:t>moveToElement(</w:t>
-      </w:r>
-      <w:proofErr w:type="gramEnd"/>
-      <w:r>
-        <w:rPr>
-          <w:sz w:val="24"/>
-          <w:szCs w:val="22"/>
-          <w:lang w:val="en-US"/>
-        </w:rPr>
-        <w:t xml:space="preserve">) </w:t>
+      <w:r>
+        <w:rPr>
+          <w:sz w:val="24"/>
+          <w:szCs w:val="22"/>
+          <w:lang w:val="en-US"/>
+        </w:rPr>
+        <w:t xml:space="preserve">moveToElement() </w:t>
       </w:r>
       <w:r>
         <w:rPr>
@@ -8096,23 +7287,13 @@
           <w:lang w:val="en-US"/>
         </w:rPr>
       </w:pPr>
-      <w:proofErr w:type="gramStart"/>
-      <w:r>
-        <w:rPr>
-          <w:sz w:val="24"/>
-          <w:szCs w:val="22"/>
-          <w:lang w:val="en-US"/>
-        </w:rPr>
-        <w:t>perform(</w:t>
-      </w:r>
-      <w:proofErr w:type="gramEnd"/>
-      <w:r>
-        <w:rPr>
-          <w:sz w:val="24"/>
-          <w:szCs w:val="22"/>
-          <w:lang w:val="en-US"/>
-        </w:rPr>
-        <w:t xml:space="preserve">) </w:t>
+      <w:r>
+        <w:rPr>
+          <w:sz w:val="24"/>
+          <w:szCs w:val="22"/>
+          <w:lang w:val="en-US"/>
+        </w:rPr>
+        <w:t xml:space="preserve">perform() </w:t>
       </w:r>
       <w:r>
         <w:rPr>
@@ -8144,23 +7325,13 @@
           <w:lang w:val="en-US"/>
         </w:rPr>
       </w:pPr>
-      <w:proofErr w:type="gramStart"/>
-      <w:r>
-        <w:rPr>
-          <w:sz w:val="24"/>
-          <w:szCs w:val="22"/>
-          <w:lang w:val="en-US"/>
-        </w:rPr>
-        <w:t>contextClick(</w:t>
-      </w:r>
-      <w:proofErr w:type="gramEnd"/>
-      <w:r>
-        <w:rPr>
-          <w:sz w:val="24"/>
-          <w:szCs w:val="22"/>
-          <w:lang w:val="en-US"/>
-        </w:rPr>
-        <w:t xml:space="preserve">) </w:t>
+      <w:r>
+        <w:rPr>
+          <w:sz w:val="24"/>
+          <w:szCs w:val="22"/>
+          <w:lang w:val="en-US"/>
+        </w:rPr>
+        <w:t xml:space="preserve">contextClick() </w:t>
       </w:r>
       <w:r>
         <w:rPr>
@@ -8192,23 +7363,13 @@
           <w:lang w:val="en-US"/>
         </w:rPr>
       </w:pPr>
-      <w:proofErr w:type="gramStart"/>
-      <w:r>
-        <w:rPr>
-          <w:sz w:val="24"/>
-          <w:szCs w:val="22"/>
-          <w:lang w:val="en-US"/>
-        </w:rPr>
-        <w:t>doubleClick(</w:t>
-      </w:r>
-      <w:proofErr w:type="gramEnd"/>
-      <w:r>
-        <w:rPr>
-          <w:sz w:val="24"/>
-          <w:szCs w:val="22"/>
-          <w:lang w:val="en-US"/>
-        </w:rPr>
-        <w:t xml:space="preserve">) </w:t>
+      <w:r>
+        <w:rPr>
+          <w:sz w:val="24"/>
+          <w:szCs w:val="22"/>
+          <w:lang w:val="en-US"/>
+        </w:rPr>
+        <w:t xml:space="preserve">doubleClick() </w:t>
       </w:r>
       <w:r>
         <w:rPr>
@@ -8240,23 +7401,13 @@
           <w:lang w:val="en-US"/>
         </w:rPr>
       </w:pPr>
-      <w:proofErr w:type="gramStart"/>
-      <w:r>
-        <w:rPr>
-          <w:sz w:val="24"/>
-          <w:szCs w:val="22"/>
-          <w:lang w:val="en-US"/>
-        </w:rPr>
-        <w:t>dragAndDrop(</w:t>
-      </w:r>
-      <w:proofErr w:type="gramEnd"/>
-      <w:r>
-        <w:rPr>
-          <w:sz w:val="24"/>
-          <w:szCs w:val="22"/>
-          <w:lang w:val="en-US"/>
-        </w:rPr>
-        <w:t xml:space="preserve">) </w:t>
+      <w:r>
+        <w:rPr>
+          <w:sz w:val="24"/>
+          <w:szCs w:val="22"/>
+          <w:lang w:val="en-US"/>
+        </w:rPr>
+        <w:t xml:space="preserve">dragAndDrop() </w:t>
       </w:r>
       <w:r>
         <w:rPr>
@@ -9279,29 +8430,7 @@
           <w:szCs w:val="22"/>
           <w:lang w:val="en-US"/>
         </w:rPr>
-        <w:t xml:space="preserve">Points to be noted about configuration methods (like BeforeTest, AfterTest, BeforeMethod, </w:t>
-      </w:r>
-      <w:proofErr w:type="gramStart"/>
-      <w:r>
-        <w:rPr>
-          <w:b/>
-          <w:bCs/>
-          <w:sz w:val="24"/>
-          <w:szCs w:val="22"/>
-          <w:lang w:val="en-US"/>
-        </w:rPr>
-        <w:t>AfterMethod</w:t>
-      </w:r>
-      <w:proofErr w:type="gramEnd"/>
-      <w:r>
-        <w:rPr>
-          <w:b/>
-          <w:bCs/>
-          <w:sz w:val="24"/>
-          <w:szCs w:val="22"/>
-          <w:lang w:val="en-US"/>
-        </w:rPr>
-        <w:t>)</w:t>
+        <w:t>Points to be noted about configuration methods (like BeforeTest, AfterTest, BeforeMethod, AfterMethod)</w:t>
       </w:r>
     </w:p>
     <w:p>
@@ -9811,19 +8940,128 @@
           <w:lang w:val="en-US"/>
         </w:rPr>
       </w:pPr>
+    </w:p>
+    <w:p>
+      <w:pPr>
+        <w:rPr>
+          <w:b/>
+          <w:bCs/>
+          <w:sz w:val="24"/>
+          <w:szCs w:val="22"/>
+          <w:lang w:val="en-US"/>
+        </w:rPr>
+      </w:pPr>
+    </w:p>
+    <w:p>
+      <w:pPr>
+        <w:rPr>
+          <w:b/>
+          <w:bCs/>
+          <w:sz w:val="24"/>
+          <w:szCs w:val="22"/>
+          <w:lang w:val="en-US"/>
+        </w:rPr>
+      </w:pPr>
+      <w:r>
+        <w:rPr>
+          <w:b/>
+          <w:bCs/>
+          <w:sz w:val="24"/>
+          <w:szCs w:val="22"/>
+          <w:lang w:val="en-US"/>
+        </w:rPr>
+        <w:t>Execution via XML file</w:t>
+      </w:r>
+    </w:p>
+    <w:p>
+      <w:pPr>
+        <w:pStyle w:val="ListParagraph"/>
+        <w:numPr>
+          <w:ilvl w:val="0"/>
+          <w:numId w:val="30"/>
+        </w:numPr>
+        <w:rPr>
+          <w:sz w:val="24"/>
+          <w:szCs w:val="22"/>
+          <w:lang w:val="en-US"/>
+        </w:rPr>
+      </w:pPr>
+      <w:r>
+        <w:rPr>
+          <w:sz w:val="24"/>
+          <w:szCs w:val="22"/>
+          <w:lang w:val="en-US"/>
+        </w:rPr>
+        <w:t>You can execute / skip single test / multiple tests via XML file</w:t>
+      </w:r>
+    </w:p>
+    <w:p>
+      <w:pPr>
+        <w:pStyle w:val="ListParagraph"/>
+        <w:numPr>
+          <w:ilvl w:val="0"/>
+          <w:numId w:val="30"/>
+        </w:numPr>
+        <w:rPr>
+          <w:sz w:val="24"/>
+          <w:szCs w:val="22"/>
+          <w:lang w:val="en-US"/>
+        </w:rPr>
+      </w:pPr>
+      <w:r>
+        <w:rPr>
+          <w:sz w:val="24"/>
+          <w:szCs w:val="22"/>
+          <w:lang w:val="en-US"/>
+        </w:rPr>
+        <w:t>All the tags from XML file are pre-defined.</w:t>
+      </w:r>
+    </w:p>
+    <w:p>
+      <w:pPr>
+        <w:pStyle w:val="ListParagraph"/>
+        <w:numPr>
+          <w:ilvl w:val="0"/>
+          <w:numId w:val="30"/>
+        </w:numPr>
+        <w:rPr>
+          <w:sz w:val="24"/>
+          <w:szCs w:val="22"/>
+          <w:lang w:val="en-US"/>
+        </w:rPr>
+      </w:pPr>
+      <w:r>
+        <w:rPr>
+          <w:sz w:val="24"/>
+          <w:szCs w:val="22"/>
+          <w:lang w:val="en-US"/>
+        </w:rPr>
+        <w:t>You should not alter the sequence of tags.</w:t>
+      </w:r>
+    </w:p>
+    <w:p>
+      <w:pPr>
+        <w:pStyle w:val="ListParagraph"/>
+        <w:numPr>
+          <w:ilvl w:val="0"/>
+          <w:numId w:val="30"/>
+        </w:numPr>
+        <w:rPr>
+          <w:sz w:val="24"/>
+          <w:szCs w:val="22"/>
+          <w:lang w:val="en-US"/>
+        </w:rPr>
+      </w:pPr>
+      <w:r>
+        <w:rPr>
+          <w:sz w:val="24"/>
+          <w:szCs w:val="22"/>
+          <w:lang w:val="en-US"/>
+        </w:rPr>
+        <w:t xml:space="preserve">All the tags are case sensitive </w:t>
+      </w:r>
       <w:bookmarkStart w:id="0" w:name="_GoBack"/>
       <w:bookmarkEnd w:id="0"/>
-    </w:p>
-    <w:p>
-      <w:pPr>
-        <w:rPr>
-          <w:b/>
-          <w:bCs/>
-          <w:sz w:val="24"/>
-          <w:szCs w:val="22"/>
-          <w:lang w:val="en-US"/>
-        </w:rPr>
-      </w:pPr>
     </w:p>
     <w:sectPr>
       <w:pgSz w:w="11906" w:h="16838"/>
@@ -10581,6 +9819,119 @@
     </w:lvl>
   </w:abstractNum>
   <w:abstractNum w:abstractNumId="7">
+    <w:nsid w:val="2EA65D2E"/>
+    <w:multiLevelType w:val="hybridMultilevel"/>
+    <w:tmpl w:val="1144A10E"/>
+    <w:lvl w:ilvl="0" w:tplc="40090001">
+      <w:start w:val="1"/>
+      <w:numFmt w:val="bullet"/>
+      <w:lvlText w:val=""/>
+      <w:lvlJc w:val="left"/>
+      <w:pPr>
+        <w:ind w:left="720" w:hanging="360"/>
+      </w:pPr>
+      <w:rPr>
+        <w:rFonts w:ascii="Symbol" w:hAnsi="Symbol" w:hint="default"/>
+      </w:rPr>
+    </w:lvl>
+    <w:lvl w:ilvl="1" w:tplc="40090003" w:tentative="1">
+      <w:start w:val="1"/>
+      <w:numFmt w:val="bullet"/>
+      <w:lvlText w:val="o"/>
+      <w:lvlJc w:val="left"/>
+      <w:pPr>
+        <w:ind w:left="1440" w:hanging="360"/>
+      </w:pPr>
+      <w:rPr>
+        <w:rFonts w:ascii="Courier New" w:hAnsi="Courier New" w:cs="Courier New" w:hint="default"/>
+      </w:rPr>
+    </w:lvl>
+    <w:lvl w:ilvl="2" w:tplc="40090005" w:tentative="1">
+      <w:start w:val="1"/>
+      <w:numFmt w:val="bullet"/>
+      <w:lvlText w:val=""/>
+      <w:lvlJc w:val="left"/>
+      <w:pPr>
+        <w:ind w:left="2160" w:hanging="360"/>
+      </w:pPr>
+      <w:rPr>
+        <w:rFonts w:ascii="Wingdings" w:hAnsi="Wingdings" w:hint="default"/>
+      </w:rPr>
+    </w:lvl>
+    <w:lvl w:ilvl="3" w:tplc="40090001" w:tentative="1">
+      <w:start w:val="1"/>
+      <w:numFmt w:val="bullet"/>
+      <w:lvlText w:val=""/>
+      <w:lvlJc w:val="left"/>
+      <w:pPr>
+        <w:ind w:left="2880" w:hanging="360"/>
+      </w:pPr>
+      <w:rPr>
+        <w:rFonts w:ascii="Symbol" w:hAnsi="Symbol" w:hint="default"/>
+      </w:rPr>
+    </w:lvl>
+    <w:lvl w:ilvl="4" w:tplc="40090003" w:tentative="1">
+      <w:start w:val="1"/>
+      <w:numFmt w:val="bullet"/>
+      <w:lvlText w:val="o"/>
+      <w:lvlJc w:val="left"/>
+      <w:pPr>
+        <w:ind w:left="3600" w:hanging="360"/>
+      </w:pPr>
+      <w:rPr>
+        <w:rFonts w:ascii="Courier New" w:hAnsi="Courier New" w:cs="Courier New" w:hint="default"/>
+      </w:rPr>
+    </w:lvl>
+    <w:lvl w:ilvl="5" w:tplc="40090005" w:tentative="1">
+      <w:start w:val="1"/>
+      <w:numFmt w:val="bullet"/>
+      <w:lvlText w:val=""/>
+      <w:lvlJc w:val="left"/>
+      <w:pPr>
+        <w:ind w:left="4320" w:hanging="360"/>
+      </w:pPr>
+      <w:rPr>
+        <w:rFonts w:ascii="Wingdings" w:hAnsi="Wingdings" w:hint="default"/>
+      </w:rPr>
+    </w:lvl>
+    <w:lvl w:ilvl="6" w:tplc="40090001" w:tentative="1">
+      <w:start w:val="1"/>
+      <w:numFmt w:val="bullet"/>
+      <w:lvlText w:val=""/>
+      <w:lvlJc w:val="left"/>
+      <w:pPr>
+        <w:ind w:left="5040" w:hanging="360"/>
+      </w:pPr>
+      <w:rPr>
+        <w:rFonts w:ascii="Symbol" w:hAnsi="Symbol" w:hint="default"/>
+      </w:rPr>
+    </w:lvl>
+    <w:lvl w:ilvl="7" w:tplc="40090003" w:tentative="1">
+      <w:start w:val="1"/>
+      <w:numFmt w:val="bullet"/>
+      <w:lvlText w:val="o"/>
+      <w:lvlJc w:val="left"/>
+      <w:pPr>
+        <w:ind w:left="5760" w:hanging="360"/>
+      </w:pPr>
+      <w:rPr>
+        <w:rFonts w:ascii="Courier New" w:hAnsi="Courier New" w:cs="Courier New" w:hint="default"/>
+      </w:rPr>
+    </w:lvl>
+    <w:lvl w:ilvl="8" w:tplc="40090005" w:tentative="1">
+      <w:start w:val="1"/>
+      <w:numFmt w:val="bullet"/>
+      <w:lvlText w:val=""/>
+      <w:lvlJc w:val="left"/>
+      <w:pPr>
+        <w:ind w:left="6480" w:hanging="360"/>
+      </w:pPr>
+      <w:rPr>
+        <w:rFonts w:ascii="Wingdings" w:hAnsi="Wingdings" w:hint="default"/>
+      </w:rPr>
+    </w:lvl>
+  </w:abstractNum>
+  <w:abstractNum w:abstractNumId="8">
     <w:nsid w:val="31165D54"/>
     <w:multiLevelType w:val="hybridMultilevel"/>
     <w:tmpl w:val="71540B72"/>
@@ -10693,7 +10044,7 @@
       </w:rPr>
     </w:lvl>
   </w:abstractNum>
-  <w:abstractNum w:abstractNumId="8">
+  <w:abstractNum w:abstractNumId="9">
     <w:nsid w:val="35122F2E"/>
     <w:multiLevelType w:val="hybridMultilevel"/>
     <w:tmpl w:val="86B8B5D2"/>
@@ -10782,7 +10133,7 @@
       </w:pPr>
     </w:lvl>
   </w:abstractNum>
-  <w:abstractNum w:abstractNumId="9">
+  <w:abstractNum w:abstractNumId="10">
     <w:nsid w:val="36FD5624"/>
     <w:multiLevelType w:val="hybridMultilevel"/>
     <w:tmpl w:val="1A5E0934"/>
@@ -10871,7 +10222,7 @@
       </w:pPr>
     </w:lvl>
   </w:abstractNum>
-  <w:abstractNum w:abstractNumId="10">
+  <w:abstractNum w:abstractNumId="11">
     <w:nsid w:val="3A3075AA"/>
     <w:multiLevelType w:val="hybridMultilevel"/>
     <w:tmpl w:val="A1584D44"/>
@@ -10984,7 +10335,7 @@
       </w:rPr>
     </w:lvl>
   </w:abstractNum>
-  <w:abstractNum w:abstractNumId="11">
+  <w:abstractNum w:abstractNumId="12">
     <w:nsid w:val="43183E58"/>
     <w:multiLevelType w:val="hybridMultilevel"/>
     <w:tmpl w:val="EA903AC8"/>
@@ -11097,7 +10448,7 @@
       </w:rPr>
     </w:lvl>
   </w:abstractNum>
-  <w:abstractNum w:abstractNumId="12">
+  <w:abstractNum w:abstractNumId="13">
     <w:nsid w:val="44C5757D"/>
     <w:multiLevelType w:val="hybridMultilevel"/>
     <w:tmpl w:val="BA887CA2"/>
@@ -11186,7 +10537,7 @@
       </w:pPr>
     </w:lvl>
   </w:abstractNum>
-  <w:abstractNum w:abstractNumId="13">
+  <w:abstractNum w:abstractNumId="14">
     <w:nsid w:val="487A3B0D"/>
     <w:multiLevelType w:val="hybridMultilevel"/>
     <w:tmpl w:val="75CA2E34"/>
@@ -11275,7 +10626,7 @@
       </w:pPr>
     </w:lvl>
   </w:abstractNum>
-  <w:abstractNum w:abstractNumId="14">
+  <w:abstractNum w:abstractNumId="15">
     <w:nsid w:val="4C187E13"/>
     <w:multiLevelType w:val="hybridMultilevel"/>
     <w:tmpl w:val="E8ACCDB8"/>
@@ -11388,7 +10739,7 @@
       </w:rPr>
     </w:lvl>
   </w:abstractNum>
-  <w:abstractNum w:abstractNumId="15">
+  <w:abstractNum w:abstractNumId="16">
     <w:nsid w:val="56A40A45"/>
     <w:multiLevelType w:val="hybridMultilevel"/>
     <w:tmpl w:val="7862B3F8"/>
@@ -11501,7 +10852,7 @@
       </w:rPr>
     </w:lvl>
   </w:abstractNum>
-  <w:abstractNum w:abstractNumId="16">
+  <w:abstractNum w:abstractNumId="17">
     <w:nsid w:val="58D1047A"/>
     <w:multiLevelType w:val="hybridMultilevel"/>
     <w:tmpl w:val="BB6E0C8E"/>
@@ -11614,7 +10965,7 @@
       </w:rPr>
     </w:lvl>
   </w:abstractNum>
-  <w:abstractNum w:abstractNumId="17">
+  <w:abstractNum w:abstractNumId="18">
     <w:nsid w:val="590A2A42"/>
     <w:multiLevelType w:val="hybridMultilevel"/>
     <w:tmpl w:val="B2CCDDE8"/>
@@ -11727,7 +11078,7 @@
       </w:rPr>
     </w:lvl>
   </w:abstractNum>
-  <w:abstractNum w:abstractNumId="18">
+  <w:abstractNum w:abstractNumId="19">
     <w:nsid w:val="5AC325C4"/>
     <w:multiLevelType w:val="hybridMultilevel"/>
     <w:tmpl w:val="6BF65148"/>
@@ -11816,7 +11167,7 @@
       </w:pPr>
     </w:lvl>
   </w:abstractNum>
-  <w:abstractNum w:abstractNumId="19">
+  <w:abstractNum w:abstractNumId="20">
     <w:nsid w:val="5E1A5E19"/>
     <w:multiLevelType w:val="hybridMultilevel"/>
     <w:tmpl w:val="3C0054B4"/>
@@ -11929,7 +11280,7 @@
       </w:rPr>
     </w:lvl>
   </w:abstractNum>
-  <w:abstractNum w:abstractNumId="20">
+  <w:abstractNum w:abstractNumId="21">
     <w:nsid w:val="60CD67B9"/>
     <w:multiLevelType w:val="hybridMultilevel"/>
     <w:tmpl w:val="898E7844"/>
@@ -12018,7 +11369,7 @@
       </w:pPr>
     </w:lvl>
   </w:abstractNum>
-  <w:abstractNum w:abstractNumId="21">
+  <w:abstractNum w:abstractNumId="22">
     <w:nsid w:val="629C4E82"/>
     <w:multiLevelType w:val="hybridMultilevel"/>
     <w:tmpl w:val="363CE55E"/>
@@ -12107,7 +11458,7 @@
       </w:pPr>
     </w:lvl>
   </w:abstractNum>
-  <w:abstractNum w:abstractNumId="22">
+  <w:abstractNum w:abstractNumId="23">
     <w:nsid w:val="632F5147"/>
     <w:multiLevelType w:val="hybridMultilevel"/>
     <w:tmpl w:val="A2A076AA"/>
@@ -12220,7 +11571,7 @@
       </w:rPr>
     </w:lvl>
   </w:abstractNum>
-  <w:abstractNum w:abstractNumId="23">
+  <w:abstractNum w:abstractNumId="24">
     <w:nsid w:val="66C14124"/>
     <w:multiLevelType w:val="hybridMultilevel"/>
     <w:tmpl w:val="87BA6304"/>
@@ -12333,7 +11684,7 @@
       </w:rPr>
     </w:lvl>
   </w:abstractNum>
-  <w:abstractNum w:abstractNumId="24">
+  <w:abstractNum w:abstractNumId="25">
     <w:nsid w:val="6CA66238"/>
     <w:multiLevelType w:val="hybridMultilevel"/>
     <w:tmpl w:val="A2201FCA"/>
@@ -12446,7 +11797,7 @@
       </w:rPr>
     </w:lvl>
   </w:abstractNum>
-  <w:abstractNum w:abstractNumId="25">
+  <w:abstractNum w:abstractNumId="26">
     <w:nsid w:val="73C523EA"/>
     <w:multiLevelType w:val="hybridMultilevel"/>
     <w:tmpl w:val="F1BEC0E4"/>
@@ -12559,7 +11910,7 @@
       </w:rPr>
     </w:lvl>
   </w:abstractNum>
-  <w:abstractNum w:abstractNumId="26">
+  <w:abstractNum w:abstractNumId="27">
     <w:nsid w:val="76CB2945"/>
     <w:multiLevelType w:val="hybridMultilevel"/>
     <w:tmpl w:val="E2880EB2"/>
@@ -12672,7 +12023,7 @@
       </w:rPr>
     </w:lvl>
   </w:abstractNum>
-  <w:abstractNum w:abstractNumId="27">
+  <w:abstractNum w:abstractNumId="28">
     <w:nsid w:val="77E60E1A"/>
     <w:multiLevelType w:val="hybridMultilevel"/>
     <w:tmpl w:val="14625B96"/>
@@ -12761,7 +12112,7 @@
       </w:pPr>
     </w:lvl>
   </w:abstractNum>
-  <w:abstractNum w:abstractNumId="28">
+  <w:abstractNum w:abstractNumId="29">
     <w:nsid w:val="79FE4925"/>
     <w:multiLevelType w:val="hybridMultilevel"/>
     <w:tmpl w:val="263AE45E"/>
@@ -12851,52 +12202,52 @@
     </w:lvl>
   </w:abstractNum>
   <w:num w:numId="1">
+    <w:abstractNumId w:val="23"/>
+  </w:num>
+  <w:num w:numId="2">
+    <w:abstractNumId w:val="27"/>
+  </w:num>
+  <w:num w:numId="3">
+    <w:abstractNumId w:val="25"/>
+  </w:num>
+  <w:num w:numId="4">
+    <w:abstractNumId w:val="16"/>
+  </w:num>
+  <w:num w:numId="5">
+    <w:abstractNumId w:val="26"/>
+  </w:num>
+  <w:num w:numId="6">
     <w:abstractNumId w:val="22"/>
   </w:num>
-  <w:num w:numId="2">
-    <w:abstractNumId w:val="26"/>
-  </w:num>
-  <w:num w:numId="3">
-    <w:abstractNumId w:val="24"/>
-  </w:num>
-  <w:num w:numId="4">
-    <w:abstractNumId w:val="15"/>
-  </w:num>
-  <w:num w:numId="5">
-    <w:abstractNumId w:val="25"/>
-  </w:num>
-  <w:num w:numId="6">
-    <w:abstractNumId w:val="21"/>
-  </w:num>
   <w:num w:numId="7">
-    <w:abstractNumId w:val="11"/>
+    <w:abstractNumId w:val="12"/>
   </w:num>
   <w:num w:numId="8">
     <w:abstractNumId w:val="3"/>
   </w:num>
   <w:num w:numId="9">
-    <w:abstractNumId w:val="28"/>
+    <w:abstractNumId w:val="29"/>
   </w:num>
   <w:num w:numId="10">
-    <w:abstractNumId w:val="8"/>
+    <w:abstractNumId w:val="9"/>
   </w:num>
   <w:num w:numId="11">
-    <w:abstractNumId w:val="18"/>
+    <w:abstractNumId w:val="19"/>
   </w:num>
   <w:num w:numId="12">
-    <w:abstractNumId w:val="9"/>
+    <w:abstractNumId w:val="10"/>
   </w:num>
   <w:num w:numId="13">
-    <w:abstractNumId w:val="13"/>
+    <w:abstractNumId w:val="14"/>
   </w:num>
   <w:num w:numId="14">
-    <w:abstractNumId w:val="17"/>
+    <w:abstractNumId w:val="18"/>
   </w:num>
   <w:num w:numId="15">
     <w:abstractNumId w:val="5"/>
   </w:num>
   <w:num w:numId="16">
-    <w:abstractNumId w:val="10"/>
+    <w:abstractNumId w:val="11"/>
   </w:num>
   <w:num w:numId="17">
     <w:abstractNumId w:val="0"/>
@@ -12905,37 +12256,40 @@
     <w:abstractNumId w:val="4"/>
   </w:num>
   <w:num w:numId="19">
-    <w:abstractNumId w:val="19"/>
+    <w:abstractNumId w:val="20"/>
   </w:num>
   <w:num w:numId="20">
     <w:abstractNumId w:val="6"/>
   </w:num>
   <w:num w:numId="21">
-    <w:abstractNumId w:val="14"/>
+    <w:abstractNumId w:val="15"/>
   </w:num>
   <w:num w:numId="22">
     <w:abstractNumId w:val="1"/>
   </w:num>
   <w:num w:numId="23">
-    <w:abstractNumId w:val="12"/>
+    <w:abstractNumId w:val="13"/>
   </w:num>
   <w:num w:numId="24">
-    <w:abstractNumId w:val="27"/>
+    <w:abstractNumId w:val="28"/>
   </w:num>
   <w:num w:numId="25">
-    <w:abstractNumId w:val="7"/>
+    <w:abstractNumId w:val="8"/>
   </w:num>
   <w:num w:numId="26">
     <w:abstractNumId w:val="2"/>
   </w:num>
   <w:num w:numId="27">
-    <w:abstractNumId w:val="20"/>
+    <w:abstractNumId w:val="21"/>
   </w:num>
   <w:num w:numId="28">
-    <w:abstractNumId w:val="23"/>
+    <w:abstractNumId w:val="24"/>
   </w:num>
   <w:num w:numId="29">
-    <w:abstractNumId w:val="16"/>
+    <w:abstractNumId w:val="17"/>
+  </w:num>
+  <w:num w:numId="30">
+    <w:abstractNumId w:val="7"/>
   </w:num>
 </w:numbering>
 </file>

</xml_diff>

<commit_message>
Date: 07 Apr 2026
</commit_message>
<xml_diff>
--- a/SeleniumNotes.docx
+++ b/SeleniumNotes.docx
@@ -1926,6 +1926,7 @@
           <w:lang w:val="en-US"/>
         </w:rPr>
       </w:pPr>
+      <w:proofErr w:type="spellStart"/>
       <w:r>
         <w:rPr>
           <w:sz w:val="24"/>
@@ -1934,6 +1935,7 @@
         </w:rPr>
         <w:t>YourName_SeleniumDemos</w:t>
       </w:r>
+      <w:proofErr w:type="spellEnd"/>
     </w:p>
     <w:p>
       <w:pPr>
@@ -1976,7 +1978,25 @@
           <w:szCs w:val="22"/>
           <w:lang w:val="en-US"/>
         </w:rPr>
-        <w:t>Launch selenium.dev site</w:t>
+        <w:t xml:space="preserve">Launch </w:t>
+      </w:r>
+      <w:proofErr w:type="spellStart"/>
+      <w:r>
+        <w:rPr>
+          <w:sz w:val="24"/>
+          <w:szCs w:val="22"/>
+          <w:lang w:val="en-US"/>
+        </w:rPr>
+        <w:t>selenium.dev</w:t>
+      </w:r>
+      <w:proofErr w:type="spellEnd"/>
+      <w:r>
+        <w:rPr>
+          <w:sz w:val="24"/>
+          <w:szCs w:val="22"/>
+          <w:lang w:val="en-US"/>
+        </w:rPr>
+        <w:t xml:space="preserve"> site</w:t>
       </w:r>
       <w:r>
         <w:rPr>
@@ -2639,8 +2659,18 @@
           <w:szCs w:val="22"/>
           <w:lang w:val="en-US"/>
         </w:rPr>
-        <w:t>Click on ClassPath</w:t>
-      </w:r>
+        <w:t xml:space="preserve">Click on </w:t>
+      </w:r>
+      <w:proofErr w:type="spellStart"/>
+      <w:r>
+        <w:rPr>
+          <w:sz w:val="24"/>
+          <w:szCs w:val="22"/>
+          <w:lang w:val="en-US"/>
+        </w:rPr>
+        <w:t>ClassPath</w:t>
+      </w:r>
+      <w:proofErr w:type="spellEnd"/>
     </w:p>
     <w:p>
       <w:pPr>
@@ -2661,8 +2691,18 @@
           <w:szCs w:val="22"/>
           <w:lang w:val="en-US"/>
         </w:rPr>
-        <w:t>Click on Add External JARs..</w:t>
-      </w:r>
+        <w:t>Click on Add External JARs</w:t>
+      </w:r>
+      <w:proofErr w:type="gramStart"/>
+      <w:r>
+        <w:rPr>
+          <w:sz w:val="24"/>
+          <w:szCs w:val="22"/>
+          <w:lang w:val="en-US"/>
+        </w:rPr>
+        <w:t>..</w:t>
+      </w:r>
+      <w:proofErr w:type="gramEnd"/>
     </w:p>
     <w:p>
       <w:pPr>
@@ -2871,13 +2911,23 @@
           <w:lang w:val="en-US"/>
         </w:rPr>
       </w:pPr>
-      <w:r>
-        <w:rPr>
-          <w:sz w:val="24"/>
-          <w:szCs w:val="22"/>
-          <w:lang w:val="en-US"/>
-        </w:rPr>
-        <w:t xml:space="preserve">get() </w:t>
+      <w:proofErr w:type="gramStart"/>
+      <w:r>
+        <w:rPr>
+          <w:sz w:val="24"/>
+          <w:szCs w:val="22"/>
+          <w:lang w:val="en-US"/>
+        </w:rPr>
+        <w:t>get(</w:t>
+      </w:r>
+      <w:proofErr w:type="gramEnd"/>
+      <w:r>
+        <w:rPr>
+          <w:sz w:val="24"/>
+          <w:szCs w:val="22"/>
+          <w:lang w:val="en-US"/>
+        </w:rPr>
+        <w:t xml:space="preserve">) </w:t>
       </w:r>
       <w:r>
         <w:rPr>
@@ -2909,13 +2959,33 @@
           <w:lang w:val="en-US"/>
         </w:rPr>
       </w:pPr>
-      <w:r>
-        <w:rPr>
-          <w:sz w:val="24"/>
-          <w:szCs w:val="22"/>
-          <w:lang w:val="en-US"/>
-        </w:rPr>
-        <w:t xml:space="preserve">driver.manage().window().maximize() </w:t>
+      <w:proofErr w:type="spellStart"/>
+      <w:proofErr w:type="gramStart"/>
+      <w:r>
+        <w:rPr>
+          <w:sz w:val="24"/>
+          <w:szCs w:val="22"/>
+          <w:lang w:val="en-US"/>
+        </w:rPr>
+        <w:t>driver.manage</w:t>
+      </w:r>
+      <w:proofErr w:type="spellEnd"/>
+      <w:r>
+        <w:rPr>
+          <w:sz w:val="24"/>
+          <w:szCs w:val="22"/>
+          <w:lang w:val="en-US"/>
+        </w:rPr>
+        <w:t>(</w:t>
+      </w:r>
+      <w:proofErr w:type="gramEnd"/>
+      <w:r>
+        <w:rPr>
+          <w:sz w:val="24"/>
+          <w:szCs w:val="22"/>
+          <w:lang w:val="en-US"/>
+        </w:rPr>
+        <w:t xml:space="preserve">).window().maximize() </w:t>
       </w:r>
       <w:r>
         <w:rPr>
@@ -2947,13 +3017,23 @@
           <w:lang w:val="en-US"/>
         </w:rPr>
       </w:pPr>
-      <w:r>
-        <w:rPr>
-          <w:sz w:val="24"/>
-          <w:szCs w:val="22"/>
-          <w:lang w:val="en-US"/>
-        </w:rPr>
-        <w:t xml:space="preserve">close() </w:t>
+      <w:proofErr w:type="gramStart"/>
+      <w:r>
+        <w:rPr>
+          <w:sz w:val="24"/>
+          <w:szCs w:val="22"/>
+          <w:lang w:val="en-US"/>
+        </w:rPr>
+        <w:t>close(</w:t>
+      </w:r>
+      <w:proofErr w:type="gramEnd"/>
+      <w:r>
+        <w:rPr>
+          <w:sz w:val="24"/>
+          <w:szCs w:val="22"/>
+          <w:lang w:val="en-US"/>
+        </w:rPr>
+        <w:t xml:space="preserve">) </w:t>
       </w:r>
       <w:r>
         <w:rPr>
@@ -2985,13 +3065,23 @@
           <w:lang w:val="en-US"/>
         </w:rPr>
       </w:pPr>
-      <w:r>
-        <w:rPr>
-          <w:sz w:val="24"/>
-          <w:szCs w:val="22"/>
-          <w:lang w:val="en-US"/>
-        </w:rPr>
-        <w:t xml:space="preserve">getTitle() </w:t>
+      <w:proofErr w:type="gramStart"/>
+      <w:r>
+        <w:rPr>
+          <w:sz w:val="24"/>
+          <w:szCs w:val="22"/>
+          <w:lang w:val="en-US"/>
+        </w:rPr>
+        <w:t>getTitle(</w:t>
+      </w:r>
+      <w:proofErr w:type="gramEnd"/>
+      <w:r>
+        <w:rPr>
+          <w:sz w:val="24"/>
+          <w:szCs w:val="22"/>
+          <w:lang w:val="en-US"/>
+        </w:rPr>
+        <w:t xml:space="preserve">) </w:t>
       </w:r>
       <w:r>
         <w:rPr>
@@ -3023,13 +3113,23 @@
           <w:lang w:val="en-US"/>
         </w:rPr>
       </w:pPr>
-      <w:r>
-        <w:rPr>
-          <w:sz w:val="24"/>
-          <w:szCs w:val="22"/>
-          <w:lang w:val="en-US"/>
-        </w:rPr>
-        <w:t xml:space="preserve">getCurrentUrl() </w:t>
+      <w:proofErr w:type="gramStart"/>
+      <w:r>
+        <w:rPr>
+          <w:sz w:val="24"/>
+          <w:szCs w:val="22"/>
+          <w:lang w:val="en-US"/>
+        </w:rPr>
+        <w:t>getCurrentUrl(</w:t>
+      </w:r>
+      <w:proofErr w:type="gramEnd"/>
+      <w:r>
+        <w:rPr>
+          <w:sz w:val="24"/>
+          <w:szCs w:val="22"/>
+          <w:lang w:val="en-US"/>
+        </w:rPr>
+        <w:t xml:space="preserve">) </w:t>
       </w:r>
       <w:r>
         <w:rPr>
@@ -3061,13 +3161,23 @@
           <w:lang w:val="en-US"/>
         </w:rPr>
       </w:pPr>
-      <w:r>
-        <w:rPr>
-          <w:sz w:val="24"/>
-          <w:szCs w:val="22"/>
-          <w:lang w:val="en-US"/>
-        </w:rPr>
-        <w:t xml:space="preserve">getPageSource() </w:t>
+      <w:proofErr w:type="gramStart"/>
+      <w:r>
+        <w:rPr>
+          <w:sz w:val="24"/>
+          <w:szCs w:val="22"/>
+          <w:lang w:val="en-US"/>
+        </w:rPr>
+        <w:t>getPageSource(</w:t>
+      </w:r>
+      <w:proofErr w:type="gramEnd"/>
+      <w:r>
+        <w:rPr>
+          <w:sz w:val="24"/>
+          <w:szCs w:val="22"/>
+          <w:lang w:val="en-US"/>
+        </w:rPr>
+        <w:t xml:space="preserve">) </w:t>
       </w:r>
       <w:r>
         <w:rPr>
@@ -3099,13 +3209,23 @@
           <w:lang w:val="en-US"/>
         </w:rPr>
       </w:pPr>
-      <w:r>
-        <w:rPr>
-          <w:sz w:val="24"/>
-          <w:szCs w:val="22"/>
-          <w:lang w:val="en-US"/>
-        </w:rPr>
-        <w:t xml:space="preserve">findElement() </w:t>
+      <w:proofErr w:type="gramStart"/>
+      <w:r>
+        <w:rPr>
+          <w:sz w:val="24"/>
+          <w:szCs w:val="22"/>
+          <w:lang w:val="en-US"/>
+        </w:rPr>
+        <w:t>findElement(</w:t>
+      </w:r>
+      <w:proofErr w:type="gramEnd"/>
+      <w:r>
+        <w:rPr>
+          <w:sz w:val="24"/>
+          <w:szCs w:val="22"/>
+          <w:lang w:val="en-US"/>
+        </w:rPr>
+        <w:t xml:space="preserve">) </w:t>
       </w:r>
       <w:r>
         <w:rPr>
@@ -3155,13 +3275,23 @@
           <w:lang w:val="en-US"/>
         </w:rPr>
       </w:pPr>
-      <w:r>
-        <w:rPr>
-          <w:sz w:val="24"/>
-          <w:szCs w:val="22"/>
-          <w:lang w:val="en-US"/>
-        </w:rPr>
-        <w:t xml:space="preserve">findElements() </w:t>
+      <w:proofErr w:type="gramStart"/>
+      <w:r>
+        <w:rPr>
+          <w:sz w:val="24"/>
+          <w:szCs w:val="22"/>
+          <w:lang w:val="en-US"/>
+        </w:rPr>
+        <w:t>findElements(</w:t>
+      </w:r>
+      <w:proofErr w:type="gramEnd"/>
+      <w:r>
+        <w:rPr>
+          <w:sz w:val="24"/>
+          <w:szCs w:val="22"/>
+          <w:lang w:val="en-US"/>
+        </w:rPr>
+        <w:t xml:space="preserve">) </w:t>
       </w:r>
       <w:r>
         <w:rPr>
@@ -3193,13 +3323,23 @@
           <w:lang w:val="en-US"/>
         </w:rPr>
       </w:pPr>
-      <w:r>
-        <w:rPr>
-          <w:sz w:val="24"/>
-          <w:szCs w:val="22"/>
-          <w:lang w:val="en-US"/>
-        </w:rPr>
-        <w:t xml:space="preserve">getWindowHandles() </w:t>
+      <w:proofErr w:type="gramStart"/>
+      <w:r>
+        <w:rPr>
+          <w:sz w:val="24"/>
+          <w:szCs w:val="22"/>
+          <w:lang w:val="en-US"/>
+        </w:rPr>
+        <w:t>getWindowHandles(</w:t>
+      </w:r>
+      <w:proofErr w:type="gramEnd"/>
+      <w:r>
+        <w:rPr>
+          <w:sz w:val="24"/>
+          <w:szCs w:val="22"/>
+          <w:lang w:val="en-US"/>
+        </w:rPr>
+        <w:t xml:space="preserve">) </w:t>
       </w:r>
       <w:r>
         <w:rPr>
@@ -3231,13 +3371,23 @@
           <w:lang w:val="en-US"/>
         </w:rPr>
       </w:pPr>
-      <w:r>
-        <w:rPr>
-          <w:sz w:val="24"/>
-          <w:szCs w:val="22"/>
-          <w:lang w:val="en-US"/>
-        </w:rPr>
-        <w:t xml:space="preserve">quit() </w:t>
+      <w:proofErr w:type="gramStart"/>
+      <w:r>
+        <w:rPr>
+          <w:sz w:val="24"/>
+          <w:szCs w:val="22"/>
+          <w:lang w:val="en-US"/>
+        </w:rPr>
+        <w:t>quit(</w:t>
+      </w:r>
+      <w:proofErr w:type="gramEnd"/>
+      <w:r>
+        <w:rPr>
+          <w:sz w:val="24"/>
+          <w:szCs w:val="22"/>
+          <w:lang w:val="en-US"/>
+        </w:rPr>
+        <w:t xml:space="preserve">) </w:t>
       </w:r>
       <w:r>
         <w:rPr>
@@ -3618,7 +3768,25 @@
           <w:szCs w:val="22"/>
           <w:lang w:val="en-US"/>
         </w:rPr>
-        <w:t xml:space="preserve"> driver.get() is having implicit wait of 30 seconds, means Selenium will wait for maximum 30 seconds till the page get loaded. But if the page is not getting loaded within 30 seconds, Selenium will throw SessionTimeoutException.</w:t>
+        <w:t xml:space="preserve"> </w:t>
+      </w:r>
+      <w:proofErr w:type="spellStart"/>
+      <w:r>
+        <w:rPr>
+          <w:sz w:val="24"/>
+          <w:szCs w:val="22"/>
+          <w:lang w:val="en-US"/>
+        </w:rPr>
+        <w:t>driver.get</w:t>
+      </w:r>
+      <w:proofErr w:type="spellEnd"/>
+      <w:r>
+        <w:rPr>
+          <w:sz w:val="24"/>
+          <w:szCs w:val="22"/>
+          <w:lang w:val="en-US"/>
+        </w:rPr>
+        <w:t>() is having implicit wait of 30 seconds, means Selenium will wait for maximum 30 seconds till the page get loaded. But if the page is not getting loaded within 30 seconds, Selenium will throw SessionTimeoutException.</w:t>
       </w:r>
     </w:p>
     <w:p>
@@ -3880,13 +4048,23 @@
           <w:lang w:val="en-US"/>
         </w:rPr>
       </w:pPr>
-      <w:r>
-        <w:rPr>
-          <w:sz w:val="24"/>
-          <w:szCs w:val="22"/>
-          <w:lang w:val="en-US"/>
-        </w:rPr>
-        <w:t xml:space="preserve">sendKeys() </w:t>
+      <w:proofErr w:type="gramStart"/>
+      <w:r>
+        <w:rPr>
+          <w:sz w:val="24"/>
+          <w:szCs w:val="22"/>
+          <w:lang w:val="en-US"/>
+        </w:rPr>
+        <w:t>sendKeys(</w:t>
+      </w:r>
+      <w:proofErr w:type="gramEnd"/>
+      <w:r>
+        <w:rPr>
+          <w:sz w:val="24"/>
+          <w:szCs w:val="22"/>
+          <w:lang w:val="en-US"/>
+        </w:rPr>
+        <w:t xml:space="preserve">) </w:t>
       </w:r>
       <w:r>
         <w:rPr>
@@ -3926,13 +4104,23 @@
           <w:lang w:val="en-US"/>
         </w:rPr>
       </w:pPr>
-      <w:r>
-        <w:rPr>
-          <w:sz w:val="24"/>
-          <w:szCs w:val="22"/>
-          <w:lang w:val="en-US"/>
-        </w:rPr>
-        <w:t xml:space="preserve">click() </w:t>
+      <w:proofErr w:type="gramStart"/>
+      <w:r>
+        <w:rPr>
+          <w:sz w:val="24"/>
+          <w:szCs w:val="22"/>
+          <w:lang w:val="en-US"/>
+        </w:rPr>
+        <w:t>click(</w:t>
+      </w:r>
+      <w:proofErr w:type="gramEnd"/>
+      <w:r>
+        <w:rPr>
+          <w:sz w:val="24"/>
+          <w:szCs w:val="22"/>
+          <w:lang w:val="en-US"/>
+        </w:rPr>
+        <w:t xml:space="preserve">) </w:t>
       </w:r>
       <w:r>
         <w:rPr>
@@ -3964,13 +4152,23 @@
           <w:lang w:val="en-US"/>
         </w:rPr>
       </w:pPr>
-      <w:r>
-        <w:rPr>
-          <w:sz w:val="24"/>
-          <w:szCs w:val="22"/>
-          <w:lang w:val="en-US"/>
-        </w:rPr>
-        <w:t xml:space="preserve">getText() </w:t>
+      <w:proofErr w:type="gramStart"/>
+      <w:r>
+        <w:rPr>
+          <w:sz w:val="24"/>
+          <w:szCs w:val="22"/>
+          <w:lang w:val="en-US"/>
+        </w:rPr>
+        <w:t>getText(</w:t>
+      </w:r>
+      <w:proofErr w:type="gramEnd"/>
+      <w:r>
+        <w:rPr>
+          <w:sz w:val="24"/>
+          <w:szCs w:val="22"/>
+          <w:lang w:val="en-US"/>
+        </w:rPr>
+        <w:t xml:space="preserve">) </w:t>
       </w:r>
       <w:r>
         <w:rPr>
@@ -4002,13 +4200,23 @@
           <w:lang w:val="en-US"/>
         </w:rPr>
       </w:pPr>
-      <w:r>
-        <w:rPr>
-          <w:sz w:val="24"/>
-          <w:szCs w:val="22"/>
-          <w:lang w:val="en-US"/>
-        </w:rPr>
-        <w:t xml:space="preserve">getAttribute() </w:t>
+      <w:proofErr w:type="gramStart"/>
+      <w:r>
+        <w:rPr>
+          <w:sz w:val="24"/>
+          <w:szCs w:val="22"/>
+          <w:lang w:val="en-US"/>
+        </w:rPr>
+        <w:t>getAttribute(</w:t>
+      </w:r>
+      <w:proofErr w:type="gramEnd"/>
+      <w:r>
+        <w:rPr>
+          <w:sz w:val="24"/>
+          <w:szCs w:val="22"/>
+          <w:lang w:val="en-US"/>
+        </w:rPr>
+        <w:t xml:space="preserve">) </w:t>
       </w:r>
       <w:r>
         <w:rPr>
@@ -4040,13 +4248,23 @@
           <w:lang w:val="en-US"/>
         </w:rPr>
       </w:pPr>
-      <w:r>
-        <w:rPr>
-          <w:sz w:val="24"/>
-          <w:szCs w:val="22"/>
-          <w:lang w:val="en-US"/>
-        </w:rPr>
-        <w:t xml:space="preserve">isSelected() </w:t>
+      <w:proofErr w:type="gramStart"/>
+      <w:r>
+        <w:rPr>
+          <w:sz w:val="24"/>
+          <w:szCs w:val="22"/>
+          <w:lang w:val="en-US"/>
+        </w:rPr>
+        <w:t>isSelected(</w:t>
+      </w:r>
+      <w:proofErr w:type="gramEnd"/>
+      <w:r>
+        <w:rPr>
+          <w:sz w:val="24"/>
+          <w:szCs w:val="22"/>
+          <w:lang w:val="en-US"/>
+        </w:rPr>
+        <w:t xml:space="preserve">) </w:t>
       </w:r>
       <w:r>
         <w:rPr>
@@ -4086,13 +4304,23 @@
           <w:lang w:val="en-US"/>
         </w:rPr>
       </w:pPr>
-      <w:r>
-        <w:rPr>
-          <w:sz w:val="24"/>
-          <w:szCs w:val="22"/>
-          <w:lang w:val="en-US"/>
-        </w:rPr>
-        <w:t xml:space="preserve">isEnabled() </w:t>
+      <w:proofErr w:type="gramStart"/>
+      <w:r>
+        <w:rPr>
+          <w:sz w:val="24"/>
+          <w:szCs w:val="22"/>
+          <w:lang w:val="en-US"/>
+        </w:rPr>
+        <w:t>isEnabled(</w:t>
+      </w:r>
+      <w:proofErr w:type="gramEnd"/>
+      <w:r>
+        <w:rPr>
+          <w:sz w:val="24"/>
+          <w:szCs w:val="22"/>
+          <w:lang w:val="en-US"/>
+        </w:rPr>
+        <w:t xml:space="preserve">) </w:t>
       </w:r>
       <w:r>
         <w:rPr>
@@ -4162,13 +4390,23 @@
           <w:lang w:val="en-US"/>
         </w:rPr>
       </w:pPr>
-      <w:r>
-        <w:rPr>
-          <w:sz w:val="24"/>
-          <w:szCs w:val="22"/>
-          <w:lang w:val="en-US"/>
-        </w:rPr>
-        <w:t xml:space="preserve">clear() </w:t>
+      <w:proofErr w:type="gramStart"/>
+      <w:r>
+        <w:rPr>
+          <w:sz w:val="24"/>
+          <w:szCs w:val="22"/>
+          <w:lang w:val="en-US"/>
+        </w:rPr>
+        <w:t>clear(</w:t>
+      </w:r>
+      <w:proofErr w:type="gramEnd"/>
+      <w:r>
+        <w:rPr>
+          <w:sz w:val="24"/>
+          <w:szCs w:val="22"/>
+          <w:lang w:val="en-US"/>
+        </w:rPr>
+        <w:t xml:space="preserve">) </w:t>
       </w:r>
       <w:r>
         <w:rPr>
@@ -5264,13 +5502,23 @@
           <w:lang w:val="en-US"/>
         </w:rPr>
       </w:pPr>
-      <w:r>
-        <w:rPr>
-          <w:sz w:val="24"/>
-          <w:szCs w:val="22"/>
-          <w:lang w:val="en-US"/>
-        </w:rPr>
-        <w:t xml:space="preserve">getFirstSelectedOption() </w:t>
+      <w:proofErr w:type="gramStart"/>
+      <w:r>
+        <w:rPr>
+          <w:sz w:val="24"/>
+          <w:szCs w:val="22"/>
+          <w:lang w:val="en-US"/>
+        </w:rPr>
+        <w:t>getFirstSelectedOption(</w:t>
+      </w:r>
+      <w:proofErr w:type="gramEnd"/>
+      <w:r>
+        <w:rPr>
+          <w:sz w:val="24"/>
+          <w:szCs w:val="22"/>
+          <w:lang w:val="en-US"/>
+        </w:rPr>
+        <w:t xml:space="preserve">) </w:t>
       </w:r>
       <w:r>
         <w:rPr>
@@ -5318,13 +5566,23 @@
           <w:lang w:val="en-US"/>
         </w:rPr>
       </w:pPr>
-      <w:r>
-        <w:rPr>
-          <w:sz w:val="24"/>
-          <w:szCs w:val="22"/>
-          <w:lang w:val="en-US"/>
-        </w:rPr>
-        <w:t xml:space="preserve">getOptions() </w:t>
+      <w:proofErr w:type="gramStart"/>
+      <w:r>
+        <w:rPr>
+          <w:sz w:val="24"/>
+          <w:szCs w:val="22"/>
+          <w:lang w:val="en-US"/>
+        </w:rPr>
+        <w:t>getOptions(</w:t>
+      </w:r>
+      <w:proofErr w:type="gramEnd"/>
+      <w:r>
+        <w:rPr>
+          <w:sz w:val="24"/>
+          <w:szCs w:val="22"/>
+          <w:lang w:val="en-US"/>
+        </w:rPr>
+        <w:t xml:space="preserve">) </w:t>
       </w:r>
       <w:r>
         <w:rPr>
@@ -5356,13 +5614,23 @@
           <w:lang w:val="en-US"/>
         </w:rPr>
       </w:pPr>
-      <w:r>
-        <w:rPr>
-          <w:sz w:val="24"/>
-          <w:szCs w:val="22"/>
-          <w:lang w:val="en-US"/>
-        </w:rPr>
-        <w:t xml:space="preserve">selectByVisibleText() </w:t>
+      <w:proofErr w:type="gramStart"/>
+      <w:r>
+        <w:rPr>
+          <w:sz w:val="24"/>
+          <w:szCs w:val="22"/>
+          <w:lang w:val="en-US"/>
+        </w:rPr>
+        <w:t>selectByVisibleText(</w:t>
+      </w:r>
+      <w:proofErr w:type="gramEnd"/>
+      <w:r>
+        <w:rPr>
+          <w:sz w:val="24"/>
+          <w:szCs w:val="22"/>
+          <w:lang w:val="en-US"/>
+        </w:rPr>
+        <w:t xml:space="preserve">) </w:t>
       </w:r>
       <w:r>
         <w:rPr>
@@ -5394,13 +5662,23 @@
           <w:lang w:val="en-US"/>
         </w:rPr>
       </w:pPr>
-      <w:r>
-        <w:rPr>
-          <w:sz w:val="24"/>
-          <w:szCs w:val="22"/>
-          <w:lang w:val="en-US"/>
-        </w:rPr>
-        <w:t xml:space="preserve">selectByContainsVisibleText() </w:t>
+      <w:proofErr w:type="gramStart"/>
+      <w:r>
+        <w:rPr>
+          <w:sz w:val="24"/>
+          <w:szCs w:val="22"/>
+          <w:lang w:val="en-US"/>
+        </w:rPr>
+        <w:t>selectByContainsVisibleText(</w:t>
+      </w:r>
+      <w:proofErr w:type="gramEnd"/>
+      <w:r>
+        <w:rPr>
+          <w:sz w:val="24"/>
+          <w:szCs w:val="22"/>
+          <w:lang w:val="en-US"/>
+        </w:rPr>
+        <w:t xml:space="preserve">) </w:t>
       </w:r>
       <w:r>
         <w:rPr>
@@ -5432,13 +5710,23 @@
           <w:lang w:val="en-US"/>
         </w:rPr>
       </w:pPr>
-      <w:r>
-        <w:rPr>
-          <w:sz w:val="24"/>
-          <w:szCs w:val="22"/>
-          <w:lang w:val="en-US"/>
-        </w:rPr>
-        <w:t xml:space="preserve">selectByValue() </w:t>
+      <w:proofErr w:type="gramStart"/>
+      <w:r>
+        <w:rPr>
+          <w:sz w:val="24"/>
+          <w:szCs w:val="22"/>
+          <w:lang w:val="en-US"/>
+        </w:rPr>
+        <w:t>selectByValue(</w:t>
+      </w:r>
+      <w:proofErr w:type="gramEnd"/>
+      <w:r>
+        <w:rPr>
+          <w:sz w:val="24"/>
+          <w:szCs w:val="22"/>
+          <w:lang w:val="en-US"/>
+        </w:rPr>
+        <w:t xml:space="preserve">) </w:t>
       </w:r>
       <w:r>
         <w:rPr>
@@ -5470,13 +5758,23 @@
           <w:lang w:val="en-US"/>
         </w:rPr>
       </w:pPr>
-      <w:r>
-        <w:rPr>
-          <w:sz w:val="24"/>
-          <w:szCs w:val="22"/>
-          <w:lang w:val="en-US"/>
-        </w:rPr>
-        <w:t xml:space="preserve">selectByIndex() </w:t>
+      <w:proofErr w:type="gramStart"/>
+      <w:r>
+        <w:rPr>
+          <w:sz w:val="24"/>
+          <w:szCs w:val="22"/>
+          <w:lang w:val="en-US"/>
+        </w:rPr>
+        <w:t>selectByIndex(</w:t>
+      </w:r>
+      <w:proofErr w:type="gramEnd"/>
+      <w:r>
+        <w:rPr>
+          <w:sz w:val="24"/>
+          <w:szCs w:val="22"/>
+          <w:lang w:val="en-US"/>
+        </w:rPr>
+        <w:t xml:space="preserve">) </w:t>
       </w:r>
       <w:r>
         <w:rPr>
@@ -5508,13 +5806,23 @@
           <w:lang w:val="en-US"/>
         </w:rPr>
       </w:pPr>
-      <w:r>
-        <w:rPr>
-          <w:sz w:val="24"/>
-          <w:szCs w:val="22"/>
-          <w:lang w:val="en-US"/>
-        </w:rPr>
-        <w:t xml:space="preserve">getAllSelectedOptions() </w:t>
+      <w:proofErr w:type="gramStart"/>
+      <w:r>
+        <w:rPr>
+          <w:sz w:val="24"/>
+          <w:szCs w:val="22"/>
+          <w:lang w:val="en-US"/>
+        </w:rPr>
+        <w:t>getAllSelectedOptions(</w:t>
+      </w:r>
+      <w:proofErr w:type="gramEnd"/>
+      <w:r>
+        <w:rPr>
+          <w:sz w:val="24"/>
+          <w:szCs w:val="22"/>
+          <w:lang w:val="en-US"/>
+        </w:rPr>
+        <w:t xml:space="preserve">) </w:t>
       </w:r>
       <w:r>
         <w:rPr>
@@ -5554,13 +5862,23 @@
           <w:lang w:val="en-US"/>
         </w:rPr>
       </w:pPr>
-      <w:r>
-        <w:rPr>
-          <w:sz w:val="24"/>
-          <w:szCs w:val="22"/>
-          <w:lang w:val="en-US"/>
-        </w:rPr>
-        <w:t xml:space="preserve">isMultiple() </w:t>
+      <w:proofErr w:type="gramStart"/>
+      <w:r>
+        <w:rPr>
+          <w:sz w:val="24"/>
+          <w:szCs w:val="22"/>
+          <w:lang w:val="en-US"/>
+        </w:rPr>
+        <w:t>isMultiple(</w:t>
+      </w:r>
+      <w:proofErr w:type="gramEnd"/>
+      <w:r>
+        <w:rPr>
+          <w:sz w:val="24"/>
+          <w:szCs w:val="22"/>
+          <w:lang w:val="en-US"/>
+        </w:rPr>
+        <w:t xml:space="preserve">) </w:t>
       </w:r>
       <w:r>
         <w:rPr>
@@ -5749,13 +6067,33 @@
           <w:lang w:val="en-US"/>
         </w:rPr>
       </w:pPr>
-      <w:r>
-        <w:rPr>
-          <w:sz w:val="24"/>
-          <w:szCs w:val="22"/>
-          <w:lang w:val="en-US"/>
-        </w:rPr>
-        <w:t>Thread.sleep()</w:t>
+      <w:proofErr w:type="spellStart"/>
+      <w:proofErr w:type="gramStart"/>
+      <w:r>
+        <w:rPr>
+          <w:sz w:val="24"/>
+          <w:szCs w:val="22"/>
+          <w:lang w:val="en-US"/>
+        </w:rPr>
+        <w:t>Thread.sleep</w:t>
+      </w:r>
+      <w:proofErr w:type="spellEnd"/>
+      <w:r>
+        <w:rPr>
+          <w:sz w:val="24"/>
+          <w:szCs w:val="22"/>
+          <w:lang w:val="en-US"/>
+        </w:rPr>
+        <w:t>(</w:t>
+      </w:r>
+      <w:proofErr w:type="gramEnd"/>
+      <w:r>
+        <w:rPr>
+          <w:sz w:val="24"/>
+          <w:szCs w:val="22"/>
+          <w:lang w:val="en-US"/>
+        </w:rPr>
+        <w:t>)</w:t>
       </w:r>
       <w:r>
         <w:rPr>
@@ -6189,7 +6527,24 @@
           <w:lang w:val="en-US"/>
         </w:rPr>
         <w:br/>
-        <w:t xml:space="preserve">i – ignoring </w:t>
+      </w:r>
+      <w:proofErr w:type="spellStart"/>
+      <w:r>
+        <w:rPr>
+          <w:sz w:val="24"/>
+          <w:szCs w:val="22"/>
+          <w:lang w:val="en-US"/>
+        </w:rPr>
+        <w:t>i</w:t>
+      </w:r>
+      <w:proofErr w:type="spellEnd"/>
+      <w:r>
+        <w:rPr>
+          <w:sz w:val="24"/>
+          <w:szCs w:val="22"/>
+          <w:lang w:val="en-US"/>
+        </w:rPr>
+        <w:t xml:space="preserve"> – ignoring </w:t>
       </w:r>
       <w:r>
         <w:rPr>
@@ -6279,7 +6634,25 @@
           <w:szCs w:val="22"/>
           <w:lang w:val="en-US"/>
         </w:rPr>
-        <w:t>&lt;table&gt;</w:t>
+        <w:t>&lt;</w:t>
+      </w:r>
+      <w:proofErr w:type="gramStart"/>
+      <w:r>
+        <w:rPr>
+          <w:sz w:val="24"/>
+          <w:szCs w:val="22"/>
+          <w:lang w:val="en-US"/>
+        </w:rPr>
+        <w:t>table</w:t>
+      </w:r>
+      <w:proofErr w:type="gramEnd"/>
+      <w:r>
+        <w:rPr>
+          <w:sz w:val="24"/>
+          <w:szCs w:val="22"/>
+          <w:lang w:val="en-US"/>
+        </w:rPr>
+        <w:t>&gt;</w:t>
       </w:r>
     </w:p>
     <w:p>
@@ -6297,7 +6670,27 @@
           <w:lang w:val="en-US"/>
         </w:rPr>
         <w:tab/>
-        <w:t>&lt;thead&gt;</w:t>
+        <w:t>&lt;</w:t>
+      </w:r>
+      <w:proofErr w:type="spellStart"/>
+      <w:proofErr w:type="gramStart"/>
+      <w:r>
+        <w:rPr>
+          <w:sz w:val="24"/>
+          <w:szCs w:val="22"/>
+          <w:lang w:val="en-US"/>
+        </w:rPr>
+        <w:t>thead</w:t>
+      </w:r>
+      <w:proofErr w:type="spellEnd"/>
+      <w:proofErr w:type="gramEnd"/>
+      <w:r>
+        <w:rPr>
+          <w:sz w:val="24"/>
+          <w:szCs w:val="22"/>
+          <w:lang w:val="en-US"/>
+        </w:rPr>
+        <w:t>&gt;</w:t>
       </w:r>
       <w:r>
         <w:rPr>
@@ -6332,7 +6725,27 @@
           <w:lang w:val="en-US"/>
         </w:rPr>
         <w:tab/>
-        <w:t>&lt;tr&gt;</w:t>
+        <w:t>&lt;</w:t>
+      </w:r>
+      <w:proofErr w:type="spellStart"/>
+      <w:proofErr w:type="gramStart"/>
+      <w:r>
+        <w:rPr>
+          <w:sz w:val="24"/>
+          <w:szCs w:val="22"/>
+          <w:lang w:val="en-US"/>
+        </w:rPr>
+        <w:t>tr</w:t>
+      </w:r>
+      <w:proofErr w:type="spellEnd"/>
+      <w:proofErr w:type="gramEnd"/>
+      <w:r>
+        <w:rPr>
+          <w:sz w:val="24"/>
+          <w:szCs w:val="22"/>
+          <w:lang w:val="en-US"/>
+        </w:rPr>
+        <w:t>&gt;</w:t>
       </w:r>
       <w:r>
         <w:rPr>
@@ -6375,7 +6788,63 @@
           <w:lang w:val="en-US"/>
         </w:rPr>
         <w:tab/>
-        <w:t>&lt;th&gt;Sr No&lt;/th&gt;</w:t>
+        <w:t>&lt;</w:t>
+      </w:r>
+      <w:proofErr w:type="spellStart"/>
+      <w:proofErr w:type="gramStart"/>
+      <w:r>
+        <w:rPr>
+          <w:sz w:val="24"/>
+          <w:szCs w:val="22"/>
+          <w:lang w:val="en-US"/>
+        </w:rPr>
+        <w:t>th</w:t>
+      </w:r>
+      <w:proofErr w:type="spellEnd"/>
+      <w:r>
+        <w:rPr>
+          <w:sz w:val="24"/>
+          <w:szCs w:val="22"/>
+          <w:lang w:val="en-US"/>
+        </w:rPr>
+        <w:t>&gt;</w:t>
+      </w:r>
+      <w:proofErr w:type="spellStart"/>
+      <w:proofErr w:type="gramEnd"/>
+      <w:r>
+        <w:rPr>
+          <w:sz w:val="24"/>
+          <w:szCs w:val="22"/>
+          <w:lang w:val="en-US"/>
+        </w:rPr>
+        <w:t>Sr</w:t>
+      </w:r>
+      <w:proofErr w:type="spellEnd"/>
+      <w:r>
+        <w:rPr>
+          <w:sz w:val="24"/>
+          <w:szCs w:val="22"/>
+          <w:lang w:val="en-US"/>
+        </w:rPr>
+        <w:t xml:space="preserve"> No&lt;/</w:t>
+      </w:r>
+      <w:proofErr w:type="spellStart"/>
+      <w:r>
+        <w:rPr>
+          <w:sz w:val="24"/>
+          <w:szCs w:val="22"/>
+          <w:lang w:val="en-US"/>
+        </w:rPr>
+        <w:t>th</w:t>
+      </w:r>
+      <w:proofErr w:type="spellEnd"/>
+      <w:r>
+        <w:rPr>
+          <w:sz w:val="24"/>
+          <w:szCs w:val="22"/>
+          <w:lang w:val="en-US"/>
+        </w:rPr>
+        <w:t>&gt;</w:t>
       </w:r>
       <w:r>
         <w:rPr>
@@ -6418,7 +6887,53 @@
           <w:lang w:val="en-US"/>
         </w:rPr>
         <w:tab/>
-        <w:t>&lt;th&gt;Company&lt;/th&gt;</w:t>
+        <w:t>&lt;</w:t>
+      </w:r>
+      <w:proofErr w:type="spellStart"/>
+      <w:proofErr w:type="gramStart"/>
+      <w:r>
+        <w:rPr>
+          <w:sz w:val="24"/>
+          <w:szCs w:val="22"/>
+          <w:lang w:val="en-US"/>
+        </w:rPr>
+        <w:t>th</w:t>
+      </w:r>
+      <w:proofErr w:type="spellEnd"/>
+      <w:r>
+        <w:rPr>
+          <w:sz w:val="24"/>
+          <w:szCs w:val="22"/>
+          <w:lang w:val="en-US"/>
+        </w:rPr>
+        <w:t>&gt;</w:t>
+      </w:r>
+      <w:proofErr w:type="gramEnd"/>
+      <w:r>
+        <w:rPr>
+          <w:sz w:val="24"/>
+          <w:szCs w:val="22"/>
+          <w:lang w:val="en-US"/>
+        </w:rPr>
+        <w:t>Company&lt;/</w:t>
+      </w:r>
+      <w:proofErr w:type="spellStart"/>
+      <w:r>
+        <w:rPr>
+          <w:sz w:val="24"/>
+          <w:szCs w:val="22"/>
+          <w:lang w:val="en-US"/>
+        </w:rPr>
+        <w:t>th</w:t>
+      </w:r>
+      <w:proofErr w:type="spellEnd"/>
+      <w:r>
+        <w:rPr>
+          <w:sz w:val="24"/>
+          <w:szCs w:val="22"/>
+          <w:lang w:val="en-US"/>
+        </w:rPr>
+        <w:t>&gt;</w:t>
       </w:r>
     </w:p>
     <w:p>
@@ -6444,7 +6959,27 @@
           <w:lang w:val="en-US"/>
         </w:rPr>
         <w:tab/>
-        <w:t>&lt;/tr&gt;</w:t>
+        <w:t>&lt;/</w:t>
+      </w:r>
+      <w:proofErr w:type="spellStart"/>
+      <w:proofErr w:type="gramStart"/>
+      <w:r>
+        <w:rPr>
+          <w:sz w:val="24"/>
+          <w:szCs w:val="22"/>
+          <w:lang w:val="en-US"/>
+        </w:rPr>
+        <w:t>tr</w:t>
+      </w:r>
+      <w:proofErr w:type="spellEnd"/>
+      <w:proofErr w:type="gramEnd"/>
+      <w:r>
+        <w:rPr>
+          <w:sz w:val="24"/>
+          <w:szCs w:val="22"/>
+          <w:lang w:val="en-US"/>
+        </w:rPr>
+        <w:t>&gt;</w:t>
       </w:r>
     </w:p>
     <w:p>
@@ -6462,7 +6997,25 @@
           <w:lang w:val="en-US"/>
         </w:rPr>
         <w:tab/>
-        <w:t>&lt;/thead&gt;</w:t>
+        <w:t>&lt;/</w:t>
+      </w:r>
+      <w:proofErr w:type="spellStart"/>
+      <w:r>
+        <w:rPr>
+          <w:sz w:val="24"/>
+          <w:szCs w:val="22"/>
+          <w:lang w:val="en-US"/>
+        </w:rPr>
+        <w:t>thead</w:t>
+      </w:r>
+      <w:proofErr w:type="spellEnd"/>
+      <w:r>
+        <w:rPr>
+          <w:sz w:val="24"/>
+          <w:szCs w:val="22"/>
+          <w:lang w:val="en-US"/>
+        </w:rPr>
+        <w:t>&gt;</w:t>
       </w:r>
     </w:p>
     <w:p>
@@ -6480,7 +7033,27 @@
           <w:lang w:val="en-US"/>
         </w:rPr>
         <w:tab/>
-        <w:t>&lt;tbody&gt;</w:t>
+        <w:t>&lt;</w:t>
+      </w:r>
+      <w:proofErr w:type="spellStart"/>
+      <w:proofErr w:type="gramStart"/>
+      <w:r>
+        <w:rPr>
+          <w:sz w:val="24"/>
+          <w:szCs w:val="22"/>
+          <w:lang w:val="en-US"/>
+        </w:rPr>
+        <w:t>tbody</w:t>
+      </w:r>
+      <w:proofErr w:type="spellEnd"/>
+      <w:proofErr w:type="gramEnd"/>
+      <w:r>
+        <w:rPr>
+          <w:sz w:val="24"/>
+          <w:szCs w:val="22"/>
+          <w:lang w:val="en-US"/>
+        </w:rPr>
+        <w:t>&gt;</w:t>
       </w:r>
       <w:r>
         <w:rPr>
@@ -6515,7 +7088,27 @@
           <w:lang w:val="en-US"/>
         </w:rPr>
         <w:tab/>
-        <w:t>&lt;tr&gt;</w:t>
+        <w:t>&lt;</w:t>
+      </w:r>
+      <w:proofErr w:type="spellStart"/>
+      <w:proofErr w:type="gramStart"/>
+      <w:r>
+        <w:rPr>
+          <w:sz w:val="24"/>
+          <w:szCs w:val="22"/>
+          <w:lang w:val="en-US"/>
+        </w:rPr>
+        <w:t>tr</w:t>
+      </w:r>
+      <w:proofErr w:type="spellEnd"/>
+      <w:proofErr w:type="gramEnd"/>
+      <w:r>
+        <w:rPr>
+          <w:sz w:val="24"/>
+          <w:szCs w:val="22"/>
+          <w:lang w:val="en-US"/>
+        </w:rPr>
+        <w:t>&gt;</w:t>
       </w:r>
     </w:p>
     <w:p>
@@ -6549,7 +7142,25 @@
           <w:lang w:val="en-US"/>
         </w:rPr>
         <w:tab/>
-        <w:t>&lt;td&gt;1&lt;/td&gt;</w:t>
+        <w:t>&lt;</w:t>
+      </w:r>
+      <w:proofErr w:type="gramStart"/>
+      <w:r>
+        <w:rPr>
+          <w:sz w:val="24"/>
+          <w:szCs w:val="22"/>
+          <w:lang w:val="en-US"/>
+        </w:rPr>
+        <w:t>td&gt;</w:t>
+      </w:r>
+      <w:proofErr w:type="gramEnd"/>
+      <w:r>
+        <w:rPr>
+          <w:sz w:val="24"/>
+          <w:szCs w:val="22"/>
+          <w:lang w:val="en-US"/>
+        </w:rPr>
+        <w:t>1&lt;/td&gt;</w:t>
       </w:r>
     </w:p>
     <w:p>
@@ -6583,7 +7194,35 @@
           <w:lang w:val="en-US"/>
         </w:rPr>
         <w:tab/>
-        <w:t>&lt;td&gt;AViIT&lt;/td&gt;</w:t>
+        <w:t>&lt;</w:t>
+      </w:r>
+      <w:proofErr w:type="gramStart"/>
+      <w:r>
+        <w:rPr>
+          <w:sz w:val="24"/>
+          <w:szCs w:val="22"/>
+          <w:lang w:val="en-US"/>
+        </w:rPr>
+        <w:t>td&gt;</w:t>
+      </w:r>
+      <w:proofErr w:type="spellStart"/>
+      <w:proofErr w:type="gramEnd"/>
+      <w:r>
+        <w:rPr>
+          <w:sz w:val="24"/>
+          <w:szCs w:val="22"/>
+          <w:lang w:val="en-US"/>
+        </w:rPr>
+        <w:t>AViIT</w:t>
+      </w:r>
+      <w:proofErr w:type="spellEnd"/>
+      <w:r>
+        <w:rPr>
+          <w:sz w:val="24"/>
+          <w:szCs w:val="22"/>
+          <w:lang w:val="en-US"/>
+        </w:rPr>
+        <w:t>&lt;/td&gt;</w:t>
       </w:r>
     </w:p>
     <w:p>
@@ -6609,7 +7248,27 @@
           <w:lang w:val="en-US"/>
         </w:rPr>
         <w:tab/>
-        <w:t>&lt;/tr&gt;</w:t>
+        <w:t>&lt;/</w:t>
+      </w:r>
+      <w:proofErr w:type="spellStart"/>
+      <w:proofErr w:type="gramStart"/>
+      <w:r>
+        <w:rPr>
+          <w:sz w:val="24"/>
+          <w:szCs w:val="22"/>
+          <w:lang w:val="en-US"/>
+        </w:rPr>
+        <w:t>tr</w:t>
+      </w:r>
+      <w:proofErr w:type="spellEnd"/>
+      <w:proofErr w:type="gramEnd"/>
+      <w:r>
+        <w:rPr>
+          <w:sz w:val="24"/>
+          <w:szCs w:val="22"/>
+          <w:lang w:val="en-US"/>
+        </w:rPr>
+        <w:t>&gt;</w:t>
       </w:r>
     </w:p>
     <w:p>
@@ -6635,7 +7294,27 @@
           <w:lang w:val="en-US"/>
         </w:rPr>
         <w:tab/>
-        <w:t>&lt;tr&gt;</w:t>
+        <w:t>&lt;</w:t>
+      </w:r>
+      <w:proofErr w:type="spellStart"/>
+      <w:proofErr w:type="gramStart"/>
+      <w:r>
+        <w:rPr>
+          <w:sz w:val="24"/>
+          <w:szCs w:val="22"/>
+          <w:lang w:val="en-US"/>
+        </w:rPr>
+        <w:t>tr</w:t>
+      </w:r>
+      <w:proofErr w:type="spellEnd"/>
+      <w:proofErr w:type="gramEnd"/>
+      <w:r>
+        <w:rPr>
+          <w:sz w:val="24"/>
+          <w:szCs w:val="22"/>
+          <w:lang w:val="en-US"/>
+        </w:rPr>
+        <w:t>&gt;</w:t>
       </w:r>
     </w:p>
     <w:p>
@@ -6669,7 +7348,25 @@
           <w:lang w:val="en-US"/>
         </w:rPr>
         <w:tab/>
-        <w:t>&lt;td&gt;2&lt;/td&gt;</w:t>
+        <w:t>&lt;</w:t>
+      </w:r>
+      <w:proofErr w:type="gramStart"/>
+      <w:r>
+        <w:rPr>
+          <w:sz w:val="24"/>
+          <w:szCs w:val="22"/>
+          <w:lang w:val="en-US"/>
+        </w:rPr>
+        <w:t>td&gt;</w:t>
+      </w:r>
+      <w:proofErr w:type="gramEnd"/>
+      <w:r>
+        <w:rPr>
+          <w:sz w:val="24"/>
+          <w:szCs w:val="22"/>
+          <w:lang w:val="en-US"/>
+        </w:rPr>
+        <w:t>2&lt;/td&gt;</w:t>
       </w:r>
     </w:p>
     <w:p>
@@ -6703,7 +7400,35 @@
           <w:lang w:val="en-US"/>
         </w:rPr>
         <w:tab/>
-        <w:t>&lt;td&gt;Manorama&lt;/td</w:t>
+        <w:t>&lt;</w:t>
+      </w:r>
+      <w:proofErr w:type="gramStart"/>
+      <w:r>
+        <w:rPr>
+          <w:sz w:val="24"/>
+          <w:szCs w:val="22"/>
+          <w:lang w:val="en-US"/>
+        </w:rPr>
+        <w:t>td&gt;</w:t>
+      </w:r>
+      <w:proofErr w:type="spellStart"/>
+      <w:proofErr w:type="gramEnd"/>
+      <w:r>
+        <w:rPr>
+          <w:sz w:val="24"/>
+          <w:szCs w:val="22"/>
+          <w:lang w:val="en-US"/>
+        </w:rPr>
+        <w:t>Manorama</w:t>
+      </w:r>
+      <w:proofErr w:type="spellEnd"/>
+      <w:r>
+        <w:rPr>
+          <w:sz w:val="24"/>
+          <w:szCs w:val="22"/>
+          <w:lang w:val="en-US"/>
+        </w:rPr>
+        <w:t>&lt;/td</w:t>
       </w:r>
     </w:p>
     <w:p>
@@ -6729,7 +7454,27 @@
           <w:lang w:val="en-US"/>
         </w:rPr>
         <w:tab/>
-        <w:t>&lt;/tr&gt;</w:t>
+        <w:t>&lt;/</w:t>
+      </w:r>
+      <w:proofErr w:type="spellStart"/>
+      <w:proofErr w:type="gramStart"/>
+      <w:r>
+        <w:rPr>
+          <w:sz w:val="24"/>
+          <w:szCs w:val="22"/>
+          <w:lang w:val="en-US"/>
+        </w:rPr>
+        <w:t>tr</w:t>
+      </w:r>
+      <w:proofErr w:type="spellEnd"/>
+      <w:proofErr w:type="gramEnd"/>
+      <w:r>
+        <w:rPr>
+          <w:sz w:val="24"/>
+          <w:szCs w:val="22"/>
+          <w:lang w:val="en-US"/>
+        </w:rPr>
+        <w:t>&gt;</w:t>
       </w:r>
     </w:p>
     <w:p>
@@ -6747,7 +7492,25 @@
           <w:lang w:val="en-US"/>
         </w:rPr>
         <w:tab/>
-        <w:t>&lt;/tbody&gt;</w:t>
+        <w:t>&lt;/</w:t>
+      </w:r>
+      <w:proofErr w:type="spellStart"/>
+      <w:r>
+        <w:rPr>
+          <w:sz w:val="24"/>
+          <w:szCs w:val="22"/>
+          <w:lang w:val="en-US"/>
+        </w:rPr>
+        <w:t>tbody</w:t>
+      </w:r>
+      <w:proofErr w:type="spellEnd"/>
+      <w:r>
+        <w:rPr>
+          <w:sz w:val="24"/>
+          <w:szCs w:val="22"/>
+          <w:lang w:val="en-US"/>
+        </w:rPr>
+        <w:t>&gt;</w:t>
       </w:r>
     </w:p>
     <w:p>
@@ -6847,7 +7610,25 @@
           <w:szCs w:val="22"/>
           <w:lang w:val="en-US"/>
         </w:rPr>
-        <w:t>For uploading any file with this control simply call .sendKeys() method.</w:t>
+        <w:t>For uploading any file with this control simply call .</w:t>
+      </w:r>
+      <w:proofErr w:type="gramStart"/>
+      <w:r>
+        <w:rPr>
+          <w:sz w:val="24"/>
+          <w:szCs w:val="22"/>
+          <w:lang w:val="en-US"/>
+        </w:rPr>
+        <w:t>sendKeys(</w:t>
+      </w:r>
+      <w:proofErr w:type="gramEnd"/>
+      <w:r>
+        <w:rPr>
+          <w:sz w:val="24"/>
+          <w:szCs w:val="22"/>
+          <w:lang w:val="en-US"/>
+        </w:rPr>
+        <w:t>) method.</w:t>
       </w:r>
     </w:p>
     <w:p>
@@ -6869,7 +7650,25 @@
           <w:szCs w:val="22"/>
           <w:lang w:val="en-US"/>
         </w:rPr>
-        <w:t>While calling .sendKeys() method pass the full path of the file.</w:t>
+        <w:t>While calling .</w:t>
+      </w:r>
+      <w:proofErr w:type="gramStart"/>
+      <w:r>
+        <w:rPr>
+          <w:sz w:val="24"/>
+          <w:szCs w:val="22"/>
+          <w:lang w:val="en-US"/>
+        </w:rPr>
+        <w:t>sendKeys(</w:t>
+      </w:r>
+      <w:proofErr w:type="gramEnd"/>
+      <w:r>
+        <w:rPr>
+          <w:sz w:val="24"/>
+          <w:szCs w:val="22"/>
+          <w:lang w:val="en-US"/>
+        </w:rPr>
+        <w:t>) method pass the full path of the file.</w:t>
       </w:r>
     </w:p>
     <w:p>
@@ -7249,13 +8048,23 @@
           <w:lang w:val="en-US"/>
         </w:rPr>
       </w:pPr>
-      <w:r>
-        <w:rPr>
-          <w:sz w:val="24"/>
-          <w:szCs w:val="22"/>
-          <w:lang w:val="en-US"/>
-        </w:rPr>
-        <w:t xml:space="preserve">moveToElement() </w:t>
+      <w:proofErr w:type="gramStart"/>
+      <w:r>
+        <w:rPr>
+          <w:sz w:val="24"/>
+          <w:szCs w:val="22"/>
+          <w:lang w:val="en-US"/>
+        </w:rPr>
+        <w:t>moveToElement(</w:t>
+      </w:r>
+      <w:proofErr w:type="gramEnd"/>
+      <w:r>
+        <w:rPr>
+          <w:sz w:val="24"/>
+          <w:szCs w:val="22"/>
+          <w:lang w:val="en-US"/>
+        </w:rPr>
+        <w:t xml:space="preserve">) </w:t>
       </w:r>
       <w:r>
         <w:rPr>
@@ -7287,13 +8096,23 @@
           <w:lang w:val="en-US"/>
         </w:rPr>
       </w:pPr>
-      <w:r>
-        <w:rPr>
-          <w:sz w:val="24"/>
-          <w:szCs w:val="22"/>
-          <w:lang w:val="en-US"/>
-        </w:rPr>
-        <w:t xml:space="preserve">perform() </w:t>
+      <w:proofErr w:type="gramStart"/>
+      <w:r>
+        <w:rPr>
+          <w:sz w:val="24"/>
+          <w:szCs w:val="22"/>
+          <w:lang w:val="en-US"/>
+        </w:rPr>
+        <w:t>perform(</w:t>
+      </w:r>
+      <w:proofErr w:type="gramEnd"/>
+      <w:r>
+        <w:rPr>
+          <w:sz w:val="24"/>
+          <w:szCs w:val="22"/>
+          <w:lang w:val="en-US"/>
+        </w:rPr>
+        <w:t xml:space="preserve">) </w:t>
       </w:r>
       <w:r>
         <w:rPr>
@@ -7325,13 +8144,23 @@
           <w:lang w:val="en-US"/>
         </w:rPr>
       </w:pPr>
-      <w:r>
-        <w:rPr>
-          <w:sz w:val="24"/>
-          <w:szCs w:val="22"/>
-          <w:lang w:val="en-US"/>
-        </w:rPr>
-        <w:t xml:space="preserve">contextClick() </w:t>
+      <w:proofErr w:type="gramStart"/>
+      <w:r>
+        <w:rPr>
+          <w:sz w:val="24"/>
+          <w:szCs w:val="22"/>
+          <w:lang w:val="en-US"/>
+        </w:rPr>
+        <w:t>contextClick(</w:t>
+      </w:r>
+      <w:proofErr w:type="gramEnd"/>
+      <w:r>
+        <w:rPr>
+          <w:sz w:val="24"/>
+          <w:szCs w:val="22"/>
+          <w:lang w:val="en-US"/>
+        </w:rPr>
+        <w:t xml:space="preserve">) </w:t>
       </w:r>
       <w:r>
         <w:rPr>
@@ -7363,13 +8192,23 @@
           <w:lang w:val="en-US"/>
         </w:rPr>
       </w:pPr>
-      <w:r>
-        <w:rPr>
-          <w:sz w:val="24"/>
-          <w:szCs w:val="22"/>
-          <w:lang w:val="en-US"/>
-        </w:rPr>
-        <w:t xml:space="preserve">doubleClick() </w:t>
+      <w:proofErr w:type="gramStart"/>
+      <w:r>
+        <w:rPr>
+          <w:sz w:val="24"/>
+          <w:szCs w:val="22"/>
+          <w:lang w:val="en-US"/>
+        </w:rPr>
+        <w:t>doubleClick(</w:t>
+      </w:r>
+      <w:proofErr w:type="gramEnd"/>
+      <w:r>
+        <w:rPr>
+          <w:sz w:val="24"/>
+          <w:szCs w:val="22"/>
+          <w:lang w:val="en-US"/>
+        </w:rPr>
+        <w:t xml:space="preserve">) </w:t>
       </w:r>
       <w:r>
         <w:rPr>
@@ -7401,13 +8240,23 @@
           <w:lang w:val="en-US"/>
         </w:rPr>
       </w:pPr>
-      <w:r>
-        <w:rPr>
-          <w:sz w:val="24"/>
-          <w:szCs w:val="22"/>
-          <w:lang w:val="en-US"/>
-        </w:rPr>
-        <w:t xml:space="preserve">dragAndDrop() </w:t>
+      <w:proofErr w:type="gramStart"/>
+      <w:r>
+        <w:rPr>
+          <w:sz w:val="24"/>
+          <w:szCs w:val="22"/>
+          <w:lang w:val="en-US"/>
+        </w:rPr>
+        <w:t>dragAndDrop(</w:t>
+      </w:r>
+      <w:proofErr w:type="gramEnd"/>
+      <w:r>
+        <w:rPr>
+          <w:sz w:val="24"/>
+          <w:szCs w:val="22"/>
+          <w:lang w:val="en-US"/>
+        </w:rPr>
+        <w:t xml:space="preserve">) </w:t>
       </w:r>
       <w:r>
         <w:rPr>
@@ -8430,7 +9279,29 @@
           <w:szCs w:val="22"/>
           <w:lang w:val="en-US"/>
         </w:rPr>
-        <w:t>Points to be noted about configuration methods (like BeforeTest, AfterTest, BeforeMethod, AfterMethod)</w:t>
+        <w:t xml:space="preserve">Points to be noted about configuration methods (like BeforeTest, AfterTest, BeforeMethod, </w:t>
+      </w:r>
+      <w:proofErr w:type="gramStart"/>
+      <w:r>
+        <w:rPr>
+          <w:b/>
+          <w:bCs/>
+          <w:sz w:val="24"/>
+          <w:szCs w:val="22"/>
+          <w:lang w:val="en-US"/>
+        </w:rPr>
+        <w:t>AfterMethod</w:t>
+      </w:r>
+      <w:proofErr w:type="gramEnd"/>
+      <w:r>
+        <w:rPr>
+          <w:b/>
+          <w:bCs/>
+          <w:sz w:val="24"/>
+          <w:szCs w:val="22"/>
+          <w:lang w:val="en-US"/>
+        </w:rPr>
+        <w:t>)</w:t>
       </w:r>
     </w:p>
     <w:p>
@@ -9059,6 +9930,72 @@
           <w:lang w:val="en-US"/>
         </w:rPr>
         <w:t xml:space="preserve">All the tags are case sensitive </w:t>
+      </w:r>
+    </w:p>
+    <w:p>
+      <w:pPr>
+        <w:rPr>
+          <w:sz w:val="24"/>
+          <w:szCs w:val="22"/>
+          <w:lang w:val="en-US"/>
+        </w:rPr>
+      </w:pPr>
+    </w:p>
+    <w:p>
+      <w:pPr>
+        <w:rPr>
+          <w:sz w:val="24"/>
+          <w:szCs w:val="22"/>
+          <w:lang w:val="en-US"/>
+        </w:rPr>
+      </w:pPr>
+      <w:r>
+        <w:rPr>
+          <w:noProof/>
+          <w:lang w:eastAsia="en-IN"/>
+        </w:rPr>
+        <w:drawing>
+          <wp:inline distT="0" distB="0" distL="0" distR="0" wp14:anchorId="0312CBB8" wp14:editId="53515424">
+            <wp:extent cx="5591437" cy="2847975"/>
+            <wp:effectExtent l="0" t="0" r="9525" b="0"/>
+            <wp:docPr id="2" name="Picture 2"/>
+            <wp:cNvGraphicFramePr>
+              <a:graphicFrameLocks xmlns:a="http://schemas.openxmlformats.org/drawingml/2006/main" noChangeAspect="1"/>
+            </wp:cNvGraphicFramePr>
+            <a:graphic xmlns:a="http://schemas.openxmlformats.org/drawingml/2006/main">
+              <a:graphicData uri="http://schemas.openxmlformats.org/drawingml/2006/picture">
+                <pic:pic xmlns:pic="http://schemas.openxmlformats.org/drawingml/2006/picture">
+                  <pic:nvPicPr>
+                    <pic:cNvPr id="1" name=""/>
+                    <pic:cNvPicPr/>
+                  </pic:nvPicPr>
+                  <pic:blipFill rotWithShape="1">
+                    <a:blip r:embed="rId7"/>
+                    <a:srcRect l="21106" t="20393" r="7766" b="15173"/>
+                    <a:stretch/>
+                  </pic:blipFill>
+                  <pic:spPr bwMode="auto">
+                    <a:xfrm>
+                      <a:off x="0" y="0"/>
+                      <a:ext cx="5598431" cy="2851538"/>
+                    </a:xfrm>
+                    <a:prstGeom prst="rect">
+                      <a:avLst/>
+                    </a:prstGeom>
+                    <a:ln>
+                      <a:noFill/>
+                    </a:ln>
+                    <a:extLst>
+                      <a:ext uri="{53640926-AAD7-44D8-BBD7-CCE9431645EC}">
+                        <a14:shadowObscured xmlns:a14="http://schemas.microsoft.com/office/drawing/2010/main"/>
+                      </a:ext>
+                    </a:extLst>
+                  </pic:spPr>
+                </pic:pic>
+              </a:graphicData>
+            </a:graphic>
+          </wp:inline>
+        </w:drawing>
       </w:r>
       <w:bookmarkStart w:id="0" w:name="_GoBack"/>
       <w:bookmarkEnd w:id="0"/>

</xml_diff>

<commit_message>
Date: 16 Apr 2026
</commit_message>
<xml_diff>
--- a/SeleniumNotes.docx
+++ b/SeleniumNotes.docx
@@ -1926,7 +1926,6 @@
           <w:lang w:val="en-US"/>
         </w:rPr>
       </w:pPr>
-      <w:proofErr w:type="spellStart"/>
       <w:r>
         <w:rPr>
           <w:sz w:val="24"/>
@@ -1935,7 +1934,6 @@
         </w:rPr>
         <w:t>YourName_SeleniumDemos</w:t>
       </w:r>
-      <w:proofErr w:type="spellEnd"/>
     </w:p>
     <w:p>
       <w:pPr>
@@ -1978,25 +1976,7 @@
           <w:szCs w:val="22"/>
           <w:lang w:val="en-US"/>
         </w:rPr>
-        <w:t xml:space="preserve">Launch </w:t>
-      </w:r>
-      <w:proofErr w:type="spellStart"/>
-      <w:r>
-        <w:rPr>
-          <w:sz w:val="24"/>
-          <w:szCs w:val="22"/>
-          <w:lang w:val="en-US"/>
-        </w:rPr>
-        <w:t>selenium.dev</w:t>
-      </w:r>
-      <w:proofErr w:type="spellEnd"/>
-      <w:r>
-        <w:rPr>
-          <w:sz w:val="24"/>
-          <w:szCs w:val="22"/>
-          <w:lang w:val="en-US"/>
-        </w:rPr>
-        <w:t xml:space="preserve"> site</w:t>
+        <w:t>Launch selenium.dev site</w:t>
       </w:r>
       <w:r>
         <w:rPr>
@@ -2659,18 +2639,8 @@
           <w:szCs w:val="22"/>
           <w:lang w:val="en-US"/>
         </w:rPr>
-        <w:t xml:space="preserve">Click on </w:t>
-      </w:r>
-      <w:proofErr w:type="spellStart"/>
-      <w:r>
-        <w:rPr>
-          <w:sz w:val="24"/>
-          <w:szCs w:val="22"/>
-          <w:lang w:val="en-US"/>
-        </w:rPr>
-        <w:t>ClassPath</w:t>
-      </w:r>
-      <w:proofErr w:type="spellEnd"/>
+        <w:t>Click on ClassPath</w:t>
+      </w:r>
     </w:p>
     <w:p>
       <w:pPr>
@@ -2691,18 +2661,8 @@
           <w:szCs w:val="22"/>
           <w:lang w:val="en-US"/>
         </w:rPr>
-        <w:t>Click on Add External JARs</w:t>
-      </w:r>
-      <w:proofErr w:type="gramStart"/>
-      <w:r>
-        <w:rPr>
-          <w:sz w:val="24"/>
-          <w:szCs w:val="22"/>
-          <w:lang w:val="en-US"/>
-        </w:rPr>
-        <w:t>..</w:t>
-      </w:r>
-      <w:proofErr w:type="gramEnd"/>
+        <w:t>Click on Add External JARs..</w:t>
+      </w:r>
     </w:p>
     <w:p>
       <w:pPr>
@@ -2911,23 +2871,13 @@
           <w:lang w:val="en-US"/>
         </w:rPr>
       </w:pPr>
-      <w:proofErr w:type="gramStart"/>
-      <w:r>
-        <w:rPr>
-          <w:sz w:val="24"/>
-          <w:szCs w:val="22"/>
-          <w:lang w:val="en-US"/>
-        </w:rPr>
-        <w:t>get(</w:t>
-      </w:r>
-      <w:proofErr w:type="gramEnd"/>
-      <w:r>
-        <w:rPr>
-          <w:sz w:val="24"/>
-          <w:szCs w:val="22"/>
-          <w:lang w:val="en-US"/>
-        </w:rPr>
-        <w:t xml:space="preserve">) </w:t>
+      <w:r>
+        <w:rPr>
+          <w:sz w:val="24"/>
+          <w:szCs w:val="22"/>
+          <w:lang w:val="en-US"/>
+        </w:rPr>
+        <w:t xml:space="preserve">get() </w:t>
       </w:r>
       <w:r>
         <w:rPr>
@@ -2959,33 +2909,13 @@
           <w:lang w:val="en-US"/>
         </w:rPr>
       </w:pPr>
-      <w:proofErr w:type="spellStart"/>
-      <w:proofErr w:type="gramStart"/>
-      <w:r>
-        <w:rPr>
-          <w:sz w:val="24"/>
-          <w:szCs w:val="22"/>
-          <w:lang w:val="en-US"/>
-        </w:rPr>
-        <w:t>driver.manage</w:t>
-      </w:r>
-      <w:proofErr w:type="spellEnd"/>
-      <w:r>
-        <w:rPr>
-          <w:sz w:val="24"/>
-          <w:szCs w:val="22"/>
-          <w:lang w:val="en-US"/>
-        </w:rPr>
-        <w:t>(</w:t>
-      </w:r>
-      <w:proofErr w:type="gramEnd"/>
-      <w:r>
-        <w:rPr>
-          <w:sz w:val="24"/>
-          <w:szCs w:val="22"/>
-          <w:lang w:val="en-US"/>
-        </w:rPr>
-        <w:t xml:space="preserve">).window().maximize() </w:t>
+      <w:r>
+        <w:rPr>
+          <w:sz w:val="24"/>
+          <w:szCs w:val="22"/>
+          <w:lang w:val="en-US"/>
+        </w:rPr>
+        <w:t xml:space="preserve">driver.manage().window().maximize() </w:t>
       </w:r>
       <w:r>
         <w:rPr>
@@ -3017,23 +2947,13 @@
           <w:lang w:val="en-US"/>
         </w:rPr>
       </w:pPr>
-      <w:proofErr w:type="gramStart"/>
-      <w:r>
-        <w:rPr>
-          <w:sz w:val="24"/>
-          <w:szCs w:val="22"/>
-          <w:lang w:val="en-US"/>
-        </w:rPr>
-        <w:t>close(</w:t>
-      </w:r>
-      <w:proofErr w:type="gramEnd"/>
-      <w:r>
-        <w:rPr>
-          <w:sz w:val="24"/>
-          <w:szCs w:val="22"/>
-          <w:lang w:val="en-US"/>
-        </w:rPr>
-        <w:t xml:space="preserve">) </w:t>
+      <w:r>
+        <w:rPr>
+          <w:sz w:val="24"/>
+          <w:szCs w:val="22"/>
+          <w:lang w:val="en-US"/>
+        </w:rPr>
+        <w:t xml:space="preserve">close() </w:t>
       </w:r>
       <w:r>
         <w:rPr>
@@ -3065,23 +2985,13 @@
           <w:lang w:val="en-US"/>
         </w:rPr>
       </w:pPr>
-      <w:proofErr w:type="gramStart"/>
-      <w:r>
-        <w:rPr>
-          <w:sz w:val="24"/>
-          <w:szCs w:val="22"/>
-          <w:lang w:val="en-US"/>
-        </w:rPr>
-        <w:t>getTitle(</w:t>
-      </w:r>
-      <w:proofErr w:type="gramEnd"/>
-      <w:r>
-        <w:rPr>
-          <w:sz w:val="24"/>
-          <w:szCs w:val="22"/>
-          <w:lang w:val="en-US"/>
-        </w:rPr>
-        <w:t xml:space="preserve">) </w:t>
+      <w:r>
+        <w:rPr>
+          <w:sz w:val="24"/>
+          <w:szCs w:val="22"/>
+          <w:lang w:val="en-US"/>
+        </w:rPr>
+        <w:t xml:space="preserve">getTitle() </w:t>
       </w:r>
       <w:r>
         <w:rPr>
@@ -3113,23 +3023,13 @@
           <w:lang w:val="en-US"/>
         </w:rPr>
       </w:pPr>
-      <w:proofErr w:type="gramStart"/>
-      <w:r>
-        <w:rPr>
-          <w:sz w:val="24"/>
-          <w:szCs w:val="22"/>
-          <w:lang w:val="en-US"/>
-        </w:rPr>
-        <w:t>getCurrentUrl(</w:t>
-      </w:r>
-      <w:proofErr w:type="gramEnd"/>
-      <w:r>
-        <w:rPr>
-          <w:sz w:val="24"/>
-          <w:szCs w:val="22"/>
-          <w:lang w:val="en-US"/>
-        </w:rPr>
-        <w:t xml:space="preserve">) </w:t>
+      <w:r>
+        <w:rPr>
+          <w:sz w:val="24"/>
+          <w:szCs w:val="22"/>
+          <w:lang w:val="en-US"/>
+        </w:rPr>
+        <w:t xml:space="preserve">getCurrentUrl() </w:t>
       </w:r>
       <w:r>
         <w:rPr>
@@ -3161,23 +3061,13 @@
           <w:lang w:val="en-US"/>
         </w:rPr>
       </w:pPr>
-      <w:proofErr w:type="gramStart"/>
-      <w:r>
-        <w:rPr>
-          <w:sz w:val="24"/>
-          <w:szCs w:val="22"/>
-          <w:lang w:val="en-US"/>
-        </w:rPr>
-        <w:t>getPageSource(</w:t>
-      </w:r>
-      <w:proofErr w:type="gramEnd"/>
-      <w:r>
-        <w:rPr>
-          <w:sz w:val="24"/>
-          <w:szCs w:val="22"/>
-          <w:lang w:val="en-US"/>
-        </w:rPr>
-        <w:t xml:space="preserve">) </w:t>
+      <w:r>
+        <w:rPr>
+          <w:sz w:val="24"/>
+          <w:szCs w:val="22"/>
+          <w:lang w:val="en-US"/>
+        </w:rPr>
+        <w:t xml:space="preserve">getPageSource() </w:t>
       </w:r>
       <w:r>
         <w:rPr>
@@ -3209,23 +3099,13 @@
           <w:lang w:val="en-US"/>
         </w:rPr>
       </w:pPr>
-      <w:proofErr w:type="gramStart"/>
-      <w:r>
-        <w:rPr>
-          <w:sz w:val="24"/>
-          <w:szCs w:val="22"/>
-          <w:lang w:val="en-US"/>
-        </w:rPr>
-        <w:t>findElement(</w:t>
-      </w:r>
-      <w:proofErr w:type="gramEnd"/>
-      <w:r>
-        <w:rPr>
-          <w:sz w:val="24"/>
-          <w:szCs w:val="22"/>
-          <w:lang w:val="en-US"/>
-        </w:rPr>
-        <w:t xml:space="preserve">) </w:t>
+      <w:r>
+        <w:rPr>
+          <w:sz w:val="24"/>
+          <w:szCs w:val="22"/>
+          <w:lang w:val="en-US"/>
+        </w:rPr>
+        <w:t xml:space="preserve">findElement() </w:t>
       </w:r>
       <w:r>
         <w:rPr>
@@ -3275,23 +3155,13 @@
           <w:lang w:val="en-US"/>
         </w:rPr>
       </w:pPr>
-      <w:proofErr w:type="gramStart"/>
-      <w:r>
-        <w:rPr>
-          <w:sz w:val="24"/>
-          <w:szCs w:val="22"/>
-          <w:lang w:val="en-US"/>
-        </w:rPr>
-        <w:t>findElements(</w:t>
-      </w:r>
-      <w:proofErr w:type="gramEnd"/>
-      <w:r>
-        <w:rPr>
-          <w:sz w:val="24"/>
-          <w:szCs w:val="22"/>
-          <w:lang w:val="en-US"/>
-        </w:rPr>
-        <w:t xml:space="preserve">) </w:t>
+      <w:r>
+        <w:rPr>
+          <w:sz w:val="24"/>
+          <w:szCs w:val="22"/>
+          <w:lang w:val="en-US"/>
+        </w:rPr>
+        <w:t xml:space="preserve">findElements() </w:t>
       </w:r>
       <w:r>
         <w:rPr>
@@ -3323,23 +3193,13 @@
           <w:lang w:val="en-US"/>
         </w:rPr>
       </w:pPr>
-      <w:proofErr w:type="gramStart"/>
-      <w:r>
-        <w:rPr>
-          <w:sz w:val="24"/>
-          <w:szCs w:val="22"/>
-          <w:lang w:val="en-US"/>
-        </w:rPr>
-        <w:t>getWindowHandles(</w:t>
-      </w:r>
-      <w:proofErr w:type="gramEnd"/>
-      <w:r>
-        <w:rPr>
-          <w:sz w:val="24"/>
-          <w:szCs w:val="22"/>
-          <w:lang w:val="en-US"/>
-        </w:rPr>
-        <w:t xml:space="preserve">) </w:t>
+      <w:r>
+        <w:rPr>
+          <w:sz w:val="24"/>
+          <w:szCs w:val="22"/>
+          <w:lang w:val="en-US"/>
+        </w:rPr>
+        <w:t xml:space="preserve">getWindowHandles() </w:t>
       </w:r>
       <w:r>
         <w:rPr>
@@ -3371,23 +3231,13 @@
           <w:lang w:val="en-US"/>
         </w:rPr>
       </w:pPr>
-      <w:proofErr w:type="gramStart"/>
-      <w:r>
-        <w:rPr>
-          <w:sz w:val="24"/>
-          <w:szCs w:val="22"/>
-          <w:lang w:val="en-US"/>
-        </w:rPr>
-        <w:t>quit(</w:t>
-      </w:r>
-      <w:proofErr w:type="gramEnd"/>
-      <w:r>
-        <w:rPr>
-          <w:sz w:val="24"/>
-          <w:szCs w:val="22"/>
-          <w:lang w:val="en-US"/>
-        </w:rPr>
-        <w:t xml:space="preserve">) </w:t>
+      <w:r>
+        <w:rPr>
+          <w:sz w:val="24"/>
+          <w:szCs w:val="22"/>
+          <w:lang w:val="en-US"/>
+        </w:rPr>
+        <w:t xml:space="preserve">quit() </w:t>
       </w:r>
       <w:r>
         <w:rPr>
@@ -3768,25 +3618,7 @@
           <w:szCs w:val="22"/>
           <w:lang w:val="en-US"/>
         </w:rPr>
-        <w:t xml:space="preserve"> </w:t>
-      </w:r>
-      <w:proofErr w:type="spellStart"/>
-      <w:r>
-        <w:rPr>
-          <w:sz w:val="24"/>
-          <w:szCs w:val="22"/>
-          <w:lang w:val="en-US"/>
-        </w:rPr>
-        <w:t>driver.get</w:t>
-      </w:r>
-      <w:proofErr w:type="spellEnd"/>
-      <w:r>
-        <w:rPr>
-          <w:sz w:val="24"/>
-          <w:szCs w:val="22"/>
-          <w:lang w:val="en-US"/>
-        </w:rPr>
-        <w:t>() is having implicit wait of 30 seconds, means Selenium will wait for maximum 30 seconds till the page get loaded. But if the page is not getting loaded within 30 seconds, Selenium will throw SessionTimeoutException.</w:t>
+        <w:t xml:space="preserve"> driver.get() is having implicit wait of 30 seconds, means Selenium will wait for maximum 30 seconds till the page get loaded. But if the page is not getting loaded within 30 seconds, Selenium will throw SessionTimeoutException.</w:t>
       </w:r>
     </w:p>
     <w:p>
@@ -4048,23 +3880,13 @@
           <w:lang w:val="en-US"/>
         </w:rPr>
       </w:pPr>
-      <w:proofErr w:type="gramStart"/>
-      <w:r>
-        <w:rPr>
-          <w:sz w:val="24"/>
-          <w:szCs w:val="22"/>
-          <w:lang w:val="en-US"/>
-        </w:rPr>
-        <w:t>sendKeys(</w:t>
-      </w:r>
-      <w:proofErr w:type="gramEnd"/>
-      <w:r>
-        <w:rPr>
-          <w:sz w:val="24"/>
-          <w:szCs w:val="22"/>
-          <w:lang w:val="en-US"/>
-        </w:rPr>
-        <w:t xml:space="preserve">) </w:t>
+      <w:r>
+        <w:rPr>
+          <w:sz w:val="24"/>
+          <w:szCs w:val="22"/>
+          <w:lang w:val="en-US"/>
+        </w:rPr>
+        <w:t xml:space="preserve">sendKeys() </w:t>
       </w:r>
       <w:r>
         <w:rPr>
@@ -4104,23 +3926,13 @@
           <w:lang w:val="en-US"/>
         </w:rPr>
       </w:pPr>
-      <w:proofErr w:type="gramStart"/>
-      <w:r>
-        <w:rPr>
-          <w:sz w:val="24"/>
-          <w:szCs w:val="22"/>
-          <w:lang w:val="en-US"/>
-        </w:rPr>
-        <w:t>click(</w:t>
-      </w:r>
-      <w:proofErr w:type="gramEnd"/>
-      <w:r>
-        <w:rPr>
-          <w:sz w:val="24"/>
-          <w:szCs w:val="22"/>
-          <w:lang w:val="en-US"/>
-        </w:rPr>
-        <w:t xml:space="preserve">) </w:t>
+      <w:r>
+        <w:rPr>
+          <w:sz w:val="24"/>
+          <w:szCs w:val="22"/>
+          <w:lang w:val="en-US"/>
+        </w:rPr>
+        <w:t xml:space="preserve">click() </w:t>
       </w:r>
       <w:r>
         <w:rPr>
@@ -4152,23 +3964,13 @@
           <w:lang w:val="en-US"/>
         </w:rPr>
       </w:pPr>
-      <w:proofErr w:type="gramStart"/>
-      <w:r>
-        <w:rPr>
-          <w:sz w:val="24"/>
-          <w:szCs w:val="22"/>
-          <w:lang w:val="en-US"/>
-        </w:rPr>
-        <w:t>getText(</w:t>
-      </w:r>
-      <w:proofErr w:type="gramEnd"/>
-      <w:r>
-        <w:rPr>
-          <w:sz w:val="24"/>
-          <w:szCs w:val="22"/>
-          <w:lang w:val="en-US"/>
-        </w:rPr>
-        <w:t xml:space="preserve">) </w:t>
+      <w:r>
+        <w:rPr>
+          <w:sz w:val="24"/>
+          <w:szCs w:val="22"/>
+          <w:lang w:val="en-US"/>
+        </w:rPr>
+        <w:t xml:space="preserve">getText() </w:t>
       </w:r>
       <w:r>
         <w:rPr>
@@ -4200,23 +4002,13 @@
           <w:lang w:val="en-US"/>
         </w:rPr>
       </w:pPr>
-      <w:proofErr w:type="gramStart"/>
-      <w:r>
-        <w:rPr>
-          <w:sz w:val="24"/>
-          <w:szCs w:val="22"/>
-          <w:lang w:val="en-US"/>
-        </w:rPr>
-        <w:t>getAttribute(</w:t>
-      </w:r>
-      <w:proofErr w:type="gramEnd"/>
-      <w:r>
-        <w:rPr>
-          <w:sz w:val="24"/>
-          <w:szCs w:val="22"/>
-          <w:lang w:val="en-US"/>
-        </w:rPr>
-        <w:t xml:space="preserve">) </w:t>
+      <w:r>
+        <w:rPr>
+          <w:sz w:val="24"/>
+          <w:szCs w:val="22"/>
+          <w:lang w:val="en-US"/>
+        </w:rPr>
+        <w:t xml:space="preserve">getAttribute() </w:t>
       </w:r>
       <w:r>
         <w:rPr>
@@ -4248,23 +4040,13 @@
           <w:lang w:val="en-US"/>
         </w:rPr>
       </w:pPr>
-      <w:proofErr w:type="gramStart"/>
-      <w:r>
-        <w:rPr>
-          <w:sz w:val="24"/>
-          <w:szCs w:val="22"/>
-          <w:lang w:val="en-US"/>
-        </w:rPr>
-        <w:t>isSelected(</w:t>
-      </w:r>
-      <w:proofErr w:type="gramEnd"/>
-      <w:r>
-        <w:rPr>
-          <w:sz w:val="24"/>
-          <w:szCs w:val="22"/>
-          <w:lang w:val="en-US"/>
-        </w:rPr>
-        <w:t xml:space="preserve">) </w:t>
+      <w:r>
+        <w:rPr>
+          <w:sz w:val="24"/>
+          <w:szCs w:val="22"/>
+          <w:lang w:val="en-US"/>
+        </w:rPr>
+        <w:t xml:space="preserve">isSelected() </w:t>
       </w:r>
       <w:r>
         <w:rPr>
@@ -4304,23 +4086,13 @@
           <w:lang w:val="en-US"/>
         </w:rPr>
       </w:pPr>
-      <w:proofErr w:type="gramStart"/>
-      <w:r>
-        <w:rPr>
-          <w:sz w:val="24"/>
-          <w:szCs w:val="22"/>
-          <w:lang w:val="en-US"/>
-        </w:rPr>
-        <w:t>isEnabled(</w:t>
-      </w:r>
-      <w:proofErr w:type="gramEnd"/>
-      <w:r>
-        <w:rPr>
-          <w:sz w:val="24"/>
-          <w:szCs w:val="22"/>
-          <w:lang w:val="en-US"/>
-        </w:rPr>
-        <w:t xml:space="preserve">) </w:t>
+      <w:r>
+        <w:rPr>
+          <w:sz w:val="24"/>
+          <w:szCs w:val="22"/>
+          <w:lang w:val="en-US"/>
+        </w:rPr>
+        <w:t xml:space="preserve">isEnabled() </w:t>
       </w:r>
       <w:r>
         <w:rPr>
@@ -4390,23 +4162,13 @@
           <w:lang w:val="en-US"/>
         </w:rPr>
       </w:pPr>
-      <w:proofErr w:type="gramStart"/>
-      <w:r>
-        <w:rPr>
-          <w:sz w:val="24"/>
-          <w:szCs w:val="22"/>
-          <w:lang w:val="en-US"/>
-        </w:rPr>
-        <w:t>clear(</w:t>
-      </w:r>
-      <w:proofErr w:type="gramEnd"/>
-      <w:r>
-        <w:rPr>
-          <w:sz w:val="24"/>
-          <w:szCs w:val="22"/>
-          <w:lang w:val="en-US"/>
-        </w:rPr>
-        <w:t xml:space="preserve">) </w:t>
+      <w:r>
+        <w:rPr>
+          <w:sz w:val="24"/>
+          <w:szCs w:val="22"/>
+          <w:lang w:val="en-US"/>
+        </w:rPr>
+        <w:t xml:space="preserve">clear() </w:t>
       </w:r>
       <w:r>
         <w:rPr>
@@ -5502,23 +5264,13 @@
           <w:lang w:val="en-US"/>
         </w:rPr>
       </w:pPr>
-      <w:proofErr w:type="gramStart"/>
-      <w:r>
-        <w:rPr>
-          <w:sz w:val="24"/>
-          <w:szCs w:val="22"/>
-          <w:lang w:val="en-US"/>
-        </w:rPr>
-        <w:t>getFirstSelectedOption(</w:t>
-      </w:r>
-      <w:proofErr w:type="gramEnd"/>
-      <w:r>
-        <w:rPr>
-          <w:sz w:val="24"/>
-          <w:szCs w:val="22"/>
-          <w:lang w:val="en-US"/>
-        </w:rPr>
-        <w:t xml:space="preserve">) </w:t>
+      <w:r>
+        <w:rPr>
+          <w:sz w:val="24"/>
+          <w:szCs w:val="22"/>
+          <w:lang w:val="en-US"/>
+        </w:rPr>
+        <w:t xml:space="preserve">getFirstSelectedOption() </w:t>
       </w:r>
       <w:r>
         <w:rPr>
@@ -5566,23 +5318,13 @@
           <w:lang w:val="en-US"/>
         </w:rPr>
       </w:pPr>
-      <w:proofErr w:type="gramStart"/>
-      <w:r>
-        <w:rPr>
-          <w:sz w:val="24"/>
-          <w:szCs w:val="22"/>
-          <w:lang w:val="en-US"/>
-        </w:rPr>
-        <w:t>getOptions(</w:t>
-      </w:r>
-      <w:proofErr w:type="gramEnd"/>
-      <w:r>
-        <w:rPr>
-          <w:sz w:val="24"/>
-          <w:szCs w:val="22"/>
-          <w:lang w:val="en-US"/>
-        </w:rPr>
-        <w:t xml:space="preserve">) </w:t>
+      <w:r>
+        <w:rPr>
+          <w:sz w:val="24"/>
+          <w:szCs w:val="22"/>
+          <w:lang w:val="en-US"/>
+        </w:rPr>
+        <w:t xml:space="preserve">getOptions() </w:t>
       </w:r>
       <w:r>
         <w:rPr>
@@ -5614,23 +5356,13 @@
           <w:lang w:val="en-US"/>
         </w:rPr>
       </w:pPr>
-      <w:proofErr w:type="gramStart"/>
-      <w:r>
-        <w:rPr>
-          <w:sz w:val="24"/>
-          <w:szCs w:val="22"/>
-          <w:lang w:val="en-US"/>
-        </w:rPr>
-        <w:t>selectByVisibleText(</w:t>
-      </w:r>
-      <w:proofErr w:type="gramEnd"/>
-      <w:r>
-        <w:rPr>
-          <w:sz w:val="24"/>
-          <w:szCs w:val="22"/>
-          <w:lang w:val="en-US"/>
-        </w:rPr>
-        <w:t xml:space="preserve">) </w:t>
+      <w:r>
+        <w:rPr>
+          <w:sz w:val="24"/>
+          <w:szCs w:val="22"/>
+          <w:lang w:val="en-US"/>
+        </w:rPr>
+        <w:t xml:space="preserve">selectByVisibleText() </w:t>
       </w:r>
       <w:r>
         <w:rPr>
@@ -5662,23 +5394,13 @@
           <w:lang w:val="en-US"/>
         </w:rPr>
       </w:pPr>
-      <w:proofErr w:type="gramStart"/>
-      <w:r>
-        <w:rPr>
-          <w:sz w:val="24"/>
-          <w:szCs w:val="22"/>
-          <w:lang w:val="en-US"/>
-        </w:rPr>
-        <w:t>selectByContainsVisibleText(</w:t>
-      </w:r>
-      <w:proofErr w:type="gramEnd"/>
-      <w:r>
-        <w:rPr>
-          <w:sz w:val="24"/>
-          <w:szCs w:val="22"/>
-          <w:lang w:val="en-US"/>
-        </w:rPr>
-        <w:t xml:space="preserve">) </w:t>
+      <w:r>
+        <w:rPr>
+          <w:sz w:val="24"/>
+          <w:szCs w:val="22"/>
+          <w:lang w:val="en-US"/>
+        </w:rPr>
+        <w:t xml:space="preserve">selectByContainsVisibleText() </w:t>
       </w:r>
       <w:r>
         <w:rPr>
@@ -5710,23 +5432,13 @@
           <w:lang w:val="en-US"/>
         </w:rPr>
       </w:pPr>
-      <w:proofErr w:type="gramStart"/>
-      <w:r>
-        <w:rPr>
-          <w:sz w:val="24"/>
-          <w:szCs w:val="22"/>
-          <w:lang w:val="en-US"/>
-        </w:rPr>
-        <w:t>selectByValue(</w:t>
-      </w:r>
-      <w:proofErr w:type="gramEnd"/>
-      <w:r>
-        <w:rPr>
-          <w:sz w:val="24"/>
-          <w:szCs w:val="22"/>
-          <w:lang w:val="en-US"/>
-        </w:rPr>
-        <w:t xml:space="preserve">) </w:t>
+      <w:r>
+        <w:rPr>
+          <w:sz w:val="24"/>
+          <w:szCs w:val="22"/>
+          <w:lang w:val="en-US"/>
+        </w:rPr>
+        <w:t xml:space="preserve">selectByValue() </w:t>
       </w:r>
       <w:r>
         <w:rPr>
@@ -5758,23 +5470,13 @@
           <w:lang w:val="en-US"/>
         </w:rPr>
       </w:pPr>
-      <w:proofErr w:type="gramStart"/>
-      <w:r>
-        <w:rPr>
-          <w:sz w:val="24"/>
-          <w:szCs w:val="22"/>
-          <w:lang w:val="en-US"/>
-        </w:rPr>
-        <w:t>selectByIndex(</w:t>
-      </w:r>
-      <w:proofErr w:type="gramEnd"/>
-      <w:r>
-        <w:rPr>
-          <w:sz w:val="24"/>
-          <w:szCs w:val="22"/>
-          <w:lang w:val="en-US"/>
-        </w:rPr>
-        <w:t xml:space="preserve">) </w:t>
+      <w:r>
+        <w:rPr>
+          <w:sz w:val="24"/>
+          <w:szCs w:val="22"/>
+          <w:lang w:val="en-US"/>
+        </w:rPr>
+        <w:t xml:space="preserve">selectByIndex() </w:t>
       </w:r>
       <w:r>
         <w:rPr>
@@ -5806,23 +5508,13 @@
           <w:lang w:val="en-US"/>
         </w:rPr>
       </w:pPr>
-      <w:proofErr w:type="gramStart"/>
-      <w:r>
-        <w:rPr>
-          <w:sz w:val="24"/>
-          <w:szCs w:val="22"/>
-          <w:lang w:val="en-US"/>
-        </w:rPr>
-        <w:t>getAllSelectedOptions(</w:t>
-      </w:r>
-      <w:proofErr w:type="gramEnd"/>
-      <w:r>
-        <w:rPr>
-          <w:sz w:val="24"/>
-          <w:szCs w:val="22"/>
-          <w:lang w:val="en-US"/>
-        </w:rPr>
-        <w:t xml:space="preserve">) </w:t>
+      <w:r>
+        <w:rPr>
+          <w:sz w:val="24"/>
+          <w:szCs w:val="22"/>
+          <w:lang w:val="en-US"/>
+        </w:rPr>
+        <w:t xml:space="preserve">getAllSelectedOptions() </w:t>
       </w:r>
       <w:r>
         <w:rPr>
@@ -5862,23 +5554,13 @@
           <w:lang w:val="en-US"/>
         </w:rPr>
       </w:pPr>
-      <w:proofErr w:type="gramStart"/>
-      <w:r>
-        <w:rPr>
-          <w:sz w:val="24"/>
-          <w:szCs w:val="22"/>
-          <w:lang w:val="en-US"/>
-        </w:rPr>
-        <w:t>isMultiple(</w:t>
-      </w:r>
-      <w:proofErr w:type="gramEnd"/>
-      <w:r>
-        <w:rPr>
-          <w:sz w:val="24"/>
-          <w:szCs w:val="22"/>
-          <w:lang w:val="en-US"/>
-        </w:rPr>
-        <w:t xml:space="preserve">) </w:t>
+      <w:r>
+        <w:rPr>
+          <w:sz w:val="24"/>
+          <w:szCs w:val="22"/>
+          <w:lang w:val="en-US"/>
+        </w:rPr>
+        <w:t xml:space="preserve">isMultiple() </w:t>
       </w:r>
       <w:r>
         <w:rPr>
@@ -6067,33 +5749,13 @@
           <w:lang w:val="en-US"/>
         </w:rPr>
       </w:pPr>
-      <w:proofErr w:type="spellStart"/>
-      <w:proofErr w:type="gramStart"/>
-      <w:r>
-        <w:rPr>
-          <w:sz w:val="24"/>
-          <w:szCs w:val="22"/>
-          <w:lang w:val="en-US"/>
-        </w:rPr>
-        <w:t>Thread.sleep</w:t>
-      </w:r>
-      <w:proofErr w:type="spellEnd"/>
-      <w:r>
-        <w:rPr>
-          <w:sz w:val="24"/>
-          <w:szCs w:val="22"/>
-          <w:lang w:val="en-US"/>
-        </w:rPr>
-        <w:t>(</w:t>
-      </w:r>
-      <w:proofErr w:type="gramEnd"/>
-      <w:r>
-        <w:rPr>
-          <w:sz w:val="24"/>
-          <w:szCs w:val="22"/>
-          <w:lang w:val="en-US"/>
-        </w:rPr>
-        <w:t>)</w:t>
+      <w:r>
+        <w:rPr>
+          <w:sz w:val="24"/>
+          <w:szCs w:val="22"/>
+          <w:lang w:val="en-US"/>
+        </w:rPr>
+        <w:t>Thread.sleep()</w:t>
       </w:r>
       <w:r>
         <w:rPr>
@@ -6527,24 +6189,7 @@
           <w:lang w:val="en-US"/>
         </w:rPr>
         <w:br/>
-      </w:r>
-      <w:proofErr w:type="spellStart"/>
-      <w:r>
-        <w:rPr>
-          <w:sz w:val="24"/>
-          <w:szCs w:val="22"/>
-          <w:lang w:val="en-US"/>
-        </w:rPr>
-        <w:t>i</w:t>
-      </w:r>
-      <w:proofErr w:type="spellEnd"/>
-      <w:r>
-        <w:rPr>
-          <w:sz w:val="24"/>
-          <w:szCs w:val="22"/>
-          <w:lang w:val="en-US"/>
-        </w:rPr>
-        <w:t xml:space="preserve"> – ignoring </w:t>
+        <w:t xml:space="preserve">i – ignoring </w:t>
       </w:r>
       <w:r>
         <w:rPr>
@@ -6634,25 +6279,7 @@
           <w:szCs w:val="22"/>
           <w:lang w:val="en-US"/>
         </w:rPr>
-        <w:t>&lt;</w:t>
-      </w:r>
-      <w:proofErr w:type="gramStart"/>
-      <w:r>
-        <w:rPr>
-          <w:sz w:val="24"/>
-          <w:szCs w:val="22"/>
-          <w:lang w:val="en-US"/>
-        </w:rPr>
-        <w:t>table</w:t>
-      </w:r>
-      <w:proofErr w:type="gramEnd"/>
-      <w:r>
-        <w:rPr>
-          <w:sz w:val="24"/>
-          <w:szCs w:val="22"/>
-          <w:lang w:val="en-US"/>
-        </w:rPr>
-        <w:t>&gt;</w:t>
+        <w:t>&lt;table&gt;</w:t>
       </w:r>
     </w:p>
     <w:p>
@@ -6670,27 +6297,7 @@
           <w:lang w:val="en-US"/>
         </w:rPr>
         <w:tab/>
-        <w:t>&lt;</w:t>
-      </w:r>
-      <w:proofErr w:type="spellStart"/>
-      <w:proofErr w:type="gramStart"/>
-      <w:r>
-        <w:rPr>
-          <w:sz w:val="24"/>
-          <w:szCs w:val="22"/>
-          <w:lang w:val="en-US"/>
-        </w:rPr>
-        <w:t>thead</w:t>
-      </w:r>
-      <w:proofErr w:type="spellEnd"/>
-      <w:proofErr w:type="gramEnd"/>
-      <w:r>
-        <w:rPr>
-          <w:sz w:val="24"/>
-          <w:szCs w:val="22"/>
-          <w:lang w:val="en-US"/>
-        </w:rPr>
-        <w:t>&gt;</w:t>
+        <w:t>&lt;thead&gt;</w:t>
       </w:r>
       <w:r>
         <w:rPr>
@@ -6725,27 +6332,7 @@
           <w:lang w:val="en-US"/>
         </w:rPr>
         <w:tab/>
-        <w:t>&lt;</w:t>
-      </w:r>
-      <w:proofErr w:type="spellStart"/>
-      <w:proofErr w:type="gramStart"/>
-      <w:r>
-        <w:rPr>
-          <w:sz w:val="24"/>
-          <w:szCs w:val="22"/>
-          <w:lang w:val="en-US"/>
-        </w:rPr>
-        <w:t>tr</w:t>
-      </w:r>
-      <w:proofErr w:type="spellEnd"/>
-      <w:proofErr w:type="gramEnd"/>
-      <w:r>
-        <w:rPr>
-          <w:sz w:val="24"/>
-          <w:szCs w:val="22"/>
-          <w:lang w:val="en-US"/>
-        </w:rPr>
-        <w:t>&gt;</w:t>
+        <w:t>&lt;tr&gt;</w:t>
       </w:r>
       <w:r>
         <w:rPr>
@@ -6788,63 +6375,7 @@
           <w:lang w:val="en-US"/>
         </w:rPr>
         <w:tab/>
-        <w:t>&lt;</w:t>
-      </w:r>
-      <w:proofErr w:type="spellStart"/>
-      <w:proofErr w:type="gramStart"/>
-      <w:r>
-        <w:rPr>
-          <w:sz w:val="24"/>
-          <w:szCs w:val="22"/>
-          <w:lang w:val="en-US"/>
-        </w:rPr>
-        <w:t>th</w:t>
-      </w:r>
-      <w:proofErr w:type="spellEnd"/>
-      <w:r>
-        <w:rPr>
-          <w:sz w:val="24"/>
-          <w:szCs w:val="22"/>
-          <w:lang w:val="en-US"/>
-        </w:rPr>
-        <w:t>&gt;</w:t>
-      </w:r>
-      <w:proofErr w:type="spellStart"/>
-      <w:proofErr w:type="gramEnd"/>
-      <w:r>
-        <w:rPr>
-          <w:sz w:val="24"/>
-          <w:szCs w:val="22"/>
-          <w:lang w:val="en-US"/>
-        </w:rPr>
-        <w:t>Sr</w:t>
-      </w:r>
-      <w:proofErr w:type="spellEnd"/>
-      <w:r>
-        <w:rPr>
-          <w:sz w:val="24"/>
-          <w:szCs w:val="22"/>
-          <w:lang w:val="en-US"/>
-        </w:rPr>
-        <w:t xml:space="preserve"> No&lt;/</w:t>
-      </w:r>
-      <w:proofErr w:type="spellStart"/>
-      <w:r>
-        <w:rPr>
-          <w:sz w:val="24"/>
-          <w:szCs w:val="22"/>
-          <w:lang w:val="en-US"/>
-        </w:rPr>
-        <w:t>th</w:t>
-      </w:r>
-      <w:proofErr w:type="spellEnd"/>
-      <w:r>
-        <w:rPr>
-          <w:sz w:val="24"/>
-          <w:szCs w:val="22"/>
-          <w:lang w:val="en-US"/>
-        </w:rPr>
-        <w:t>&gt;</w:t>
+        <w:t>&lt;th&gt;Sr No&lt;/th&gt;</w:t>
       </w:r>
       <w:r>
         <w:rPr>
@@ -6887,53 +6418,7 @@
           <w:lang w:val="en-US"/>
         </w:rPr>
         <w:tab/>
-        <w:t>&lt;</w:t>
-      </w:r>
-      <w:proofErr w:type="spellStart"/>
-      <w:proofErr w:type="gramStart"/>
-      <w:r>
-        <w:rPr>
-          <w:sz w:val="24"/>
-          <w:szCs w:val="22"/>
-          <w:lang w:val="en-US"/>
-        </w:rPr>
-        <w:t>th</w:t>
-      </w:r>
-      <w:proofErr w:type="spellEnd"/>
-      <w:r>
-        <w:rPr>
-          <w:sz w:val="24"/>
-          <w:szCs w:val="22"/>
-          <w:lang w:val="en-US"/>
-        </w:rPr>
-        <w:t>&gt;</w:t>
-      </w:r>
-      <w:proofErr w:type="gramEnd"/>
-      <w:r>
-        <w:rPr>
-          <w:sz w:val="24"/>
-          <w:szCs w:val="22"/>
-          <w:lang w:val="en-US"/>
-        </w:rPr>
-        <w:t>Company&lt;/</w:t>
-      </w:r>
-      <w:proofErr w:type="spellStart"/>
-      <w:r>
-        <w:rPr>
-          <w:sz w:val="24"/>
-          <w:szCs w:val="22"/>
-          <w:lang w:val="en-US"/>
-        </w:rPr>
-        <w:t>th</w:t>
-      </w:r>
-      <w:proofErr w:type="spellEnd"/>
-      <w:r>
-        <w:rPr>
-          <w:sz w:val="24"/>
-          <w:szCs w:val="22"/>
-          <w:lang w:val="en-US"/>
-        </w:rPr>
-        <w:t>&gt;</w:t>
+        <w:t>&lt;th&gt;Company&lt;/th&gt;</w:t>
       </w:r>
     </w:p>
     <w:p>
@@ -6959,27 +6444,7 @@
           <w:lang w:val="en-US"/>
         </w:rPr>
         <w:tab/>
-        <w:t>&lt;/</w:t>
-      </w:r>
-      <w:proofErr w:type="spellStart"/>
-      <w:proofErr w:type="gramStart"/>
-      <w:r>
-        <w:rPr>
-          <w:sz w:val="24"/>
-          <w:szCs w:val="22"/>
-          <w:lang w:val="en-US"/>
-        </w:rPr>
-        <w:t>tr</w:t>
-      </w:r>
-      <w:proofErr w:type="spellEnd"/>
-      <w:proofErr w:type="gramEnd"/>
-      <w:r>
-        <w:rPr>
-          <w:sz w:val="24"/>
-          <w:szCs w:val="22"/>
-          <w:lang w:val="en-US"/>
-        </w:rPr>
-        <w:t>&gt;</w:t>
+        <w:t>&lt;/tr&gt;</w:t>
       </w:r>
     </w:p>
     <w:p>
@@ -6997,25 +6462,7 @@
           <w:lang w:val="en-US"/>
         </w:rPr>
         <w:tab/>
-        <w:t>&lt;/</w:t>
-      </w:r>
-      <w:proofErr w:type="spellStart"/>
-      <w:r>
-        <w:rPr>
-          <w:sz w:val="24"/>
-          <w:szCs w:val="22"/>
-          <w:lang w:val="en-US"/>
-        </w:rPr>
-        <w:t>thead</w:t>
-      </w:r>
-      <w:proofErr w:type="spellEnd"/>
-      <w:r>
-        <w:rPr>
-          <w:sz w:val="24"/>
-          <w:szCs w:val="22"/>
-          <w:lang w:val="en-US"/>
-        </w:rPr>
-        <w:t>&gt;</w:t>
+        <w:t>&lt;/thead&gt;</w:t>
       </w:r>
     </w:p>
     <w:p>
@@ -7033,27 +6480,7 @@
           <w:lang w:val="en-US"/>
         </w:rPr>
         <w:tab/>
-        <w:t>&lt;</w:t>
-      </w:r>
-      <w:proofErr w:type="spellStart"/>
-      <w:proofErr w:type="gramStart"/>
-      <w:r>
-        <w:rPr>
-          <w:sz w:val="24"/>
-          <w:szCs w:val="22"/>
-          <w:lang w:val="en-US"/>
-        </w:rPr>
-        <w:t>tbody</w:t>
-      </w:r>
-      <w:proofErr w:type="spellEnd"/>
-      <w:proofErr w:type="gramEnd"/>
-      <w:r>
-        <w:rPr>
-          <w:sz w:val="24"/>
-          <w:szCs w:val="22"/>
-          <w:lang w:val="en-US"/>
-        </w:rPr>
-        <w:t>&gt;</w:t>
+        <w:t>&lt;tbody&gt;</w:t>
       </w:r>
       <w:r>
         <w:rPr>
@@ -7088,27 +6515,7 @@
           <w:lang w:val="en-US"/>
         </w:rPr>
         <w:tab/>
-        <w:t>&lt;</w:t>
-      </w:r>
-      <w:proofErr w:type="spellStart"/>
-      <w:proofErr w:type="gramStart"/>
-      <w:r>
-        <w:rPr>
-          <w:sz w:val="24"/>
-          <w:szCs w:val="22"/>
-          <w:lang w:val="en-US"/>
-        </w:rPr>
-        <w:t>tr</w:t>
-      </w:r>
-      <w:proofErr w:type="spellEnd"/>
-      <w:proofErr w:type="gramEnd"/>
-      <w:r>
-        <w:rPr>
-          <w:sz w:val="24"/>
-          <w:szCs w:val="22"/>
-          <w:lang w:val="en-US"/>
-        </w:rPr>
-        <w:t>&gt;</w:t>
+        <w:t>&lt;tr&gt;</w:t>
       </w:r>
     </w:p>
     <w:p>
@@ -7142,25 +6549,7 @@
           <w:lang w:val="en-US"/>
         </w:rPr>
         <w:tab/>
-        <w:t>&lt;</w:t>
-      </w:r>
-      <w:proofErr w:type="gramStart"/>
-      <w:r>
-        <w:rPr>
-          <w:sz w:val="24"/>
-          <w:szCs w:val="22"/>
-          <w:lang w:val="en-US"/>
-        </w:rPr>
-        <w:t>td&gt;</w:t>
-      </w:r>
-      <w:proofErr w:type="gramEnd"/>
-      <w:r>
-        <w:rPr>
-          <w:sz w:val="24"/>
-          <w:szCs w:val="22"/>
-          <w:lang w:val="en-US"/>
-        </w:rPr>
-        <w:t>1&lt;/td&gt;</w:t>
+        <w:t>&lt;td&gt;1&lt;/td&gt;</w:t>
       </w:r>
     </w:p>
     <w:p>
@@ -7194,35 +6583,7 @@
           <w:lang w:val="en-US"/>
         </w:rPr>
         <w:tab/>
-        <w:t>&lt;</w:t>
-      </w:r>
-      <w:proofErr w:type="gramStart"/>
-      <w:r>
-        <w:rPr>
-          <w:sz w:val="24"/>
-          <w:szCs w:val="22"/>
-          <w:lang w:val="en-US"/>
-        </w:rPr>
-        <w:t>td&gt;</w:t>
-      </w:r>
-      <w:proofErr w:type="spellStart"/>
-      <w:proofErr w:type="gramEnd"/>
-      <w:r>
-        <w:rPr>
-          <w:sz w:val="24"/>
-          <w:szCs w:val="22"/>
-          <w:lang w:val="en-US"/>
-        </w:rPr>
-        <w:t>AViIT</w:t>
-      </w:r>
-      <w:proofErr w:type="spellEnd"/>
-      <w:r>
-        <w:rPr>
-          <w:sz w:val="24"/>
-          <w:szCs w:val="22"/>
-          <w:lang w:val="en-US"/>
-        </w:rPr>
-        <w:t>&lt;/td&gt;</w:t>
+        <w:t>&lt;td&gt;AViIT&lt;/td&gt;</w:t>
       </w:r>
     </w:p>
     <w:p>
@@ -7248,27 +6609,7 @@
           <w:lang w:val="en-US"/>
         </w:rPr>
         <w:tab/>
-        <w:t>&lt;/</w:t>
-      </w:r>
-      <w:proofErr w:type="spellStart"/>
-      <w:proofErr w:type="gramStart"/>
-      <w:r>
-        <w:rPr>
-          <w:sz w:val="24"/>
-          <w:szCs w:val="22"/>
-          <w:lang w:val="en-US"/>
-        </w:rPr>
-        <w:t>tr</w:t>
-      </w:r>
-      <w:proofErr w:type="spellEnd"/>
-      <w:proofErr w:type="gramEnd"/>
-      <w:r>
-        <w:rPr>
-          <w:sz w:val="24"/>
-          <w:szCs w:val="22"/>
-          <w:lang w:val="en-US"/>
-        </w:rPr>
-        <w:t>&gt;</w:t>
+        <w:t>&lt;/tr&gt;</w:t>
       </w:r>
     </w:p>
     <w:p>
@@ -7294,27 +6635,7 @@
           <w:lang w:val="en-US"/>
         </w:rPr>
         <w:tab/>
-        <w:t>&lt;</w:t>
-      </w:r>
-      <w:proofErr w:type="spellStart"/>
-      <w:proofErr w:type="gramStart"/>
-      <w:r>
-        <w:rPr>
-          <w:sz w:val="24"/>
-          <w:szCs w:val="22"/>
-          <w:lang w:val="en-US"/>
-        </w:rPr>
-        <w:t>tr</w:t>
-      </w:r>
-      <w:proofErr w:type="spellEnd"/>
-      <w:proofErr w:type="gramEnd"/>
-      <w:r>
-        <w:rPr>
-          <w:sz w:val="24"/>
-          <w:szCs w:val="22"/>
-          <w:lang w:val="en-US"/>
-        </w:rPr>
-        <w:t>&gt;</w:t>
+        <w:t>&lt;tr&gt;</w:t>
       </w:r>
     </w:p>
     <w:p>
@@ -7348,25 +6669,7 @@
           <w:lang w:val="en-US"/>
         </w:rPr>
         <w:tab/>
-        <w:t>&lt;</w:t>
-      </w:r>
-      <w:proofErr w:type="gramStart"/>
-      <w:r>
-        <w:rPr>
-          <w:sz w:val="24"/>
-          <w:szCs w:val="22"/>
-          <w:lang w:val="en-US"/>
-        </w:rPr>
-        <w:t>td&gt;</w:t>
-      </w:r>
-      <w:proofErr w:type="gramEnd"/>
-      <w:r>
-        <w:rPr>
-          <w:sz w:val="24"/>
-          <w:szCs w:val="22"/>
-          <w:lang w:val="en-US"/>
-        </w:rPr>
-        <w:t>2&lt;/td&gt;</w:t>
+        <w:t>&lt;td&gt;2&lt;/td&gt;</w:t>
       </w:r>
     </w:p>
     <w:p>
@@ -7400,35 +6703,7 @@
           <w:lang w:val="en-US"/>
         </w:rPr>
         <w:tab/>
-        <w:t>&lt;</w:t>
-      </w:r>
-      <w:proofErr w:type="gramStart"/>
-      <w:r>
-        <w:rPr>
-          <w:sz w:val="24"/>
-          <w:szCs w:val="22"/>
-          <w:lang w:val="en-US"/>
-        </w:rPr>
-        <w:t>td&gt;</w:t>
-      </w:r>
-      <w:proofErr w:type="spellStart"/>
-      <w:proofErr w:type="gramEnd"/>
-      <w:r>
-        <w:rPr>
-          <w:sz w:val="24"/>
-          <w:szCs w:val="22"/>
-          <w:lang w:val="en-US"/>
-        </w:rPr>
-        <w:t>Manorama</w:t>
-      </w:r>
-      <w:proofErr w:type="spellEnd"/>
-      <w:r>
-        <w:rPr>
-          <w:sz w:val="24"/>
-          <w:szCs w:val="22"/>
-          <w:lang w:val="en-US"/>
-        </w:rPr>
-        <w:t>&lt;/td</w:t>
+        <w:t>&lt;td&gt;Manorama&lt;/td</w:t>
       </w:r>
     </w:p>
     <w:p>
@@ -7454,27 +6729,7 @@
           <w:lang w:val="en-US"/>
         </w:rPr>
         <w:tab/>
-        <w:t>&lt;/</w:t>
-      </w:r>
-      <w:proofErr w:type="spellStart"/>
-      <w:proofErr w:type="gramStart"/>
-      <w:r>
-        <w:rPr>
-          <w:sz w:val="24"/>
-          <w:szCs w:val="22"/>
-          <w:lang w:val="en-US"/>
-        </w:rPr>
-        <w:t>tr</w:t>
-      </w:r>
-      <w:proofErr w:type="spellEnd"/>
-      <w:proofErr w:type="gramEnd"/>
-      <w:r>
-        <w:rPr>
-          <w:sz w:val="24"/>
-          <w:szCs w:val="22"/>
-          <w:lang w:val="en-US"/>
-        </w:rPr>
-        <w:t>&gt;</w:t>
+        <w:t>&lt;/tr&gt;</w:t>
       </w:r>
     </w:p>
     <w:p>
@@ -7492,25 +6747,7 @@
           <w:lang w:val="en-US"/>
         </w:rPr>
         <w:tab/>
-        <w:t>&lt;/</w:t>
-      </w:r>
-      <w:proofErr w:type="spellStart"/>
-      <w:r>
-        <w:rPr>
-          <w:sz w:val="24"/>
-          <w:szCs w:val="22"/>
-          <w:lang w:val="en-US"/>
-        </w:rPr>
-        <w:t>tbody</w:t>
-      </w:r>
-      <w:proofErr w:type="spellEnd"/>
-      <w:r>
-        <w:rPr>
-          <w:sz w:val="24"/>
-          <w:szCs w:val="22"/>
-          <w:lang w:val="en-US"/>
-        </w:rPr>
-        <w:t>&gt;</w:t>
+        <w:t>&lt;/tbody&gt;</w:t>
       </w:r>
     </w:p>
     <w:p>
@@ -7610,25 +6847,7 @@
           <w:szCs w:val="22"/>
           <w:lang w:val="en-US"/>
         </w:rPr>
-        <w:t>For uploading any file with this control simply call .</w:t>
-      </w:r>
-      <w:proofErr w:type="gramStart"/>
-      <w:r>
-        <w:rPr>
-          <w:sz w:val="24"/>
-          <w:szCs w:val="22"/>
-          <w:lang w:val="en-US"/>
-        </w:rPr>
-        <w:t>sendKeys(</w:t>
-      </w:r>
-      <w:proofErr w:type="gramEnd"/>
-      <w:r>
-        <w:rPr>
-          <w:sz w:val="24"/>
-          <w:szCs w:val="22"/>
-          <w:lang w:val="en-US"/>
-        </w:rPr>
-        <w:t>) method.</w:t>
+        <w:t>For uploading any file with this control simply call .sendKeys() method.</w:t>
       </w:r>
     </w:p>
     <w:p>
@@ -7650,25 +6869,7 @@
           <w:szCs w:val="22"/>
           <w:lang w:val="en-US"/>
         </w:rPr>
-        <w:t>While calling .</w:t>
-      </w:r>
-      <w:proofErr w:type="gramStart"/>
-      <w:r>
-        <w:rPr>
-          <w:sz w:val="24"/>
-          <w:szCs w:val="22"/>
-          <w:lang w:val="en-US"/>
-        </w:rPr>
-        <w:t>sendKeys(</w:t>
-      </w:r>
-      <w:proofErr w:type="gramEnd"/>
-      <w:r>
-        <w:rPr>
-          <w:sz w:val="24"/>
-          <w:szCs w:val="22"/>
-          <w:lang w:val="en-US"/>
-        </w:rPr>
-        <w:t>) method pass the full path of the file.</w:t>
+        <w:t>While calling .sendKeys() method pass the full path of the file.</w:t>
       </w:r>
     </w:p>
     <w:p>
@@ -8048,23 +7249,13 @@
           <w:lang w:val="en-US"/>
         </w:rPr>
       </w:pPr>
-      <w:proofErr w:type="gramStart"/>
-      <w:r>
-        <w:rPr>
-          <w:sz w:val="24"/>
-          <w:szCs w:val="22"/>
-          <w:lang w:val="en-US"/>
-        </w:rPr>
-        <w:t>moveToElement(</w:t>
-      </w:r>
-      <w:proofErr w:type="gramEnd"/>
-      <w:r>
-        <w:rPr>
-          <w:sz w:val="24"/>
-          <w:szCs w:val="22"/>
-          <w:lang w:val="en-US"/>
-        </w:rPr>
-        <w:t xml:space="preserve">) </w:t>
+      <w:r>
+        <w:rPr>
+          <w:sz w:val="24"/>
+          <w:szCs w:val="22"/>
+          <w:lang w:val="en-US"/>
+        </w:rPr>
+        <w:t xml:space="preserve">moveToElement() </w:t>
       </w:r>
       <w:r>
         <w:rPr>
@@ -8096,23 +7287,13 @@
           <w:lang w:val="en-US"/>
         </w:rPr>
       </w:pPr>
-      <w:proofErr w:type="gramStart"/>
-      <w:r>
-        <w:rPr>
-          <w:sz w:val="24"/>
-          <w:szCs w:val="22"/>
-          <w:lang w:val="en-US"/>
-        </w:rPr>
-        <w:t>perform(</w:t>
-      </w:r>
-      <w:proofErr w:type="gramEnd"/>
-      <w:r>
-        <w:rPr>
-          <w:sz w:val="24"/>
-          <w:szCs w:val="22"/>
-          <w:lang w:val="en-US"/>
-        </w:rPr>
-        <w:t xml:space="preserve">) </w:t>
+      <w:r>
+        <w:rPr>
+          <w:sz w:val="24"/>
+          <w:szCs w:val="22"/>
+          <w:lang w:val="en-US"/>
+        </w:rPr>
+        <w:t xml:space="preserve">perform() </w:t>
       </w:r>
       <w:r>
         <w:rPr>
@@ -8144,23 +7325,13 @@
           <w:lang w:val="en-US"/>
         </w:rPr>
       </w:pPr>
-      <w:proofErr w:type="gramStart"/>
-      <w:r>
-        <w:rPr>
-          <w:sz w:val="24"/>
-          <w:szCs w:val="22"/>
-          <w:lang w:val="en-US"/>
-        </w:rPr>
-        <w:t>contextClick(</w:t>
-      </w:r>
-      <w:proofErr w:type="gramEnd"/>
-      <w:r>
-        <w:rPr>
-          <w:sz w:val="24"/>
-          <w:szCs w:val="22"/>
-          <w:lang w:val="en-US"/>
-        </w:rPr>
-        <w:t xml:space="preserve">) </w:t>
+      <w:r>
+        <w:rPr>
+          <w:sz w:val="24"/>
+          <w:szCs w:val="22"/>
+          <w:lang w:val="en-US"/>
+        </w:rPr>
+        <w:t xml:space="preserve">contextClick() </w:t>
       </w:r>
       <w:r>
         <w:rPr>
@@ -8192,23 +7363,13 @@
           <w:lang w:val="en-US"/>
         </w:rPr>
       </w:pPr>
-      <w:proofErr w:type="gramStart"/>
-      <w:r>
-        <w:rPr>
-          <w:sz w:val="24"/>
-          <w:szCs w:val="22"/>
-          <w:lang w:val="en-US"/>
-        </w:rPr>
-        <w:t>doubleClick(</w:t>
-      </w:r>
-      <w:proofErr w:type="gramEnd"/>
-      <w:r>
-        <w:rPr>
-          <w:sz w:val="24"/>
-          <w:szCs w:val="22"/>
-          <w:lang w:val="en-US"/>
-        </w:rPr>
-        <w:t xml:space="preserve">) </w:t>
+      <w:r>
+        <w:rPr>
+          <w:sz w:val="24"/>
+          <w:szCs w:val="22"/>
+          <w:lang w:val="en-US"/>
+        </w:rPr>
+        <w:t xml:space="preserve">doubleClick() </w:t>
       </w:r>
       <w:r>
         <w:rPr>
@@ -8240,23 +7401,13 @@
           <w:lang w:val="en-US"/>
         </w:rPr>
       </w:pPr>
-      <w:proofErr w:type="gramStart"/>
-      <w:r>
-        <w:rPr>
-          <w:sz w:val="24"/>
-          <w:szCs w:val="22"/>
-          <w:lang w:val="en-US"/>
-        </w:rPr>
-        <w:t>dragAndDrop(</w:t>
-      </w:r>
-      <w:proofErr w:type="gramEnd"/>
-      <w:r>
-        <w:rPr>
-          <w:sz w:val="24"/>
-          <w:szCs w:val="22"/>
-          <w:lang w:val="en-US"/>
-        </w:rPr>
-        <w:t xml:space="preserve">) </w:t>
+      <w:r>
+        <w:rPr>
+          <w:sz w:val="24"/>
+          <w:szCs w:val="22"/>
+          <w:lang w:val="en-US"/>
+        </w:rPr>
+        <w:t xml:space="preserve">dragAndDrop() </w:t>
       </w:r>
       <w:r>
         <w:rPr>
@@ -9279,29 +8430,7 @@
           <w:szCs w:val="22"/>
           <w:lang w:val="en-US"/>
         </w:rPr>
-        <w:t xml:space="preserve">Points to be noted about configuration methods (like BeforeTest, AfterTest, BeforeMethod, </w:t>
-      </w:r>
-      <w:proofErr w:type="gramStart"/>
-      <w:r>
-        <w:rPr>
-          <w:b/>
-          <w:bCs/>
-          <w:sz w:val="24"/>
-          <w:szCs w:val="22"/>
-          <w:lang w:val="en-US"/>
-        </w:rPr>
-        <w:t>AfterMethod</w:t>
-      </w:r>
-      <w:proofErr w:type="gramEnd"/>
-      <w:r>
-        <w:rPr>
-          <w:b/>
-          <w:bCs/>
-          <w:sz w:val="24"/>
-          <w:szCs w:val="22"/>
-          <w:lang w:val="en-US"/>
-        </w:rPr>
-        <w:t>)</w:t>
+        <w:t>Points to be noted about configuration methods (like BeforeTest, AfterTest, BeforeMethod, AfterMethod)</w:t>
       </w:r>
     </w:p>
     <w:p>
@@ -9997,6 +9126,248 @@
           </wp:inline>
         </w:drawing>
       </w:r>
+    </w:p>
+    <w:p>
+      <w:pPr>
+        <w:rPr>
+          <w:sz w:val="24"/>
+          <w:szCs w:val="22"/>
+          <w:lang w:val="en-US"/>
+        </w:rPr>
+      </w:pPr>
+    </w:p>
+    <w:p>
+      <w:pPr>
+        <w:rPr>
+          <w:sz w:val="24"/>
+          <w:szCs w:val="22"/>
+          <w:lang w:val="en-US"/>
+        </w:rPr>
+      </w:pPr>
+      <w:r>
+        <w:rPr>
+          <w:sz w:val="24"/>
+          <w:szCs w:val="22"/>
+          <w:lang w:val="en-US"/>
+        </w:rPr>
+        <w:br w:type="page"/>
+      </w:r>
+    </w:p>
+    <w:p>
+      <w:pPr>
+        <w:rPr>
+          <w:b/>
+          <w:bCs/>
+          <w:sz w:val="24"/>
+          <w:szCs w:val="22"/>
+          <w:lang w:val="en-US"/>
+        </w:rPr>
+      </w:pPr>
+      <w:r>
+        <w:rPr>
+          <w:b/>
+          <w:bCs/>
+          <w:sz w:val="24"/>
+          <w:szCs w:val="22"/>
+          <w:lang w:val="en-US"/>
+        </w:rPr>
+        <w:lastRenderedPageBreak/>
+        <w:t>Maven</w:t>
+      </w:r>
+    </w:p>
+    <w:p>
+      <w:pPr>
+        <w:pStyle w:val="ListParagraph"/>
+        <w:numPr>
+          <w:ilvl w:val="0"/>
+          <w:numId w:val="31"/>
+        </w:numPr>
+        <w:rPr>
+          <w:sz w:val="24"/>
+          <w:szCs w:val="22"/>
+          <w:lang w:val="en-US"/>
+        </w:rPr>
+      </w:pPr>
+      <w:r>
+        <w:rPr>
+          <w:sz w:val="24"/>
+          <w:szCs w:val="22"/>
+          <w:lang w:val="en-US"/>
+        </w:rPr>
+        <w:t>Build Management tool</w:t>
+      </w:r>
+    </w:p>
+    <w:p>
+      <w:pPr>
+        <w:pStyle w:val="ListParagraph"/>
+        <w:numPr>
+          <w:ilvl w:val="0"/>
+          <w:numId w:val="31"/>
+        </w:numPr>
+        <w:rPr>
+          <w:sz w:val="24"/>
+          <w:szCs w:val="22"/>
+          <w:lang w:val="en-US"/>
+        </w:rPr>
+      </w:pPr>
+      <w:r>
+        <w:rPr>
+          <w:sz w:val="24"/>
+          <w:szCs w:val="22"/>
+          <w:lang w:val="en-US"/>
+        </w:rPr>
+        <w:t>It is Apache product</w:t>
+      </w:r>
+    </w:p>
+    <w:p>
+      <w:pPr>
+        <w:pStyle w:val="ListParagraph"/>
+        <w:numPr>
+          <w:ilvl w:val="0"/>
+          <w:numId w:val="31"/>
+        </w:numPr>
+        <w:rPr>
+          <w:sz w:val="24"/>
+          <w:szCs w:val="22"/>
+          <w:lang w:val="en-US"/>
+        </w:rPr>
+      </w:pPr>
+      <w:r>
+        <w:rPr>
+          <w:sz w:val="24"/>
+          <w:szCs w:val="22"/>
+          <w:lang w:val="en-US"/>
+        </w:rPr>
+        <w:t>Open Source</w:t>
+      </w:r>
+    </w:p>
+    <w:p>
+      <w:pPr>
+        <w:pStyle w:val="ListParagraph"/>
+        <w:numPr>
+          <w:ilvl w:val="0"/>
+          <w:numId w:val="31"/>
+        </w:numPr>
+        <w:rPr>
+          <w:sz w:val="24"/>
+          <w:szCs w:val="22"/>
+          <w:lang w:val="en-US"/>
+        </w:rPr>
+      </w:pPr>
+      <w:r>
+        <w:rPr>
+          <w:sz w:val="24"/>
+          <w:szCs w:val="22"/>
+          <w:lang w:val="en-US"/>
+        </w:rPr>
+        <w:t>It can be used by both developer and tester</w:t>
+      </w:r>
+    </w:p>
+    <w:p>
+      <w:pPr>
+        <w:pStyle w:val="ListParagraph"/>
+        <w:numPr>
+          <w:ilvl w:val="0"/>
+          <w:numId w:val="31"/>
+        </w:numPr>
+        <w:rPr>
+          <w:sz w:val="24"/>
+          <w:szCs w:val="22"/>
+          <w:lang w:val="en-US"/>
+        </w:rPr>
+      </w:pPr>
+      <w:r>
+        <w:rPr>
+          <w:sz w:val="24"/>
+          <w:szCs w:val="22"/>
+          <w:lang w:val="en-US"/>
+        </w:rPr>
+        <w:t>A single project can be shared with both developer and tester</w:t>
+      </w:r>
+    </w:p>
+    <w:p>
+      <w:pPr>
+        <w:pStyle w:val="ListParagraph"/>
+        <w:numPr>
+          <w:ilvl w:val="0"/>
+          <w:numId w:val="31"/>
+        </w:numPr>
+        <w:rPr>
+          <w:sz w:val="24"/>
+          <w:szCs w:val="22"/>
+          <w:lang w:val="en-US"/>
+        </w:rPr>
+      </w:pPr>
+      <w:r>
+        <w:rPr>
+          <w:sz w:val="24"/>
+          <w:szCs w:val="22"/>
+          <w:lang w:val="en-US"/>
+        </w:rPr>
+        <w:t>Easy configuration via pom.xml file</w:t>
+      </w:r>
+    </w:p>
+    <w:p>
+      <w:pPr>
+        <w:pStyle w:val="ListParagraph"/>
+        <w:numPr>
+          <w:ilvl w:val="0"/>
+          <w:numId w:val="31"/>
+        </w:numPr>
+        <w:rPr>
+          <w:sz w:val="24"/>
+          <w:szCs w:val="22"/>
+          <w:lang w:val="en-US"/>
+        </w:rPr>
+      </w:pPr>
+      <w:r>
+        <w:rPr>
+          <w:sz w:val="24"/>
+          <w:szCs w:val="22"/>
+          <w:lang w:val="en-US"/>
+        </w:rPr>
+        <w:t>Uses dependency instead of jar files.</w:t>
+      </w:r>
+    </w:p>
+    <w:p>
+      <w:pPr>
+        <w:pStyle w:val="ListParagraph"/>
+        <w:numPr>
+          <w:ilvl w:val="0"/>
+          <w:numId w:val="31"/>
+        </w:numPr>
+        <w:rPr>
+          <w:sz w:val="24"/>
+          <w:szCs w:val="22"/>
+          <w:lang w:val="en-US"/>
+        </w:rPr>
+      </w:pPr>
+      <w:r>
+        <w:rPr>
+          <w:sz w:val="24"/>
+          <w:szCs w:val="22"/>
+          <w:lang w:val="en-US"/>
+        </w:rPr>
+        <w:t>Easy execution via testng.xml</w:t>
+      </w:r>
+    </w:p>
+    <w:p>
+      <w:pPr>
+        <w:rPr>
+          <w:sz w:val="24"/>
+          <w:szCs w:val="22"/>
+          <w:lang w:val="en-US"/>
+        </w:rPr>
+      </w:pPr>
+    </w:p>
+    <w:p>
+      <w:pPr>
+        <w:rPr>
+          <w:sz w:val="24"/>
+          <w:szCs w:val="22"/>
+          <w:lang w:val="en-US"/>
+        </w:rPr>
+      </w:pPr>
       <w:bookmarkStart w:id="0" w:name="_GoBack"/>
       <w:bookmarkEnd w:id="0"/>
     </w:p>
@@ -11475,6 +10846,119 @@
     </w:lvl>
   </w:abstractNum>
   <w:abstractNum w:abstractNumId="14">
+    <w:nsid w:val="4771029A"/>
+    <w:multiLevelType w:val="hybridMultilevel"/>
+    <w:tmpl w:val="F2681506"/>
+    <w:lvl w:ilvl="0" w:tplc="40090001">
+      <w:start w:val="1"/>
+      <w:numFmt w:val="bullet"/>
+      <w:lvlText w:val=""/>
+      <w:lvlJc w:val="left"/>
+      <w:pPr>
+        <w:ind w:left="720" w:hanging="360"/>
+      </w:pPr>
+      <w:rPr>
+        <w:rFonts w:ascii="Symbol" w:hAnsi="Symbol" w:hint="default"/>
+      </w:rPr>
+    </w:lvl>
+    <w:lvl w:ilvl="1" w:tplc="40090003" w:tentative="1">
+      <w:start w:val="1"/>
+      <w:numFmt w:val="bullet"/>
+      <w:lvlText w:val="o"/>
+      <w:lvlJc w:val="left"/>
+      <w:pPr>
+        <w:ind w:left="1440" w:hanging="360"/>
+      </w:pPr>
+      <w:rPr>
+        <w:rFonts w:ascii="Courier New" w:hAnsi="Courier New" w:cs="Courier New" w:hint="default"/>
+      </w:rPr>
+    </w:lvl>
+    <w:lvl w:ilvl="2" w:tplc="40090005" w:tentative="1">
+      <w:start w:val="1"/>
+      <w:numFmt w:val="bullet"/>
+      <w:lvlText w:val=""/>
+      <w:lvlJc w:val="left"/>
+      <w:pPr>
+        <w:ind w:left="2160" w:hanging="360"/>
+      </w:pPr>
+      <w:rPr>
+        <w:rFonts w:ascii="Wingdings" w:hAnsi="Wingdings" w:hint="default"/>
+      </w:rPr>
+    </w:lvl>
+    <w:lvl w:ilvl="3" w:tplc="40090001" w:tentative="1">
+      <w:start w:val="1"/>
+      <w:numFmt w:val="bullet"/>
+      <w:lvlText w:val=""/>
+      <w:lvlJc w:val="left"/>
+      <w:pPr>
+        <w:ind w:left="2880" w:hanging="360"/>
+      </w:pPr>
+      <w:rPr>
+        <w:rFonts w:ascii="Symbol" w:hAnsi="Symbol" w:hint="default"/>
+      </w:rPr>
+    </w:lvl>
+    <w:lvl w:ilvl="4" w:tplc="40090003" w:tentative="1">
+      <w:start w:val="1"/>
+      <w:numFmt w:val="bullet"/>
+      <w:lvlText w:val="o"/>
+      <w:lvlJc w:val="left"/>
+      <w:pPr>
+        <w:ind w:left="3600" w:hanging="360"/>
+      </w:pPr>
+      <w:rPr>
+        <w:rFonts w:ascii="Courier New" w:hAnsi="Courier New" w:cs="Courier New" w:hint="default"/>
+      </w:rPr>
+    </w:lvl>
+    <w:lvl w:ilvl="5" w:tplc="40090005" w:tentative="1">
+      <w:start w:val="1"/>
+      <w:numFmt w:val="bullet"/>
+      <w:lvlText w:val=""/>
+      <w:lvlJc w:val="left"/>
+      <w:pPr>
+        <w:ind w:left="4320" w:hanging="360"/>
+      </w:pPr>
+      <w:rPr>
+        <w:rFonts w:ascii="Wingdings" w:hAnsi="Wingdings" w:hint="default"/>
+      </w:rPr>
+    </w:lvl>
+    <w:lvl w:ilvl="6" w:tplc="40090001" w:tentative="1">
+      <w:start w:val="1"/>
+      <w:numFmt w:val="bullet"/>
+      <w:lvlText w:val=""/>
+      <w:lvlJc w:val="left"/>
+      <w:pPr>
+        <w:ind w:left="5040" w:hanging="360"/>
+      </w:pPr>
+      <w:rPr>
+        <w:rFonts w:ascii="Symbol" w:hAnsi="Symbol" w:hint="default"/>
+      </w:rPr>
+    </w:lvl>
+    <w:lvl w:ilvl="7" w:tplc="40090003" w:tentative="1">
+      <w:start w:val="1"/>
+      <w:numFmt w:val="bullet"/>
+      <w:lvlText w:val="o"/>
+      <w:lvlJc w:val="left"/>
+      <w:pPr>
+        <w:ind w:left="5760" w:hanging="360"/>
+      </w:pPr>
+      <w:rPr>
+        <w:rFonts w:ascii="Courier New" w:hAnsi="Courier New" w:cs="Courier New" w:hint="default"/>
+      </w:rPr>
+    </w:lvl>
+    <w:lvl w:ilvl="8" w:tplc="40090005" w:tentative="1">
+      <w:start w:val="1"/>
+      <w:numFmt w:val="bullet"/>
+      <w:lvlText w:val=""/>
+      <w:lvlJc w:val="left"/>
+      <w:pPr>
+        <w:ind w:left="6480" w:hanging="360"/>
+      </w:pPr>
+      <w:rPr>
+        <w:rFonts w:ascii="Wingdings" w:hAnsi="Wingdings" w:hint="default"/>
+      </w:rPr>
+    </w:lvl>
+  </w:abstractNum>
+  <w:abstractNum w:abstractNumId="15">
     <w:nsid w:val="487A3B0D"/>
     <w:multiLevelType w:val="hybridMultilevel"/>
     <w:tmpl w:val="75CA2E34"/>
@@ -11563,7 +11047,7 @@
       </w:pPr>
     </w:lvl>
   </w:abstractNum>
-  <w:abstractNum w:abstractNumId="15">
+  <w:abstractNum w:abstractNumId="16">
     <w:nsid w:val="4C187E13"/>
     <w:multiLevelType w:val="hybridMultilevel"/>
     <w:tmpl w:val="E8ACCDB8"/>
@@ -11676,7 +11160,7 @@
       </w:rPr>
     </w:lvl>
   </w:abstractNum>
-  <w:abstractNum w:abstractNumId="16">
+  <w:abstractNum w:abstractNumId="17">
     <w:nsid w:val="56A40A45"/>
     <w:multiLevelType w:val="hybridMultilevel"/>
     <w:tmpl w:val="7862B3F8"/>
@@ -11789,7 +11273,7 @@
       </w:rPr>
     </w:lvl>
   </w:abstractNum>
-  <w:abstractNum w:abstractNumId="17">
+  <w:abstractNum w:abstractNumId="18">
     <w:nsid w:val="58D1047A"/>
     <w:multiLevelType w:val="hybridMultilevel"/>
     <w:tmpl w:val="BB6E0C8E"/>
@@ -11902,7 +11386,7 @@
       </w:rPr>
     </w:lvl>
   </w:abstractNum>
-  <w:abstractNum w:abstractNumId="18">
+  <w:abstractNum w:abstractNumId="19">
     <w:nsid w:val="590A2A42"/>
     <w:multiLevelType w:val="hybridMultilevel"/>
     <w:tmpl w:val="B2CCDDE8"/>
@@ -12015,7 +11499,7 @@
       </w:rPr>
     </w:lvl>
   </w:abstractNum>
-  <w:abstractNum w:abstractNumId="19">
+  <w:abstractNum w:abstractNumId="20">
     <w:nsid w:val="5AC325C4"/>
     <w:multiLevelType w:val="hybridMultilevel"/>
     <w:tmpl w:val="6BF65148"/>
@@ -12104,7 +11588,7 @@
       </w:pPr>
     </w:lvl>
   </w:abstractNum>
-  <w:abstractNum w:abstractNumId="20">
+  <w:abstractNum w:abstractNumId="21">
     <w:nsid w:val="5E1A5E19"/>
     <w:multiLevelType w:val="hybridMultilevel"/>
     <w:tmpl w:val="3C0054B4"/>
@@ -12217,7 +11701,7 @@
       </w:rPr>
     </w:lvl>
   </w:abstractNum>
-  <w:abstractNum w:abstractNumId="21">
+  <w:abstractNum w:abstractNumId="22">
     <w:nsid w:val="60CD67B9"/>
     <w:multiLevelType w:val="hybridMultilevel"/>
     <w:tmpl w:val="898E7844"/>
@@ -12306,7 +11790,7 @@
       </w:pPr>
     </w:lvl>
   </w:abstractNum>
-  <w:abstractNum w:abstractNumId="22">
+  <w:abstractNum w:abstractNumId="23">
     <w:nsid w:val="629C4E82"/>
     <w:multiLevelType w:val="hybridMultilevel"/>
     <w:tmpl w:val="363CE55E"/>
@@ -12395,7 +11879,7 @@
       </w:pPr>
     </w:lvl>
   </w:abstractNum>
-  <w:abstractNum w:abstractNumId="23">
+  <w:abstractNum w:abstractNumId="24">
     <w:nsid w:val="632F5147"/>
     <w:multiLevelType w:val="hybridMultilevel"/>
     <w:tmpl w:val="A2A076AA"/>
@@ -12508,7 +11992,7 @@
       </w:rPr>
     </w:lvl>
   </w:abstractNum>
-  <w:abstractNum w:abstractNumId="24">
+  <w:abstractNum w:abstractNumId="25">
     <w:nsid w:val="66C14124"/>
     <w:multiLevelType w:val="hybridMultilevel"/>
     <w:tmpl w:val="87BA6304"/>
@@ -12621,7 +12105,7 @@
       </w:rPr>
     </w:lvl>
   </w:abstractNum>
-  <w:abstractNum w:abstractNumId="25">
+  <w:abstractNum w:abstractNumId="26">
     <w:nsid w:val="6CA66238"/>
     <w:multiLevelType w:val="hybridMultilevel"/>
     <w:tmpl w:val="A2201FCA"/>
@@ -12734,7 +12218,7 @@
       </w:rPr>
     </w:lvl>
   </w:abstractNum>
-  <w:abstractNum w:abstractNumId="26">
+  <w:abstractNum w:abstractNumId="27">
     <w:nsid w:val="73C523EA"/>
     <w:multiLevelType w:val="hybridMultilevel"/>
     <w:tmpl w:val="F1BEC0E4"/>
@@ -12847,7 +12331,7 @@
       </w:rPr>
     </w:lvl>
   </w:abstractNum>
-  <w:abstractNum w:abstractNumId="27">
+  <w:abstractNum w:abstractNumId="28">
     <w:nsid w:val="76CB2945"/>
     <w:multiLevelType w:val="hybridMultilevel"/>
     <w:tmpl w:val="E2880EB2"/>
@@ -12960,7 +12444,7 @@
       </w:rPr>
     </w:lvl>
   </w:abstractNum>
-  <w:abstractNum w:abstractNumId="28">
+  <w:abstractNum w:abstractNumId="29">
     <w:nsid w:val="77E60E1A"/>
     <w:multiLevelType w:val="hybridMultilevel"/>
     <w:tmpl w:val="14625B96"/>
@@ -13049,7 +12533,7 @@
       </w:pPr>
     </w:lvl>
   </w:abstractNum>
-  <w:abstractNum w:abstractNumId="29">
+  <w:abstractNum w:abstractNumId="30">
     <w:nsid w:val="79FE4925"/>
     <w:multiLevelType w:val="hybridMultilevel"/>
     <w:tmpl w:val="263AE45E"/>
@@ -13139,22 +12623,22 @@
     </w:lvl>
   </w:abstractNum>
   <w:num w:numId="1">
-    <w:abstractNumId w:val="23"/>
+    <w:abstractNumId w:val="24"/>
   </w:num>
   <w:num w:numId="2">
+    <w:abstractNumId w:val="28"/>
+  </w:num>
+  <w:num w:numId="3">
+    <w:abstractNumId w:val="26"/>
+  </w:num>
+  <w:num w:numId="4">
+    <w:abstractNumId w:val="17"/>
+  </w:num>
+  <w:num w:numId="5">
     <w:abstractNumId w:val="27"/>
   </w:num>
-  <w:num w:numId="3">
-    <w:abstractNumId w:val="25"/>
-  </w:num>
-  <w:num w:numId="4">
-    <w:abstractNumId w:val="16"/>
-  </w:num>
-  <w:num w:numId="5">
-    <w:abstractNumId w:val="26"/>
-  </w:num>
   <w:num w:numId="6">
-    <w:abstractNumId w:val="22"/>
+    <w:abstractNumId w:val="23"/>
   </w:num>
   <w:num w:numId="7">
     <w:abstractNumId w:val="12"/>
@@ -13163,22 +12647,22 @@
     <w:abstractNumId w:val="3"/>
   </w:num>
   <w:num w:numId="9">
-    <w:abstractNumId w:val="29"/>
+    <w:abstractNumId w:val="30"/>
   </w:num>
   <w:num w:numId="10">
     <w:abstractNumId w:val="9"/>
   </w:num>
   <w:num w:numId="11">
-    <w:abstractNumId w:val="19"/>
+    <w:abstractNumId w:val="20"/>
   </w:num>
   <w:num w:numId="12">
     <w:abstractNumId w:val="10"/>
   </w:num>
   <w:num w:numId="13">
-    <w:abstractNumId w:val="14"/>
+    <w:abstractNumId w:val="15"/>
   </w:num>
   <w:num w:numId="14">
-    <w:abstractNumId w:val="18"/>
+    <w:abstractNumId w:val="19"/>
   </w:num>
   <w:num w:numId="15">
     <w:abstractNumId w:val="5"/>
@@ -13193,13 +12677,13 @@
     <w:abstractNumId w:val="4"/>
   </w:num>
   <w:num w:numId="19">
-    <w:abstractNumId w:val="20"/>
+    <w:abstractNumId w:val="21"/>
   </w:num>
   <w:num w:numId="20">
     <w:abstractNumId w:val="6"/>
   </w:num>
   <w:num w:numId="21">
-    <w:abstractNumId w:val="15"/>
+    <w:abstractNumId w:val="16"/>
   </w:num>
   <w:num w:numId="22">
     <w:abstractNumId w:val="1"/>
@@ -13208,7 +12692,7 @@
     <w:abstractNumId w:val="13"/>
   </w:num>
   <w:num w:numId="24">
-    <w:abstractNumId w:val="28"/>
+    <w:abstractNumId w:val="29"/>
   </w:num>
   <w:num w:numId="25">
     <w:abstractNumId w:val="8"/>
@@ -13217,16 +12701,19 @@
     <w:abstractNumId w:val="2"/>
   </w:num>
   <w:num w:numId="27">
-    <w:abstractNumId w:val="21"/>
+    <w:abstractNumId w:val="22"/>
   </w:num>
   <w:num w:numId="28">
-    <w:abstractNumId w:val="24"/>
+    <w:abstractNumId w:val="25"/>
   </w:num>
   <w:num w:numId="29">
-    <w:abstractNumId w:val="17"/>
+    <w:abstractNumId w:val="18"/>
   </w:num>
   <w:num w:numId="30">
     <w:abstractNumId w:val="7"/>
+  </w:num>
+  <w:num w:numId="31">
+    <w:abstractNumId w:val="14"/>
   </w:num>
 </w:numbering>
 </file>

</xml_diff>

<commit_message>
Date: 24 Apr 2026
</commit_message>
<xml_diff>
--- a/SeleniumNotes.docx
+++ b/SeleniumNotes.docx
@@ -1926,6 +1926,7 @@
           <w:lang w:val="en-US"/>
         </w:rPr>
       </w:pPr>
+      <w:proofErr w:type="spellStart"/>
       <w:r>
         <w:rPr>
           <w:sz w:val="24"/>
@@ -1934,6 +1935,7 @@
         </w:rPr>
         <w:t>YourName_SeleniumDemos</w:t>
       </w:r>
+      <w:proofErr w:type="spellEnd"/>
     </w:p>
     <w:p>
       <w:pPr>
@@ -1976,7 +1978,25 @@
           <w:szCs w:val="22"/>
           <w:lang w:val="en-US"/>
         </w:rPr>
-        <w:t>Launch selenium.dev site</w:t>
+        <w:t xml:space="preserve">Launch </w:t>
+      </w:r>
+      <w:proofErr w:type="spellStart"/>
+      <w:r>
+        <w:rPr>
+          <w:sz w:val="24"/>
+          <w:szCs w:val="22"/>
+          <w:lang w:val="en-US"/>
+        </w:rPr>
+        <w:t>selenium.dev</w:t>
+      </w:r>
+      <w:proofErr w:type="spellEnd"/>
+      <w:r>
+        <w:rPr>
+          <w:sz w:val="24"/>
+          <w:szCs w:val="22"/>
+          <w:lang w:val="en-US"/>
+        </w:rPr>
+        <w:t xml:space="preserve"> site</w:t>
       </w:r>
       <w:r>
         <w:rPr>
@@ -2639,8 +2659,18 @@
           <w:szCs w:val="22"/>
           <w:lang w:val="en-US"/>
         </w:rPr>
-        <w:t>Click on ClassPath</w:t>
-      </w:r>
+        <w:t xml:space="preserve">Click on </w:t>
+      </w:r>
+      <w:proofErr w:type="spellStart"/>
+      <w:r>
+        <w:rPr>
+          <w:sz w:val="24"/>
+          <w:szCs w:val="22"/>
+          <w:lang w:val="en-US"/>
+        </w:rPr>
+        <w:t>ClassPath</w:t>
+      </w:r>
+      <w:proofErr w:type="spellEnd"/>
     </w:p>
     <w:p>
       <w:pPr>
@@ -2661,8 +2691,18 @@
           <w:szCs w:val="22"/>
           <w:lang w:val="en-US"/>
         </w:rPr>
-        <w:t>Click on Add External JARs..</w:t>
-      </w:r>
+        <w:t>Click on Add External JARs</w:t>
+      </w:r>
+      <w:proofErr w:type="gramStart"/>
+      <w:r>
+        <w:rPr>
+          <w:sz w:val="24"/>
+          <w:szCs w:val="22"/>
+          <w:lang w:val="en-US"/>
+        </w:rPr>
+        <w:t>..</w:t>
+      </w:r>
+      <w:proofErr w:type="gramEnd"/>
     </w:p>
     <w:p>
       <w:pPr>
@@ -2871,13 +2911,23 @@
           <w:lang w:val="en-US"/>
         </w:rPr>
       </w:pPr>
-      <w:r>
-        <w:rPr>
-          <w:sz w:val="24"/>
-          <w:szCs w:val="22"/>
-          <w:lang w:val="en-US"/>
-        </w:rPr>
-        <w:t xml:space="preserve">get() </w:t>
+      <w:proofErr w:type="gramStart"/>
+      <w:r>
+        <w:rPr>
+          <w:sz w:val="24"/>
+          <w:szCs w:val="22"/>
+          <w:lang w:val="en-US"/>
+        </w:rPr>
+        <w:t>get(</w:t>
+      </w:r>
+      <w:proofErr w:type="gramEnd"/>
+      <w:r>
+        <w:rPr>
+          <w:sz w:val="24"/>
+          <w:szCs w:val="22"/>
+          <w:lang w:val="en-US"/>
+        </w:rPr>
+        <w:t xml:space="preserve">) </w:t>
       </w:r>
       <w:r>
         <w:rPr>
@@ -2909,13 +2959,33 @@
           <w:lang w:val="en-US"/>
         </w:rPr>
       </w:pPr>
-      <w:r>
-        <w:rPr>
-          <w:sz w:val="24"/>
-          <w:szCs w:val="22"/>
-          <w:lang w:val="en-US"/>
-        </w:rPr>
-        <w:t xml:space="preserve">driver.manage().window().maximize() </w:t>
+      <w:proofErr w:type="spellStart"/>
+      <w:proofErr w:type="gramStart"/>
+      <w:r>
+        <w:rPr>
+          <w:sz w:val="24"/>
+          <w:szCs w:val="22"/>
+          <w:lang w:val="en-US"/>
+        </w:rPr>
+        <w:t>driver.manage</w:t>
+      </w:r>
+      <w:proofErr w:type="spellEnd"/>
+      <w:r>
+        <w:rPr>
+          <w:sz w:val="24"/>
+          <w:szCs w:val="22"/>
+          <w:lang w:val="en-US"/>
+        </w:rPr>
+        <w:t>(</w:t>
+      </w:r>
+      <w:proofErr w:type="gramEnd"/>
+      <w:r>
+        <w:rPr>
+          <w:sz w:val="24"/>
+          <w:szCs w:val="22"/>
+          <w:lang w:val="en-US"/>
+        </w:rPr>
+        <w:t xml:space="preserve">).window().maximize() </w:t>
       </w:r>
       <w:r>
         <w:rPr>
@@ -2947,13 +3017,23 @@
           <w:lang w:val="en-US"/>
         </w:rPr>
       </w:pPr>
-      <w:r>
-        <w:rPr>
-          <w:sz w:val="24"/>
-          <w:szCs w:val="22"/>
-          <w:lang w:val="en-US"/>
-        </w:rPr>
-        <w:t xml:space="preserve">close() </w:t>
+      <w:proofErr w:type="gramStart"/>
+      <w:r>
+        <w:rPr>
+          <w:sz w:val="24"/>
+          <w:szCs w:val="22"/>
+          <w:lang w:val="en-US"/>
+        </w:rPr>
+        <w:t>close(</w:t>
+      </w:r>
+      <w:proofErr w:type="gramEnd"/>
+      <w:r>
+        <w:rPr>
+          <w:sz w:val="24"/>
+          <w:szCs w:val="22"/>
+          <w:lang w:val="en-US"/>
+        </w:rPr>
+        <w:t xml:space="preserve">) </w:t>
       </w:r>
       <w:r>
         <w:rPr>
@@ -2985,13 +3065,23 @@
           <w:lang w:val="en-US"/>
         </w:rPr>
       </w:pPr>
-      <w:r>
-        <w:rPr>
-          <w:sz w:val="24"/>
-          <w:szCs w:val="22"/>
-          <w:lang w:val="en-US"/>
-        </w:rPr>
-        <w:t xml:space="preserve">getTitle() </w:t>
+      <w:proofErr w:type="gramStart"/>
+      <w:r>
+        <w:rPr>
+          <w:sz w:val="24"/>
+          <w:szCs w:val="22"/>
+          <w:lang w:val="en-US"/>
+        </w:rPr>
+        <w:t>getTitle(</w:t>
+      </w:r>
+      <w:proofErr w:type="gramEnd"/>
+      <w:r>
+        <w:rPr>
+          <w:sz w:val="24"/>
+          <w:szCs w:val="22"/>
+          <w:lang w:val="en-US"/>
+        </w:rPr>
+        <w:t xml:space="preserve">) </w:t>
       </w:r>
       <w:r>
         <w:rPr>
@@ -3023,13 +3113,23 @@
           <w:lang w:val="en-US"/>
         </w:rPr>
       </w:pPr>
-      <w:r>
-        <w:rPr>
-          <w:sz w:val="24"/>
-          <w:szCs w:val="22"/>
-          <w:lang w:val="en-US"/>
-        </w:rPr>
-        <w:t xml:space="preserve">getCurrentUrl() </w:t>
+      <w:proofErr w:type="gramStart"/>
+      <w:r>
+        <w:rPr>
+          <w:sz w:val="24"/>
+          <w:szCs w:val="22"/>
+          <w:lang w:val="en-US"/>
+        </w:rPr>
+        <w:t>getCurrentUrl(</w:t>
+      </w:r>
+      <w:proofErr w:type="gramEnd"/>
+      <w:r>
+        <w:rPr>
+          <w:sz w:val="24"/>
+          <w:szCs w:val="22"/>
+          <w:lang w:val="en-US"/>
+        </w:rPr>
+        <w:t xml:space="preserve">) </w:t>
       </w:r>
       <w:r>
         <w:rPr>
@@ -3061,13 +3161,23 @@
           <w:lang w:val="en-US"/>
         </w:rPr>
       </w:pPr>
-      <w:r>
-        <w:rPr>
-          <w:sz w:val="24"/>
-          <w:szCs w:val="22"/>
-          <w:lang w:val="en-US"/>
-        </w:rPr>
-        <w:t xml:space="preserve">getPageSource() </w:t>
+      <w:proofErr w:type="gramStart"/>
+      <w:r>
+        <w:rPr>
+          <w:sz w:val="24"/>
+          <w:szCs w:val="22"/>
+          <w:lang w:val="en-US"/>
+        </w:rPr>
+        <w:t>getPageSource(</w:t>
+      </w:r>
+      <w:proofErr w:type="gramEnd"/>
+      <w:r>
+        <w:rPr>
+          <w:sz w:val="24"/>
+          <w:szCs w:val="22"/>
+          <w:lang w:val="en-US"/>
+        </w:rPr>
+        <w:t xml:space="preserve">) </w:t>
       </w:r>
       <w:r>
         <w:rPr>
@@ -3099,13 +3209,23 @@
           <w:lang w:val="en-US"/>
         </w:rPr>
       </w:pPr>
-      <w:r>
-        <w:rPr>
-          <w:sz w:val="24"/>
-          <w:szCs w:val="22"/>
-          <w:lang w:val="en-US"/>
-        </w:rPr>
-        <w:t xml:space="preserve">findElement() </w:t>
+      <w:proofErr w:type="gramStart"/>
+      <w:r>
+        <w:rPr>
+          <w:sz w:val="24"/>
+          <w:szCs w:val="22"/>
+          <w:lang w:val="en-US"/>
+        </w:rPr>
+        <w:t>findElement(</w:t>
+      </w:r>
+      <w:proofErr w:type="gramEnd"/>
+      <w:r>
+        <w:rPr>
+          <w:sz w:val="24"/>
+          <w:szCs w:val="22"/>
+          <w:lang w:val="en-US"/>
+        </w:rPr>
+        <w:t xml:space="preserve">) </w:t>
       </w:r>
       <w:r>
         <w:rPr>
@@ -3155,13 +3275,23 @@
           <w:lang w:val="en-US"/>
         </w:rPr>
       </w:pPr>
-      <w:r>
-        <w:rPr>
-          <w:sz w:val="24"/>
-          <w:szCs w:val="22"/>
-          <w:lang w:val="en-US"/>
-        </w:rPr>
-        <w:t xml:space="preserve">findElements() </w:t>
+      <w:proofErr w:type="gramStart"/>
+      <w:r>
+        <w:rPr>
+          <w:sz w:val="24"/>
+          <w:szCs w:val="22"/>
+          <w:lang w:val="en-US"/>
+        </w:rPr>
+        <w:t>findElements(</w:t>
+      </w:r>
+      <w:proofErr w:type="gramEnd"/>
+      <w:r>
+        <w:rPr>
+          <w:sz w:val="24"/>
+          <w:szCs w:val="22"/>
+          <w:lang w:val="en-US"/>
+        </w:rPr>
+        <w:t xml:space="preserve">) </w:t>
       </w:r>
       <w:r>
         <w:rPr>
@@ -3193,13 +3323,23 @@
           <w:lang w:val="en-US"/>
         </w:rPr>
       </w:pPr>
-      <w:r>
-        <w:rPr>
-          <w:sz w:val="24"/>
-          <w:szCs w:val="22"/>
-          <w:lang w:val="en-US"/>
-        </w:rPr>
-        <w:t xml:space="preserve">getWindowHandles() </w:t>
+      <w:proofErr w:type="gramStart"/>
+      <w:r>
+        <w:rPr>
+          <w:sz w:val="24"/>
+          <w:szCs w:val="22"/>
+          <w:lang w:val="en-US"/>
+        </w:rPr>
+        <w:t>getWindowHandles(</w:t>
+      </w:r>
+      <w:proofErr w:type="gramEnd"/>
+      <w:r>
+        <w:rPr>
+          <w:sz w:val="24"/>
+          <w:szCs w:val="22"/>
+          <w:lang w:val="en-US"/>
+        </w:rPr>
+        <w:t xml:space="preserve">) </w:t>
       </w:r>
       <w:r>
         <w:rPr>
@@ -3231,13 +3371,23 @@
           <w:lang w:val="en-US"/>
         </w:rPr>
       </w:pPr>
-      <w:r>
-        <w:rPr>
-          <w:sz w:val="24"/>
-          <w:szCs w:val="22"/>
-          <w:lang w:val="en-US"/>
-        </w:rPr>
-        <w:t xml:space="preserve">quit() </w:t>
+      <w:proofErr w:type="gramStart"/>
+      <w:r>
+        <w:rPr>
+          <w:sz w:val="24"/>
+          <w:szCs w:val="22"/>
+          <w:lang w:val="en-US"/>
+        </w:rPr>
+        <w:t>quit(</w:t>
+      </w:r>
+      <w:proofErr w:type="gramEnd"/>
+      <w:r>
+        <w:rPr>
+          <w:sz w:val="24"/>
+          <w:szCs w:val="22"/>
+          <w:lang w:val="en-US"/>
+        </w:rPr>
+        <w:t xml:space="preserve">) </w:t>
       </w:r>
       <w:r>
         <w:rPr>
@@ -3618,7 +3768,25 @@
           <w:szCs w:val="22"/>
           <w:lang w:val="en-US"/>
         </w:rPr>
-        <w:t xml:space="preserve"> driver.get() is having implicit wait of 30 seconds, means Selenium will wait for maximum 30 seconds till the page get loaded. But if the page is not getting loaded within 30 seconds, Selenium will throw SessionTimeoutException.</w:t>
+        <w:t xml:space="preserve"> </w:t>
+      </w:r>
+      <w:proofErr w:type="spellStart"/>
+      <w:r>
+        <w:rPr>
+          <w:sz w:val="24"/>
+          <w:szCs w:val="22"/>
+          <w:lang w:val="en-US"/>
+        </w:rPr>
+        <w:t>driver.get</w:t>
+      </w:r>
+      <w:proofErr w:type="spellEnd"/>
+      <w:r>
+        <w:rPr>
+          <w:sz w:val="24"/>
+          <w:szCs w:val="22"/>
+          <w:lang w:val="en-US"/>
+        </w:rPr>
+        <w:t>() is having implicit wait of 30 seconds, means Selenium will wait for maximum 30 seconds till the page get loaded. But if the page is not getting loaded within 30 seconds, Selenium will throw SessionTimeoutException.</w:t>
       </w:r>
     </w:p>
     <w:p>
@@ -3880,13 +4048,23 @@
           <w:lang w:val="en-US"/>
         </w:rPr>
       </w:pPr>
-      <w:r>
-        <w:rPr>
-          <w:sz w:val="24"/>
-          <w:szCs w:val="22"/>
-          <w:lang w:val="en-US"/>
-        </w:rPr>
-        <w:t xml:space="preserve">sendKeys() </w:t>
+      <w:proofErr w:type="gramStart"/>
+      <w:r>
+        <w:rPr>
+          <w:sz w:val="24"/>
+          <w:szCs w:val="22"/>
+          <w:lang w:val="en-US"/>
+        </w:rPr>
+        <w:t>sendKeys(</w:t>
+      </w:r>
+      <w:proofErr w:type="gramEnd"/>
+      <w:r>
+        <w:rPr>
+          <w:sz w:val="24"/>
+          <w:szCs w:val="22"/>
+          <w:lang w:val="en-US"/>
+        </w:rPr>
+        <w:t xml:space="preserve">) </w:t>
       </w:r>
       <w:r>
         <w:rPr>
@@ -3926,13 +4104,23 @@
           <w:lang w:val="en-US"/>
         </w:rPr>
       </w:pPr>
-      <w:r>
-        <w:rPr>
-          <w:sz w:val="24"/>
-          <w:szCs w:val="22"/>
-          <w:lang w:val="en-US"/>
-        </w:rPr>
-        <w:t xml:space="preserve">click() </w:t>
+      <w:proofErr w:type="gramStart"/>
+      <w:r>
+        <w:rPr>
+          <w:sz w:val="24"/>
+          <w:szCs w:val="22"/>
+          <w:lang w:val="en-US"/>
+        </w:rPr>
+        <w:t>click(</w:t>
+      </w:r>
+      <w:proofErr w:type="gramEnd"/>
+      <w:r>
+        <w:rPr>
+          <w:sz w:val="24"/>
+          <w:szCs w:val="22"/>
+          <w:lang w:val="en-US"/>
+        </w:rPr>
+        <w:t xml:space="preserve">) </w:t>
       </w:r>
       <w:r>
         <w:rPr>
@@ -3964,13 +4152,23 @@
           <w:lang w:val="en-US"/>
         </w:rPr>
       </w:pPr>
-      <w:r>
-        <w:rPr>
-          <w:sz w:val="24"/>
-          <w:szCs w:val="22"/>
-          <w:lang w:val="en-US"/>
-        </w:rPr>
-        <w:t xml:space="preserve">getText() </w:t>
+      <w:proofErr w:type="gramStart"/>
+      <w:r>
+        <w:rPr>
+          <w:sz w:val="24"/>
+          <w:szCs w:val="22"/>
+          <w:lang w:val="en-US"/>
+        </w:rPr>
+        <w:t>getText(</w:t>
+      </w:r>
+      <w:proofErr w:type="gramEnd"/>
+      <w:r>
+        <w:rPr>
+          <w:sz w:val="24"/>
+          <w:szCs w:val="22"/>
+          <w:lang w:val="en-US"/>
+        </w:rPr>
+        <w:t xml:space="preserve">) </w:t>
       </w:r>
       <w:r>
         <w:rPr>
@@ -4002,13 +4200,23 @@
           <w:lang w:val="en-US"/>
         </w:rPr>
       </w:pPr>
-      <w:r>
-        <w:rPr>
-          <w:sz w:val="24"/>
-          <w:szCs w:val="22"/>
-          <w:lang w:val="en-US"/>
-        </w:rPr>
-        <w:t xml:space="preserve">getAttribute() </w:t>
+      <w:proofErr w:type="gramStart"/>
+      <w:r>
+        <w:rPr>
+          <w:sz w:val="24"/>
+          <w:szCs w:val="22"/>
+          <w:lang w:val="en-US"/>
+        </w:rPr>
+        <w:t>getAttribute(</w:t>
+      </w:r>
+      <w:proofErr w:type="gramEnd"/>
+      <w:r>
+        <w:rPr>
+          <w:sz w:val="24"/>
+          <w:szCs w:val="22"/>
+          <w:lang w:val="en-US"/>
+        </w:rPr>
+        <w:t xml:space="preserve">) </w:t>
       </w:r>
       <w:r>
         <w:rPr>
@@ -4040,13 +4248,23 @@
           <w:lang w:val="en-US"/>
         </w:rPr>
       </w:pPr>
-      <w:r>
-        <w:rPr>
-          <w:sz w:val="24"/>
-          <w:szCs w:val="22"/>
-          <w:lang w:val="en-US"/>
-        </w:rPr>
-        <w:t xml:space="preserve">isSelected() </w:t>
+      <w:proofErr w:type="gramStart"/>
+      <w:r>
+        <w:rPr>
+          <w:sz w:val="24"/>
+          <w:szCs w:val="22"/>
+          <w:lang w:val="en-US"/>
+        </w:rPr>
+        <w:t>isSelected(</w:t>
+      </w:r>
+      <w:proofErr w:type="gramEnd"/>
+      <w:r>
+        <w:rPr>
+          <w:sz w:val="24"/>
+          <w:szCs w:val="22"/>
+          <w:lang w:val="en-US"/>
+        </w:rPr>
+        <w:t xml:space="preserve">) </w:t>
       </w:r>
       <w:r>
         <w:rPr>
@@ -4086,13 +4304,23 @@
           <w:lang w:val="en-US"/>
         </w:rPr>
       </w:pPr>
-      <w:r>
-        <w:rPr>
-          <w:sz w:val="24"/>
-          <w:szCs w:val="22"/>
-          <w:lang w:val="en-US"/>
-        </w:rPr>
-        <w:t xml:space="preserve">isEnabled() </w:t>
+      <w:proofErr w:type="gramStart"/>
+      <w:r>
+        <w:rPr>
+          <w:sz w:val="24"/>
+          <w:szCs w:val="22"/>
+          <w:lang w:val="en-US"/>
+        </w:rPr>
+        <w:t>isEnabled(</w:t>
+      </w:r>
+      <w:proofErr w:type="gramEnd"/>
+      <w:r>
+        <w:rPr>
+          <w:sz w:val="24"/>
+          <w:szCs w:val="22"/>
+          <w:lang w:val="en-US"/>
+        </w:rPr>
+        <w:t xml:space="preserve">) </w:t>
       </w:r>
       <w:r>
         <w:rPr>
@@ -4162,13 +4390,23 @@
           <w:lang w:val="en-US"/>
         </w:rPr>
       </w:pPr>
-      <w:r>
-        <w:rPr>
-          <w:sz w:val="24"/>
-          <w:szCs w:val="22"/>
-          <w:lang w:val="en-US"/>
-        </w:rPr>
-        <w:t xml:space="preserve">clear() </w:t>
+      <w:proofErr w:type="gramStart"/>
+      <w:r>
+        <w:rPr>
+          <w:sz w:val="24"/>
+          <w:szCs w:val="22"/>
+          <w:lang w:val="en-US"/>
+        </w:rPr>
+        <w:t>clear(</w:t>
+      </w:r>
+      <w:proofErr w:type="gramEnd"/>
+      <w:r>
+        <w:rPr>
+          <w:sz w:val="24"/>
+          <w:szCs w:val="22"/>
+          <w:lang w:val="en-US"/>
+        </w:rPr>
+        <w:t xml:space="preserve">) </w:t>
       </w:r>
       <w:r>
         <w:rPr>
@@ -5264,13 +5502,23 @@
           <w:lang w:val="en-US"/>
         </w:rPr>
       </w:pPr>
-      <w:r>
-        <w:rPr>
-          <w:sz w:val="24"/>
-          <w:szCs w:val="22"/>
-          <w:lang w:val="en-US"/>
-        </w:rPr>
-        <w:t xml:space="preserve">getFirstSelectedOption() </w:t>
+      <w:proofErr w:type="gramStart"/>
+      <w:r>
+        <w:rPr>
+          <w:sz w:val="24"/>
+          <w:szCs w:val="22"/>
+          <w:lang w:val="en-US"/>
+        </w:rPr>
+        <w:t>getFirstSelectedOption(</w:t>
+      </w:r>
+      <w:proofErr w:type="gramEnd"/>
+      <w:r>
+        <w:rPr>
+          <w:sz w:val="24"/>
+          <w:szCs w:val="22"/>
+          <w:lang w:val="en-US"/>
+        </w:rPr>
+        <w:t xml:space="preserve">) </w:t>
       </w:r>
       <w:r>
         <w:rPr>
@@ -5318,13 +5566,23 @@
           <w:lang w:val="en-US"/>
         </w:rPr>
       </w:pPr>
-      <w:r>
-        <w:rPr>
-          <w:sz w:val="24"/>
-          <w:szCs w:val="22"/>
-          <w:lang w:val="en-US"/>
-        </w:rPr>
-        <w:t xml:space="preserve">getOptions() </w:t>
+      <w:proofErr w:type="gramStart"/>
+      <w:r>
+        <w:rPr>
+          <w:sz w:val="24"/>
+          <w:szCs w:val="22"/>
+          <w:lang w:val="en-US"/>
+        </w:rPr>
+        <w:t>getOptions(</w:t>
+      </w:r>
+      <w:proofErr w:type="gramEnd"/>
+      <w:r>
+        <w:rPr>
+          <w:sz w:val="24"/>
+          <w:szCs w:val="22"/>
+          <w:lang w:val="en-US"/>
+        </w:rPr>
+        <w:t xml:space="preserve">) </w:t>
       </w:r>
       <w:r>
         <w:rPr>
@@ -5356,13 +5614,23 @@
           <w:lang w:val="en-US"/>
         </w:rPr>
       </w:pPr>
-      <w:r>
-        <w:rPr>
-          <w:sz w:val="24"/>
-          <w:szCs w:val="22"/>
-          <w:lang w:val="en-US"/>
-        </w:rPr>
-        <w:t xml:space="preserve">selectByVisibleText() </w:t>
+      <w:proofErr w:type="gramStart"/>
+      <w:r>
+        <w:rPr>
+          <w:sz w:val="24"/>
+          <w:szCs w:val="22"/>
+          <w:lang w:val="en-US"/>
+        </w:rPr>
+        <w:t>selectByVisibleText(</w:t>
+      </w:r>
+      <w:proofErr w:type="gramEnd"/>
+      <w:r>
+        <w:rPr>
+          <w:sz w:val="24"/>
+          <w:szCs w:val="22"/>
+          <w:lang w:val="en-US"/>
+        </w:rPr>
+        <w:t xml:space="preserve">) </w:t>
       </w:r>
       <w:r>
         <w:rPr>
@@ -5394,13 +5662,23 @@
           <w:lang w:val="en-US"/>
         </w:rPr>
       </w:pPr>
-      <w:r>
-        <w:rPr>
-          <w:sz w:val="24"/>
-          <w:szCs w:val="22"/>
-          <w:lang w:val="en-US"/>
-        </w:rPr>
-        <w:t xml:space="preserve">selectByContainsVisibleText() </w:t>
+      <w:proofErr w:type="gramStart"/>
+      <w:r>
+        <w:rPr>
+          <w:sz w:val="24"/>
+          <w:szCs w:val="22"/>
+          <w:lang w:val="en-US"/>
+        </w:rPr>
+        <w:t>selectByContainsVisibleText(</w:t>
+      </w:r>
+      <w:proofErr w:type="gramEnd"/>
+      <w:r>
+        <w:rPr>
+          <w:sz w:val="24"/>
+          <w:szCs w:val="22"/>
+          <w:lang w:val="en-US"/>
+        </w:rPr>
+        <w:t xml:space="preserve">) </w:t>
       </w:r>
       <w:r>
         <w:rPr>
@@ -5432,13 +5710,23 @@
           <w:lang w:val="en-US"/>
         </w:rPr>
       </w:pPr>
-      <w:r>
-        <w:rPr>
-          <w:sz w:val="24"/>
-          <w:szCs w:val="22"/>
-          <w:lang w:val="en-US"/>
-        </w:rPr>
-        <w:t xml:space="preserve">selectByValue() </w:t>
+      <w:proofErr w:type="gramStart"/>
+      <w:r>
+        <w:rPr>
+          <w:sz w:val="24"/>
+          <w:szCs w:val="22"/>
+          <w:lang w:val="en-US"/>
+        </w:rPr>
+        <w:t>selectByValue(</w:t>
+      </w:r>
+      <w:proofErr w:type="gramEnd"/>
+      <w:r>
+        <w:rPr>
+          <w:sz w:val="24"/>
+          <w:szCs w:val="22"/>
+          <w:lang w:val="en-US"/>
+        </w:rPr>
+        <w:t xml:space="preserve">) </w:t>
       </w:r>
       <w:r>
         <w:rPr>
@@ -5470,13 +5758,23 @@
           <w:lang w:val="en-US"/>
         </w:rPr>
       </w:pPr>
-      <w:r>
-        <w:rPr>
-          <w:sz w:val="24"/>
-          <w:szCs w:val="22"/>
-          <w:lang w:val="en-US"/>
-        </w:rPr>
-        <w:t xml:space="preserve">selectByIndex() </w:t>
+      <w:proofErr w:type="gramStart"/>
+      <w:r>
+        <w:rPr>
+          <w:sz w:val="24"/>
+          <w:szCs w:val="22"/>
+          <w:lang w:val="en-US"/>
+        </w:rPr>
+        <w:t>selectByIndex(</w:t>
+      </w:r>
+      <w:proofErr w:type="gramEnd"/>
+      <w:r>
+        <w:rPr>
+          <w:sz w:val="24"/>
+          <w:szCs w:val="22"/>
+          <w:lang w:val="en-US"/>
+        </w:rPr>
+        <w:t xml:space="preserve">) </w:t>
       </w:r>
       <w:r>
         <w:rPr>
@@ -5508,13 +5806,23 @@
           <w:lang w:val="en-US"/>
         </w:rPr>
       </w:pPr>
-      <w:r>
-        <w:rPr>
-          <w:sz w:val="24"/>
-          <w:szCs w:val="22"/>
-          <w:lang w:val="en-US"/>
-        </w:rPr>
-        <w:t xml:space="preserve">getAllSelectedOptions() </w:t>
+      <w:proofErr w:type="gramStart"/>
+      <w:r>
+        <w:rPr>
+          <w:sz w:val="24"/>
+          <w:szCs w:val="22"/>
+          <w:lang w:val="en-US"/>
+        </w:rPr>
+        <w:t>getAllSelectedOptions(</w:t>
+      </w:r>
+      <w:proofErr w:type="gramEnd"/>
+      <w:r>
+        <w:rPr>
+          <w:sz w:val="24"/>
+          <w:szCs w:val="22"/>
+          <w:lang w:val="en-US"/>
+        </w:rPr>
+        <w:t xml:space="preserve">) </w:t>
       </w:r>
       <w:r>
         <w:rPr>
@@ -5554,13 +5862,23 @@
           <w:lang w:val="en-US"/>
         </w:rPr>
       </w:pPr>
-      <w:r>
-        <w:rPr>
-          <w:sz w:val="24"/>
-          <w:szCs w:val="22"/>
-          <w:lang w:val="en-US"/>
-        </w:rPr>
-        <w:t xml:space="preserve">isMultiple() </w:t>
+      <w:proofErr w:type="gramStart"/>
+      <w:r>
+        <w:rPr>
+          <w:sz w:val="24"/>
+          <w:szCs w:val="22"/>
+          <w:lang w:val="en-US"/>
+        </w:rPr>
+        <w:t>isMultiple(</w:t>
+      </w:r>
+      <w:proofErr w:type="gramEnd"/>
+      <w:r>
+        <w:rPr>
+          <w:sz w:val="24"/>
+          <w:szCs w:val="22"/>
+          <w:lang w:val="en-US"/>
+        </w:rPr>
+        <w:t xml:space="preserve">) </w:t>
       </w:r>
       <w:r>
         <w:rPr>
@@ -5749,13 +6067,33 @@
           <w:lang w:val="en-US"/>
         </w:rPr>
       </w:pPr>
-      <w:r>
-        <w:rPr>
-          <w:sz w:val="24"/>
-          <w:szCs w:val="22"/>
-          <w:lang w:val="en-US"/>
-        </w:rPr>
-        <w:t>Thread.sleep()</w:t>
+      <w:proofErr w:type="spellStart"/>
+      <w:proofErr w:type="gramStart"/>
+      <w:r>
+        <w:rPr>
+          <w:sz w:val="24"/>
+          <w:szCs w:val="22"/>
+          <w:lang w:val="en-US"/>
+        </w:rPr>
+        <w:t>Thread.sleep</w:t>
+      </w:r>
+      <w:proofErr w:type="spellEnd"/>
+      <w:r>
+        <w:rPr>
+          <w:sz w:val="24"/>
+          <w:szCs w:val="22"/>
+          <w:lang w:val="en-US"/>
+        </w:rPr>
+        <w:t>(</w:t>
+      </w:r>
+      <w:proofErr w:type="gramEnd"/>
+      <w:r>
+        <w:rPr>
+          <w:sz w:val="24"/>
+          <w:szCs w:val="22"/>
+          <w:lang w:val="en-US"/>
+        </w:rPr>
+        <w:t>)</w:t>
       </w:r>
       <w:r>
         <w:rPr>
@@ -6189,7 +6527,24 @@
           <w:lang w:val="en-US"/>
         </w:rPr>
         <w:br/>
-        <w:t xml:space="preserve">i – ignoring </w:t>
+      </w:r>
+      <w:proofErr w:type="spellStart"/>
+      <w:r>
+        <w:rPr>
+          <w:sz w:val="24"/>
+          <w:szCs w:val="22"/>
+          <w:lang w:val="en-US"/>
+        </w:rPr>
+        <w:t>i</w:t>
+      </w:r>
+      <w:proofErr w:type="spellEnd"/>
+      <w:r>
+        <w:rPr>
+          <w:sz w:val="24"/>
+          <w:szCs w:val="22"/>
+          <w:lang w:val="en-US"/>
+        </w:rPr>
+        <w:t xml:space="preserve"> – ignoring </w:t>
       </w:r>
       <w:r>
         <w:rPr>
@@ -6279,7 +6634,25 @@
           <w:szCs w:val="22"/>
           <w:lang w:val="en-US"/>
         </w:rPr>
-        <w:t>&lt;table&gt;</w:t>
+        <w:t>&lt;</w:t>
+      </w:r>
+      <w:proofErr w:type="gramStart"/>
+      <w:r>
+        <w:rPr>
+          <w:sz w:val="24"/>
+          <w:szCs w:val="22"/>
+          <w:lang w:val="en-US"/>
+        </w:rPr>
+        <w:t>table</w:t>
+      </w:r>
+      <w:proofErr w:type="gramEnd"/>
+      <w:r>
+        <w:rPr>
+          <w:sz w:val="24"/>
+          <w:szCs w:val="22"/>
+          <w:lang w:val="en-US"/>
+        </w:rPr>
+        <w:t>&gt;</w:t>
       </w:r>
     </w:p>
     <w:p>
@@ -6297,7 +6670,27 @@
           <w:lang w:val="en-US"/>
         </w:rPr>
         <w:tab/>
-        <w:t>&lt;thead&gt;</w:t>
+        <w:t>&lt;</w:t>
+      </w:r>
+      <w:proofErr w:type="spellStart"/>
+      <w:proofErr w:type="gramStart"/>
+      <w:r>
+        <w:rPr>
+          <w:sz w:val="24"/>
+          <w:szCs w:val="22"/>
+          <w:lang w:val="en-US"/>
+        </w:rPr>
+        <w:t>thead</w:t>
+      </w:r>
+      <w:proofErr w:type="spellEnd"/>
+      <w:proofErr w:type="gramEnd"/>
+      <w:r>
+        <w:rPr>
+          <w:sz w:val="24"/>
+          <w:szCs w:val="22"/>
+          <w:lang w:val="en-US"/>
+        </w:rPr>
+        <w:t>&gt;</w:t>
       </w:r>
       <w:r>
         <w:rPr>
@@ -6332,7 +6725,27 @@
           <w:lang w:val="en-US"/>
         </w:rPr>
         <w:tab/>
-        <w:t>&lt;tr&gt;</w:t>
+        <w:t>&lt;</w:t>
+      </w:r>
+      <w:proofErr w:type="spellStart"/>
+      <w:proofErr w:type="gramStart"/>
+      <w:r>
+        <w:rPr>
+          <w:sz w:val="24"/>
+          <w:szCs w:val="22"/>
+          <w:lang w:val="en-US"/>
+        </w:rPr>
+        <w:t>tr</w:t>
+      </w:r>
+      <w:proofErr w:type="spellEnd"/>
+      <w:proofErr w:type="gramEnd"/>
+      <w:r>
+        <w:rPr>
+          <w:sz w:val="24"/>
+          <w:szCs w:val="22"/>
+          <w:lang w:val="en-US"/>
+        </w:rPr>
+        <w:t>&gt;</w:t>
       </w:r>
       <w:r>
         <w:rPr>
@@ -6375,7 +6788,63 @@
           <w:lang w:val="en-US"/>
         </w:rPr>
         <w:tab/>
-        <w:t>&lt;th&gt;Sr No&lt;/th&gt;</w:t>
+        <w:t>&lt;</w:t>
+      </w:r>
+      <w:proofErr w:type="spellStart"/>
+      <w:proofErr w:type="gramStart"/>
+      <w:r>
+        <w:rPr>
+          <w:sz w:val="24"/>
+          <w:szCs w:val="22"/>
+          <w:lang w:val="en-US"/>
+        </w:rPr>
+        <w:t>th</w:t>
+      </w:r>
+      <w:proofErr w:type="spellEnd"/>
+      <w:r>
+        <w:rPr>
+          <w:sz w:val="24"/>
+          <w:szCs w:val="22"/>
+          <w:lang w:val="en-US"/>
+        </w:rPr>
+        <w:t>&gt;</w:t>
+      </w:r>
+      <w:proofErr w:type="spellStart"/>
+      <w:proofErr w:type="gramEnd"/>
+      <w:r>
+        <w:rPr>
+          <w:sz w:val="24"/>
+          <w:szCs w:val="22"/>
+          <w:lang w:val="en-US"/>
+        </w:rPr>
+        <w:t>Sr</w:t>
+      </w:r>
+      <w:proofErr w:type="spellEnd"/>
+      <w:r>
+        <w:rPr>
+          <w:sz w:val="24"/>
+          <w:szCs w:val="22"/>
+          <w:lang w:val="en-US"/>
+        </w:rPr>
+        <w:t xml:space="preserve"> No&lt;/</w:t>
+      </w:r>
+      <w:proofErr w:type="spellStart"/>
+      <w:r>
+        <w:rPr>
+          <w:sz w:val="24"/>
+          <w:szCs w:val="22"/>
+          <w:lang w:val="en-US"/>
+        </w:rPr>
+        <w:t>th</w:t>
+      </w:r>
+      <w:proofErr w:type="spellEnd"/>
+      <w:r>
+        <w:rPr>
+          <w:sz w:val="24"/>
+          <w:szCs w:val="22"/>
+          <w:lang w:val="en-US"/>
+        </w:rPr>
+        <w:t>&gt;</w:t>
       </w:r>
       <w:r>
         <w:rPr>
@@ -6418,7 +6887,53 @@
           <w:lang w:val="en-US"/>
         </w:rPr>
         <w:tab/>
-        <w:t>&lt;th&gt;Company&lt;/th&gt;</w:t>
+        <w:t>&lt;</w:t>
+      </w:r>
+      <w:proofErr w:type="spellStart"/>
+      <w:proofErr w:type="gramStart"/>
+      <w:r>
+        <w:rPr>
+          <w:sz w:val="24"/>
+          <w:szCs w:val="22"/>
+          <w:lang w:val="en-US"/>
+        </w:rPr>
+        <w:t>th</w:t>
+      </w:r>
+      <w:proofErr w:type="spellEnd"/>
+      <w:r>
+        <w:rPr>
+          <w:sz w:val="24"/>
+          <w:szCs w:val="22"/>
+          <w:lang w:val="en-US"/>
+        </w:rPr>
+        <w:t>&gt;</w:t>
+      </w:r>
+      <w:proofErr w:type="gramEnd"/>
+      <w:r>
+        <w:rPr>
+          <w:sz w:val="24"/>
+          <w:szCs w:val="22"/>
+          <w:lang w:val="en-US"/>
+        </w:rPr>
+        <w:t>Company&lt;/</w:t>
+      </w:r>
+      <w:proofErr w:type="spellStart"/>
+      <w:r>
+        <w:rPr>
+          <w:sz w:val="24"/>
+          <w:szCs w:val="22"/>
+          <w:lang w:val="en-US"/>
+        </w:rPr>
+        <w:t>th</w:t>
+      </w:r>
+      <w:proofErr w:type="spellEnd"/>
+      <w:r>
+        <w:rPr>
+          <w:sz w:val="24"/>
+          <w:szCs w:val="22"/>
+          <w:lang w:val="en-US"/>
+        </w:rPr>
+        <w:t>&gt;</w:t>
       </w:r>
     </w:p>
     <w:p>
@@ -6444,7 +6959,27 @@
           <w:lang w:val="en-US"/>
         </w:rPr>
         <w:tab/>
-        <w:t>&lt;/tr&gt;</w:t>
+        <w:t>&lt;/</w:t>
+      </w:r>
+      <w:proofErr w:type="spellStart"/>
+      <w:proofErr w:type="gramStart"/>
+      <w:r>
+        <w:rPr>
+          <w:sz w:val="24"/>
+          <w:szCs w:val="22"/>
+          <w:lang w:val="en-US"/>
+        </w:rPr>
+        <w:t>tr</w:t>
+      </w:r>
+      <w:proofErr w:type="spellEnd"/>
+      <w:proofErr w:type="gramEnd"/>
+      <w:r>
+        <w:rPr>
+          <w:sz w:val="24"/>
+          <w:szCs w:val="22"/>
+          <w:lang w:val="en-US"/>
+        </w:rPr>
+        <w:t>&gt;</w:t>
       </w:r>
     </w:p>
     <w:p>
@@ -6462,7 +6997,25 @@
           <w:lang w:val="en-US"/>
         </w:rPr>
         <w:tab/>
-        <w:t>&lt;/thead&gt;</w:t>
+        <w:t>&lt;/</w:t>
+      </w:r>
+      <w:proofErr w:type="spellStart"/>
+      <w:r>
+        <w:rPr>
+          <w:sz w:val="24"/>
+          <w:szCs w:val="22"/>
+          <w:lang w:val="en-US"/>
+        </w:rPr>
+        <w:t>thead</w:t>
+      </w:r>
+      <w:proofErr w:type="spellEnd"/>
+      <w:r>
+        <w:rPr>
+          <w:sz w:val="24"/>
+          <w:szCs w:val="22"/>
+          <w:lang w:val="en-US"/>
+        </w:rPr>
+        <w:t>&gt;</w:t>
       </w:r>
     </w:p>
     <w:p>
@@ -6480,7 +7033,27 @@
           <w:lang w:val="en-US"/>
         </w:rPr>
         <w:tab/>
-        <w:t>&lt;tbody&gt;</w:t>
+        <w:t>&lt;</w:t>
+      </w:r>
+      <w:proofErr w:type="spellStart"/>
+      <w:proofErr w:type="gramStart"/>
+      <w:r>
+        <w:rPr>
+          <w:sz w:val="24"/>
+          <w:szCs w:val="22"/>
+          <w:lang w:val="en-US"/>
+        </w:rPr>
+        <w:t>tbody</w:t>
+      </w:r>
+      <w:proofErr w:type="spellEnd"/>
+      <w:proofErr w:type="gramEnd"/>
+      <w:r>
+        <w:rPr>
+          <w:sz w:val="24"/>
+          <w:szCs w:val="22"/>
+          <w:lang w:val="en-US"/>
+        </w:rPr>
+        <w:t>&gt;</w:t>
       </w:r>
       <w:r>
         <w:rPr>
@@ -6515,7 +7088,27 @@
           <w:lang w:val="en-US"/>
         </w:rPr>
         <w:tab/>
-        <w:t>&lt;tr&gt;</w:t>
+        <w:t>&lt;</w:t>
+      </w:r>
+      <w:proofErr w:type="spellStart"/>
+      <w:proofErr w:type="gramStart"/>
+      <w:r>
+        <w:rPr>
+          <w:sz w:val="24"/>
+          <w:szCs w:val="22"/>
+          <w:lang w:val="en-US"/>
+        </w:rPr>
+        <w:t>tr</w:t>
+      </w:r>
+      <w:proofErr w:type="spellEnd"/>
+      <w:proofErr w:type="gramEnd"/>
+      <w:r>
+        <w:rPr>
+          <w:sz w:val="24"/>
+          <w:szCs w:val="22"/>
+          <w:lang w:val="en-US"/>
+        </w:rPr>
+        <w:t>&gt;</w:t>
       </w:r>
     </w:p>
     <w:p>
@@ -6549,7 +7142,25 @@
           <w:lang w:val="en-US"/>
         </w:rPr>
         <w:tab/>
-        <w:t>&lt;td&gt;1&lt;/td&gt;</w:t>
+        <w:t>&lt;</w:t>
+      </w:r>
+      <w:proofErr w:type="gramStart"/>
+      <w:r>
+        <w:rPr>
+          <w:sz w:val="24"/>
+          <w:szCs w:val="22"/>
+          <w:lang w:val="en-US"/>
+        </w:rPr>
+        <w:t>td&gt;</w:t>
+      </w:r>
+      <w:proofErr w:type="gramEnd"/>
+      <w:r>
+        <w:rPr>
+          <w:sz w:val="24"/>
+          <w:szCs w:val="22"/>
+          <w:lang w:val="en-US"/>
+        </w:rPr>
+        <w:t>1&lt;/td&gt;</w:t>
       </w:r>
     </w:p>
     <w:p>
@@ -6583,7 +7194,35 @@
           <w:lang w:val="en-US"/>
         </w:rPr>
         <w:tab/>
-        <w:t>&lt;td&gt;AViIT&lt;/td&gt;</w:t>
+        <w:t>&lt;</w:t>
+      </w:r>
+      <w:proofErr w:type="gramStart"/>
+      <w:r>
+        <w:rPr>
+          <w:sz w:val="24"/>
+          <w:szCs w:val="22"/>
+          <w:lang w:val="en-US"/>
+        </w:rPr>
+        <w:t>td&gt;</w:t>
+      </w:r>
+      <w:proofErr w:type="spellStart"/>
+      <w:proofErr w:type="gramEnd"/>
+      <w:r>
+        <w:rPr>
+          <w:sz w:val="24"/>
+          <w:szCs w:val="22"/>
+          <w:lang w:val="en-US"/>
+        </w:rPr>
+        <w:t>AViIT</w:t>
+      </w:r>
+      <w:proofErr w:type="spellEnd"/>
+      <w:r>
+        <w:rPr>
+          <w:sz w:val="24"/>
+          <w:szCs w:val="22"/>
+          <w:lang w:val="en-US"/>
+        </w:rPr>
+        <w:t>&lt;/td&gt;</w:t>
       </w:r>
     </w:p>
     <w:p>
@@ -6609,7 +7248,27 @@
           <w:lang w:val="en-US"/>
         </w:rPr>
         <w:tab/>
-        <w:t>&lt;/tr&gt;</w:t>
+        <w:t>&lt;/</w:t>
+      </w:r>
+      <w:proofErr w:type="spellStart"/>
+      <w:proofErr w:type="gramStart"/>
+      <w:r>
+        <w:rPr>
+          <w:sz w:val="24"/>
+          <w:szCs w:val="22"/>
+          <w:lang w:val="en-US"/>
+        </w:rPr>
+        <w:t>tr</w:t>
+      </w:r>
+      <w:proofErr w:type="spellEnd"/>
+      <w:proofErr w:type="gramEnd"/>
+      <w:r>
+        <w:rPr>
+          <w:sz w:val="24"/>
+          <w:szCs w:val="22"/>
+          <w:lang w:val="en-US"/>
+        </w:rPr>
+        <w:t>&gt;</w:t>
       </w:r>
     </w:p>
     <w:p>
@@ -6635,7 +7294,27 @@
           <w:lang w:val="en-US"/>
         </w:rPr>
         <w:tab/>
-        <w:t>&lt;tr&gt;</w:t>
+        <w:t>&lt;</w:t>
+      </w:r>
+      <w:proofErr w:type="spellStart"/>
+      <w:proofErr w:type="gramStart"/>
+      <w:r>
+        <w:rPr>
+          <w:sz w:val="24"/>
+          <w:szCs w:val="22"/>
+          <w:lang w:val="en-US"/>
+        </w:rPr>
+        <w:t>tr</w:t>
+      </w:r>
+      <w:proofErr w:type="spellEnd"/>
+      <w:proofErr w:type="gramEnd"/>
+      <w:r>
+        <w:rPr>
+          <w:sz w:val="24"/>
+          <w:szCs w:val="22"/>
+          <w:lang w:val="en-US"/>
+        </w:rPr>
+        <w:t>&gt;</w:t>
       </w:r>
     </w:p>
     <w:p>
@@ -6669,7 +7348,25 @@
           <w:lang w:val="en-US"/>
         </w:rPr>
         <w:tab/>
-        <w:t>&lt;td&gt;2&lt;/td&gt;</w:t>
+        <w:t>&lt;</w:t>
+      </w:r>
+      <w:proofErr w:type="gramStart"/>
+      <w:r>
+        <w:rPr>
+          <w:sz w:val="24"/>
+          <w:szCs w:val="22"/>
+          <w:lang w:val="en-US"/>
+        </w:rPr>
+        <w:t>td&gt;</w:t>
+      </w:r>
+      <w:proofErr w:type="gramEnd"/>
+      <w:r>
+        <w:rPr>
+          <w:sz w:val="24"/>
+          <w:szCs w:val="22"/>
+          <w:lang w:val="en-US"/>
+        </w:rPr>
+        <w:t>2&lt;/td&gt;</w:t>
       </w:r>
     </w:p>
     <w:p>
@@ -6703,7 +7400,35 @@
           <w:lang w:val="en-US"/>
         </w:rPr>
         <w:tab/>
-        <w:t>&lt;td&gt;Manorama&lt;/td</w:t>
+        <w:t>&lt;</w:t>
+      </w:r>
+      <w:proofErr w:type="gramStart"/>
+      <w:r>
+        <w:rPr>
+          <w:sz w:val="24"/>
+          <w:szCs w:val="22"/>
+          <w:lang w:val="en-US"/>
+        </w:rPr>
+        <w:t>td&gt;</w:t>
+      </w:r>
+      <w:proofErr w:type="spellStart"/>
+      <w:proofErr w:type="gramEnd"/>
+      <w:r>
+        <w:rPr>
+          <w:sz w:val="24"/>
+          <w:szCs w:val="22"/>
+          <w:lang w:val="en-US"/>
+        </w:rPr>
+        <w:t>Manorama</w:t>
+      </w:r>
+      <w:proofErr w:type="spellEnd"/>
+      <w:r>
+        <w:rPr>
+          <w:sz w:val="24"/>
+          <w:szCs w:val="22"/>
+          <w:lang w:val="en-US"/>
+        </w:rPr>
+        <w:t>&lt;/td</w:t>
       </w:r>
     </w:p>
     <w:p>
@@ -6729,7 +7454,27 @@
           <w:lang w:val="en-US"/>
         </w:rPr>
         <w:tab/>
-        <w:t>&lt;/tr&gt;</w:t>
+        <w:t>&lt;/</w:t>
+      </w:r>
+      <w:proofErr w:type="spellStart"/>
+      <w:proofErr w:type="gramStart"/>
+      <w:r>
+        <w:rPr>
+          <w:sz w:val="24"/>
+          <w:szCs w:val="22"/>
+          <w:lang w:val="en-US"/>
+        </w:rPr>
+        <w:t>tr</w:t>
+      </w:r>
+      <w:proofErr w:type="spellEnd"/>
+      <w:proofErr w:type="gramEnd"/>
+      <w:r>
+        <w:rPr>
+          <w:sz w:val="24"/>
+          <w:szCs w:val="22"/>
+          <w:lang w:val="en-US"/>
+        </w:rPr>
+        <w:t>&gt;</w:t>
       </w:r>
     </w:p>
     <w:p>
@@ -6747,7 +7492,25 @@
           <w:lang w:val="en-US"/>
         </w:rPr>
         <w:tab/>
-        <w:t>&lt;/tbody&gt;</w:t>
+        <w:t>&lt;/</w:t>
+      </w:r>
+      <w:proofErr w:type="spellStart"/>
+      <w:r>
+        <w:rPr>
+          <w:sz w:val="24"/>
+          <w:szCs w:val="22"/>
+          <w:lang w:val="en-US"/>
+        </w:rPr>
+        <w:t>tbody</w:t>
+      </w:r>
+      <w:proofErr w:type="spellEnd"/>
+      <w:r>
+        <w:rPr>
+          <w:sz w:val="24"/>
+          <w:szCs w:val="22"/>
+          <w:lang w:val="en-US"/>
+        </w:rPr>
+        <w:t>&gt;</w:t>
       </w:r>
     </w:p>
     <w:p>
@@ -6847,7 +7610,25 @@
           <w:szCs w:val="22"/>
           <w:lang w:val="en-US"/>
         </w:rPr>
-        <w:t>For uploading any file with this control simply call .sendKeys() method.</w:t>
+        <w:t>For uploading any file with this control simply call .</w:t>
+      </w:r>
+      <w:proofErr w:type="gramStart"/>
+      <w:r>
+        <w:rPr>
+          <w:sz w:val="24"/>
+          <w:szCs w:val="22"/>
+          <w:lang w:val="en-US"/>
+        </w:rPr>
+        <w:t>sendKeys(</w:t>
+      </w:r>
+      <w:proofErr w:type="gramEnd"/>
+      <w:r>
+        <w:rPr>
+          <w:sz w:val="24"/>
+          <w:szCs w:val="22"/>
+          <w:lang w:val="en-US"/>
+        </w:rPr>
+        <w:t>) method.</w:t>
       </w:r>
     </w:p>
     <w:p>
@@ -6869,7 +7650,25 @@
           <w:szCs w:val="22"/>
           <w:lang w:val="en-US"/>
         </w:rPr>
-        <w:t>While calling .sendKeys() method pass the full path of the file.</w:t>
+        <w:t>While calling .</w:t>
+      </w:r>
+      <w:proofErr w:type="gramStart"/>
+      <w:r>
+        <w:rPr>
+          <w:sz w:val="24"/>
+          <w:szCs w:val="22"/>
+          <w:lang w:val="en-US"/>
+        </w:rPr>
+        <w:t>sendKeys(</w:t>
+      </w:r>
+      <w:proofErr w:type="gramEnd"/>
+      <w:r>
+        <w:rPr>
+          <w:sz w:val="24"/>
+          <w:szCs w:val="22"/>
+          <w:lang w:val="en-US"/>
+        </w:rPr>
+        <w:t>) method pass the full path of the file.</w:t>
       </w:r>
     </w:p>
     <w:p>
@@ -7249,13 +8048,23 @@
           <w:lang w:val="en-US"/>
         </w:rPr>
       </w:pPr>
-      <w:r>
-        <w:rPr>
-          <w:sz w:val="24"/>
-          <w:szCs w:val="22"/>
-          <w:lang w:val="en-US"/>
-        </w:rPr>
-        <w:t xml:space="preserve">moveToElement() </w:t>
+      <w:proofErr w:type="gramStart"/>
+      <w:r>
+        <w:rPr>
+          <w:sz w:val="24"/>
+          <w:szCs w:val="22"/>
+          <w:lang w:val="en-US"/>
+        </w:rPr>
+        <w:t>moveToElement(</w:t>
+      </w:r>
+      <w:proofErr w:type="gramEnd"/>
+      <w:r>
+        <w:rPr>
+          <w:sz w:val="24"/>
+          <w:szCs w:val="22"/>
+          <w:lang w:val="en-US"/>
+        </w:rPr>
+        <w:t xml:space="preserve">) </w:t>
       </w:r>
       <w:r>
         <w:rPr>
@@ -7287,13 +8096,23 @@
           <w:lang w:val="en-US"/>
         </w:rPr>
       </w:pPr>
-      <w:r>
-        <w:rPr>
-          <w:sz w:val="24"/>
-          <w:szCs w:val="22"/>
-          <w:lang w:val="en-US"/>
-        </w:rPr>
-        <w:t xml:space="preserve">perform() </w:t>
+      <w:proofErr w:type="gramStart"/>
+      <w:r>
+        <w:rPr>
+          <w:sz w:val="24"/>
+          <w:szCs w:val="22"/>
+          <w:lang w:val="en-US"/>
+        </w:rPr>
+        <w:t>perform(</w:t>
+      </w:r>
+      <w:proofErr w:type="gramEnd"/>
+      <w:r>
+        <w:rPr>
+          <w:sz w:val="24"/>
+          <w:szCs w:val="22"/>
+          <w:lang w:val="en-US"/>
+        </w:rPr>
+        <w:t xml:space="preserve">) </w:t>
       </w:r>
       <w:r>
         <w:rPr>
@@ -7325,13 +8144,23 @@
           <w:lang w:val="en-US"/>
         </w:rPr>
       </w:pPr>
-      <w:r>
-        <w:rPr>
-          <w:sz w:val="24"/>
-          <w:szCs w:val="22"/>
-          <w:lang w:val="en-US"/>
-        </w:rPr>
-        <w:t xml:space="preserve">contextClick() </w:t>
+      <w:proofErr w:type="gramStart"/>
+      <w:r>
+        <w:rPr>
+          <w:sz w:val="24"/>
+          <w:szCs w:val="22"/>
+          <w:lang w:val="en-US"/>
+        </w:rPr>
+        <w:t>contextClick(</w:t>
+      </w:r>
+      <w:proofErr w:type="gramEnd"/>
+      <w:r>
+        <w:rPr>
+          <w:sz w:val="24"/>
+          <w:szCs w:val="22"/>
+          <w:lang w:val="en-US"/>
+        </w:rPr>
+        <w:t xml:space="preserve">) </w:t>
       </w:r>
       <w:r>
         <w:rPr>
@@ -7363,13 +8192,23 @@
           <w:lang w:val="en-US"/>
         </w:rPr>
       </w:pPr>
-      <w:r>
-        <w:rPr>
-          <w:sz w:val="24"/>
-          <w:szCs w:val="22"/>
-          <w:lang w:val="en-US"/>
-        </w:rPr>
-        <w:t xml:space="preserve">doubleClick() </w:t>
+      <w:proofErr w:type="gramStart"/>
+      <w:r>
+        <w:rPr>
+          <w:sz w:val="24"/>
+          <w:szCs w:val="22"/>
+          <w:lang w:val="en-US"/>
+        </w:rPr>
+        <w:t>doubleClick(</w:t>
+      </w:r>
+      <w:proofErr w:type="gramEnd"/>
+      <w:r>
+        <w:rPr>
+          <w:sz w:val="24"/>
+          <w:szCs w:val="22"/>
+          <w:lang w:val="en-US"/>
+        </w:rPr>
+        <w:t xml:space="preserve">) </w:t>
       </w:r>
       <w:r>
         <w:rPr>
@@ -7401,13 +8240,23 @@
           <w:lang w:val="en-US"/>
         </w:rPr>
       </w:pPr>
-      <w:r>
-        <w:rPr>
-          <w:sz w:val="24"/>
-          <w:szCs w:val="22"/>
-          <w:lang w:val="en-US"/>
-        </w:rPr>
-        <w:t xml:space="preserve">dragAndDrop() </w:t>
+      <w:proofErr w:type="gramStart"/>
+      <w:r>
+        <w:rPr>
+          <w:sz w:val="24"/>
+          <w:szCs w:val="22"/>
+          <w:lang w:val="en-US"/>
+        </w:rPr>
+        <w:t>dragAndDrop(</w:t>
+      </w:r>
+      <w:proofErr w:type="gramEnd"/>
+      <w:r>
+        <w:rPr>
+          <w:sz w:val="24"/>
+          <w:szCs w:val="22"/>
+          <w:lang w:val="en-US"/>
+        </w:rPr>
+        <w:t xml:space="preserve">) </w:t>
       </w:r>
       <w:r>
         <w:rPr>
@@ -8430,7 +9279,29 @@
           <w:szCs w:val="22"/>
           <w:lang w:val="en-US"/>
         </w:rPr>
-        <w:t>Points to be noted about configuration methods (like BeforeTest, AfterTest, BeforeMethod, AfterMethod)</w:t>
+        <w:t xml:space="preserve">Points to be noted about configuration methods (like BeforeTest, AfterTest, BeforeMethod, </w:t>
+      </w:r>
+      <w:proofErr w:type="gramStart"/>
+      <w:r>
+        <w:rPr>
+          <w:b/>
+          <w:bCs/>
+          <w:sz w:val="24"/>
+          <w:szCs w:val="22"/>
+          <w:lang w:val="en-US"/>
+        </w:rPr>
+        <w:t>AfterMethod</w:t>
+      </w:r>
+      <w:proofErr w:type="gramEnd"/>
+      <w:r>
+        <w:rPr>
+          <w:b/>
+          <w:bCs/>
+          <w:sz w:val="24"/>
+          <w:szCs w:val="22"/>
+          <w:lang w:val="en-US"/>
+        </w:rPr>
+        <w:t>)</w:t>
       </w:r>
     </w:p>
     <w:p>
@@ -9368,8 +10239,1144 @@
           <w:lang w:val="en-US"/>
         </w:rPr>
       </w:pPr>
+      <w:r>
+        <w:rPr>
+          <w:sz w:val="24"/>
+          <w:szCs w:val="22"/>
+          <w:lang w:val="en-US"/>
+        </w:rPr>
+        <w:br w:type="page"/>
+      </w:r>
+    </w:p>
+    <w:p>
+      <w:pPr>
+        <w:rPr>
+          <w:b/>
+          <w:bCs/>
+          <w:sz w:val="24"/>
+          <w:szCs w:val="22"/>
+          <w:lang w:val="en-US"/>
+        </w:rPr>
+      </w:pPr>
+      <w:r>
+        <w:rPr>
+          <w:b/>
+          <w:bCs/>
+          <w:sz w:val="24"/>
+          <w:szCs w:val="22"/>
+          <w:lang w:val="en-US"/>
+        </w:rPr>
+        <w:lastRenderedPageBreak/>
+        <w:t xml:space="preserve">BDD Approach </w:t>
+      </w:r>
+    </w:p>
+    <w:p>
+      <w:pPr>
+        <w:pStyle w:val="ListParagraph"/>
+        <w:numPr>
+          <w:ilvl w:val="0"/>
+          <w:numId w:val="32"/>
+        </w:numPr>
+        <w:rPr>
+          <w:b/>
+          <w:bCs/>
+          <w:sz w:val="24"/>
+          <w:szCs w:val="22"/>
+          <w:lang w:val="en-US"/>
+        </w:rPr>
+      </w:pPr>
+      <w:r>
+        <w:rPr>
+          <w:sz w:val="24"/>
+          <w:szCs w:val="22"/>
+          <w:lang w:val="en-US"/>
+        </w:rPr>
+        <w:t>BA, Development team, QA team will gather the requirements from client.</w:t>
+      </w:r>
+    </w:p>
+    <w:p>
+      <w:pPr>
+        <w:pStyle w:val="ListParagraph"/>
+        <w:numPr>
+          <w:ilvl w:val="0"/>
+          <w:numId w:val="32"/>
+        </w:numPr>
+        <w:rPr>
+          <w:b/>
+          <w:bCs/>
+          <w:sz w:val="24"/>
+          <w:szCs w:val="22"/>
+          <w:lang w:val="en-US"/>
+        </w:rPr>
+      </w:pPr>
+      <w:r>
+        <w:rPr>
+          <w:sz w:val="24"/>
+          <w:szCs w:val="22"/>
+          <w:lang w:val="en-US"/>
+        </w:rPr>
+        <w:t>Then requirements will be shared with QA team</w:t>
+      </w:r>
+    </w:p>
+    <w:p>
+      <w:pPr>
+        <w:pStyle w:val="ListParagraph"/>
+        <w:numPr>
+          <w:ilvl w:val="0"/>
+          <w:numId w:val="32"/>
+        </w:numPr>
+        <w:rPr>
+          <w:b/>
+          <w:bCs/>
+          <w:sz w:val="24"/>
+          <w:szCs w:val="22"/>
+          <w:lang w:val="en-US"/>
+        </w:rPr>
+      </w:pPr>
+      <w:r>
+        <w:rPr>
+          <w:sz w:val="24"/>
+          <w:szCs w:val="22"/>
+          <w:lang w:val="en-US"/>
+        </w:rPr>
+        <w:t xml:space="preserve">QA team will create </w:t>
+      </w:r>
+      <w:r>
+        <w:rPr>
+          <w:b/>
+          <w:bCs/>
+          <w:sz w:val="24"/>
+          <w:szCs w:val="22"/>
+          <w:lang w:val="en-US"/>
+        </w:rPr>
+        <w:t>Feature File (1</w:t>
+      </w:r>
+      <w:r>
+        <w:rPr>
+          <w:b/>
+          <w:bCs/>
+          <w:sz w:val="24"/>
+          <w:szCs w:val="22"/>
+          <w:vertAlign w:val="superscript"/>
+          <w:lang w:val="en-US"/>
+        </w:rPr>
+        <w:t>st</w:t>
+      </w:r>
+      <w:r>
+        <w:rPr>
+          <w:b/>
+          <w:bCs/>
+          <w:sz w:val="24"/>
+          <w:szCs w:val="22"/>
+          <w:lang w:val="en-US"/>
+        </w:rPr>
+        <w:t xml:space="preserve"> Component of BDD)</w:t>
+      </w:r>
+    </w:p>
+    <w:p>
+      <w:pPr>
+        <w:pStyle w:val="ListParagraph"/>
+        <w:numPr>
+          <w:ilvl w:val="1"/>
+          <w:numId w:val="32"/>
+        </w:numPr>
+        <w:rPr>
+          <w:b/>
+          <w:bCs/>
+          <w:sz w:val="24"/>
+          <w:szCs w:val="22"/>
+          <w:lang w:val="en-US"/>
+        </w:rPr>
+      </w:pPr>
+      <w:r>
+        <w:rPr>
+          <w:sz w:val="24"/>
+          <w:szCs w:val="22"/>
+          <w:lang w:val="en-US"/>
+        </w:rPr>
+        <w:t>Feature file is collection of Test Scenarios</w:t>
+      </w:r>
+    </w:p>
+    <w:p>
+      <w:pPr>
+        <w:pStyle w:val="ListParagraph"/>
+        <w:numPr>
+          <w:ilvl w:val="1"/>
+          <w:numId w:val="32"/>
+        </w:numPr>
+        <w:rPr>
+          <w:b/>
+          <w:bCs/>
+          <w:sz w:val="24"/>
+          <w:szCs w:val="22"/>
+          <w:lang w:val="en-US"/>
+        </w:rPr>
+      </w:pPr>
+      <w:r>
+        <w:rPr>
+          <w:sz w:val="24"/>
+          <w:szCs w:val="22"/>
+          <w:lang w:val="en-US"/>
+        </w:rPr>
+        <w:t>Having extension .feature</w:t>
+      </w:r>
+    </w:p>
+    <w:p>
+      <w:pPr>
+        <w:pStyle w:val="ListParagraph"/>
+        <w:numPr>
+          <w:ilvl w:val="1"/>
+          <w:numId w:val="32"/>
+        </w:numPr>
+        <w:rPr>
+          <w:b/>
+          <w:bCs/>
+          <w:sz w:val="24"/>
+          <w:szCs w:val="22"/>
+          <w:lang w:val="en-US"/>
+        </w:rPr>
+      </w:pPr>
+      <w:r>
+        <w:rPr>
+          <w:sz w:val="24"/>
+          <w:szCs w:val="22"/>
+          <w:lang w:val="en-US"/>
+        </w:rPr>
+        <w:t>Created using Gherkin language</w:t>
+      </w:r>
+    </w:p>
+    <w:p>
+      <w:pPr>
+        <w:pStyle w:val="ListParagraph"/>
+        <w:numPr>
+          <w:ilvl w:val="0"/>
+          <w:numId w:val="32"/>
+        </w:numPr>
+        <w:rPr>
+          <w:b/>
+          <w:bCs/>
+          <w:sz w:val="24"/>
+          <w:szCs w:val="22"/>
+          <w:lang w:val="en-US"/>
+        </w:rPr>
+      </w:pPr>
+      <w:r>
+        <w:rPr>
+          <w:sz w:val="24"/>
+          <w:szCs w:val="22"/>
+          <w:lang w:val="en-US"/>
+        </w:rPr>
+        <w:t xml:space="preserve">This feature file will be shared with </w:t>
+      </w:r>
+    </w:p>
+    <w:p>
+      <w:pPr>
+        <w:pStyle w:val="ListParagraph"/>
+        <w:numPr>
+          <w:ilvl w:val="1"/>
+          <w:numId w:val="32"/>
+        </w:numPr>
+        <w:rPr>
+          <w:b/>
+          <w:bCs/>
+          <w:sz w:val="24"/>
+          <w:szCs w:val="22"/>
+          <w:lang w:val="en-US"/>
+        </w:rPr>
+      </w:pPr>
+      <w:r>
+        <w:rPr>
+          <w:sz w:val="24"/>
+          <w:szCs w:val="22"/>
+          <w:lang w:val="en-US"/>
+        </w:rPr>
+        <w:t>Development team</w:t>
+      </w:r>
+    </w:p>
+    <w:p>
+      <w:pPr>
+        <w:pStyle w:val="ListParagraph"/>
+        <w:numPr>
+          <w:ilvl w:val="1"/>
+          <w:numId w:val="32"/>
+        </w:numPr>
+        <w:rPr>
+          <w:b/>
+          <w:bCs/>
+          <w:sz w:val="24"/>
+          <w:szCs w:val="22"/>
+          <w:lang w:val="en-US"/>
+        </w:rPr>
+      </w:pPr>
+      <w:r>
+        <w:rPr>
+          <w:sz w:val="24"/>
+          <w:szCs w:val="22"/>
+          <w:lang w:val="en-US"/>
+        </w:rPr>
+        <w:t>Manual Tester</w:t>
+      </w:r>
+    </w:p>
+    <w:p>
+      <w:pPr>
+        <w:pStyle w:val="ListParagraph"/>
+        <w:numPr>
+          <w:ilvl w:val="1"/>
+          <w:numId w:val="32"/>
+        </w:numPr>
+        <w:rPr>
+          <w:b/>
+          <w:bCs/>
+          <w:sz w:val="24"/>
+          <w:szCs w:val="22"/>
+          <w:lang w:val="en-US"/>
+        </w:rPr>
+      </w:pPr>
+      <w:r>
+        <w:rPr>
+          <w:sz w:val="24"/>
+          <w:szCs w:val="22"/>
+          <w:lang w:val="en-US"/>
+        </w:rPr>
+        <w:t>Automation Tester</w:t>
+      </w:r>
+    </w:p>
+    <w:p>
+      <w:pPr>
+        <w:pStyle w:val="ListParagraph"/>
+        <w:numPr>
+          <w:ilvl w:val="0"/>
+          <w:numId w:val="32"/>
+        </w:numPr>
+        <w:rPr>
+          <w:b/>
+          <w:bCs/>
+          <w:sz w:val="24"/>
+          <w:szCs w:val="22"/>
+          <w:lang w:val="en-US"/>
+        </w:rPr>
+      </w:pPr>
+      <w:r>
+        <w:rPr>
+          <w:sz w:val="24"/>
+          <w:szCs w:val="22"/>
+          <w:lang w:val="en-US"/>
+        </w:rPr>
+        <w:t xml:space="preserve">Automation tester will execute this feature file and they will get </w:t>
+      </w:r>
+      <w:r>
+        <w:rPr>
+          <w:b/>
+          <w:bCs/>
+          <w:sz w:val="24"/>
+          <w:szCs w:val="22"/>
+          <w:lang w:val="en-US"/>
+        </w:rPr>
+        <w:t>Glue Code / Step Definition (2</w:t>
+      </w:r>
+      <w:r>
+        <w:rPr>
+          <w:b/>
+          <w:bCs/>
+          <w:sz w:val="24"/>
+          <w:szCs w:val="22"/>
+          <w:vertAlign w:val="superscript"/>
+          <w:lang w:val="en-US"/>
+        </w:rPr>
+        <w:t>nd</w:t>
+      </w:r>
+      <w:r>
+        <w:rPr>
+          <w:b/>
+          <w:bCs/>
+          <w:sz w:val="24"/>
+          <w:szCs w:val="22"/>
+          <w:lang w:val="en-US"/>
+        </w:rPr>
+        <w:t xml:space="preserve"> Component of BDD)</w:t>
+      </w:r>
+    </w:p>
+    <w:p>
+      <w:pPr>
+        <w:pStyle w:val="ListParagraph"/>
+        <w:numPr>
+          <w:ilvl w:val="1"/>
+          <w:numId w:val="32"/>
+        </w:numPr>
+        <w:rPr>
+          <w:b/>
+          <w:bCs/>
+          <w:sz w:val="24"/>
+          <w:szCs w:val="22"/>
+          <w:lang w:val="en-US"/>
+        </w:rPr>
+      </w:pPr>
+      <w:r>
+        <w:rPr>
+          <w:sz w:val="24"/>
+          <w:szCs w:val="22"/>
+          <w:lang w:val="en-US"/>
+        </w:rPr>
+        <w:t>Glue code contains the skeleton for automation script</w:t>
+      </w:r>
+    </w:p>
+    <w:p>
+      <w:pPr>
+        <w:pStyle w:val="ListParagraph"/>
+        <w:numPr>
+          <w:ilvl w:val="1"/>
+          <w:numId w:val="32"/>
+        </w:numPr>
+        <w:rPr>
+          <w:b/>
+          <w:bCs/>
+          <w:sz w:val="24"/>
+          <w:szCs w:val="22"/>
+          <w:lang w:val="en-US"/>
+        </w:rPr>
+      </w:pPr>
+      <w:r>
+        <w:rPr>
+          <w:sz w:val="24"/>
+          <w:szCs w:val="22"/>
+          <w:lang w:val="en-US"/>
+        </w:rPr>
+        <w:t>Contains some methods</w:t>
+      </w:r>
+    </w:p>
+    <w:p>
+      <w:pPr>
+        <w:pStyle w:val="ListParagraph"/>
+        <w:numPr>
+          <w:ilvl w:val="0"/>
+          <w:numId w:val="32"/>
+        </w:numPr>
+        <w:rPr>
+          <w:b/>
+          <w:bCs/>
+          <w:sz w:val="24"/>
+          <w:szCs w:val="22"/>
+          <w:lang w:val="en-US"/>
+        </w:rPr>
+      </w:pPr>
+      <w:r>
+        <w:rPr>
+          <w:b/>
+          <w:bCs/>
+          <w:sz w:val="24"/>
+          <w:szCs w:val="22"/>
+          <w:lang w:val="en-US"/>
+        </w:rPr>
+        <w:t>Runner Class (3</w:t>
+      </w:r>
+      <w:r>
+        <w:rPr>
+          <w:b/>
+          <w:bCs/>
+          <w:sz w:val="24"/>
+          <w:szCs w:val="22"/>
+          <w:vertAlign w:val="superscript"/>
+          <w:lang w:val="en-US"/>
+        </w:rPr>
+        <w:t>rd</w:t>
+      </w:r>
+      <w:r>
+        <w:rPr>
+          <w:b/>
+          <w:bCs/>
+          <w:sz w:val="24"/>
+          <w:szCs w:val="22"/>
+          <w:lang w:val="en-US"/>
+        </w:rPr>
+        <w:t xml:space="preserve"> Component of BDD) </w:t>
+      </w:r>
+      <w:r>
+        <w:rPr>
+          <w:sz w:val="24"/>
+          <w:szCs w:val="22"/>
+          <w:lang w:val="en-US"/>
+        </w:rPr>
+        <w:t>is used to execute the automation script</w:t>
+      </w:r>
+    </w:p>
+    <w:p>
+      <w:pPr>
+        <w:pBdr>
+          <w:bottom w:val="single" w:sz="6" w:space="1" w:color="auto"/>
+        </w:pBdr>
+        <w:rPr>
+          <w:sz w:val="24"/>
+          <w:szCs w:val="22"/>
+          <w:lang w:val="en-US"/>
+        </w:rPr>
+      </w:pPr>
+    </w:p>
+    <w:p>
+      <w:pPr>
+        <w:rPr>
+          <w:b/>
+          <w:bCs/>
+          <w:sz w:val="24"/>
+          <w:szCs w:val="22"/>
+          <w:lang w:val="en-US"/>
+        </w:rPr>
+      </w:pPr>
+    </w:p>
+    <w:p>
+      <w:pPr>
+        <w:rPr>
+          <w:b/>
+          <w:bCs/>
+          <w:sz w:val="24"/>
+          <w:szCs w:val="22"/>
+          <w:lang w:val="en-US"/>
+        </w:rPr>
+      </w:pPr>
+      <w:r>
+        <w:rPr>
+          <w:b/>
+          <w:bCs/>
+          <w:sz w:val="24"/>
+          <w:szCs w:val="22"/>
+          <w:lang w:val="en-US"/>
+        </w:rPr>
+        <w:t>Feature File</w:t>
+      </w:r>
+    </w:p>
+    <w:p>
+      <w:pPr>
+        <w:pStyle w:val="ListParagraph"/>
+        <w:numPr>
+          <w:ilvl w:val="0"/>
+          <w:numId w:val="33"/>
+        </w:numPr>
+        <w:rPr>
+          <w:sz w:val="24"/>
+          <w:szCs w:val="22"/>
+          <w:lang w:val="en-US"/>
+        </w:rPr>
+      </w:pPr>
+      <w:r>
+        <w:rPr>
+          <w:sz w:val="24"/>
+          <w:szCs w:val="22"/>
+          <w:lang w:val="en-US"/>
+        </w:rPr>
+        <w:t>Collection of Test Scenarios</w:t>
+      </w:r>
+    </w:p>
+    <w:p>
+      <w:pPr>
+        <w:pStyle w:val="ListParagraph"/>
+        <w:numPr>
+          <w:ilvl w:val="0"/>
+          <w:numId w:val="33"/>
+        </w:numPr>
+        <w:rPr>
+          <w:sz w:val="24"/>
+          <w:szCs w:val="22"/>
+          <w:lang w:val="en-US"/>
+        </w:rPr>
+      </w:pPr>
+      <w:r>
+        <w:rPr>
+          <w:sz w:val="24"/>
+          <w:szCs w:val="22"/>
+          <w:lang w:val="en-US"/>
+        </w:rPr>
+        <w:t>Created using Gherkin language</w:t>
+      </w:r>
+    </w:p>
+    <w:p>
+      <w:pPr>
+        <w:pStyle w:val="ListParagraph"/>
+        <w:numPr>
+          <w:ilvl w:val="0"/>
+          <w:numId w:val="33"/>
+        </w:numPr>
+        <w:rPr>
+          <w:sz w:val="24"/>
+          <w:szCs w:val="22"/>
+          <w:lang w:val="en-US"/>
+        </w:rPr>
+      </w:pPr>
+      <w:r>
+        <w:rPr>
+          <w:sz w:val="24"/>
+          <w:szCs w:val="22"/>
+          <w:lang w:val="en-US"/>
+        </w:rPr>
+        <w:t>Created using keywords</w:t>
+      </w:r>
+    </w:p>
+    <w:p>
+      <w:pPr>
+        <w:pStyle w:val="ListParagraph"/>
+        <w:numPr>
+          <w:ilvl w:val="1"/>
+          <w:numId w:val="33"/>
+        </w:numPr>
+        <w:rPr>
+          <w:sz w:val="24"/>
+          <w:szCs w:val="22"/>
+          <w:lang w:val="en-US"/>
+        </w:rPr>
+      </w:pPr>
+      <w:r>
+        <w:rPr>
+          <w:sz w:val="24"/>
+          <w:szCs w:val="22"/>
+          <w:lang w:val="en-US"/>
+        </w:rPr>
+        <w:t xml:space="preserve">Feature: </w:t>
+      </w:r>
+      <w:r>
+        <w:rPr>
+          <w:sz w:val="24"/>
+          <w:szCs w:val="22"/>
+          <w:lang w:val="en-US"/>
+        </w:rPr>
+        <w:sym w:font="Wingdings" w:char="F0E0"/>
+      </w:r>
+      <w:r>
+        <w:rPr>
+          <w:sz w:val="24"/>
+          <w:szCs w:val="22"/>
+          <w:lang w:val="en-US"/>
+        </w:rPr>
+        <w:t xml:space="preserve"> Represents requirement</w:t>
+      </w:r>
+    </w:p>
+    <w:p>
+      <w:pPr>
+        <w:pStyle w:val="ListParagraph"/>
+        <w:numPr>
+          <w:ilvl w:val="1"/>
+          <w:numId w:val="33"/>
+        </w:numPr>
+        <w:rPr>
+          <w:sz w:val="24"/>
+          <w:szCs w:val="22"/>
+          <w:lang w:val="en-US"/>
+        </w:rPr>
+      </w:pPr>
+      <w:r>
+        <w:rPr>
+          <w:sz w:val="24"/>
+          <w:szCs w:val="22"/>
+          <w:lang w:val="en-US"/>
+        </w:rPr>
+        <w:t xml:space="preserve">Scenario: </w:t>
+      </w:r>
+      <w:r>
+        <w:rPr>
+          <w:sz w:val="24"/>
+          <w:szCs w:val="22"/>
+          <w:lang w:val="en-US"/>
+        </w:rPr>
+        <w:sym w:font="Wingdings" w:char="F0E0"/>
+      </w:r>
+      <w:r>
+        <w:rPr>
+          <w:sz w:val="24"/>
+          <w:szCs w:val="22"/>
+          <w:lang w:val="en-US"/>
+        </w:rPr>
+        <w:t xml:space="preserve"> Represents Test Objective</w:t>
+      </w:r>
+    </w:p>
+    <w:p>
+      <w:pPr>
+        <w:pStyle w:val="ListParagraph"/>
+        <w:numPr>
+          <w:ilvl w:val="1"/>
+          <w:numId w:val="33"/>
+        </w:numPr>
+        <w:rPr>
+          <w:sz w:val="24"/>
+          <w:szCs w:val="22"/>
+          <w:lang w:val="en-US"/>
+        </w:rPr>
+      </w:pPr>
+      <w:r>
+        <w:rPr>
+          <w:sz w:val="24"/>
+          <w:szCs w:val="22"/>
+          <w:lang w:val="en-US"/>
+        </w:rPr>
+        <w:t xml:space="preserve">Given </w:t>
+      </w:r>
+      <w:r>
+        <w:rPr>
+          <w:sz w:val="24"/>
+          <w:szCs w:val="22"/>
+          <w:lang w:val="en-US"/>
+        </w:rPr>
+        <w:sym w:font="Wingdings" w:char="F0E0"/>
+      </w:r>
+      <w:r>
+        <w:rPr>
+          <w:sz w:val="24"/>
+          <w:szCs w:val="22"/>
+          <w:lang w:val="en-US"/>
+        </w:rPr>
+        <w:t xml:space="preserve"> Represents Pre-Requisite</w:t>
+      </w:r>
+    </w:p>
+    <w:p>
+      <w:pPr>
+        <w:pStyle w:val="ListParagraph"/>
+        <w:numPr>
+          <w:ilvl w:val="1"/>
+          <w:numId w:val="33"/>
+        </w:numPr>
+        <w:rPr>
+          <w:sz w:val="24"/>
+          <w:szCs w:val="22"/>
+          <w:lang w:val="en-US"/>
+        </w:rPr>
+      </w:pPr>
+      <w:r>
+        <w:rPr>
+          <w:sz w:val="24"/>
+          <w:szCs w:val="22"/>
+          <w:lang w:val="en-US"/>
+        </w:rPr>
+        <w:t xml:space="preserve">When </w:t>
+      </w:r>
+      <w:r>
+        <w:rPr>
+          <w:sz w:val="24"/>
+          <w:szCs w:val="22"/>
+          <w:lang w:val="en-US"/>
+        </w:rPr>
+        <w:sym w:font="Wingdings" w:char="F0E0"/>
+      </w:r>
+      <w:r>
+        <w:rPr>
+          <w:sz w:val="24"/>
+          <w:szCs w:val="22"/>
+          <w:lang w:val="en-US"/>
+        </w:rPr>
+        <w:t xml:space="preserve"> Represents step. Multiple steps can be written with multiple When statement</w:t>
+      </w:r>
+    </w:p>
+    <w:p>
+      <w:pPr>
+        <w:pStyle w:val="ListParagraph"/>
+        <w:numPr>
+          <w:ilvl w:val="1"/>
+          <w:numId w:val="33"/>
+        </w:numPr>
+        <w:rPr>
+          <w:sz w:val="24"/>
+          <w:szCs w:val="22"/>
+          <w:lang w:val="en-US"/>
+        </w:rPr>
+      </w:pPr>
+      <w:r>
+        <w:rPr>
+          <w:sz w:val="24"/>
+          <w:szCs w:val="22"/>
+          <w:lang w:val="en-US"/>
+        </w:rPr>
+        <w:t xml:space="preserve">And </w:t>
+      </w:r>
+      <w:r>
+        <w:rPr>
+          <w:sz w:val="24"/>
+          <w:szCs w:val="22"/>
+          <w:lang w:val="en-US"/>
+        </w:rPr>
+        <w:sym w:font="Wingdings" w:char="F0E0"/>
+      </w:r>
+      <w:r>
+        <w:rPr>
+          <w:sz w:val="24"/>
+          <w:szCs w:val="22"/>
+          <w:lang w:val="en-US"/>
+        </w:rPr>
+        <w:t xml:space="preserve"> Used to combine multiple When statements</w:t>
+      </w:r>
+    </w:p>
+    <w:p>
+      <w:pPr>
+        <w:pStyle w:val="ListParagraph"/>
+        <w:numPr>
+          <w:ilvl w:val="1"/>
+          <w:numId w:val="33"/>
+        </w:numPr>
+        <w:rPr>
+          <w:sz w:val="24"/>
+          <w:szCs w:val="22"/>
+          <w:lang w:val="en-US"/>
+        </w:rPr>
+      </w:pPr>
+      <w:r>
+        <w:rPr>
+          <w:sz w:val="24"/>
+          <w:szCs w:val="22"/>
+          <w:lang w:val="en-US"/>
+        </w:rPr>
+        <w:t xml:space="preserve">Then </w:t>
+      </w:r>
+      <w:r>
+        <w:rPr>
+          <w:sz w:val="24"/>
+          <w:szCs w:val="22"/>
+          <w:lang w:val="en-US"/>
+        </w:rPr>
+        <w:sym w:font="Wingdings" w:char="F0E0"/>
+      </w:r>
+      <w:r>
+        <w:rPr>
+          <w:sz w:val="24"/>
+          <w:szCs w:val="22"/>
+          <w:lang w:val="en-US"/>
+        </w:rPr>
+        <w:t xml:space="preserve"> Represents expected Result</w:t>
+      </w:r>
+    </w:p>
+    <w:p>
+      <w:pPr>
+        <w:pStyle w:val="ListParagraph"/>
+        <w:numPr>
+          <w:ilvl w:val="1"/>
+          <w:numId w:val="33"/>
+        </w:numPr>
+        <w:rPr>
+          <w:sz w:val="24"/>
+          <w:szCs w:val="22"/>
+          <w:lang w:val="en-US"/>
+        </w:rPr>
+      </w:pPr>
+      <w:r>
+        <w:rPr>
+          <w:sz w:val="24"/>
+          <w:szCs w:val="22"/>
+          <w:lang w:val="en-US"/>
+        </w:rPr>
+        <w:t xml:space="preserve">Background: </w:t>
+      </w:r>
+      <w:r>
+        <w:rPr>
+          <w:sz w:val="24"/>
+          <w:szCs w:val="22"/>
+          <w:lang w:val="en-US"/>
+        </w:rPr>
+        <w:sym w:font="Wingdings" w:char="F0E0"/>
+      </w:r>
+      <w:r>
+        <w:rPr>
+          <w:sz w:val="24"/>
+          <w:szCs w:val="22"/>
+          <w:lang w:val="en-US"/>
+        </w:rPr>
+        <w:t xml:space="preserve"> Used avoid multiple </w:t>
+      </w:r>
+      <w:proofErr w:type="gramStart"/>
+      <w:r>
+        <w:rPr>
+          <w:sz w:val="24"/>
+          <w:szCs w:val="22"/>
+          <w:lang w:val="en-US"/>
+        </w:rPr>
+        <w:t>Given</w:t>
+      </w:r>
+      <w:proofErr w:type="gramEnd"/>
+      <w:r>
+        <w:rPr>
+          <w:sz w:val="24"/>
+          <w:szCs w:val="22"/>
+          <w:lang w:val="en-US"/>
+        </w:rPr>
+        <w:t xml:space="preserve"> statements.</w:t>
+      </w:r>
+    </w:p>
+    <w:p>
+      <w:pPr>
+        <w:pStyle w:val="ListParagraph"/>
+        <w:numPr>
+          <w:ilvl w:val="1"/>
+          <w:numId w:val="33"/>
+        </w:numPr>
+        <w:rPr>
+          <w:sz w:val="24"/>
+          <w:szCs w:val="22"/>
+          <w:lang w:val="en-US"/>
+        </w:rPr>
+      </w:pPr>
+      <w:r>
+        <w:rPr>
+          <w:sz w:val="24"/>
+          <w:szCs w:val="22"/>
+          <w:lang w:val="en-US"/>
+        </w:rPr>
+        <w:t xml:space="preserve">Examples: </w:t>
+      </w:r>
+      <w:r>
+        <w:rPr>
+          <w:sz w:val="24"/>
+          <w:szCs w:val="22"/>
+          <w:lang w:val="en-US"/>
+        </w:rPr>
+        <w:sym w:font="Wingdings" w:char="F0E0"/>
+      </w:r>
+      <w:r>
+        <w:rPr>
+          <w:sz w:val="24"/>
+          <w:szCs w:val="22"/>
+          <w:lang w:val="en-US"/>
+        </w:rPr>
+        <w:t xml:space="preserve"> Used in Data Driven Testing (Works like @DataProvider)</w:t>
+      </w:r>
+    </w:p>
+    <w:p>
+      <w:pPr>
+        <w:pStyle w:val="ListParagraph"/>
+        <w:numPr>
+          <w:ilvl w:val="1"/>
+          <w:numId w:val="33"/>
+        </w:numPr>
+        <w:rPr>
+          <w:sz w:val="24"/>
+          <w:szCs w:val="22"/>
+          <w:lang w:val="en-US"/>
+        </w:rPr>
+      </w:pPr>
+      <w:r>
+        <w:rPr>
+          <w:sz w:val="24"/>
+          <w:szCs w:val="22"/>
+          <w:lang w:val="en-US"/>
+        </w:rPr>
+        <w:t xml:space="preserve">Scenario Outline: </w:t>
+      </w:r>
+      <w:r>
+        <w:rPr>
+          <w:sz w:val="24"/>
+          <w:szCs w:val="22"/>
+          <w:lang w:val="en-US"/>
+        </w:rPr>
+        <w:sym w:font="Wingdings" w:char="F0E0"/>
+      </w:r>
+      <w:r>
+        <w:rPr>
+          <w:sz w:val="24"/>
+          <w:szCs w:val="22"/>
+          <w:lang w:val="en-US"/>
+        </w:rPr>
+        <w:t xml:space="preserve"> Used in Data Driven Testing</w:t>
+      </w:r>
+    </w:p>
+    <w:p>
+      <w:pPr>
+        <w:pBdr>
+          <w:bottom w:val="single" w:sz="6" w:space="1" w:color="auto"/>
+        </w:pBdr>
+        <w:rPr>
+          <w:sz w:val="24"/>
+          <w:szCs w:val="22"/>
+          <w:lang w:val="en-US"/>
+        </w:rPr>
+      </w:pPr>
+    </w:p>
+    <w:p>
+      <w:pPr>
+        <w:rPr>
+          <w:sz w:val="24"/>
+          <w:szCs w:val="22"/>
+          <w:lang w:val="en-US"/>
+        </w:rPr>
+      </w:pPr>
+      <w:r>
+        <w:rPr>
+          <w:sz w:val="24"/>
+          <w:szCs w:val="22"/>
+          <w:lang w:val="en-US"/>
+        </w:rPr>
+        <w:t>Requirement – Google Title</w:t>
+      </w:r>
+    </w:p>
+    <w:p>
+      <w:pPr>
+        <w:pStyle w:val="ListParagraph"/>
+        <w:numPr>
+          <w:ilvl w:val="0"/>
+          <w:numId w:val="34"/>
+        </w:numPr>
+        <w:rPr>
+          <w:sz w:val="24"/>
+          <w:szCs w:val="22"/>
+          <w:lang w:val="en-US"/>
+        </w:rPr>
+      </w:pPr>
+      <w:r>
+        <w:rPr>
+          <w:sz w:val="24"/>
+          <w:szCs w:val="22"/>
+          <w:lang w:val="en-US"/>
+        </w:rPr>
+        <w:t>Open Google</w:t>
+      </w:r>
+    </w:p>
+    <w:p>
+      <w:pPr>
+        <w:pStyle w:val="ListParagraph"/>
+        <w:numPr>
+          <w:ilvl w:val="0"/>
+          <w:numId w:val="34"/>
+        </w:numPr>
+        <w:rPr>
+          <w:sz w:val="24"/>
+          <w:szCs w:val="22"/>
+          <w:lang w:val="en-US"/>
+        </w:rPr>
+      </w:pPr>
+      <w:r>
+        <w:rPr>
+          <w:sz w:val="24"/>
+          <w:szCs w:val="22"/>
+          <w:lang w:val="en-US"/>
+        </w:rPr>
+        <w:t>Read the title</w:t>
+      </w:r>
+    </w:p>
+    <w:p>
+      <w:pPr>
+        <w:pStyle w:val="ListParagraph"/>
+        <w:numPr>
+          <w:ilvl w:val="0"/>
+          <w:numId w:val="34"/>
+        </w:numPr>
+        <w:rPr>
+          <w:sz w:val="24"/>
+          <w:szCs w:val="22"/>
+          <w:lang w:val="en-US"/>
+        </w:rPr>
+      </w:pPr>
+      <w:r>
+        <w:rPr>
+          <w:sz w:val="24"/>
+          <w:szCs w:val="22"/>
+          <w:lang w:val="en-US"/>
+        </w:rPr>
+        <w:t>Verify that title is Google / Title should be Google</w:t>
+      </w:r>
+    </w:p>
+    <w:p>
+      <w:pPr>
+        <w:rPr>
+          <w:sz w:val="24"/>
+          <w:szCs w:val="22"/>
+          <w:lang w:val="en-US"/>
+        </w:rPr>
+      </w:pPr>
+    </w:p>
+    <w:p>
+      <w:pPr>
+        <w:rPr>
+          <w:sz w:val="24"/>
+          <w:szCs w:val="22"/>
+          <w:lang w:val="en-US"/>
+        </w:rPr>
+      </w:pPr>
+      <w:r>
+        <w:rPr>
+          <w:sz w:val="24"/>
+          <w:szCs w:val="22"/>
+          <w:lang w:val="en-US"/>
+        </w:rPr>
+        <w:lastRenderedPageBreak/>
+        <w:t>Feature File</w:t>
+      </w:r>
+    </w:p>
+    <w:p>
+      <w:pPr>
+        <w:rPr>
+          <w:sz w:val="24"/>
+          <w:szCs w:val="22"/>
+          <w:lang w:val="en-US"/>
+        </w:rPr>
+      </w:pPr>
+      <w:r>
+        <w:rPr>
+          <w:sz w:val="24"/>
+          <w:szCs w:val="22"/>
+          <w:lang w:val="en-US"/>
+        </w:rPr>
+        <w:t>Feature: Google Title</w:t>
+      </w:r>
       <w:bookmarkStart w:id="0" w:name="_GoBack"/>
       <w:bookmarkEnd w:id="0"/>
+    </w:p>
+    <w:p>
+      <w:pPr>
+        <w:rPr>
+          <w:sz w:val="24"/>
+          <w:szCs w:val="22"/>
+          <w:lang w:val="en-US"/>
+        </w:rPr>
+      </w:pPr>
+      <w:r>
+        <w:rPr>
+          <w:sz w:val="24"/>
+          <w:szCs w:val="22"/>
+          <w:lang w:val="en-US"/>
+        </w:rPr>
+        <w:t>Scenario: To validate title of Google</w:t>
+      </w:r>
+    </w:p>
+    <w:p>
+      <w:pPr>
+        <w:rPr>
+          <w:sz w:val="24"/>
+          <w:szCs w:val="22"/>
+          <w:lang w:val="en-US"/>
+        </w:rPr>
+      </w:pPr>
+      <w:r>
+        <w:rPr>
+          <w:sz w:val="24"/>
+          <w:szCs w:val="22"/>
+          <w:lang w:val="en-US"/>
+        </w:rPr>
+        <w:t>Given Open Google</w:t>
+      </w:r>
+    </w:p>
+    <w:p>
+      <w:pPr>
+        <w:rPr>
+          <w:sz w:val="24"/>
+          <w:szCs w:val="22"/>
+          <w:lang w:val="en-US"/>
+        </w:rPr>
+      </w:pPr>
+      <w:r>
+        <w:rPr>
+          <w:sz w:val="24"/>
+          <w:szCs w:val="22"/>
+          <w:lang w:val="en-US"/>
+        </w:rPr>
+        <w:t>When Read the title</w:t>
+      </w:r>
+    </w:p>
+    <w:p>
+      <w:pPr>
+        <w:rPr>
+          <w:sz w:val="24"/>
+          <w:szCs w:val="22"/>
+          <w:lang w:val="en-US"/>
+        </w:rPr>
+      </w:pPr>
+      <w:r>
+        <w:rPr>
+          <w:sz w:val="24"/>
+          <w:szCs w:val="22"/>
+          <w:lang w:val="en-US"/>
+        </w:rPr>
+        <w:t>Then Title should be Google</w:t>
+      </w:r>
     </w:p>
     <w:sectPr>
       <w:pgSz w:w="11906" w:h="16838"/>
@@ -9384,6 +11391,95 @@
 <file path=word/numbering.xml><?xml version="1.0" encoding="utf-8"?>
 <w:numbering xmlns:wpc="http://schemas.microsoft.com/office/word/2010/wordprocessingCanvas" xmlns:mc="http://schemas.openxmlformats.org/markup-compatibility/2006" xmlns:o="urn:schemas-microsoft-com:office:office" xmlns:r="http://schemas.openxmlformats.org/officeDocument/2006/relationships" xmlns:m="http://schemas.openxmlformats.org/officeDocument/2006/math" xmlns:v="urn:schemas-microsoft-com:vml" xmlns:wp14="http://schemas.microsoft.com/office/word/2010/wordprocessingDrawing" xmlns:wp="http://schemas.openxmlformats.org/drawingml/2006/wordprocessingDrawing" xmlns:w10="urn:schemas-microsoft-com:office:word" xmlns:w="http://schemas.openxmlformats.org/wordprocessingml/2006/main" xmlns:w14="http://schemas.microsoft.com/office/word/2010/wordml" xmlns:w15="http://schemas.microsoft.com/office/word/2012/wordml" xmlns:wpg="http://schemas.microsoft.com/office/word/2010/wordprocessingGroup" xmlns:wpi="http://schemas.microsoft.com/office/word/2010/wordprocessingInk" xmlns:wne="http://schemas.microsoft.com/office/word/2006/wordml" xmlns:wps="http://schemas.microsoft.com/office/word/2010/wordprocessingShape" mc:Ignorable="w14 w15 wp14">
   <w:abstractNum w:abstractNumId="0">
+    <w:nsid w:val="0B00394E"/>
+    <w:multiLevelType w:val="hybridMultilevel"/>
+    <w:tmpl w:val="097AC6E4"/>
+    <w:lvl w:ilvl="0" w:tplc="4009000F">
+      <w:start w:val="1"/>
+      <w:numFmt w:val="decimal"/>
+      <w:lvlText w:val="%1."/>
+      <w:lvlJc w:val="left"/>
+      <w:pPr>
+        <w:ind w:left="720" w:hanging="360"/>
+      </w:pPr>
+      <w:rPr>
+        <w:rFonts w:hint="default"/>
+      </w:rPr>
+    </w:lvl>
+    <w:lvl w:ilvl="1" w:tplc="40090019" w:tentative="1">
+      <w:start w:val="1"/>
+      <w:numFmt w:val="lowerLetter"/>
+      <w:lvlText w:val="%2."/>
+      <w:lvlJc w:val="left"/>
+      <w:pPr>
+        <w:ind w:left="1440" w:hanging="360"/>
+      </w:pPr>
+    </w:lvl>
+    <w:lvl w:ilvl="2" w:tplc="4009001B" w:tentative="1">
+      <w:start w:val="1"/>
+      <w:numFmt w:val="lowerRoman"/>
+      <w:lvlText w:val="%3."/>
+      <w:lvlJc w:val="right"/>
+      <w:pPr>
+        <w:ind w:left="2160" w:hanging="180"/>
+      </w:pPr>
+    </w:lvl>
+    <w:lvl w:ilvl="3" w:tplc="4009000F" w:tentative="1">
+      <w:start w:val="1"/>
+      <w:numFmt w:val="decimal"/>
+      <w:lvlText w:val="%4."/>
+      <w:lvlJc w:val="left"/>
+      <w:pPr>
+        <w:ind w:left="2880" w:hanging="360"/>
+      </w:pPr>
+    </w:lvl>
+    <w:lvl w:ilvl="4" w:tplc="40090019" w:tentative="1">
+      <w:start w:val="1"/>
+      <w:numFmt w:val="lowerLetter"/>
+      <w:lvlText w:val="%5."/>
+      <w:lvlJc w:val="left"/>
+      <w:pPr>
+        <w:ind w:left="3600" w:hanging="360"/>
+      </w:pPr>
+    </w:lvl>
+    <w:lvl w:ilvl="5" w:tplc="4009001B" w:tentative="1">
+      <w:start w:val="1"/>
+      <w:numFmt w:val="lowerRoman"/>
+      <w:lvlText w:val="%6."/>
+      <w:lvlJc w:val="right"/>
+      <w:pPr>
+        <w:ind w:left="4320" w:hanging="180"/>
+      </w:pPr>
+    </w:lvl>
+    <w:lvl w:ilvl="6" w:tplc="4009000F" w:tentative="1">
+      <w:start w:val="1"/>
+      <w:numFmt w:val="decimal"/>
+      <w:lvlText w:val="%7."/>
+      <w:lvlJc w:val="left"/>
+      <w:pPr>
+        <w:ind w:left="5040" w:hanging="360"/>
+      </w:pPr>
+    </w:lvl>
+    <w:lvl w:ilvl="7" w:tplc="40090019" w:tentative="1">
+      <w:start w:val="1"/>
+      <w:numFmt w:val="lowerLetter"/>
+      <w:lvlText w:val="%8."/>
+      <w:lvlJc w:val="left"/>
+      <w:pPr>
+        <w:ind w:left="5760" w:hanging="360"/>
+      </w:pPr>
+    </w:lvl>
+    <w:lvl w:ilvl="8" w:tplc="4009001B" w:tentative="1">
+      <w:start w:val="1"/>
+      <w:numFmt w:val="lowerRoman"/>
+      <w:lvlText w:val="%9."/>
+      <w:lvlJc w:val="right"/>
+      <w:pPr>
+        <w:ind w:left="6480" w:hanging="180"/>
+      </w:pPr>
+    </w:lvl>
+  </w:abstractNum>
+  <w:abstractNum w:abstractNumId="1">
     <w:nsid w:val="0E6C085D"/>
     <w:multiLevelType w:val="hybridMultilevel"/>
     <w:tmpl w:val="27DA2BEA"/>
@@ -9496,7 +11592,7 @@
       </w:rPr>
     </w:lvl>
   </w:abstractNum>
-  <w:abstractNum w:abstractNumId="1">
+  <w:abstractNum w:abstractNumId="2">
     <w:nsid w:val="0F1265BA"/>
     <w:multiLevelType w:val="hybridMultilevel"/>
     <w:tmpl w:val="C93479F6"/>
@@ -9609,7 +11705,7 @@
       </w:rPr>
     </w:lvl>
   </w:abstractNum>
-  <w:abstractNum w:abstractNumId="2">
+  <w:abstractNum w:abstractNumId="3">
     <w:nsid w:val="100D7FB2"/>
     <w:multiLevelType w:val="hybridMultilevel"/>
     <w:tmpl w:val="C9A42DF4"/>
@@ -9698,7 +11794,120 @@
       </w:pPr>
     </w:lvl>
   </w:abstractNum>
-  <w:abstractNum w:abstractNumId="3">
+  <w:abstractNum w:abstractNumId="4">
+    <w:nsid w:val="1749766A"/>
+    <w:multiLevelType w:val="hybridMultilevel"/>
+    <w:tmpl w:val="4774C184"/>
+    <w:lvl w:ilvl="0" w:tplc="40090001">
+      <w:start w:val="1"/>
+      <w:numFmt w:val="bullet"/>
+      <w:lvlText w:val=""/>
+      <w:lvlJc w:val="left"/>
+      <w:pPr>
+        <w:ind w:left="720" w:hanging="360"/>
+      </w:pPr>
+      <w:rPr>
+        <w:rFonts w:ascii="Symbol" w:hAnsi="Symbol" w:hint="default"/>
+      </w:rPr>
+    </w:lvl>
+    <w:lvl w:ilvl="1" w:tplc="40090003">
+      <w:start w:val="1"/>
+      <w:numFmt w:val="bullet"/>
+      <w:lvlText w:val="o"/>
+      <w:lvlJc w:val="left"/>
+      <w:pPr>
+        <w:ind w:left="1440" w:hanging="360"/>
+      </w:pPr>
+      <w:rPr>
+        <w:rFonts w:ascii="Courier New" w:hAnsi="Courier New" w:cs="Courier New" w:hint="default"/>
+      </w:rPr>
+    </w:lvl>
+    <w:lvl w:ilvl="2" w:tplc="40090005" w:tentative="1">
+      <w:start w:val="1"/>
+      <w:numFmt w:val="bullet"/>
+      <w:lvlText w:val=""/>
+      <w:lvlJc w:val="left"/>
+      <w:pPr>
+        <w:ind w:left="2160" w:hanging="360"/>
+      </w:pPr>
+      <w:rPr>
+        <w:rFonts w:ascii="Wingdings" w:hAnsi="Wingdings" w:hint="default"/>
+      </w:rPr>
+    </w:lvl>
+    <w:lvl w:ilvl="3" w:tplc="40090001" w:tentative="1">
+      <w:start w:val="1"/>
+      <w:numFmt w:val="bullet"/>
+      <w:lvlText w:val=""/>
+      <w:lvlJc w:val="left"/>
+      <w:pPr>
+        <w:ind w:left="2880" w:hanging="360"/>
+      </w:pPr>
+      <w:rPr>
+        <w:rFonts w:ascii="Symbol" w:hAnsi="Symbol" w:hint="default"/>
+      </w:rPr>
+    </w:lvl>
+    <w:lvl w:ilvl="4" w:tplc="40090003" w:tentative="1">
+      <w:start w:val="1"/>
+      <w:numFmt w:val="bullet"/>
+      <w:lvlText w:val="o"/>
+      <w:lvlJc w:val="left"/>
+      <w:pPr>
+        <w:ind w:left="3600" w:hanging="360"/>
+      </w:pPr>
+      <w:rPr>
+        <w:rFonts w:ascii="Courier New" w:hAnsi="Courier New" w:cs="Courier New" w:hint="default"/>
+      </w:rPr>
+    </w:lvl>
+    <w:lvl w:ilvl="5" w:tplc="40090005" w:tentative="1">
+      <w:start w:val="1"/>
+      <w:numFmt w:val="bullet"/>
+      <w:lvlText w:val=""/>
+      <w:lvlJc w:val="left"/>
+      <w:pPr>
+        <w:ind w:left="4320" w:hanging="360"/>
+      </w:pPr>
+      <w:rPr>
+        <w:rFonts w:ascii="Wingdings" w:hAnsi="Wingdings" w:hint="default"/>
+      </w:rPr>
+    </w:lvl>
+    <w:lvl w:ilvl="6" w:tplc="40090001" w:tentative="1">
+      <w:start w:val="1"/>
+      <w:numFmt w:val="bullet"/>
+      <w:lvlText w:val=""/>
+      <w:lvlJc w:val="left"/>
+      <w:pPr>
+        <w:ind w:left="5040" w:hanging="360"/>
+      </w:pPr>
+      <w:rPr>
+        <w:rFonts w:ascii="Symbol" w:hAnsi="Symbol" w:hint="default"/>
+      </w:rPr>
+    </w:lvl>
+    <w:lvl w:ilvl="7" w:tplc="40090003" w:tentative="1">
+      <w:start w:val="1"/>
+      <w:numFmt w:val="bullet"/>
+      <w:lvlText w:val="o"/>
+      <w:lvlJc w:val="left"/>
+      <w:pPr>
+        <w:ind w:left="5760" w:hanging="360"/>
+      </w:pPr>
+      <w:rPr>
+        <w:rFonts w:ascii="Courier New" w:hAnsi="Courier New" w:cs="Courier New" w:hint="default"/>
+      </w:rPr>
+    </w:lvl>
+    <w:lvl w:ilvl="8" w:tplc="40090005" w:tentative="1">
+      <w:start w:val="1"/>
+      <w:numFmt w:val="bullet"/>
+      <w:lvlText w:val=""/>
+      <w:lvlJc w:val="left"/>
+      <w:pPr>
+        <w:ind w:left="6480" w:hanging="360"/>
+      </w:pPr>
+      <w:rPr>
+        <w:rFonts w:ascii="Wingdings" w:hAnsi="Wingdings" w:hint="default"/>
+      </w:rPr>
+    </w:lvl>
+  </w:abstractNum>
+  <w:abstractNum w:abstractNumId="5">
     <w:nsid w:val="18B75B88"/>
     <w:multiLevelType w:val="hybridMultilevel"/>
     <w:tmpl w:val="6630C3CA"/>
@@ -9811,7 +12020,7 @@
       </w:rPr>
     </w:lvl>
   </w:abstractNum>
-  <w:abstractNum w:abstractNumId="4">
+  <w:abstractNum w:abstractNumId="6">
     <w:nsid w:val="1BB17B8A"/>
     <w:multiLevelType w:val="hybridMultilevel"/>
     <w:tmpl w:val="5F1AE160"/>
@@ -9924,7 +12133,7 @@
       </w:rPr>
     </w:lvl>
   </w:abstractNum>
-  <w:abstractNum w:abstractNumId="5">
+  <w:abstractNum w:abstractNumId="7">
     <w:nsid w:val="1C9C50BA"/>
     <w:multiLevelType w:val="hybridMultilevel"/>
     <w:tmpl w:val="67DA846C"/>
@@ -10037,7 +12246,120 @@
       </w:rPr>
     </w:lvl>
   </w:abstractNum>
-  <w:abstractNum w:abstractNumId="6">
+  <w:abstractNum w:abstractNumId="8">
+    <w:nsid w:val="242854DD"/>
+    <w:multiLevelType w:val="hybridMultilevel"/>
+    <w:tmpl w:val="F042BBE6"/>
+    <w:lvl w:ilvl="0" w:tplc="40090001">
+      <w:start w:val="1"/>
+      <w:numFmt w:val="bullet"/>
+      <w:lvlText w:val=""/>
+      <w:lvlJc w:val="left"/>
+      <w:pPr>
+        <w:ind w:left="720" w:hanging="360"/>
+      </w:pPr>
+      <w:rPr>
+        <w:rFonts w:ascii="Symbol" w:hAnsi="Symbol" w:hint="default"/>
+      </w:rPr>
+    </w:lvl>
+    <w:lvl w:ilvl="1" w:tplc="40090003">
+      <w:start w:val="1"/>
+      <w:numFmt w:val="bullet"/>
+      <w:lvlText w:val="o"/>
+      <w:lvlJc w:val="left"/>
+      <w:pPr>
+        <w:ind w:left="1440" w:hanging="360"/>
+      </w:pPr>
+      <w:rPr>
+        <w:rFonts w:ascii="Courier New" w:hAnsi="Courier New" w:cs="Courier New" w:hint="default"/>
+      </w:rPr>
+    </w:lvl>
+    <w:lvl w:ilvl="2" w:tplc="40090005" w:tentative="1">
+      <w:start w:val="1"/>
+      <w:numFmt w:val="bullet"/>
+      <w:lvlText w:val=""/>
+      <w:lvlJc w:val="left"/>
+      <w:pPr>
+        <w:ind w:left="2160" w:hanging="360"/>
+      </w:pPr>
+      <w:rPr>
+        <w:rFonts w:ascii="Wingdings" w:hAnsi="Wingdings" w:hint="default"/>
+      </w:rPr>
+    </w:lvl>
+    <w:lvl w:ilvl="3" w:tplc="40090001" w:tentative="1">
+      <w:start w:val="1"/>
+      <w:numFmt w:val="bullet"/>
+      <w:lvlText w:val=""/>
+      <w:lvlJc w:val="left"/>
+      <w:pPr>
+        <w:ind w:left="2880" w:hanging="360"/>
+      </w:pPr>
+      <w:rPr>
+        <w:rFonts w:ascii="Symbol" w:hAnsi="Symbol" w:hint="default"/>
+      </w:rPr>
+    </w:lvl>
+    <w:lvl w:ilvl="4" w:tplc="40090003" w:tentative="1">
+      <w:start w:val="1"/>
+      <w:numFmt w:val="bullet"/>
+      <w:lvlText w:val="o"/>
+      <w:lvlJc w:val="left"/>
+      <w:pPr>
+        <w:ind w:left="3600" w:hanging="360"/>
+      </w:pPr>
+      <w:rPr>
+        <w:rFonts w:ascii="Courier New" w:hAnsi="Courier New" w:cs="Courier New" w:hint="default"/>
+      </w:rPr>
+    </w:lvl>
+    <w:lvl w:ilvl="5" w:tplc="40090005" w:tentative="1">
+      <w:start w:val="1"/>
+      <w:numFmt w:val="bullet"/>
+      <w:lvlText w:val=""/>
+      <w:lvlJc w:val="left"/>
+      <w:pPr>
+        <w:ind w:left="4320" w:hanging="360"/>
+      </w:pPr>
+      <w:rPr>
+        <w:rFonts w:ascii="Wingdings" w:hAnsi="Wingdings" w:hint="default"/>
+      </w:rPr>
+    </w:lvl>
+    <w:lvl w:ilvl="6" w:tplc="40090001" w:tentative="1">
+      <w:start w:val="1"/>
+      <w:numFmt w:val="bullet"/>
+      <w:lvlText w:val=""/>
+      <w:lvlJc w:val="left"/>
+      <w:pPr>
+        <w:ind w:left="5040" w:hanging="360"/>
+      </w:pPr>
+      <w:rPr>
+        <w:rFonts w:ascii="Symbol" w:hAnsi="Symbol" w:hint="default"/>
+      </w:rPr>
+    </w:lvl>
+    <w:lvl w:ilvl="7" w:tplc="40090003" w:tentative="1">
+      <w:start w:val="1"/>
+      <w:numFmt w:val="bullet"/>
+      <w:lvlText w:val="o"/>
+      <w:lvlJc w:val="left"/>
+      <w:pPr>
+        <w:ind w:left="5760" w:hanging="360"/>
+      </w:pPr>
+      <w:rPr>
+        <w:rFonts w:ascii="Courier New" w:hAnsi="Courier New" w:cs="Courier New" w:hint="default"/>
+      </w:rPr>
+    </w:lvl>
+    <w:lvl w:ilvl="8" w:tplc="40090005" w:tentative="1">
+      <w:start w:val="1"/>
+      <w:numFmt w:val="bullet"/>
+      <w:lvlText w:val=""/>
+      <w:lvlJc w:val="left"/>
+      <w:pPr>
+        <w:ind w:left="6480" w:hanging="360"/>
+      </w:pPr>
+      <w:rPr>
+        <w:rFonts w:ascii="Wingdings" w:hAnsi="Wingdings" w:hint="default"/>
+      </w:rPr>
+    </w:lvl>
+  </w:abstractNum>
+  <w:abstractNum w:abstractNumId="9">
     <w:nsid w:val="25056A18"/>
     <w:multiLevelType w:val="hybridMultilevel"/>
     <w:tmpl w:val="9CEA619E"/>
@@ -10126,7 +12448,7 @@
       </w:pPr>
     </w:lvl>
   </w:abstractNum>
-  <w:abstractNum w:abstractNumId="7">
+  <w:abstractNum w:abstractNumId="10">
     <w:nsid w:val="2EA65D2E"/>
     <w:multiLevelType w:val="hybridMultilevel"/>
     <w:tmpl w:val="1144A10E"/>
@@ -10239,7 +12561,7 @@
       </w:rPr>
     </w:lvl>
   </w:abstractNum>
-  <w:abstractNum w:abstractNumId="8">
+  <w:abstractNum w:abstractNumId="11">
     <w:nsid w:val="31165D54"/>
     <w:multiLevelType w:val="hybridMultilevel"/>
     <w:tmpl w:val="71540B72"/>
@@ -10352,7 +12674,7 @@
       </w:rPr>
     </w:lvl>
   </w:abstractNum>
-  <w:abstractNum w:abstractNumId="9">
+  <w:abstractNum w:abstractNumId="12">
     <w:nsid w:val="35122F2E"/>
     <w:multiLevelType w:val="hybridMultilevel"/>
     <w:tmpl w:val="86B8B5D2"/>
@@ -10441,7 +12763,7 @@
       </w:pPr>
     </w:lvl>
   </w:abstractNum>
-  <w:abstractNum w:abstractNumId="10">
+  <w:abstractNum w:abstractNumId="13">
     <w:nsid w:val="36FD5624"/>
     <w:multiLevelType w:val="hybridMultilevel"/>
     <w:tmpl w:val="1A5E0934"/>
@@ -10530,7 +12852,7 @@
       </w:pPr>
     </w:lvl>
   </w:abstractNum>
-  <w:abstractNum w:abstractNumId="11">
+  <w:abstractNum w:abstractNumId="14">
     <w:nsid w:val="3A3075AA"/>
     <w:multiLevelType w:val="hybridMultilevel"/>
     <w:tmpl w:val="A1584D44"/>
@@ -10643,7 +12965,7 @@
       </w:rPr>
     </w:lvl>
   </w:abstractNum>
-  <w:abstractNum w:abstractNumId="12">
+  <w:abstractNum w:abstractNumId="15">
     <w:nsid w:val="43183E58"/>
     <w:multiLevelType w:val="hybridMultilevel"/>
     <w:tmpl w:val="EA903AC8"/>
@@ -10756,7 +13078,7 @@
       </w:rPr>
     </w:lvl>
   </w:abstractNum>
-  <w:abstractNum w:abstractNumId="13">
+  <w:abstractNum w:abstractNumId="16">
     <w:nsid w:val="44C5757D"/>
     <w:multiLevelType w:val="hybridMultilevel"/>
     <w:tmpl w:val="BA887CA2"/>
@@ -10845,7 +13167,7 @@
       </w:pPr>
     </w:lvl>
   </w:abstractNum>
-  <w:abstractNum w:abstractNumId="14">
+  <w:abstractNum w:abstractNumId="17">
     <w:nsid w:val="4771029A"/>
     <w:multiLevelType w:val="hybridMultilevel"/>
     <w:tmpl w:val="F2681506"/>
@@ -10958,7 +13280,7 @@
       </w:rPr>
     </w:lvl>
   </w:abstractNum>
-  <w:abstractNum w:abstractNumId="15">
+  <w:abstractNum w:abstractNumId="18">
     <w:nsid w:val="487A3B0D"/>
     <w:multiLevelType w:val="hybridMultilevel"/>
     <w:tmpl w:val="75CA2E34"/>
@@ -11047,7 +13369,7 @@
       </w:pPr>
     </w:lvl>
   </w:abstractNum>
-  <w:abstractNum w:abstractNumId="16">
+  <w:abstractNum w:abstractNumId="19">
     <w:nsid w:val="4C187E13"/>
     <w:multiLevelType w:val="hybridMultilevel"/>
     <w:tmpl w:val="E8ACCDB8"/>
@@ -11160,7 +13482,7 @@
       </w:rPr>
     </w:lvl>
   </w:abstractNum>
-  <w:abstractNum w:abstractNumId="17">
+  <w:abstractNum w:abstractNumId="20">
     <w:nsid w:val="56A40A45"/>
     <w:multiLevelType w:val="hybridMultilevel"/>
     <w:tmpl w:val="7862B3F8"/>
@@ -11273,7 +13595,7 @@
       </w:rPr>
     </w:lvl>
   </w:abstractNum>
-  <w:abstractNum w:abstractNumId="18">
+  <w:abstractNum w:abstractNumId="21">
     <w:nsid w:val="58D1047A"/>
     <w:multiLevelType w:val="hybridMultilevel"/>
     <w:tmpl w:val="BB6E0C8E"/>
@@ -11386,7 +13708,7 @@
       </w:rPr>
     </w:lvl>
   </w:abstractNum>
-  <w:abstractNum w:abstractNumId="19">
+  <w:abstractNum w:abstractNumId="22">
     <w:nsid w:val="590A2A42"/>
     <w:multiLevelType w:val="hybridMultilevel"/>
     <w:tmpl w:val="B2CCDDE8"/>
@@ -11499,7 +13821,7 @@
       </w:rPr>
     </w:lvl>
   </w:abstractNum>
-  <w:abstractNum w:abstractNumId="20">
+  <w:abstractNum w:abstractNumId="23">
     <w:nsid w:val="5AC325C4"/>
     <w:multiLevelType w:val="hybridMultilevel"/>
     <w:tmpl w:val="6BF65148"/>
@@ -11588,7 +13910,7 @@
       </w:pPr>
     </w:lvl>
   </w:abstractNum>
-  <w:abstractNum w:abstractNumId="21">
+  <w:abstractNum w:abstractNumId="24">
     <w:nsid w:val="5E1A5E19"/>
     <w:multiLevelType w:val="hybridMultilevel"/>
     <w:tmpl w:val="3C0054B4"/>
@@ -11701,7 +14023,7 @@
       </w:rPr>
     </w:lvl>
   </w:abstractNum>
-  <w:abstractNum w:abstractNumId="22">
+  <w:abstractNum w:abstractNumId="25">
     <w:nsid w:val="60CD67B9"/>
     <w:multiLevelType w:val="hybridMultilevel"/>
     <w:tmpl w:val="898E7844"/>
@@ -11790,7 +14112,7 @@
       </w:pPr>
     </w:lvl>
   </w:abstractNum>
-  <w:abstractNum w:abstractNumId="23">
+  <w:abstractNum w:abstractNumId="26">
     <w:nsid w:val="629C4E82"/>
     <w:multiLevelType w:val="hybridMultilevel"/>
     <w:tmpl w:val="363CE55E"/>
@@ -11879,7 +14201,7 @@
       </w:pPr>
     </w:lvl>
   </w:abstractNum>
-  <w:abstractNum w:abstractNumId="24">
+  <w:abstractNum w:abstractNumId="27">
     <w:nsid w:val="632F5147"/>
     <w:multiLevelType w:val="hybridMultilevel"/>
     <w:tmpl w:val="A2A076AA"/>
@@ -11992,7 +14314,7 @@
       </w:rPr>
     </w:lvl>
   </w:abstractNum>
-  <w:abstractNum w:abstractNumId="25">
+  <w:abstractNum w:abstractNumId="28">
     <w:nsid w:val="66C14124"/>
     <w:multiLevelType w:val="hybridMultilevel"/>
     <w:tmpl w:val="87BA6304"/>
@@ -12105,7 +14427,7 @@
       </w:rPr>
     </w:lvl>
   </w:abstractNum>
-  <w:abstractNum w:abstractNumId="26">
+  <w:abstractNum w:abstractNumId="29">
     <w:nsid w:val="6CA66238"/>
     <w:multiLevelType w:val="hybridMultilevel"/>
     <w:tmpl w:val="A2201FCA"/>
@@ -12218,7 +14540,7 @@
       </w:rPr>
     </w:lvl>
   </w:abstractNum>
-  <w:abstractNum w:abstractNumId="27">
+  <w:abstractNum w:abstractNumId="30">
     <w:nsid w:val="73C523EA"/>
     <w:multiLevelType w:val="hybridMultilevel"/>
     <w:tmpl w:val="F1BEC0E4"/>
@@ -12331,7 +14653,7 @@
       </w:rPr>
     </w:lvl>
   </w:abstractNum>
-  <w:abstractNum w:abstractNumId="28">
+  <w:abstractNum w:abstractNumId="31">
     <w:nsid w:val="76CB2945"/>
     <w:multiLevelType w:val="hybridMultilevel"/>
     <w:tmpl w:val="E2880EB2"/>
@@ -12444,7 +14766,7 @@
       </w:rPr>
     </w:lvl>
   </w:abstractNum>
-  <w:abstractNum w:abstractNumId="29">
+  <w:abstractNum w:abstractNumId="32">
     <w:nsid w:val="77E60E1A"/>
     <w:multiLevelType w:val="hybridMultilevel"/>
     <w:tmpl w:val="14625B96"/>
@@ -12533,7 +14855,7 @@
       </w:pPr>
     </w:lvl>
   </w:abstractNum>
-  <w:abstractNum w:abstractNumId="30">
+  <w:abstractNum w:abstractNumId="33">
     <w:nsid w:val="79FE4925"/>
     <w:multiLevelType w:val="hybridMultilevel"/>
     <w:tmpl w:val="263AE45E"/>
@@ -12623,97 +14945,106 @@
     </w:lvl>
   </w:abstractNum>
   <w:num w:numId="1">
+    <w:abstractNumId w:val="27"/>
+  </w:num>
+  <w:num w:numId="2">
+    <w:abstractNumId w:val="31"/>
+  </w:num>
+  <w:num w:numId="3">
+    <w:abstractNumId w:val="29"/>
+  </w:num>
+  <w:num w:numId="4">
+    <w:abstractNumId w:val="20"/>
+  </w:num>
+  <w:num w:numId="5">
+    <w:abstractNumId w:val="30"/>
+  </w:num>
+  <w:num w:numId="6">
+    <w:abstractNumId w:val="26"/>
+  </w:num>
+  <w:num w:numId="7">
+    <w:abstractNumId w:val="15"/>
+  </w:num>
+  <w:num w:numId="8">
+    <w:abstractNumId w:val="5"/>
+  </w:num>
+  <w:num w:numId="9">
+    <w:abstractNumId w:val="33"/>
+  </w:num>
+  <w:num w:numId="10">
+    <w:abstractNumId w:val="12"/>
+  </w:num>
+  <w:num w:numId="11">
+    <w:abstractNumId w:val="23"/>
+  </w:num>
+  <w:num w:numId="12">
+    <w:abstractNumId w:val="13"/>
+  </w:num>
+  <w:num w:numId="13">
+    <w:abstractNumId w:val="18"/>
+  </w:num>
+  <w:num w:numId="14">
+    <w:abstractNumId w:val="22"/>
+  </w:num>
+  <w:num w:numId="15">
+    <w:abstractNumId w:val="7"/>
+  </w:num>
+  <w:num w:numId="16">
+    <w:abstractNumId w:val="14"/>
+  </w:num>
+  <w:num w:numId="17">
+    <w:abstractNumId w:val="1"/>
+  </w:num>
+  <w:num w:numId="18">
+    <w:abstractNumId w:val="6"/>
+  </w:num>
+  <w:num w:numId="19">
     <w:abstractNumId w:val="24"/>
   </w:num>
-  <w:num w:numId="2">
+  <w:num w:numId="20">
+    <w:abstractNumId w:val="9"/>
+  </w:num>
+  <w:num w:numId="21">
+    <w:abstractNumId w:val="19"/>
+  </w:num>
+  <w:num w:numId="22">
+    <w:abstractNumId w:val="2"/>
+  </w:num>
+  <w:num w:numId="23">
+    <w:abstractNumId w:val="16"/>
+  </w:num>
+  <w:num w:numId="24">
+    <w:abstractNumId w:val="32"/>
+  </w:num>
+  <w:num w:numId="25">
+    <w:abstractNumId w:val="11"/>
+  </w:num>
+  <w:num w:numId="26">
+    <w:abstractNumId w:val="3"/>
+  </w:num>
+  <w:num w:numId="27">
+    <w:abstractNumId w:val="25"/>
+  </w:num>
+  <w:num w:numId="28">
     <w:abstractNumId w:val="28"/>
   </w:num>
-  <w:num w:numId="3">
-    <w:abstractNumId w:val="26"/>
+  <w:num w:numId="29">
+    <w:abstractNumId w:val="21"/>
   </w:num>
-  <w:num w:numId="4">
+  <w:num w:numId="30">
+    <w:abstractNumId w:val="10"/>
+  </w:num>
+  <w:num w:numId="31">
     <w:abstractNumId w:val="17"/>
   </w:num>
-  <w:num w:numId="5">
-    <w:abstractNumId w:val="27"/>
+  <w:num w:numId="32">
+    <w:abstractNumId w:val="8"/>
   </w:num>
-  <w:num w:numId="6">
-    <w:abstractNumId w:val="23"/>
-  </w:num>
-  <w:num w:numId="7">
-    <w:abstractNumId w:val="12"/>
-  </w:num>
-  <w:num w:numId="8">
-    <w:abstractNumId w:val="3"/>
-  </w:num>
-  <w:num w:numId="9">
-    <w:abstractNumId w:val="30"/>
-  </w:num>
-  <w:num w:numId="10">
-    <w:abstractNumId w:val="9"/>
-  </w:num>
-  <w:num w:numId="11">
-    <w:abstractNumId w:val="20"/>
-  </w:num>
-  <w:num w:numId="12">
-    <w:abstractNumId w:val="10"/>
-  </w:num>
-  <w:num w:numId="13">
-    <w:abstractNumId w:val="15"/>
-  </w:num>
-  <w:num w:numId="14">
-    <w:abstractNumId w:val="19"/>
-  </w:num>
-  <w:num w:numId="15">
-    <w:abstractNumId w:val="5"/>
-  </w:num>
-  <w:num w:numId="16">
-    <w:abstractNumId w:val="11"/>
-  </w:num>
-  <w:num w:numId="17">
-    <w:abstractNumId w:val="0"/>
-  </w:num>
-  <w:num w:numId="18">
+  <w:num w:numId="33">
     <w:abstractNumId w:val="4"/>
   </w:num>
-  <w:num w:numId="19">
-    <w:abstractNumId w:val="21"/>
-  </w:num>
-  <w:num w:numId="20">
-    <w:abstractNumId w:val="6"/>
-  </w:num>
-  <w:num w:numId="21">
-    <w:abstractNumId w:val="16"/>
-  </w:num>
-  <w:num w:numId="22">
-    <w:abstractNumId w:val="1"/>
-  </w:num>
-  <w:num w:numId="23">
-    <w:abstractNumId w:val="13"/>
-  </w:num>
-  <w:num w:numId="24">
-    <w:abstractNumId w:val="29"/>
-  </w:num>
-  <w:num w:numId="25">
-    <w:abstractNumId w:val="8"/>
-  </w:num>
-  <w:num w:numId="26">
-    <w:abstractNumId w:val="2"/>
-  </w:num>
-  <w:num w:numId="27">
-    <w:abstractNumId w:val="22"/>
-  </w:num>
-  <w:num w:numId="28">
-    <w:abstractNumId w:val="25"/>
-  </w:num>
-  <w:num w:numId="29">
-    <w:abstractNumId w:val="18"/>
-  </w:num>
-  <w:num w:numId="30">
-    <w:abstractNumId w:val="7"/>
-  </w:num>
-  <w:num w:numId="31">
-    <w:abstractNumId w:val="14"/>
+  <w:num w:numId="34">
+    <w:abstractNumId w:val="0"/>
   </w:num>
 </w:numbering>
 </file>

</xml_diff>

<commit_message>
Date: 28 Apr 2026
</commit_message>
<xml_diff>
--- a/SeleniumNotes.docx
+++ b/SeleniumNotes.docx
@@ -1926,7 +1926,6 @@
           <w:lang w:val="en-US"/>
         </w:rPr>
       </w:pPr>
-      <w:proofErr w:type="spellStart"/>
       <w:r>
         <w:rPr>
           <w:sz w:val="24"/>
@@ -1935,7 +1934,6 @@
         </w:rPr>
         <w:t>YourName_SeleniumDemos</w:t>
       </w:r>
-      <w:proofErr w:type="spellEnd"/>
     </w:p>
     <w:p>
       <w:pPr>
@@ -1978,25 +1976,7 @@
           <w:szCs w:val="22"/>
           <w:lang w:val="en-US"/>
         </w:rPr>
-        <w:t xml:space="preserve">Launch </w:t>
-      </w:r>
-      <w:proofErr w:type="spellStart"/>
-      <w:r>
-        <w:rPr>
-          <w:sz w:val="24"/>
-          <w:szCs w:val="22"/>
-          <w:lang w:val="en-US"/>
-        </w:rPr>
-        <w:t>selenium.dev</w:t>
-      </w:r>
-      <w:proofErr w:type="spellEnd"/>
-      <w:r>
-        <w:rPr>
-          <w:sz w:val="24"/>
-          <w:szCs w:val="22"/>
-          <w:lang w:val="en-US"/>
-        </w:rPr>
-        <w:t xml:space="preserve"> site</w:t>
+        <w:t>Launch selenium.dev site</w:t>
       </w:r>
       <w:r>
         <w:rPr>
@@ -2659,18 +2639,8 @@
           <w:szCs w:val="22"/>
           <w:lang w:val="en-US"/>
         </w:rPr>
-        <w:t xml:space="preserve">Click on </w:t>
-      </w:r>
-      <w:proofErr w:type="spellStart"/>
-      <w:r>
-        <w:rPr>
-          <w:sz w:val="24"/>
-          <w:szCs w:val="22"/>
-          <w:lang w:val="en-US"/>
-        </w:rPr>
-        <w:t>ClassPath</w:t>
-      </w:r>
-      <w:proofErr w:type="spellEnd"/>
+        <w:t>Click on ClassPath</w:t>
+      </w:r>
     </w:p>
     <w:p>
       <w:pPr>
@@ -2691,18 +2661,8 @@
           <w:szCs w:val="22"/>
           <w:lang w:val="en-US"/>
         </w:rPr>
-        <w:t>Click on Add External JARs</w:t>
-      </w:r>
-      <w:proofErr w:type="gramStart"/>
-      <w:r>
-        <w:rPr>
-          <w:sz w:val="24"/>
-          <w:szCs w:val="22"/>
-          <w:lang w:val="en-US"/>
-        </w:rPr>
-        <w:t>..</w:t>
-      </w:r>
-      <w:proofErr w:type="gramEnd"/>
+        <w:t>Click on Add External JARs..</w:t>
+      </w:r>
     </w:p>
     <w:p>
       <w:pPr>
@@ -2911,23 +2871,13 @@
           <w:lang w:val="en-US"/>
         </w:rPr>
       </w:pPr>
-      <w:proofErr w:type="gramStart"/>
-      <w:r>
-        <w:rPr>
-          <w:sz w:val="24"/>
-          <w:szCs w:val="22"/>
-          <w:lang w:val="en-US"/>
-        </w:rPr>
-        <w:t>get(</w:t>
-      </w:r>
-      <w:proofErr w:type="gramEnd"/>
-      <w:r>
-        <w:rPr>
-          <w:sz w:val="24"/>
-          <w:szCs w:val="22"/>
-          <w:lang w:val="en-US"/>
-        </w:rPr>
-        <w:t xml:space="preserve">) </w:t>
+      <w:r>
+        <w:rPr>
+          <w:sz w:val="24"/>
+          <w:szCs w:val="22"/>
+          <w:lang w:val="en-US"/>
+        </w:rPr>
+        <w:t xml:space="preserve">get() </w:t>
       </w:r>
       <w:r>
         <w:rPr>
@@ -2959,33 +2909,13 @@
           <w:lang w:val="en-US"/>
         </w:rPr>
       </w:pPr>
-      <w:proofErr w:type="spellStart"/>
-      <w:proofErr w:type="gramStart"/>
-      <w:r>
-        <w:rPr>
-          <w:sz w:val="24"/>
-          <w:szCs w:val="22"/>
-          <w:lang w:val="en-US"/>
-        </w:rPr>
-        <w:t>driver.manage</w:t>
-      </w:r>
-      <w:proofErr w:type="spellEnd"/>
-      <w:r>
-        <w:rPr>
-          <w:sz w:val="24"/>
-          <w:szCs w:val="22"/>
-          <w:lang w:val="en-US"/>
-        </w:rPr>
-        <w:t>(</w:t>
-      </w:r>
-      <w:proofErr w:type="gramEnd"/>
-      <w:r>
-        <w:rPr>
-          <w:sz w:val="24"/>
-          <w:szCs w:val="22"/>
-          <w:lang w:val="en-US"/>
-        </w:rPr>
-        <w:t xml:space="preserve">).window().maximize() </w:t>
+      <w:r>
+        <w:rPr>
+          <w:sz w:val="24"/>
+          <w:szCs w:val="22"/>
+          <w:lang w:val="en-US"/>
+        </w:rPr>
+        <w:t xml:space="preserve">driver.manage().window().maximize() </w:t>
       </w:r>
       <w:r>
         <w:rPr>
@@ -3017,23 +2947,13 @@
           <w:lang w:val="en-US"/>
         </w:rPr>
       </w:pPr>
-      <w:proofErr w:type="gramStart"/>
-      <w:r>
-        <w:rPr>
-          <w:sz w:val="24"/>
-          <w:szCs w:val="22"/>
-          <w:lang w:val="en-US"/>
-        </w:rPr>
-        <w:t>close(</w:t>
-      </w:r>
-      <w:proofErr w:type="gramEnd"/>
-      <w:r>
-        <w:rPr>
-          <w:sz w:val="24"/>
-          <w:szCs w:val="22"/>
-          <w:lang w:val="en-US"/>
-        </w:rPr>
-        <w:t xml:space="preserve">) </w:t>
+      <w:r>
+        <w:rPr>
+          <w:sz w:val="24"/>
+          <w:szCs w:val="22"/>
+          <w:lang w:val="en-US"/>
+        </w:rPr>
+        <w:t xml:space="preserve">close() </w:t>
       </w:r>
       <w:r>
         <w:rPr>
@@ -3065,23 +2985,13 @@
           <w:lang w:val="en-US"/>
         </w:rPr>
       </w:pPr>
-      <w:proofErr w:type="gramStart"/>
-      <w:r>
-        <w:rPr>
-          <w:sz w:val="24"/>
-          <w:szCs w:val="22"/>
-          <w:lang w:val="en-US"/>
-        </w:rPr>
-        <w:t>getTitle(</w:t>
-      </w:r>
-      <w:proofErr w:type="gramEnd"/>
-      <w:r>
-        <w:rPr>
-          <w:sz w:val="24"/>
-          <w:szCs w:val="22"/>
-          <w:lang w:val="en-US"/>
-        </w:rPr>
-        <w:t xml:space="preserve">) </w:t>
+      <w:r>
+        <w:rPr>
+          <w:sz w:val="24"/>
+          <w:szCs w:val="22"/>
+          <w:lang w:val="en-US"/>
+        </w:rPr>
+        <w:t xml:space="preserve">getTitle() </w:t>
       </w:r>
       <w:r>
         <w:rPr>
@@ -3113,23 +3023,13 @@
           <w:lang w:val="en-US"/>
         </w:rPr>
       </w:pPr>
-      <w:proofErr w:type="gramStart"/>
-      <w:r>
-        <w:rPr>
-          <w:sz w:val="24"/>
-          <w:szCs w:val="22"/>
-          <w:lang w:val="en-US"/>
-        </w:rPr>
-        <w:t>getCurrentUrl(</w:t>
-      </w:r>
-      <w:proofErr w:type="gramEnd"/>
-      <w:r>
-        <w:rPr>
-          <w:sz w:val="24"/>
-          <w:szCs w:val="22"/>
-          <w:lang w:val="en-US"/>
-        </w:rPr>
-        <w:t xml:space="preserve">) </w:t>
+      <w:r>
+        <w:rPr>
+          <w:sz w:val="24"/>
+          <w:szCs w:val="22"/>
+          <w:lang w:val="en-US"/>
+        </w:rPr>
+        <w:t xml:space="preserve">getCurrentUrl() </w:t>
       </w:r>
       <w:r>
         <w:rPr>
@@ -3161,23 +3061,13 @@
           <w:lang w:val="en-US"/>
         </w:rPr>
       </w:pPr>
-      <w:proofErr w:type="gramStart"/>
-      <w:r>
-        <w:rPr>
-          <w:sz w:val="24"/>
-          <w:szCs w:val="22"/>
-          <w:lang w:val="en-US"/>
-        </w:rPr>
-        <w:t>getPageSource(</w:t>
-      </w:r>
-      <w:proofErr w:type="gramEnd"/>
-      <w:r>
-        <w:rPr>
-          <w:sz w:val="24"/>
-          <w:szCs w:val="22"/>
-          <w:lang w:val="en-US"/>
-        </w:rPr>
-        <w:t xml:space="preserve">) </w:t>
+      <w:r>
+        <w:rPr>
+          <w:sz w:val="24"/>
+          <w:szCs w:val="22"/>
+          <w:lang w:val="en-US"/>
+        </w:rPr>
+        <w:t xml:space="preserve">getPageSource() </w:t>
       </w:r>
       <w:r>
         <w:rPr>
@@ -3209,23 +3099,13 @@
           <w:lang w:val="en-US"/>
         </w:rPr>
       </w:pPr>
-      <w:proofErr w:type="gramStart"/>
-      <w:r>
-        <w:rPr>
-          <w:sz w:val="24"/>
-          <w:szCs w:val="22"/>
-          <w:lang w:val="en-US"/>
-        </w:rPr>
-        <w:t>findElement(</w:t>
-      </w:r>
-      <w:proofErr w:type="gramEnd"/>
-      <w:r>
-        <w:rPr>
-          <w:sz w:val="24"/>
-          <w:szCs w:val="22"/>
-          <w:lang w:val="en-US"/>
-        </w:rPr>
-        <w:t xml:space="preserve">) </w:t>
+      <w:r>
+        <w:rPr>
+          <w:sz w:val="24"/>
+          <w:szCs w:val="22"/>
+          <w:lang w:val="en-US"/>
+        </w:rPr>
+        <w:t xml:space="preserve">findElement() </w:t>
       </w:r>
       <w:r>
         <w:rPr>
@@ -3275,23 +3155,13 @@
           <w:lang w:val="en-US"/>
         </w:rPr>
       </w:pPr>
-      <w:proofErr w:type="gramStart"/>
-      <w:r>
-        <w:rPr>
-          <w:sz w:val="24"/>
-          <w:szCs w:val="22"/>
-          <w:lang w:val="en-US"/>
-        </w:rPr>
-        <w:t>findElements(</w:t>
-      </w:r>
-      <w:proofErr w:type="gramEnd"/>
-      <w:r>
-        <w:rPr>
-          <w:sz w:val="24"/>
-          <w:szCs w:val="22"/>
-          <w:lang w:val="en-US"/>
-        </w:rPr>
-        <w:t xml:space="preserve">) </w:t>
+      <w:r>
+        <w:rPr>
+          <w:sz w:val="24"/>
+          <w:szCs w:val="22"/>
+          <w:lang w:val="en-US"/>
+        </w:rPr>
+        <w:t xml:space="preserve">findElements() </w:t>
       </w:r>
       <w:r>
         <w:rPr>
@@ -3323,23 +3193,13 @@
           <w:lang w:val="en-US"/>
         </w:rPr>
       </w:pPr>
-      <w:proofErr w:type="gramStart"/>
-      <w:r>
-        <w:rPr>
-          <w:sz w:val="24"/>
-          <w:szCs w:val="22"/>
-          <w:lang w:val="en-US"/>
-        </w:rPr>
-        <w:t>getWindowHandles(</w:t>
-      </w:r>
-      <w:proofErr w:type="gramEnd"/>
-      <w:r>
-        <w:rPr>
-          <w:sz w:val="24"/>
-          <w:szCs w:val="22"/>
-          <w:lang w:val="en-US"/>
-        </w:rPr>
-        <w:t xml:space="preserve">) </w:t>
+      <w:r>
+        <w:rPr>
+          <w:sz w:val="24"/>
+          <w:szCs w:val="22"/>
+          <w:lang w:val="en-US"/>
+        </w:rPr>
+        <w:t xml:space="preserve">getWindowHandles() </w:t>
       </w:r>
       <w:r>
         <w:rPr>
@@ -3371,23 +3231,13 @@
           <w:lang w:val="en-US"/>
         </w:rPr>
       </w:pPr>
-      <w:proofErr w:type="gramStart"/>
-      <w:r>
-        <w:rPr>
-          <w:sz w:val="24"/>
-          <w:szCs w:val="22"/>
-          <w:lang w:val="en-US"/>
-        </w:rPr>
-        <w:t>quit(</w:t>
-      </w:r>
-      <w:proofErr w:type="gramEnd"/>
-      <w:r>
-        <w:rPr>
-          <w:sz w:val="24"/>
-          <w:szCs w:val="22"/>
-          <w:lang w:val="en-US"/>
-        </w:rPr>
-        <w:t xml:space="preserve">) </w:t>
+      <w:r>
+        <w:rPr>
+          <w:sz w:val="24"/>
+          <w:szCs w:val="22"/>
+          <w:lang w:val="en-US"/>
+        </w:rPr>
+        <w:t xml:space="preserve">quit() </w:t>
       </w:r>
       <w:r>
         <w:rPr>
@@ -3768,25 +3618,7 @@
           <w:szCs w:val="22"/>
           <w:lang w:val="en-US"/>
         </w:rPr>
-        <w:t xml:space="preserve"> </w:t>
-      </w:r>
-      <w:proofErr w:type="spellStart"/>
-      <w:r>
-        <w:rPr>
-          <w:sz w:val="24"/>
-          <w:szCs w:val="22"/>
-          <w:lang w:val="en-US"/>
-        </w:rPr>
-        <w:t>driver.get</w:t>
-      </w:r>
-      <w:proofErr w:type="spellEnd"/>
-      <w:r>
-        <w:rPr>
-          <w:sz w:val="24"/>
-          <w:szCs w:val="22"/>
-          <w:lang w:val="en-US"/>
-        </w:rPr>
-        <w:t>() is having implicit wait of 30 seconds, means Selenium will wait for maximum 30 seconds till the page get loaded. But if the page is not getting loaded within 30 seconds, Selenium will throw SessionTimeoutException.</w:t>
+        <w:t xml:space="preserve"> driver.get() is having implicit wait of 30 seconds, means Selenium will wait for maximum 30 seconds till the page get loaded. But if the page is not getting loaded within 30 seconds, Selenium will throw SessionTimeoutException.</w:t>
       </w:r>
     </w:p>
     <w:p>
@@ -4048,23 +3880,13 @@
           <w:lang w:val="en-US"/>
         </w:rPr>
       </w:pPr>
-      <w:proofErr w:type="gramStart"/>
-      <w:r>
-        <w:rPr>
-          <w:sz w:val="24"/>
-          <w:szCs w:val="22"/>
-          <w:lang w:val="en-US"/>
-        </w:rPr>
-        <w:t>sendKeys(</w:t>
-      </w:r>
-      <w:proofErr w:type="gramEnd"/>
-      <w:r>
-        <w:rPr>
-          <w:sz w:val="24"/>
-          <w:szCs w:val="22"/>
-          <w:lang w:val="en-US"/>
-        </w:rPr>
-        <w:t xml:space="preserve">) </w:t>
+      <w:r>
+        <w:rPr>
+          <w:sz w:val="24"/>
+          <w:szCs w:val="22"/>
+          <w:lang w:val="en-US"/>
+        </w:rPr>
+        <w:t xml:space="preserve">sendKeys() </w:t>
       </w:r>
       <w:r>
         <w:rPr>
@@ -4104,23 +3926,13 @@
           <w:lang w:val="en-US"/>
         </w:rPr>
       </w:pPr>
-      <w:proofErr w:type="gramStart"/>
-      <w:r>
-        <w:rPr>
-          <w:sz w:val="24"/>
-          <w:szCs w:val="22"/>
-          <w:lang w:val="en-US"/>
-        </w:rPr>
-        <w:t>click(</w:t>
-      </w:r>
-      <w:proofErr w:type="gramEnd"/>
-      <w:r>
-        <w:rPr>
-          <w:sz w:val="24"/>
-          <w:szCs w:val="22"/>
-          <w:lang w:val="en-US"/>
-        </w:rPr>
-        <w:t xml:space="preserve">) </w:t>
+      <w:r>
+        <w:rPr>
+          <w:sz w:val="24"/>
+          <w:szCs w:val="22"/>
+          <w:lang w:val="en-US"/>
+        </w:rPr>
+        <w:t xml:space="preserve">click() </w:t>
       </w:r>
       <w:r>
         <w:rPr>
@@ -4152,23 +3964,13 @@
           <w:lang w:val="en-US"/>
         </w:rPr>
       </w:pPr>
-      <w:proofErr w:type="gramStart"/>
-      <w:r>
-        <w:rPr>
-          <w:sz w:val="24"/>
-          <w:szCs w:val="22"/>
-          <w:lang w:val="en-US"/>
-        </w:rPr>
-        <w:t>getText(</w:t>
-      </w:r>
-      <w:proofErr w:type="gramEnd"/>
-      <w:r>
-        <w:rPr>
-          <w:sz w:val="24"/>
-          <w:szCs w:val="22"/>
-          <w:lang w:val="en-US"/>
-        </w:rPr>
-        <w:t xml:space="preserve">) </w:t>
+      <w:r>
+        <w:rPr>
+          <w:sz w:val="24"/>
+          <w:szCs w:val="22"/>
+          <w:lang w:val="en-US"/>
+        </w:rPr>
+        <w:t xml:space="preserve">getText() </w:t>
       </w:r>
       <w:r>
         <w:rPr>
@@ -4200,23 +4002,13 @@
           <w:lang w:val="en-US"/>
         </w:rPr>
       </w:pPr>
-      <w:proofErr w:type="gramStart"/>
-      <w:r>
-        <w:rPr>
-          <w:sz w:val="24"/>
-          <w:szCs w:val="22"/>
-          <w:lang w:val="en-US"/>
-        </w:rPr>
-        <w:t>getAttribute(</w:t>
-      </w:r>
-      <w:proofErr w:type="gramEnd"/>
-      <w:r>
-        <w:rPr>
-          <w:sz w:val="24"/>
-          <w:szCs w:val="22"/>
-          <w:lang w:val="en-US"/>
-        </w:rPr>
-        <w:t xml:space="preserve">) </w:t>
+      <w:r>
+        <w:rPr>
+          <w:sz w:val="24"/>
+          <w:szCs w:val="22"/>
+          <w:lang w:val="en-US"/>
+        </w:rPr>
+        <w:t xml:space="preserve">getAttribute() </w:t>
       </w:r>
       <w:r>
         <w:rPr>
@@ -4248,23 +4040,13 @@
           <w:lang w:val="en-US"/>
         </w:rPr>
       </w:pPr>
-      <w:proofErr w:type="gramStart"/>
-      <w:r>
-        <w:rPr>
-          <w:sz w:val="24"/>
-          <w:szCs w:val="22"/>
-          <w:lang w:val="en-US"/>
-        </w:rPr>
-        <w:t>isSelected(</w:t>
-      </w:r>
-      <w:proofErr w:type="gramEnd"/>
-      <w:r>
-        <w:rPr>
-          <w:sz w:val="24"/>
-          <w:szCs w:val="22"/>
-          <w:lang w:val="en-US"/>
-        </w:rPr>
-        <w:t xml:space="preserve">) </w:t>
+      <w:r>
+        <w:rPr>
+          <w:sz w:val="24"/>
+          <w:szCs w:val="22"/>
+          <w:lang w:val="en-US"/>
+        </w:rPr>
+        <w:t xml:space="preserve">isSelected() </w:t>
       </w:r>
       <w:r>
         <w:rPr>
@@ -4304,23 +4086,13 @@
           <w:lang w:val="en-US"/>
         </w:rPr>
       </w:pPr>
-      <w:proofErr w:type="gramStart"/>
-      <w:r>
-        <w:rPr>
-          <w:sz w:val="24"/>
-          <w:szCs w:val="22"/>
-          <w:lang w:val="en-US"/>
-        </w:rPr>
-        <w:t>isEnabled(</w:t>
-      </w:r>
-      <w:proofErr w:type="gramEnd"/>
-      <w:r>
-        <w:rPr>
-          <w:sz w:val="24"/>
-          <w:szCs w:val="22"/>
-          <w:lang w:val="en-US"/>
-        </w:rPr>
-        <w:t xml:space="preserve">) </w:t>
+      <w:r>
+        <w:rPr>
+          <w:sz w:val="24"/>
+          <w:szCs w:val="22"/>
+          <w:lang w:val="en-US"/>
+        </w:rPr>
+        <w:t xml:space="preserve">isEnabled() </w:t>
       </w:r>
       <w:r>
         <w:rPr>
@@ -4390,23 +4162,13 @@
           <w:lang w:val="en-US"/>
         </w:rPr>
       </w:pPr>
-      <w:proofErr w:type="gramStart"/>
-      <w:r>
-        <w:rPr>
-          <w:sz w:val="24"/>
-          <w:szCs w:val="22"/>
-          <w:lang w:val="en-US"/>
-        </w:rPr>
-        <w:t>clear(</w:t>
-      </w:r>
-      <w:proofErr w:type="gramEnd"/>
-      <w:r>
-        <w:rPr>
-          <w:sz w:val="24"/>
-          <w:szCs w:val="22"/>
-          <w:lang w:val="en-US"/>
-        </w:rPr>
-        <w:t xml:space="preserve">) </w:t>
+      <w:r>
+        <w:rPr>
+          <w:sz w:val="24"/>
+          <w:szCs w:val="22"/>
+          <w:lang w:val="en-US"/>
+        </w:rPr>
+        <w:t xml:space="preserve">clear() </w:t>
       </w:r>
       <w:r>
         <w:rPr>
@@ -5502,23 +5264,13 @@
           <w:lang w:val="en-US"/>
         </w:rPr>
       </w:pPr>
-      <w:proofErr w:type="gramStart"/>
-      <w:r>
-        <w:rPr>
-          <w:sz w:val="24"/>
-          <w:szCs w:val="22"/>
-          <w:lang w:val="en-US"/>
-        </w:rPr>
-        <w:t>getFirstSelectedOption(</w:t>
-      </w:r>
-      <w:proofErr w:type="gramEnd"/>
-      <w:r>
-        <w:rPr>
-          <w:sz w:val="24"/>
-          <w:szCs w:val="22"/>
-          <w:lang w:val="en-US"/>
-        </w:rPr>
-        <w:t xml:space="preserve">) </w:t>
+      <w:r>
+        <w:rPr>
+          <w:sz w:val="24"/>
+          <w:szCs w:val="22"/>
+          <w:lang w:val="en-US"/>
+        </w:rPr>
+        <w:t xml:space="preserve">getFirstSelectedOption() </w:t>
       </w:r>
       <w:r>
         <w:rPr>
@@ -5566,23 +5318,13 @@
           <w:lang w:val="en-US"/>
         </w:rPr>
       </w:pPr>
-      <w:proofErr w:type="gramStart"/>
-      <w:r>
-        <w:rPr>
-          <w:sz w:val="24"/>
-          <w:szCs w:val="22"/>
-          <w:lang w:val="en-US"/>
-        </w:rPr>
-        <w:t>getOptions(</w:t>
-      </w:r>
-      <w:proofErr w:type="gramEnd"/>
-      <w:r>
-        <w:rPr>
-          <w:sz w:val="24"/>
-          <w:szCs w:val="22"/>
-          <w:lang w:val="en-US"/>
-        </w:rPr>
-        <w:t xml:space="preserve">) </w:t>
+      <w:r>
+        <w:rPr>
+          <w:sz w:val="24"/>
+          <w:szCs w:val="22"/>
+          <w:lang w:val="en-US"/>
+        </w:rPr>
+        <w:t xml:space="preserve">getOptions() </w:t>
       </w:r>
       <w:r>
         <w:rPr>
@@ -5614,23 +5356,13 @@
           <w:lang w:val="en-US"/>
         </w:rPr>
       </w:pPr>
-      <w:proofErr w:type="gramStart"/>
-      <w:r>
-        <w:rPr>
-          <w:sz w:val="24"/>
-          <w:szCs w:val="22"/>
-          <w:lang w:val="en-US"/>
-        </w:rPr>
-        <w:t>selectByVisibleText(</w:t>
-      </w:r>
-      <w:proofErr w:type="gramEnd"/>
-      <w:r>
-        <w:rPr>
-          <w:sz w:val="24"/>
-          <w:szCs w:val="22"/>
-          <w:lang w:val="en-US"/>
-        </w:rPr>
-        <w:t xml:space="preserve">) </w:t>
+      <w:r>
+        <w:rPr>
+          <w:sz w:val="24"/>
+          <w:szCs w:val="22"/>
+          <w:lang w:val="en-US"/>
+        </w:rPr>
+        <w:t xml:space="preserve">selectByVisibleText() </w:t>
       </w:r>
       <w:r>
         <w:rPr>
@@ -5662,23 +5394,13 @@
           <w:lang w:val="en-US"/>
         </w:rPr>
       </w:pPr>
-      <w:proofErr w:type="gramStart"/>
-      <w:r>
-        <w:rPr>
-          <w:sz w:val="24"/>
-          <w:szCs w:val="22"/>
-          <w:lang w:val="en-US"/>
-        </w:rPr>
-        <w:t>selectByContainsVisibleText(</w:t>
-      </w:r>
-      <w:proofErr w:type="gramEnd"/>
-      <w:r>
-        <w:rPr>
-          <w:sz w:val="24"/>
-          <w:szCs w:val="22"/>
-          <w:lang w:val="en-US"/>
-        </w:rPr>
-        <w:t xml:space="preserve">) </w:t>
+      <w:r>
+        <w:rPr>
+          <w:sz w:val="24"/>
+          <w:szCs w:val="22"/>
+          <w:lang w:val="en-US"/>
+        </w:rPr>
+        <w:t xml:space="preserve">selectByContainsVisibleText() </w:t>
       </w:r>
       <w:r>
         <w:rPr>
@@ -5710,23 +5432,13 @@
           <w:lang w:val="en-US"/>
         </w:rPr>
       </w:pPr>
-      <w:proofErr w:type="gramStart"/>
-      <w:r>
-        <w:rPr>
-          <w:sz w:val="24"/>
-          <w:szCs w:val="22"/>
-          <w:lang w:val="en-US"/>
-        </w:rPr>
-        <w:t>selectByValue(</w:t>
-      </w:r>
-      <w:proofErr w:type="gramEnd"/>
-      <w:r>
-        <w:rPr>
-          <w:sz w:val="24"/>
-          <w:szCs w:val="22"/>
-          <w:lang w:val="en-US"/>
-        </w:rPr>
-        <w:t xml:space="preserve">) </w:t>
+      <w:r>
+        <w:rPr>
+          <w:sz w:val="24"/>
+          <w:szCs w:val="22"/>
+          <w:lang w:val="en-US"/>
+        </w:rPr>
+        <w:t xml:space="preserve">selectByValue() </w:t>
       </w:r>
       <w:r>
         <w:rPr>
@@ -5758,23 +5470,13 @@
           <w:lang w:val="en-US"/>
         </w:rPr>
       </w:pPr>
-      <w:proofErr w:type="gramStart"/>
-      <w:r>
-        <w:rPr>
-          <w:sz w:val="24"/>
-          <w:szCs w:val="22"/>
-          <w:lang w:val="en-US"/>
-        </w:rPr>
-        <w:t>selectByIndex(</w:t>
-      </w:r>
-      <w:proofErr w:type="gramEnd"/>
-      <w:r>
-        <w:rPr>
-          <w:sz w:val="24"/>
-          <w:szCs w:val="22"/>
-          <w:lang w:val="en-US"/>
-        </w:rPr>
-        <w:t xml:space="preserve">) </w:t>
+      <w:r>
+        <w:rPr>
+          <w:sz w:val="24"/>
+          <w:szCs w:val="22"/>
+          <w:lang w:val="en-US"/>
+        </w:rPr>
+        <w:t xml:space="preserve">selectByIndex() </w:t>
       </w:r>
       <w:r>
         <w:rPr>
@@ -5806,23 +5508,13 @@
           <w:lang w:val="en-US"/>
         </w:rPr>
       </w:pPr>
-      <w:proofErr w:type="gramStart"/>
-      <w:r>
-        <w:rPr>
-          <w:sz w:val="24"/>
-          <w:szCs w:val="22"/>
-          <w:lang w:val="en-US"/>
-        </w:rPr>
-        <w:t>getAllSelectedOptions(</w:t>
-      </w:r>
-      <w:proofErr w:type="gramEnd"/>
-      <w:r>
-        <w:rPr>
-          <w:sz w:val="24"/>
-          <w:szCs w:val="22"/>
-          <w:lang w:val="en-US"/>
-        </w:rPr>
-        <w:t xml:space="preserve">) </w:t>
+      <w:r>
+        <w:rPr>
+          <w:sz w:val="24"/>
+          <w:szCs w:val="22"/>
+          <w:lang w:val="en-US"/>
+        </w:rPr>
+        <w:t xml:space="preserve">getAllSelectedOptions() </w:t>
       </w:r>
       <w:r>
         <w:rPr>
@@ -5862,23 +5554,13 @@
           <w:lang w:val="en-US"/>
         </w:rPr>
       </w:pPr>
-      <w:proofErr w:type="gramStart"/>
-      <w:r>
-        <w:rPr>
-          <w:sz w:val="24"/>
-          <w:szCs w:val="22"/>
-          <w:lang w:val="en-US"/>
-        </w:rPr>
-        <w:t>isMultiple(</w:t>
-      </w:r>
-      <w:proofErr w:type="gramEnd"/>
-      <w:r>
-        <w:rPr>
-          <w:sz w:val="24"/>
-          <w:szCs w:val="22"/>
-          <w:lang w:val="en-US"/>
-        </w:rPr>
-        <w:t xml:space="preserve">) </w:t>
+      <w:r>
+        <w:rPr>
+          <w:sz w:val="24"/>
+          <w:szCs w:val="22"/>
+          <w:lang w:val="en-US"/>
+        </w:rPr>
+        <w:t xml:space="preserve">isMultiple() </w:t>
       </w:r>
       <w:r>
         <w:rPr>
@@ -6067,33 +5749,13 @@
           <w:lang w:val="en-US"/>
         </w:rPr>
       </w:pPr>
-      <w:proofErr w:type="spellStart"/>
-      <w:proofErr w:type="gramStart"/>
-      <w:r>
-        <w:rPr>
-          <w:sz w:val="24"/>
-          <w:szCs w:val="22"/>
-          <w:lang w:val="en-US"/>
-        </w:rPr>
-        <w:t>Thread.sleep</w:t>
-      </w:r>
-      <w:proofErr w:type="spellEnd"/>
-      <w:r>
-        <w:rPr>
-          <w:sz w:val="24"/>
-          <w:szCs w:val="22"/>
-          <w:lang w:val="en-US"/>
-        </w:rPr>
-        <w:t>(</w:t>
-      </w:r>
-      <w:proofErr w:type="gramEnd"/>
-      <w:r>
-        <w:rPr>
-          <w:sz w:val="24"/>
-          <w:szCs w:val="22"/>
-          <w:lang w:val="en-US"/>
-        </w:rPr>
-        <w:t>)</w:t>
+      <w:r>
+        <w:rPr>
+          <w:sz w:val="24"/>
+          <w:szCs w:val="22"/>
+          <w:lang w:val="en-US"/>
+        </w:rPr>
+        <w:t>Thread.sleep()</w:t>
       </w:r>
       <w:r>
         <w:rPr>
@@ -6527,24 +6189,7 @@
           <w:lang w:val="en-US"/>
         </w:rPr>
         <w:br/>
-      </w:r>
-      <w:proofErr w:type="spellStart"/>
-      <w:r>
-        <w:rPr>
-          <w:sz w:val="24"/>
-          <w:szCs w:val="22"/>
-          <w:lang w:val="en-US"/>
-        </w:rPr>
-        <w:t>i</w:t>
-      </w:r>
-      <w:proofErr w:type="spellEnd"/>
-      <w:r>
-        <w:rPr>
-          <w:sz w:val="24"/>
-          <w:szCs w:val="22"/>
-          <w:lang w:val="en-US"/>
-        </w:rPr>
-        <w:t xml:space="preserve"> – ignoring </w:t>
+        <w:t xml:space="preserve">i – ignoring </w:t>
       </w:r>
       <w:r>
         <w:rPr>
@@ -6634,25 +6279,7 @@
           <w:szCs w:val="22"/>
           <w:lang w:val="en-US"/>
         </w:rPr>
-        <w:t>&lt;</w:t>
-      </w:r>
-      <w:proofErr w:type="gramStart"/>
-      <w:r>
-        <w:rPr>
-          <w:sz w:val="24"/>
-          <w:szCs w:val="22"/>
-          <w:lang w:val="en-US"/>
-        </w:rPr>
-        <w:t>table</w:t>
-      </w:r>
-      <w:proofErr w:type="gramEnd"/>
-      <w:r>
-        <w:rPr>
-          <w:sz w:val="24"/>
-          <w:szCs w:val="22"/>
-          <w:lang w:val="en-US"/>
-        </w:rPr>
-        <w:t>&gt;</w:t>
+        <w:t>&lt;table&gt;</w:t>
       </w:r>
     </w:p>
     <w:p>
@@ -6670,27 +6297,7 @@
           <w:lang w:val="en-US"/>
         </w:rPr>
         <w:tab/>
-        <w:t>&lt;</w:t>
-      </w:r>
-      <w:proofErr w:type="spellStart"/>
-      <w:proofErr w:type="gramStart"/>
-      <w:r>
-        <w:rPr>
-          <w:sz w:val="24"/>
-          <w:szCs w:val="22"/>
-          <w:lang w:val="en-US"/>
-        </w:rPr>
-        <w:t>thead</w:t>
-      </w:r>
-      <w:proofErr w:type="spellEnd"/>
-      <w:proofErr w:type="gramEnd"/>
-      <w:r>
-        <w:rPr>
-          <w:sz w:val="24"/>
-          <w:szCs w:val="22"/>
-          <w:lang w:val="en-US"/>
-        </w:rPr>
-        <w:t>&gt;</w:t>
+        <w:t>&lt;thead&gt;</w:t>
       </w:r>
       <w:r>
         <w:rPr>
@@ -6725,27 +6332,7 @@
           <w:lang w:val="en-US"/>
         </w:rPr>
         <w:tab/>
-        <w:t>&lt;</w:t>
-      </w:r>
-      <w:proofErr w:type="spellStart"/>
-      <w:proofErr w:type="gramStart"/>
-      <w:r>
-        <w:rPr>
-          <w:sz w:val="24"/>
-          <w:szCs w:val="22"/>
-          <w:lang w:val="en-US"/>
-        </w:rPr>
-        <w:t>tr</w:t>
-      </w:r>
-      <w:proofErr w:type="spellEnd"/>
-      <w:proofErr w:type="gramEnd"/>
-      <w:r>
-        <w:rPr>
-          <w:sz w:val="24"/>
-          <w:szCs w:val="22"/>
-          <w:lang w:val="en-US"/>
-        </w:rPr>
-        <w:t>&gt;</w:t>
+        <w:t>&lt;tr&gt;</w:t>
       </w:r>
       <w:r>
         <w:rPr>
@@ -6788,63 +6375,7 @@
           <w:lang w:val="en-US"/>
         </w:rPr>
         <w:tab/>
-        <w:t>&lt;</w:t>
-      </w:r>
-      <w:proofErr w:type="spellStart"/>
-      <w:proofErr w:type="gramStart"/>
-      <w:r>
-        <w:rPr>
-          <w:sz w:val="24"/>
-          <w:szCs w:val="22"/>
-          <w:lang w:val="en-US"/>
-        </w:rPr>
-        <w:t>th</w:t>
-      </w:r>
-      <w:proofErr w:type="spellEnd"/>
-      <w:r>
-        <w:rPr>
-          <w:sz w:val="24"/>
-          <w:szCs w:val="22"/>
-          <w:lang w:val="en-US"/>
-        </w:rPr>
-        <w:t>&gt;</w:t>
-      </w:r>
-      <w:proofErr w:type="spellStart"/>
-      <w:proofErr w:type="gramEnd"/>
-      <w:r>
-        <w:rPr>
-          <w:sz w:val="24"/>
-          <w:szCs w:val="22"/>
-          <w:lang w:val="en-US"/>
-        </w:rPr>
-        <w:t>Sr</w:t>
-      </w:r>
-      <w:proofErr w:type="spellEnd"/>
-      <w:r>
-        <w:rPr>
-          <w:sz w:val="24"/>
-          <w:szCs w:val="22"/>
-          <w:lang w:val="en-US"/>
-        </w:rPr>
-        <w:t xml:space="preserve"> No&lt;/</w:t>
-      </w:r>
-      <w:proofErr w:type="spellStart"/>
-      <w:r>
-        <w:rPr>
-          <w:sz w:val="24"/>
-          <w:szCs w:val="22"/>
-          <w:lang w:val="en-US"/>
-        </w:rPr>
-        <w:t>th</w:t>
-      </w:r>
-      <w:proofErr w:type="spellEnd"/>
-      <w:r>
-        <w:rPr>
-          <w:sz w:val="24"/>
-          <w:szCs w:val="22"/>
-          <w:lang w:val="en-US"/>
-        </w:rPr>
-        <w:t>&gt;</w:t>
+        <w:t>&lt;th&gt;Sr No&lt;/th&gt;</w:t>
       </w:r>
       <w:r>
         <w:rPr>
@@ -6887,53 +6418,7 @@
           <w:lang w:val="en-US"/>
         </w:rPr>
         <w:tab/>
-        <w:t>&lt;</w:t>
-      </w:r>
-      <w:proofErr w:type="spellStart"/>
-      <w:proofErr w:type="gramStart"/>
-      <w:r>
-        <w:rPr>
-          <w:sz w:val="24"/>
-          <w:szCs w:val="22"/>
-          <w:lang w:val="en-US"/>
-        </w:rPr>
-        <w:t>th</w:t>
-      </w:r>
-      <w:proofErr w:type="spellEnd"/>
-      <w:r>
-        <w:rPr>
-          <w:sz w:val="24"/>
-          <w:szCs w:val="22"/>
-          <w:lang w:val="en-US"/>
-        </w:rPr>
-        <w:t>&gt;</w:t>
-      </w:r>
-      <w:proofErr w:type="gramEnd"/>
-      <w:r>
-        <w:rPr>
-          <w:sz w:val="24"/>
-          <w:szCs w:val="22"/>
-          <w:lang w:val="en-US"/>
-        </w:rPr>
-        <w:t>Company&lt;/</w:t>
-      </w:r>
-      <w:proofErr w:type="spellStart"/>
-      <w:r>
-        <w:rPr>
-          <w:sz w:val="24"/>
-          <w:szCs w:val="22"/>
-          <w:lang w:val="en-US"/>
-        </w:rPr>
-        <w:t>th</w:t>
-      </w:r>
-      <w:proofErr w:type="spellEnd"/>
-      <w:r>
-        <w:rPr>
-          <w:sz w:val="24"/>
-          <w:szCs w:val="22"/>
-          <w:lang w:val="en-US"/>
-        </w:rPr>
-        <w:t>&gt;</w:t>
+        <w:t>&lt;th&gt;Company&lt;/th&gt;</w:t>
       </w:r>
     </w:p>
     <w:p>
@@ -6959,27 +6444,7 @@
           <w:lang w:val="en-US"/>
         </w:rPr>
         <w:tab/>
-        <w:t>&lt;/</w:t>
-      </w:r>
-      <w:proofErr w:type="spellStart"/>
-      <w:proofErr w:type="gramStart"/>
-      <w:r>
-        <w:rPr>
-          <w:sz w:val="24"/>
-          <w:szCs w:val="22"/>
-          <w:lang w:val="en-US"/>
-        </w:rPr>
-        <w:t>tr</w:t>
-      </w:r>
-      <w:proofErr w:type="spellEnd"/>
-      <w:proofErr w:type="gramEnd"/>
-      <w:r>
-        <w:rPr>
-          <w:sz w:val="24"/>
-          <w:szCs w:val="22"/>
-          <w:lang w:val="en-US"/>
-        </w:rPr>
-        <w:t>&gt;</w:t>
+        <w:t>&lt;/tr&gt;</w:t>
       </w:r>
     </w:p>
     <w:p>
@@ -6997,25 +6462,7 @@
           <w:lang w:val="en-US"/>
         </w:rPr>
         <w:tab/>
-        <w:t>&lt;/</w:t>
-      </w:r>
-      <w:proofErr w:type="spellStart"/>
-      <w:r>
-        <w:rPr>
-          <w:sz w:val="24"/>
-          <w:szCs w:val="22"/>
-          <w:lang w:val="en-US"/>
-        </w:rPr>
-        <w:t>thead</w:t>
-      </w:r>
-      <w:proofErr w:type="spellEnd"/>
-      <w:r>
-        <w:rPr>
-          <w:sz w:val="24"/>
-          <w:szCs w:val="22"/>
-          <w:lang w:val="en-US"/>
-        </w:rPr>
-        <w:t>&gt;</w:t>
+        <w:t>&lt;/thead&gt;</w:t>
       </w:r>
     </w:p>
     <w:p>
@@ -7033,27 +6480,7 @@
           <w:lang w:val="en-US"/>
         </w:rPr>
         <w:tab/>
-        <w:t>&lt;</w:t>
-      </w:r>
-      <w:proofErr w:type="spellStart"/>
-      <w:proofErr w:type="gramStart"/>
-      <w:r>
-        <w:rPr>
-          <w:sz w:val="24"/>
-          <w:szCs w:val="22"/>
-          <w:lang w:val="en-US"/>
-        </w:rPr>
-        <w:t>tbody</w:t>
-      </w:r>
-      <w:proofErr w:type="spellEnd"/>
-      <w:proofErr w:type="gramEnd"/>
-      <w:r>
-        <w:rPr>
-          <w:sz w:val="24"/>
-          <w:szCs w:val="22"/>
-          <w:lang w:val="en-US"/>
-        </w:rPr>
-        <w:t>&gt;</w:t>
+        <w:t>&lt;tbody&gt;</w:t>
       </w:r>
       <w:r>
         <w:rPr>
@@ -7088,27 +6515,7 @@
           <w:lang w:val="en-US"/>
         </w:rPr>
         <w:tab/>
-        <w:t>&lt;</w:t>
-      </w:r>
-      <w:proofErr w:type="spellStart"/>
-      <w:proofErr w:type="gramStart"/>
-      <w:r>
-        <w:rPr>
-          <w:sz w:val="24"/>
-          <w:szCs w:val="22"/>
-          <w:lang w:val="en-US"/>
-        </w:rPr>
-        <w:t>tr</w:t>
-      </w:r>
-      <w:proofErr w:type="spellEnd"/>
-      <w:proofErr w:type="gramEnd"/>
-      <w:r>
-        <w:rPr>
-          <w:sz w:val="24"/>
-          <w:szCs w:val="22"/>
-          <w:lang w:val="en-US"/>
-        </w:rPr>
-        <w:t>&gt;</w:t>
+        <w:t>&lt;tr&gt;</w:t>
       </w:r>
     </w:p>
     <w:p>
@@ -7142,25 +6549,7 @@
           <w:lang w:val="en-US"/>
         </w:rPr>
         <w:tab/>
-        <w:t>&lt;</w:t>
-      </w:r>
-      <w:proofErr w:type="gramStart"/>
-      <w:r>
-        <w:rPr>
-          <w:sz w:val="24"/>
-          <w:szCs w:val="22"/>
-          <w:lang w:val="en-US"/>
-        </w:rPr>
-        <w:t>td&gt;</w:t>
-      </w:r>
-      <w:proofErr w:type="gramEnd"/>
-      <w:r>
-        <w:rPr>
-          <w:sz w:val="24"/>
-          <w:szCs w:val="22"/>
-          <w:lang w:val="en-US"/>
-        </w:rPr>
-        <w:t>1&lt;/td&gt;</w:t>
+        <w:t>&lt;td&gt;1&lt;/td&gt;</w:t>
       </w:r>
     </w:p>
     <w:p>
@@ -7194,35 +6583,7 @@
           <w:lang w:val="en-US"/>
         </w:rPr>
         <w:tab/>
-        <w:t>&lt;</w:t>
-      </w:r>
-      <w:proofErr w:type="gramStart"/>
-      <w:r>
-        <w:rPr>
-          <w:sz w:val="24"/>
-          <w:szCs w:val="22"/>
-          <w:lang w:val="en-US"/>
-        </w:rPr>
-        <w:t>td&gt;</w:t>
-      </w:r>
-      <w:proofErr w:type="spellStart"/>
-      <w:proofErr w:type="gramEnd"/>
-      <w:r>
-        <w:rPr>
-          <w:sz w:val="24"/>
-          <w:szCs w:val="22"/>
-          <w:lang w:val="en-US"/>
-        </w:rPr>
-        <w:t>AViIT</w:t>
-      </w:r>
-      <w:proofErr w:type="spellEnd"/>
-      <w:r>
-        <w:rPr>
-          <w:sz w:val="24"/>
-          <w:szCs w:val="22"/>
-          <w:lang w:val="en-US"/>
-        </w:rPr>
-        <w:t>&lt;/td&gt;</w:t>
+        <w:t>&lt;td&gt;AViIT&lt;/td&gt;</w:t>
       </w:r>
     </w:p>
     <w:p>
@@ -7248,27 +6609,7 @@
           <w:lang w:val="en-US"/>
         </w:rPr>
         <w:tab/>
-        <w:t>&lt;/</w:t>
-      </w:r>
-      <w:proofErr w:type="spellStart"/>
-      <w:proofErr w:type="gramStart"/>
-      <w:r>
-        <w:rPr>
-          <w:sz w:val="24"/>
-          <w:szCs w:val="22"/>
-          <w:lang w:val="en-US"/>
-        </w:rPr>
-        <w:t>tr</w:t>
-      </w:r>
-      <w:proofErr w:type="spellEnd"/>
-      <w:proofErr w:type="gramEnd"/>
-      <w:r>
-        <w:rPr>
-          <w:sz w:val="24"/>
-          <w:szCs w:val="22"/>
-          <w:lang w:val="en-US"/>
-        </w:rPr>
-        <w:t>&gt;</w:t>
+        <w:t>&lt;/tr&gt;</w:t>
       </w:r>
     </w:p>
     <w:p>
@@ -7294,27 +6635,7 @@
           <w:lang w:val="en-US"/>
         </w:rPr>
         <w:tab/>
-        <w:t>&lt;</w:t>
-      </w:r>
-      <w:proofErr w:type="spellStart"/>
-      <w:proofErr w:type="gramStart"/>
-      <w:r>
-        <w:rPr>
-          <w:sz w:val="24"/>
-          <w:szCs w:val="22"/>
-          <w:lang w:val="en-US"/>
-        </w:rPr>
-        <w:t>tr</w:t>
-      </w:r>
-      <w:proofErr w:type="spellEnd"/>
-      <w:proofErr w:type="gramEnd"/>
-      <w:r>
-        <w:rPr>
-          <w:sz w:val="24"/>
-          <w:szCs w:val="22"/>
-          <w:lang w:val="en-US"/>
-        </w:rPr>
-        <w:t>&gt;</w:t>
+        <w:t>&lt;tr&gt;</w:t>
       </w:r>
     </w:p>
     <w:p>
@@ -7348,25 +6669,7 @@
           <w:lang w:val="en-US"/>
         </w:rPr>
         <w:tab/>
-        <w:t>&lt;</w:t>
-      </w:r>
-      <w:proofErr w:type="gramStart"/>
-      <w:r>
-        <w:rPr>
-          <w:sz w:val="24"/>
-          <w:szCs w:val="22"/>
-          <w:lang w:val="en-US"/>
-        </w:rPr>
-        <w:t>td&gt;</w:t>
-      </w:r>
-      <w:proofErr w:type="gramEnd"/>
-      <w:r>
-        <w:rPr>
-          <w:sz w:val="24"/>
-          <w:szCs w:val="22"/>
-          <w:lang w:val="en-US"/>
-        </w:rPr>
-        <w:t>2&lt;/td&gt;</w:t>
+        <w:t>&lt;td&gt;2&lt;/td&gt;</w:t>
       </w:r>
     </w:p>
     <w:p>
@@ -7400,35 +6703,7 @@
           <w:lang w:val="en-US"/>
         </w:rPr>
         <w:tab/>
-        <w:t>&lt;</w:t>
-      </w:r>
-      <w:proofErr w:type="gramStart"/>
-      <w:r>
-        <w:rPr>
-          <w:sz w:val="24"/>
-          <w:szCs w:val="22"/>
-          <w:lang w:val="en-US"/>
-        </w:rPr>
-        <w:t>td&gt;</w:t>
-      </w:r>
-      <w:proofErr w:type="spellStart"/>
-      <w:proofErr w:type="gramEnd"/>
-      <w:r>
-        <w:rPr>
-          <w:sz w:val="24"/>
-          <w:szCs w:val="22"/>
-          <w:lang w:val="en-US"/>
-        </w:rPr>
-        <w:t>Manorama</w:t>
-      </w:r>
-      <w:proofErr w:type="spellEnd"/>
-      <w:r>
-        <w:rPr>
-          <w:sz w:val="24"/>
-          <w:szCs w:val="22"/>
-          <w:lang w:val="en-US"/>
-        </w:rPr>
-        <w:t>&lt;/td</w:t>
+        <w:t>&lt;td&gt;Manorama&lt;/td</w:t>
       </w:r>
     </w:p>
     <w:p>
@@ -7454,27 +6729,7 @@
           <w:lang w:val="en-US"/>
         </w:rPr>
         <w:tab/>
-        <w:t>&lt;/</w:t>
-      </w:r>
-      <w:proofErr w:type="spellStart"/>
-      <w:proofErr w:type="gramStart"/>
-      <w:r>
-        <w:rPr>
-          <w:sz w:val="24"/>
-          <w:szCs w:val="22"/>
-          <w:lang w:val="en-US"/>
-        </w:rPr>
-        <w:t>tr</w:t>
-      </w:r>
-      <w:proofErr w:type="spellEnd"/>
-      <w:proofErr w:type="gramEnd"/>
-      <w:r>
-        <w:rPr>
-          <w:sz w:val="24"/>
-          <w:szCs w:val="22"/>
-          <w:lang w:val="en-US"/>
-        </w:rPr>
-        <w:t>&gt;</w:t>
+        <w:t>&lt;/tr&gt;</w:t>
       </w:r>
     </w:p>
     <w:p>
@@ -7492,25 +6747,7 @@
           <w:lang w:val="en-US"/>
         </w:rPr>
         <w:tab/>
-        <w:t>&lt;/</w:t>
-      </w:r>
-      <w:proofErr w:type="spellStart"/>
-      <w:r>
-        <w:rPr>
-          <w:sz w:val="24"/>
-          <w:szCs w:val="22"/>
-          <w:lang w:val="en-US"/>
-        </w:rPr>
-        <w:t>tbody</w:t>
-      </w:r>
-      <w:proofErr w:type="spellEnd"/>
-      <w:r>
-        <w:rPr>
-          <w:sz w:val="24"/>
-          <w:szCs w:val="22"/>
-          <w:lang w:val="en-US"/>
-        </w:rPr>
-        <w:t>&gt;</w:t>
+        <w:t>&lt;/tbody&gt;</w:t>
       </w:r>
     </w:p>
     <w:p>
@@ -7610,25 +6847,7 @@
           <w:szCs w:val="22"/>
           <w:lang w:val="en-US"/>
         </w:rPr>
-        <w:t>For uploading any file with this control simply call .</w:t>
-      </w:r>
-      <w:proofErr w:type="gramStart"/>
-      <w:r>
-        <w:rPr>
-          <w:sz w:val="24"/>
-          <w:szCs w:val="22"/>
-          <w:lang w:val="en-US"/>
-        </w:rPr>
-        <w:t>sendKeys(</w:t>
-      </w:r>
-      <w:proofErr w:type="gramEnd"/>
-      <w:r>
-        <w:rPr>
-          <w:sz w:val="24"/>
-          <w:szCs w:val="22"/>
-          <w:lang w:val="en-US"/>
-        </w:rPr>
-        <w:t>) method.</w:t>
+        <w:t>For uploading any file with this control simply call .sendKeys() method.</w:t>
       </w:r>
     </w:p>
     <w:p>
@@ -7650,25 +6869,7 @@
           <w:szCs w:val="22"/>
           <w:lang w:val="en-US"/>
         </w:rPr>
-        <w:t>While calling .</w:t>
-      </w:r>
-      <w:proofErr w:type="gramStart"/>
-      <w:r>
-        <w:rPr>
-          <w:sz w:val="24"/>
-          <w:szCs w:val="22"/>
-          <w:lang w:val="en-US"/>
-        </w:rPr>
-        <w:t>sendKeys(</w:t>
-      </w:r>
-      <w:proofErr w:type="gramEnd"/>
-      <w:r>
-        <w:rPr>
-          <w:sz w:val="24"/>
-          <w:szCs w:val="22"/>
-          <w:lang w:val="en-US"/>
-        </w:rPr>
-        <w:t>) method pass the full path of the file.</w:t>
+        <w:t>While calling .sendKeys() method pass the full path of the file.</w:t>
       </w:r>
     </w:p>
     <w:p>
@@ -8048,23 +7249,13 @@
           <w:lang w:val="en-US"/>
         </w:rPr>
       </w:pPr>
-      <w:proofErr w:type="gramStart"/>
-      <w:r>
-        <w:rPr>
-          <w:sz w:val="24"/>
-          <w:szCs w:val="22"/>
-          <w:lang w:val="en-US"/>
-        </w:rPr>
-        <w:t>moveToElement(</w:t>
-      </w:r>
-      <w:proofErr w:type="gramEnd"/>
-      <w:r>
-        <w:rPr>
-          <w:sz w:val="24"/>
-          <w:szCs w:val="22"/>
-          <w:lang w:val="en-US"/>
-        </w:rPr>
-        <w:t xml:space="preserve">) </w:t>
+      <w:r>
+        <w:rPr>
+          <w:sz w:val="24"/>
+          <w:szCs w:val="22"/>
+          <w:lang w:val="en-US"/>
+        </w:rPr>
+        <w:t xml:space="preserve">moveToElement() </w:t>
       </w:r>
       <w:r>
         <w:rPr>
@@ -8096,23 +7287,13 @@
           <w:lang w:val="en-US"/>
         </w:rPr>
       </w:pPr>
-      <w:proofErr w:type="gramStart"/>
-      <w:r>
-        <w:rPr>
-          <w:sz w:val="24"/>
-          <w:szCs w:val="22"/>
-          <w:lang w:val="en-US"/>
-        </w:rPr>
-        <w:t>perform(</w:t>
-      </w:r>
-      <w:proofErr w:type="gramEnd"/>
-      <w:r>
-        <w:rPr>
-          <w:sz w:val="24"/>
-          <w:szCs w:val="22"/>
-          <w:lang w:val="en-US"/>
-        </w:rPr>
-        <w:t xml:space="preserve">) </w:t>
+      <w:r>
+        <w:rPr>
+          <w:sz w:val="24"/>
+          <w:szCs w:val="22"/>
+          <w:lang w:val="en-US"/>
+        </w:rPr>
+        <w:t xml:space="preserve">perform() </w:t>
       </w:r>
       <w:r>
         <w:rPr>
@@ -8144,23 +7325,13 @@
           <w:lang w:val="en-US"/>
         </w:rPr>
       </w:pPr>
-      <w:proofErr w:type="gramStart"/>
-      <w:r>
-        <w:rPr>
-          <w:sz w:val="24"/>
-          <w:szCs w:val="22"/>
-          <w:lang w:val="en-US"/>
-        </w:rPr>
-        <w:t>contextClick(</w:t>
-      </w:r>
-      <w:proofErr w:type="gramEnd"/>
-      <w:r>
-        <w:rPr>
-          <w:sz w:val="24"/>
-          <w:szCs w:val="22"/>
-          <w:lang w:val="en-US"/>
-        </w:rPr>
-        <w:t xml:space="preserve">) </w:t>
+      <w:r>
+        <w:rPr>
+          <w:sz w:val="24"/>
+          <w:szCs w:val="22"/>
+          <w:lang w:val="en-US"/>
+        </w:rPr>
+        <w:t xml:space="preserve">contextClick() </w:t>
       </w:r>
       <w:r>
         <w:rPr>
@@ -8192,23 +7363,13 @@
           <w:lang w:val="en-US"/>
         </w:rPr>
       </w:pPr>
-      <w:proofErr w:type="gramStart"/>
-      <w:r>
-        <w:rPr>
-          <w:sz w:val="24"/>
-          <w:szCs w:val="22"/>
-          <w:lang w:val="en-US"/>
-        </w:rPr>
-        <w:t>doubleClick(</w:t>
-      </w:r>
-      <w:proofErr w:type="gramEnd"/>
-      <w:r>
-        <w:rPr>
-          <w:sz w:val="24"/>
-          <w:szCs w:val="22"/>
-          <w:lang w:val="en-US"/>
-        </w:rPr>
-        <w:t xml:space="preserve">) </w:t>
+      <w:r>
+        <w:rPr>
+          <w:sz w:val="24"/>
+          <w:szCs w:val="22"/>
+          <w:lang w:val="en-US"/>
+        </w:rPr>
+        <w:t xml:space="preserve">doubleClick() </w:t>
       </w:r>
       <w:r>
         <w:rPr>
@@ -8240,23 +7401,13 @@
           <w:lang w:val="en-US"/>
         </w:rPr>
       </w:pPr>
-      <w:proofErr w:type="gramStart"/>
-      <w:r>
-        <w:rPr>
-          <w:sz w:val="24"/>
-          <w:szCs w:val="22"/>
-          <w:lang w:val="en-US"/>
-        </w:rPr>
-        <w:t>dragAndDrop(</w:t>
-      </w:r>
-      <w:proofErr w:type="gramEnd"/>
-      <w:r>
-        <w:rPr>
-          <w:sz w:val="24"/>
-          <w:szCs w:val="22"/>
-          <w:lang w:val="en-US"/>
-        </w:rPr>
-        <w:t xml:space="preserve">) </w:t>
+      <w:r>
+        <w:rPr>
+          <w:sz w:val="24"/>
+          <w:szCs w:val="22"/>
+          <w:lang w:val="en-US"/>
+        </w:rPr>
+        <w:t xml:space="preserve">dragAndDrop() </w:t>
       </w:r>
       <w:r>
         <w:rPr>
@@ -9279,29 +8430,7 @@
           <w:szCs w:val="22"/>
           <w:lang w:val="en-US"/>
         </w:rPr>
-        <w:t xml:space="preserve">Points to be noted about configuration methods (like BeforeTest, AfterTest, BeforeMethod, </w:t>
-      </w:r>
-      <w:proofErr w:type="gramStart"/>
-      <w:r>
-        <w:rPr>
-          <w:b/>
-          <w:bCs/>
-          <w:sz w:val="24"/>
-          <w:szCs w:val="22"/>
-          <w:lang w:val="en-US"/>
-        </w:rPr>
-        <w:t>AfterMethod</w:t>
-      </w:r>
-      <w:proofErr w:type="gramEnd"/>
-      <w:r>
-        <w:rPr>
-          <w:b/>
-          <w:bCs/>
-          <w:sz w:val="24"/>
-          <w:szCs w:val="22"/>
-          <w:lang w:val="en-US"/>
-        </w:rPr>
-        <w:t>)</w:t>
+        <w:t>Points to be noted about configuration methods (like BeforeTest, AfterTest, BeforeMethod, AfterMethod)</w:t>
       </w:r>
     </w:p>
     <w:p>
@@ -11072,25 +10201,7 @@
           <w:szCs w:val="22"/>
           <w:lang w:val="en-US"/>
         </w:rPr>
-        <w:t xml:space="preserve"> Used avoid multiple </w:t>
-      </w:r>
-      <w:proofErr w:type="gramStart"/>
-      <w:r>
-        <w:rPr>
-          <w:sz w:val="24"/>
-          <w:szCs w:val="22"/>
-          <w:lang w:val="en-US"/>
-        </w:rPr>
-        <w:t>Given</w:t>
-      </w:r>
-      <w:proofErr w:type="gramEnd"/>
-      <w:r>
-        <w:rPr>
-          <w:sz w:val="24"/>
-          <w:szCs w:val="22"/>
-          <w:lang w:val="en-US"/>
-        </w:rPr>
-        <w:t xml:space="preserve"> statements.</w:t>
+        <w:t xml:space="preserve"> Used avoid multiple Given statements.</w:t>
       </w:r>
     </w:p>
     <w:p>
@@ -11307,76 +10418,409 @@
         </w:rPr>
         <w:t>Feature: Google Title</w:t>
       </w:r>
+    </w:p>
+    <w:p>
+      <w:pPr>
+        <w:rPr>
+          <w:sz w:val="24"/>
+          <w:szCs w:val="22"/>
+          <w:lang w:val="en-US"/>
+        </w:rPr>
+      </w:pPr>
+      <w:r>
+        <w:rPr>
+          <w:sz w:val="24"/>
+          <w:szCs w:val="22"/>
+          <w:lang w:val="en-US"/>
+        </w:rPr>
+        <w:t>Scenario: To validate title of Google</w:t>
+      </w:r>
+    </w:p>
+    <w:p>
+      <w:pPr>
+        <w:rPr>
+          <w:sz w:val="24"/>
+          <w:szCs w:val="22"/>
+          <w:lang w:val="en-US"/>
+        </w:rPr>
+      </w:pPr>
+      <w:r>
+        <w:rPr>
+          <w:sz w:val="24"/>
+          <w:szCs w:val="22"/>
+          <w:lang w:val="en-US"/>
+        </w:rPr>
+        <w:t>Given Open Google</w:t>
+      </w:r>
+    </w:p>
+    <w:p>
+      <w:pPr>
+        <w:rPr>
+          <w:sz w:val="24"/>
+          <w:szCs w:val="22"/>
+          <w:lang w:val="en-US"/>
+        </w:rPr>
+      </w:pPr>
+      <w:r>
+        <w:rPr>
+          <w:sz w:val="24"/>
+          <w:szCs w:val="22"/>
+          <w:lang w:val="en-US"/>
+        </w:rPr>
+        <w:t>When Read the title</w:t>
+      </w:r>
+    </w:p>
+    <w:p>
+      <w:pPr>
+        <w:rPr>
+          <w:sz w:val="24"/>
+          <w:szCs w:val="22"/>
+          <w:lang w:val="en-US"/>
+        </w:rPr>
+      </w:pPr>
+      <w:r>
+        <w:rPr>
+          <w:sz w:val="24"/>
+          <w:szCs w:val="22"/>
+          <w:lang w:val="en-US"/>
+        </w:rPr>
+        <w:t>Then Title should be Google</w:t>
+      </w:r>
+    </w:p>
+    <w:p>
+      <w:pPr>
+        <w:rPr>
+          <w:sz w:val="24"/>
+          <w:szCs w:val="22"/>
+          <w:lang w:val="en-US"/>
+        </w:rPr>
+      </w:pPr>
+    </w:p>
+    <w:p>
+      <w:pPr>
+        <w:rPr>
+          <w:sz w:val="24"/>
+          <w:szCs w:val="22"/>
+          <w:lang w:val="en-US"/>
+        </w:rPr>
+      </w:pPr>
+    </w:p>
+    <w:p>
+      <w:pPr>
+        <w:rPr>
+          <w:b/>
+          <w:bCs/>
+          <w:sz w:val="24"/>
+          <w:szCs w:val="22"/>
+          <w:lang w:val="en-US"/>
+        </w:rPr>
+      </w:pPr>
+      <w:r>
+        <w:rPr>
+          <w:b/>
+          <w:bCs/>
+          <w:sz w:val="24"/>
+          <w:szCs w:val="22"/>
+          <w:lang w:val="en-US"/>
+        </w:rPr>
+        <w:t>Tags in Cucumber</w:t>
+      </w:r>
+    </w:p>
+    <w:p>
+      <w:pPr>
+        <w:pStyle w:val="ListParagraph"/>
+        <w:numPr>
+          <w:ilvl w:val="0"/>
+          <w:numId w:val="35"/>
+        </w:numPr>
+        <w:rPr>
+          <w:b/>
+          <w:bCs/>
+          <w:sz w:val="24"/>
+          <w:szCs w:val="22"/>
+          <w:lang w:val="en-US"/>
+        </w:rPr>
+      </w:pPr>
+      <w:r>
+        <w:rPr>
+          <w:sz w:val="24"/>
+          <w:szCs w:val="22"/>
+          <w:lang w:val="en-US"/>
+        </w:rPr>
+        <w:t>Tags allows to execute / skip single scenario / multiple scenarios</w:t>
+      </w:r>
+    </w:p>
+    <w:p>
+      <w:pPr>
+        <w:pStyle w:val="ListParagraph"/>
+        <w:numPr>
+          <w:ilvl w:val="0"/>
+          <w:numId w:val="35"/>
+        </w:numPr>
+        <w:rPr>
+          <w:b/>
+          <w:bCs/>
+          <w:sz w:val="24"/>
+          <w:szCs w:val="22"/>
+          <w:lang w:val="en-US"/>
+        </w:rPr>
+      </w:pPr>
+      <w:r>
+        <w:rPr>
+          <w:sz w:val="24"/>
+          <w:szCs w:val="22"/>
+          <w:lang w:val="en-US"/>
+        </w:rPr>
+        <w:t>Tags needs to be defined in feature file</w:t>
+      </w:r>
+    </w:p>
+    <w:p>
+      <w:pPr>
+        <w:pStyle w:val="ListParagraph"/>
+        <w:numPr>
+          <w:ilvl w:val="0"/>
+          <w:numId w:val="35"/>
+        </w:numPr>
+        <w:rPr>
+          <w:b/>
+          <w:bCs/>
+          <w:sz w:val="24"/>
+          <w:szCs w:val="22"/>
+          <w:lang w:val="en-US"/>
+        </w:rPr>
+      </w:pPr>
+      <w:r>
+        <w:rPr>
+          <w:sz w:val="24"/>
+          <w:szCs w:val="22"/>
+          <w:lang w:val="en-US"/>
+        </w:rPr>
+        <w:t>The execution criteria needs to be specified in runner class</w:t>
+      </w:r>
+    </w:p>
+    <w:p>
+      <w:pPr>
+        <w:pStyle w:val="ListParagraph"/>
+        <w:numPr>
+          <w:ilvl w:val="0"/>
+          <w:numId w:val="35"/>
+        </w:numPr>
+        <w:rPr>
+          <w:sz w:val="24"/>
+          <w:szCs w:val="22"/>
+          <w:lang w:val="en-US"/>
+        </w:rPr>
+      </w:pPr>
+      <w:r>
+        <w:rPr>
+          <w:sz w:val="24"/>
+          <w:szCs w:val="22"/>
+          <w:lang w:val="en-US"/>
+        </w:rPr>
+        <w:t>Tags are</w:t>
+      </w:r>
+      <w:r>
+        <w:rPr>
+          <w:sz w:val="24"/>
+          <w:szCs w:val="22"/>
+          <w:lang w:val="en-US"/>
+        </w:rPr>
+        <w:t xml:space="preserve"> defined using @</w:t>
+      </w:r>
+    </w:p>
+    <w:p>
+      <w:pPr>
+        <w:rPr>
+          <w:sz w:val="24"/>
+          <w:szCs w:val="22"/>
+          <w:lang w:val="en-US"/>
+        </w:rPr>
+      </w:pPr>
+    </w:p>
+    <w:p>
+      <w:pPr>
+        <w:rPr>
+          <w:b/>
+          <w:bCs/>
+          <w:sz w:val="24"/>
+          <w:szCs w:val="22"/>
+          <w:lang w:val="en-US"/>
+        </w:rPr>
+      </w:pPr>
+      <w:r>
+        <w:rPr>
+          <w:b/>
+          <w:bCs/>
+          <w:sz w:val="24"/>
+          <w:szCs w:val="22"/>
+          <w:lang w:val="en-US"/>
+        </w:rPr>
+        <w:t>Hooks in Cucumber</w:t>
+      </w:r>
+    </w:p>
+    <w:p>
+      <w:pPr>
+        <w:pStyle w:val="ListParagraph"/>
+        <w:numPr>
+          <w:ilvl w:val="0"/>
+          <w:numId w:val="36"/>
+        </w:numPr>
+        <w:rPr>
+          <w:b/>
+          <w:bCs/>
+          <w:sz w:val="24"/>
+          <w:szCs w:val="22"/>
+          <w:lang w:val="en-US"/>
+        </w:rPr>
+      </w:pPr>
+      <w:r>
+        <w:rPr>
+          <w:sz w:val="24"/>
+          <w:szCs w:val="22"/>
+          <w:lang w:val="en-US"/>
+        </w:rPr>
+        <w:t xml:space="preserve">These are special methods in Cucumber those get executed </w:t>
+      </w:r>
+      <w:r>
+        <w:rPr>
+          <w:b/>
+          <w:bCs/>
+          <w:sz w:val="24"/>
+          <w:szCs w:val="22"/>
+          <w:lang w:val="en-US"/>
+        </w:rPr>
+        <w:t>before and after every scenario.</w:t>
+      </w:r>
+    </w:p>
+    <w:p>
+      <w:pPr>
+        <w:pStyle w:val="ListParagraph"/>
+        <w:numPr>
+          <w:ilvl w:val="0"/>
+          <w:numId w:val="36"/>
+        </w:numPr>
+        <w:rPr>
+          <w:sz w:val="24"/>
+          <w:szCs w:val="22"/>
+          <w:lang w:val="en-US"/>
+        </w:rPr>
+      </w:pPr>
+      <w:r>
+        <w:rPr>
+          <w:sz w:val="24"/>
+          <w:szCs w:val="22"/>
+          <w:lang w:val="en-US"/>
+        </w:rPr>
+        <w:t>There are two hooks in cucumber</w:t>
+      </w:r>
+    </w:p>
+    <w:p>
+      <w:pPr>
+        <w:pStyle w:val="ListParagraph"/>
+        <w:numPr>
+          <w:ilvl w:val="1"/>
+          <w:numId w:val="36"/>
+        </w:numPr>
+        <w:rPr>
+          <w:sz w:val="24"/>
+          <w:szCs w:val="22"/>
+          <w:lang w:val="en-US"/>
+        </w:rPr>
+      </w:pPr>
+      <w:r>
+        <w:rPr>
+          <w:sz w:val="24"/>
+          <w:szCs w:val="22"/>
+          <w:lang w:val="en-US"/>
+        </w:rPr>
+        <w:t>@Before</w:t>
+      </w:r>
+    </w:p>
+    <w:p>
+      <w:pPr>
+        <w:pStyle w:val="ListParagraph"/>
+        <w:numPr>
+          <w:ilvl w:val="1"/>
+          <w:numId w:val="36"/>
+        </w:numPr>
+        <w:rPr>
+          <w:sz w:val="24"/>
+          <w:szCs w:val="22"/>
+          <w:lang w:val="en-US"/>
+        </w:rPr>
+      </w:pPr>
+      <w:r>
+        <w:rPr>
+          <w:sz w:val="24"/>
+          <w:szCs w:val="22"/>
+          <w:lang w:val="en-US"/>
+        </w:rPr>
+        <w:t>@After</w:t>
+      </w:r>
+    </w:p>
+    <w:p>
+      <w:pPr>
+        <w:pStyle w:val="ListParagraph"/>
+        <w:numPr>
+          <w:ilvl w:val="0"/>
+          <w:numId w:val="36"/>
+        </w:numPr>
+        <w:rPr>
+          <w:sz w:val="24"/>
+          <w:szCs w:val="22"/>
+          <w:lang w:val="en-US"/>
+        </w:rPr>
+      </w:pPr>
+      <w:r>
+        <w:rPr>
+          <w:sz w:val="24"/>
+          <w:szCs w:val="22"/>
+          <w:lang w:val="en-US"/>
+        </w:rPr>
+        <w:t>Hooks can be specified in Step Definition</w:t>
+      </w:r>
+    </w:p>
+    <w:p>
+      <w:pPr>
+        <w:pStyle w:val="ListParagraph"/>
+        <w:numPr>
+          <w:ilvl w:val="0"/>
+          <w:numId w:val="36"/>
+        </w:numPr>
+        <w:rPr>
+          <w:sz w:val="24"/>
+          <w:szCs w:val="22"/>
+          <w:lang w:val="en-US"/>
+        </w:rPr>
+      </w:pPr>
+      <w:r>
+        <w:rPr>
+          <w:sz w:val="24"/>
+          <w:szCs w:val="22"/>
+          <w:lang w:val="en-US"/>
+        </w:rPr>
+        <w:t>Hooks are never been part of Feature file</w:t>
+      </w:r>
+    </w:p>
+    <w:p>
+      <w:pPr>
+        <w:rPr>
+          <w:sz w:val="24"/>
+          <w:szCs w:val="22"/>
+          <w:lang w:val="en-US"/>
+        </w:rPr>
+      </w:pPr>
+    </w:p>
+    <w:p>
+      <w:pPr>
+        <w:rPr>
+          <w:sz w:val="24"/>
+          <w:szCs w:val="22"/>
+          <w:lang w:val="en-US"/>
+        </w:rPr>
+      </w:pPr>
       <w:bookmarkStart w:id="0" w:name="_GoBack"/>
       <w:bookmarkEnd w:id="0"/>
-    </w:p>
-    <w:p>
-      <w:pPr>
-        <w:rPr>
-          <w:sz w:val="24"/>
-          <w:szCs w:val="22"/>
-          <w:lang w:val="en-US"/>
-        </w:rPr>
-      </w:pPr>
-      <w:r>
-        <w:rPr>
-          <w:sz w:val="24"/>
-          <w:szCs w:val="22"/>
-          <w:lang w:val="en-US"/>
-        </w:rPr>
-        <w:t>Scenario: To validate title of Google</w:t>
-      </w:r>
-    </w:p>
-    <w:p>
-      <w:pPr>
-        <w:rPr>
-          <w:sz w:val="24"/>
-          <w:szCs w:val="22"/>
-          <w:lang w:val="en-US"/>
-        </w:rPr>
-      </w:pPr>
-      <w:r>
-        <w:rPr>
-          <w:sz w:val="24"/>
-          <w:szCs w:val="22"/>
-          <w:lang w:val="en-US"/>
-        </w:rPr>
-        <w:t>Given Open Google</w:t>
-      </w:r>
-    </w:p>
-    <w:p>
-      <w:pPr>
-        <w:rPr>
-          <w:sz w:val="24"/>
-          <w:szCs w:val="22"/>
-          <w:lang w:val="en-US"/>
-        </w:rPr>
-      </w:pPr>
-      <w:r>
-        <w:rPr>
-          <w:sz w:val="24"/>
-          <w:szCs w:val="22"/>
-          <w:lang w:val="en-US"/>
-        </w:rPr>
-        <w:t>When Read the title</w:t>
-      </w:r>
-    </w:p>
-    <w:p>
-      <w:pPr>
-        <w:rPr>
-          <w:sz w:val="24"/>
-          <w:szCs w:val="22"/>
-          <w:lang w:val="en-US"/>
-        </w:rPr>
-      </w:pPr>
-      <w:r>
-        <w:rPr>
-          <w:sz w:val="24"/>
-          <w:szCs w:val="22"/>
-          <w:lang w:val="en-US"/>
-        </w:rPr>
-        <w:t>Then Title should be Google</w:t>
-      </w:r>
     </w:p>
     <w:sectPr>
       <w:pgSz w:w="11906" w:h="16838"/>
@@ -13079,6 +12523,119 @@
     </w:lvl>
   </w:abstractNum>
   <w:abstractNum w:abstractNumId="16">
+    <w:nsid w:val="449973FA"/>
+    <w:multiLevelType w:val="hybridMultilevel"/>
+    <w:tmpl w:val="36E2E922"/>
+    <w:lvl w:ilvl="0" w:tplc="40090001">
+      <w:start w:val="1"/>
+      <w:numFmt w:val="bullet"/>
+      <w:lvlText w:val=""/>
+      <w:lvlJc w:val="left"/>
+      <w:pPr>
+        <w:ind w:left="720" w:hanging="360"/>
+      </w:pPr>
+      <w:rPr>
+        <w:rFonts w:ascii="Symbol" w:hAnsi="Symbol" w:hint="default"/>
+      </w:rPr>
+    </w:lvl>
+    <w:lvl w:ilvl="1" w:tplc="40090003">
+      <w:start w:val="1"/>
+      <w:numFmt w:val="bullet"/>
+      <w:lvlText w:val="o"/>
+      <w:lvlJc w:val="left"/>
+      <w:pPr>
+        <w:ind w:left="1440" w:hanging="360"/>
+      </w:pPr>
+      <w:rPr>
+        <w:rFonts w:ascii="Courier New" w:hAnsi="Courier New" w:cs="Courier New" w:hint="default"/>
+      </w:rPr>
+    </w:lvl>
+    <w:lvl w:ilvl="2" w:tplc="40090005" w:tentative="1">
+      <w:start w:val="1"/>
+      <w:numFmt w:val="bullet"/>
+      <w:lvlText w:val=""/>
+      <w:lvlJc w:val="left"/>
+      <w:pPr>
+        <w:ind w:left="2160" w:hanging="360"/>
+      </w:pPr>
+      <w:rPr>
+        <w:rFonts w:ascii="Wingdings" w:hAnsi="Wingdings" w:hint="default"/>
+      </w:rPr>
+    </w:lvl>
+    <w:lvl w:ilvl="3" w:tplc="40090001" w:tentative="1">
+      <w:start w:val="1"/>
+      <w:numFmt w:val="bullet"/>
+      <w:lvlText w:val=""/>
+      <w:lvlJc w:val="left"/>
+      <w:pPr>
+        <w:ind w:left="2880" w:hanging="360"/>
+      </w:pPr>
+      <w:rPr>
+        <w:rFonts w:ascii="Symbol" w:hAnsi="Symbol" w:hint="default"/>
+      </w:rPr>
+    </w:lvl>
+    <w:lvl w:ilvl="4" w:tplc="40090003" w:tentative="1">
+      <w:start w:val="1"/>
+      <w:numFmt w:val="bullet"/>
+      <w:lvlText w:val="o"/>
+      <w:lvlJc w:val="left"/>
+      <w:pPr>
+        <w:ind w:left="3600" w:hanging="360"/>
+      </w:pPr>
+      <w:rPr>
+        <w:rFonts w:ascii="Courier New" w:hAnsi="Courier New" w:cs="Courier New" w:hint="default"/>
+      </w:rPr>
+    </w:lvl>
+    <w:lvl w:ilvl="5" w:tplc="40090005" w:tentative="1">
+      <w:start w:val="1"/>
+      <w:numFmt w:val="bullet"/>
+      <w:lvlText w:val=""/>
+      <w:lvlJc w:val="left"/>
+      <w:pPr>
+        <w:ind w:left="4320" w:hanging="360"/>
+      </w:pPr>
+      <w:rPr>
+        <w:rFonts w:ascii="Wingdings" w:hAnsi="Wingdings" w:hint="default"/>
+      </w:rPr>
+    </w:lvl>
+    <w:lvl w:ilvl="6" w:tplc="40090001" w:tentative="1">
+      <w:start w:val="1"/>
+      <w:numFmt w:val="bullet"/>
+      <w:lvlText w:val=""/>
+      <w:lvlJc w:val="left"/>
+      <w:pPr>
+        <w:ind w:left="5040" w:hanging="360"/>
+      </w:pPr>
+      <w:rPr>
+        <w:rFonts w:ascii="Symbol" w:hAnsi="Symbol" w:hint="default"/>
+      </w:rPr>
+    </w:lvl>
+    <w:lvl w:ilvl="7" w:tplc="40090003" w:tentative="1">
+      <w:start w:val="1"/>
+      <w:numFmt w:val="bullet"/>
+      <w:lvlText w:val="o"/>
+      <w:lvlJc w:val="left"/>
+      <w:pPr>
+        <w:ind w:left="5760" w:hanging="360"/>
+      </w:pPr>
+      <w:rPr>
+        <w:rFonts w:ascii="Courier New" w:hAnsi="Courier New" w:cs="Courier New" w:hint="default"/>
+      </w:rPr>
+    </w:lvl>
+    <w:lvl w:ilvl="8" w:tplc="40090005" w:tentative="1">
+      <w:start w:val="1"/>
+      <w:numFmt w:val="bullet"/>
+      <w:lvlText w:val=""/>
+      <w:lvlJc w:val="left"/>
+      <w:pPr>
+        <w:ind w:left="6480" w:hanging="360"/>
+      </w:pPr>
+      <w:rPr>
+        <w:rFonts w:ascii="Wingdings" w:hAnsi="Wingdings" w:hint="default"/>
+      </w:rPr>
+    </w:lvl>
+  </w:abstractNum>
+  <w:abstractNum w:abstractNumId="17">
     <w:nsid w:val="44C5757D"/>
     <w:multiLevelType w:val="hybridMultilevel"/>
     <w:tmpl w:val="BA887CA2"/>
@@ -13167,7 +12724,7 @@
       </w:pPr>
     </w:lvl>
   </w:abstractNum>
-  <w:abstractNum w:abstractNumId="17">
+  <w:abstractNum w:abstractNumId="18">
     <w:nsid w:val="4771029A"/>
     <w:multiLevelType w:val="hybridMultilevel"/>
     <w:tmpl w:val="F2681506"/>
@@ -13280,7 +12837,7 @@
       </w:rPr>
     </w:lvl>
   </w:abstractNum>
-  <w:abstractNum w:abstractNumId="18">
+  <w:abstractNum w:abstractNumId="19">
     <w:nsid w:val="487A3B0D"/>
     <w:multiLevelType w:val="hybridMultilevel"/>
     <w:tmpl w:val="75CA2E34"/>
@@ -13369,7 +12926,7 @@
       </w:pPr>
     </w:lvl>
   </w:abstractNum>
-  <w:abstractNum w:abstractNumId="19">
+  <w:abstractNum w:abstractNumId="20">
     <w:nsid w:val="4C187E13"/>
     <w:multiLevelType w:val="hybridMultilevel"/>
     <w:tmpl w:val="E8ACCDB8"/>
@@ -13482,7 +13039,7 @@
       </w:rPr>
     </w:lvl>
   </w:abstractNum>
-  <w:abstractNum w:abstractNumId="20">
+  <w:abstractNum w:abstractNumId="21">
     <w:nsid w:val="56A40A45"/>
     <w:multiLevelType w:val="hybridMultilevel"/>
     <w:tmpl w:val="7862B3F8"/>
@@ -13595,7 +13152,7 @@
       </w:rPr>
     </w:lvl>
   </w:abstractNum>
-  <w:abstractNum w:abstractNumId="21">
+  <w:abstractNum w:abstractNumId="22">
     <w:nsid w:val="58D1047A"/>
     <w:multiLevelType w:val="hybridMultilevel"/>
     <w:tmpl w:val="BB6E0C8E"/>
@@ -13708,7 +13265,7 @@
       </w:rPr>
     </w:lvl>
   </w:abstractNum>
-  <w:abstractNum w:abstractNumId="22">
+  <w:abstractNum w:abstractNumId="23">
     <w:nsid w:val="590A2A42"/>
     <w:multiLevelType w:val="hybridMultilevel"/>
     <w:tmpl w:val="B2CCDDE8"/>
@@ -13821,7 +13378,7 @@
       </w:rPr>
     </w:lvl>
   </w:abstractNum>
-  <w:abstractNum w:abstractNumId="23">
+  <w:abstractNum w:abstractNumId="24">
     <w:nsid w:val="5AC325C4"/>
     <w:multiLevelType w:val="hybridMultilevel"/>
     <w:tmpl w:val="6BF65148"/>
@@ -13910,7 +13467,7 @@
       </w:pPr>
     </w:lvl>
   </w:abstractNum>
-  <w:abstractNum w:abstractNumId="24">
+  <w:abstractNum w:abstractNumId="25">
     <w:nsid w:val="5E1A5E19"/>
     <w:multiLevelType w:val="hybridMultilevel"/>
     <w:tmpl w:val="3C0054B4"/>
@@ -14023,7 +13580,7 @@
       </w:rPr>
     </w:lvl>
   </w:abstractNum>
-  <w:abstractNum w:abstractNumId="25">
+  <w:abstractNum w:abstractNumId="26">
     <w:nsid w:val="60CD67B9"/>
     <w:multiLevelType w:val="hybridMultilevel"/>
     <w:tmpl w:val="898E7844"/>
@@ -14112,7 +13669,7 @@
       </w:pPr>
     </w:lvl>
   </w:abstractNum>
-  <w:abstractNum w:abstractNumId="26">
+  <w:abstractNum w:abstractNumId="27">
     <w:nsid w:val="629C4E82"/>
     <w:multiLevelType w:val="hybridMultilevel"/>
     <w:tmpl w:val="363CE55E"/>
@@ -14201,7 +13758,7 @@
       </w:pPr>
     </w:lvl>
   </w:abstractNum>
-  <w:abstractNum w:abstractNumId="27">
+  <w:abstractNum w:abstractNumId="28">
     <w:nsid w:val="632F5147"/>
     <w:multiLevelType w:val="hybridMultilevel"/>
     <w:tmpl w:val="A2A076AA"/>
@@ -14314,7 +13871,7 @@
       </w:rPr>
     </w:lvl>
   </w:abstractNum>
-  <w:abstractNum w:abstractNumId="28">
+  <w:abstractNum w:abstractNumId="29">
     <w:nsid w:val="66C14124"/>
     <w:multiLevelType w:val="hybridMultilevel"/>
     <w:tmpl w:val="87BA6304"/>
@@ -14427,7 +13984,7 @@
       </w:rPr>
     </w:lvl>
   </w:abstractNum>
-  <w:abstractNum w:abstractNumId="29">
+  <w:abstractNum w:abstractNumId="30">
     <w:nsid w:val="6CA66238"/>
     <w:multiLevelType w:val="hybridMultilevel"/>
     <w:tmpl w:val="A2201FCA"/>
@@ -14540,7 +14097,7 @@
       </w:rPr>
     </w:lvl>
   </w:abstractNum>
-  <w:abstractNum w:abstractNumId="30">
+  <w:abstractNum w:abstractNumId="31">
     <w:nsid w:val="73C523EA"/>
     <w:multiLevelType w:val="hybridMultilevel"/>
     <w:tmpl w:val="F1BEC0E4"/>
@@ -14653,7 +14210,7 @@
       </w:rPr>
     </w:lvl>
   </w:abstractNum>
-  <w:abstractNum w:abstractNumId="31">
+  <w:abstractNum w:abstractNumId="32">
     <w:nsid w:val="76CB2945"/>
     <w:multiLevelType w:val="hybridMultilevel"/>
     <w:tmpl w:val="E2880EB2"/>
@@ -14766,7 +14323,7 @@
       </w:rPr>
     </w:lvl>
   </w:abstractNum>
-  <w:abstractNum w:abstractNumId="32">
+  <w:abstractNum w:abstractNumId="33">
     <w:nsid w:val="77E60E1A"/>
     <w:multiLevelType w:val="hybridMultilevel"/>
     <w:tmpl w:val="14625B96"/>
@@ -14855,7 +14412,7 @@
       </w:pPr>
     </w:lvl>
   </w:abstractNum>
-  <w:abstractNum w:abstractNumId="33">
+  <w:abstractNum w:abstractNumId="34">
     <w:nsid w:val="79FE4925"/>
     <w:multiLevelType w:val="hybridMultilevel"/>
     <w:tmpl w:val="263AE45E"/>
@@ -14944,23 +14501,136 @@
       </w:pPr>
     </w:lvl>
   </w:abstractNum>
+  <w:abstractNum w:abstractNumId="35">
+    <w:nsid w:val="7DD65BB0"/>
+    <w:multiLevelType w:val="hybridMultilevel"/>
+    <w:tmpl w:val="6672A80C"/>
+    <w:lvl w:ilvl="0" w:tplc="40090001">
+      <w:start w:val="1"/>
+      <w:numFmt w:val="bullet"/>
+      <w:lvlText w:val=""/>
+      <w:lvlJc w:val="left"/>
+      <w:pPr>
+        <w:ind w:left="720" w:hanging="360"/>
+      </w:pPr>
+      <w:rPr>
+        <w:rFonts w:ascii="Symbol" w:hAnsi="Symbol" w:hint="default"/>
+      </w:rPr>
+    </w:lvl>
+    <w:lvl w:ilvl="1" w:tplc="40090003" w:tentative="1">
+      <w:start w:val="1"/>
+      <w:numFmt w:val="bullet"/>
+      <w:lvlText w:val="o"/>
+      <w:lvlJc w:val="left"/>
+      <w:pPr>
+        <w:ind w:left="1440" w:hanging="360"/>
+      </w:pPr>
+      <w:rPr>
+        <w:rFonts w:ascii="Courier New" w:hAnsi="Courier New" w:cs="Courier New" w:hint="default"/>
+      </w:rPr>
+    </w:lvl>
+    <w:lvl w:ilvl="2" w:tplc="40090005" w:tentative="1">
+      <w:start w:val="1"/>
+      <w:numFmt w:val="bullet"/>
+      <w:lvlText w:val=""/>
+      <w:lvlJc w:val="left"/>
+      <w:pPr>
+        <w:ind w:left="2160" w:hanging="360"/>
+      </w:pPr>
+      <w:rPr>
+        <w:rFonts w:ascii="Wingdings" w:hAnsi="Wingdings" w:hint="default"/>
+      </w:rPr>
+    </w:lvl>
+    <w:lvl w:ilvl="3" w:tplc="40090001" w:tentative="1">
+      <w:start w:val="1"/>
+      <w:numFmt w:val="bullet"/>
+      <w:lvlText w:val=""/>
+      <w:lvlJc w:val="left"/>
+      <w:pPr>
+        <w:ind w:left="2880" w:hanging="360"/>
+      </w:pPr>
+      <w:rPr>
+        <w:rFonts w:ascii="Symbol" w:hAnsi="Symbol" w:hint="default"/>
+      </w:rPr>
+    </w:lvl>
+    <w:lvl w:ilvl="4" w:tplc="40090003" w:tentative="1">
+      <w:start w:val="1"/>
+      <w:numFmt w:val="bullet"/>
+      <w:lvlText w:val="o"/>
+      <w:lvlJc w:val="left"/>
+      <w:pPr>
+        <w:ind w:left="3600" w:hanging="360"/>
+      </w:pPr>
+      <w:rPr>
+        <w:rFonts w:ascii="Courier New" w:hAnsi="Courier New" w:cs="Courier New" w:hint="default"/>
+      </w:rPr>
+    </w:lvl>
+    <w:lvl w:ilvl="5" w:tplc="40090005" w:tentative="1">
+      <w:start w:val="1"/>
+      <w:numFmt w:val="bullet"/>
+      <w:lvlText w:val=""/>
+      <w:lvlJc w:val="left"/>
+      <w:pPr>
+        <w:ind w:left="4320" w:hanging="360"/>
+      </w:pPr>
+      <w:rPr>
+        <w:rFonts w:ascii="Wingdings" w:hAnsi="Wingdings" w:hint="default"/>
+      </w:rPr>
+    </w:lvl>
+    <w:lvl w:ilvl="6" w:tplc="40090001" w:tentative="1">
+      <w:start w:val="1"/>
+      <w:numFmt w:val="bullet"/>
+      <w:lvlText w:val=""/>
+      <w:lvlJc w:val="left"/>
+      <w:pPr>
+        <w:ind w:left="5040" w:hanging="360"/>
+      </w:pPr>
+      <w:rPr>
+        <w:rFonts w:ascii="Symbol" w:hAnsi="Symbol" w:hint="default"/>
+      </w:rPr>
+    </w:lvl>
+    <w:lvl w:ilvl="7" w:tplc="40090003" w:tentative="1">
+      <w:start w:val="1"/>
+      <w:numFmt w:val="bullet"/>
+      <w:lvlText w:val="o"/>
+      <w:lvlJc w:val="left"/>
+      <w:pPr>
+        <w:ind w:left="5760" w:hanging="360"/>
+      </w:pPr>
+      <w:rPr>
+        <w:rFonts w:ascii="Courier New" w:hAnsi="Courier New" w:cs="Courier New" w:hint="default"/>
+      </w:rPr>
+    </w:lvl>
+    <w:lvl w:ilvl="8" w:tplc="40090005" w:tentative="1">
+      <w:start w:val="1"/>
+      <w:numFmt w:val="bullet"/>
+      <w:lvlText w:val=""/>
+      <w:lvlJc w:val="left"/>
+      <w:pPr>
+        <w:ind w:left="6480" w:hanging="360"/>
+      </w:pPr>
+      <w:rPr>
+        <w:rFonts w:ascii="Wingdings" w:hAnsi="Wingdings" w:hint="default"/>
+      </w:rPr>
+    </w:lvl>
+  </w:abstractNum>
   <w:num w:numId="1">
-    <w:abstractNumId w:val="27"/>
+    <w:abstractNumId w:val="28"/>
   </w:num>
   <w:num w:numId="2">
+    <w:abstractNumId w:val="32"/>
+  </w:num>
+  <w:num w:numId="3">
+    <w:abstractNumId w:val="30"/>
+  </w:num>
+  <w:num w:numId="4">
+    <w:abstractNumId w:val="21"/>
+  </w:num>
+  <w:num w:numId="5">
     <w:abstractNumId w:val="31"/>
   </w:num>
-  <w:num w:numId="3">
-    <w:abstractNumId w:val="29"/>
-  </w:num>
-  <w:num w:numId="4">
-    <w:abstractNumId w:val="20"/>
-  </w:num>
-  <w:num w:numId="5">
-    <w:abstractNumId w:val="30"/>
-  </w:num>
   <w:num w:numId="6">
-    <w:abstractNumId w:val="26"/>
+    <w:abstractNumId w:val="27"/>
   </w:num>
   <w:num w:numId="7">
     <w:abstractNumId w:val="15"/>
@@ -14969,22 +14639,22 @@
     <w:abstractNumId w:val="5"/>
   </w:num>
   <w:num w:numId="9">
-    <w:abstractNumId w:val="33"/>
+    <w:abstractNumId w:val="34"/>
   </w:num>
   <w:num w:numId="10">
     <w:abstractNumId w:val="12"/>
   </w:num>
   <w:num w:numId="11">
-    <w:abstractNumId w:val="23"/>
+    <w:abstractNumId w:val="24"/>
   </w:num>
   <w:num w:numId="12">
     <w:abstractNumId w:val="13"/>
   </w:num>
   <w:num w:numId="13">
-    <w:abstractNumId w:val="18"/>
+    <w:abstractNumId w:val="19"/>
   </w:num>
   <w:num w:numId="14">
-    <w:abstractNumId w:val="22"/>
+    <w:abstractNumId w:val="23"/>
   </w:num>
   <w:num w:numId="15">
     <w:abstractNumId w:val="7"/>
@@ -14999,22 +14669,22 @@
     <w:abstractNumId w:val="6"/>
   </w:num>
   <w:num w:numId="19">
-    <w:abstractNumId w:val="24"/>
+    <w:abstractNumId w:val="25"/>
   </w:num>
   <w:num w:numId="20">
     <w:abstractNumId w:val="9"/>
   </w:num>
   <w:num w:numId="21">
-    <w:abstractNumId w:val="19"/>
+    <w:abstractNumId w:val="20"/>
   </w:num>
   <w:num w:numId="22">
     <w:abstractNumId w:val="2"/>
   </w:num>
   <w:num w:numId="23">
-    <w:abstractNumId w:val="16"/>
+    <w:abstractNumId w:val="17"/>
   </w:num>
   <w:num w:numId="24">
-    <w:abstractNumId w:val="32"/>
+    <w:abstractNumId w:val="33"/>
   </w:num>
   <w:num w:numId="25">
     <w:abstractNumId w:val="11"/>
@@ -15023,19 +14693,19 @@
     <w:abstractNumId w:val="3"/>
   </w:num>
   <w:num w:numId="27">
-    <w:abstractNumId w:val="25"/>
+    <w:abstractNumId w:val="26"/>
   </w:num>
   <w:num w:numId="28">
-    <w:abstractNumId w:val="28"/>
+    <w:abstractNumId w:val="29"/>
   </w:num>
   <w:num w:numId="29">
-    <w:abstractNumId w:val="21"/>
+    <w:abstractNumId w:val="22"/>
   </w:num>
   <w:num w:numId="30">
     <w:abstractNumId w:val="10"/>
   </w:num>
   <w:num w:numId="31">
-    <w:abstractNumId w:val="17"/>
+    <w:abstractNumId w:val="18"/>
   </w:num>
   <w:num w:numId="32">
     <w:abstractNumId w:val="8"/>
@@ -15045,6 +14715,12 @@
   </w:num>
   <w:num w:numId="34">
     <w:abstractNumId w:val="0"/>
+  </w:num>
+  <w:num w:numId="35">
+    <w:abstractNumId w:val="35"/>
+  </w:num>
+  <w:num w:numId="36">
+    <w:abstractNumId w:val="16"/>
   </w:num>
 </w:numbering>
 </file>

</xml_diff>